<commit_message>
feat: enhance project proposal template with dynamic budget and related projects data,
fix: successfully resolve resend bugs
</commit_message>
<xml_diff>
--- a/public/templates/project-proposal.docx
+++ b/public/templates/project-proposal.docx
@@ -1114,32 +1114,34 @@
             <w:pPr>
               <w:spacing w:after="0" w:line="240" w:lineRule="auto"/>
               <w:rPr>
-                <w:rFonts w:ascii="TH SarabunIT๙" w:eastAsia="Calibri" w:hAnsi="TH SarabunIT๙" w:cs="TH SarabunIT๙"/>
+                <w:rFonts w:ascii="TH SarabunIT๙" w:eastAsia="Calibri" w:hAnsi="TH SarabunIT๙" w:cs="TH SarabunIT๙" w:hint="cs"/>
                 <w:color w:val="000000"/>
                 <w:sz w:val="32"/>
                 <w:szCs w:val="32"/>
-              </w:rPr>
-            </w:pPr>
-            <w:r>
-              <w:rPr>
-                <w:rFonts w:ascii="TH SarabunIT๙" w:eastAsia="Calibri" w:hAnsi="TH SarabunIT๙" w:cs="TH SarabunIT๙"/>
+                <w:cs/>
+              </w:rPr>
+            </w:pPr>
+            <w:r>
+              <w:rPr>
+                <w:rFonts w:ascii="TH SarabunIT๙" w:eastAsia="Calibri" w:hAnsi="TH SarabunIT๙" w:cs="TH SarabunIT๙"/>
+                <w:b/>
+                <w:bCs/>
                 <w:color w:val="000000"/>
                 <w:sz w:val="32"/>
                 <w:szCs w:val="32"/>
-                <w:cs/>
-              </w:rPr>
-              <w:t xml:space="preserve">พ.ศ. </w:t>
-            </w:r>
-            <w:r>
-              <w:rPr>
-                <w:rFonts w:ascii="TH SarabunIT๙" w:eastAsia="Calibri" w:hAnsi="TH SarabunIT๙" w:cs="TH SarabunIT๙" w:hint="cs"/>
+              </w:rPr>
+              <w:t>{</w:t>
+            </w:r>
+            <w:r>
+              <w:rPr>
+                <w:rFonts w:ascii="TH SarabunIT๙" w:eastAsia="Calibri" w:hAnsi="TH SarabunIT๙" w:cs="TH SarabunIT๙"/>
                 <w:color w:val="000000"/>
                 <w:sz w:val="32"/>
                 <w:szCs w:val="32"/>
-                <w:cs/>
-              </w:rPr>
-              <w:t>…</w:t>
-            </w:r>
+              </w:rPr>
+              <w:t>#</w:t>
+            </w:r>
+            <w:proofErr w:type="gramStart"/>
             <w:r>
               <w:rPr>
                 <w:rFonts w:ascii="TH SarabunIT๙" w:eastAsia="Calibri" w:hAnsi="TH SarabunIT๙" w:cs="TH SarabunIT๙"/>
@@ -1147,17 +1149,18 @@
                 <w:sz w:val="32"/>
                 <w:szCs w:val="32"/>
               </w:rPr>
-              <w:t>………</w:t>
-            </w:r>
-            <w:r>
-              <w:rPr>
-                <w:rFonts w:ascii="TH SarabunIT๙" w:eastAsia="Calibri" w:hAnsi="TH SarabunIT๙" w:cs="TH SarabunIT๙"/>
+              <w:t>budgetsByYear</w:t>
+            </w:r>
+            <w:r>
+              <w:rPr>
+                <w:rFonts w:ascii="TH SarabunIT๙" w:eastAsia="Calibri" w:hAnsi="TH SarabunIT๙" w:cs="TH SarabunIT๙"/>
+                <w:b/>
+                <w:bCs/>
                 <w:color w:val="000000"/>
                 <w:sz w:val="32"/>
                 <w:szCs w:val="32"/>
-                <w:cs/>
-              </w:rPr>
-              <w:t>...</w:t>
+              </w:rPr>
+              <w:t>}</w:t>
             </w:r>
             <w:r>
               <w:rPr>
@@ -1165,334 +1168,117 @@
                 <w:color w:val="000000"/>
                 <w:sz w:val="32"/>
                 <w:szCs w:val="32"/>
-                <w:cs/>
-              </w:rPr>
-              <w:br/>
-              <w:t xml:space="preserve">พ.ศ. </w:t>
-            </w:r>
-            <w:r>
-              <w:rPr>
-                <w:rFonts w:ascii="TH SarabunIT๙" w:eastAsia="Calibri" w:hAnsi="TH SarabunIT๙" w:cs="TH SarabunIT๙" w:hint="cs"/>
+              </w:rPr>
+              <w:t>{</w:t>
+            </w:r>
+            <w:proofErr w:type="gramEnd"/>
+            <w:r>
+              <w:rPr>
+                <w:rFonts w:ascii="TH SarabunIT๙" w:eastAsia="Calibri" w:hAnsi="TH SarabunIT๙" w:cs="TH SarabunIT๙"/>
                 <w:color w:val="000000"/>
                 <w:sz w:val="32"/>
                 <w:szCs w:val="32"/>
-                <w:cs/>
-              </w:rPr>
-              <w:t>…</w:t>
-            </w:r>
-            <w:r>
+              </w:rPr>
+              <w:t>year}</w:t>
+            </w:r>
+          </w:p>
+        </w:tc>
+        <w:tc>
+          <w:tcPr>
+            <w:tcW w:w="2520" w:type="dxa"/>
+          </w:tcPr>
+          <w:p>
+            <w:pPr>
+              <w:spacing w:after="0" w:line="240" w:lineRule="auto"/>
               <w:rPr>
                 <w:rFonts w:ascii="TH SarabunIT๙" w:eastAsia="Calibri" w:hAnsi="TH SarabunIT๙" w:cs="TH SarabunIT๙"/>
                 <w:color w:val="000000"/>
                 <w:sz w:val="32"/>
                 <w:szCs w:val="32"/>
               </w:rPr>
-              <w:t>………</w:t>
-            </w:r>
+            </w:pPr>
             <w:r>
               <w:rPr>
                 <w:rFonts w:ascii="TH SarabunIT๙" w:eastAsia="Calibri" w:hAnsi="TH SarabunIT๙" w:cs="TH SarabunIT๙"/>
                 <w:color w:val="000000"/>
                 <w:sz w:val="32"/>
                 <w:szCs w:val="32"/>
-                <w:cs/>
-              </w:rPr>
-              <w:t>...</w:t>
-            </w:r>
-          </w:p>
-          <w:p>
-            <w:pPr>
-              <w:spacing w:after="0" w:line="240" w:lineRule="auto"/>
-              <w:rPr>
-                <w:rFonts w:ascii="TH SarabunIT๙" w:eastAsia="Calibri" w:hAnsi="TH SarabunIT๙" w:cs="TH SarabunIT๙"/>
+              </w:rPr>
+              <w:t>{amount}</w:t>
+            </w:r>
+          </w:p>
+        </w:tc>
+        <w:tc>
+          <w:tcPr>
+            <w:tcW w:w="4107" w:type="dxa"/>
+          </w:tcPr>
+          <w:p>
+            <w:pPr>
+              <w:spacing w:after="0" w:line="240" w:lineRule="auto"/>
+              <w:rPr>
+                <w:rFonts w:ascii="TH SarabunIT๙" w:eastAsia="Calibri" w:hAnsi="TH SarabunIT๙" w:cstheme="minorBidi"/>
                 <w:color w:val="000000"/>
                 <w:sz w:val="32"/>
                 <w:szCs w:val="32"/>
-                <w:cs/>
-              </w:rPr>
-            </w:pPr>
-            <w:r>
-              <w:rPr>
-                <w:rFonts w:ascii="TH SarabunIT๙" w:eastAsia="Calibri" w:hAnsi="TH SarabunIT๙" w:cs="TH SarabunIT๙"/>
+              </w:rPr>
+            </w:pPr>
+            <w:r>
+              <w:rPr>
+                <w:rFonts w:ascii="TH SarabunIT๙" w:eastAsia="Calibri" w:hAnsi="TH SarabunIT๙" w:cstheme="minorBidi"/>
                 <w:color w:val="000000"/>
                 <w:sz w:val="32"/>
                 <w:szCs w:val="32"/>
-                <w:cs/>
-              </w:rPr>
-              <w:t xml:space="preserve">พ.ศ. </w:t>
-            </w:r>
-            <w:r>
-              <w:rPr>
-                <w:rFonts w:ascii="TH SarabunIT๙" w:eastAsia="Calibri" w:hAnsi="TH SarabunIT๙" w:cs="TH SarabunIT๙" w:hint="cs"/>
+              </w:rPr>
+              <w:t>{</w:t>
+            </w:r>
+            <w:proofErr w:type="spellStart"/>
+            <w:r>
+              <w:rPr>
+                <w:rFonts w:ascii="TH SarabunIT๙" w:eastAsia="Calibri" w:hAnsi="TH SarabunIT๙" w:cstheme="minorBidi"/>
                 <w:color w:val="000000"/>
                 <w:sz w:val="32"/>
                 <w:szCs w:val="32"/>
-                <w:cs/>
-              </w:rPr>
-              <w:t>…</w:t>
-            </w:r>
-            <w:r>
-              <w:rPr>
-                <w:rFonts w:ascii="TH SarabunIT๙" w:eastAsia="Calibri" w:hAnsi="TH SarabunIT๙" w:cs="TH SarabunIT๙"/>
+              </w:rPr>
+              <w:t>budgetType</w:t>
+            </w:r>
+            <w:proofErr w:type="spellEnd"/>
+            <w:r>
+              <w:rPr>
+                <w:rFonts w:ascii="TH SarabunIT๙" w:eastAsia="Calibri" w:hAnsi="TH SarabunIT๙" w:cstheme="minorBidi"/>
                 <w:color w:val="000000"/>
                 <w:sz w:val="32"/>
                 <w:szCs w:val="32"/>
               </w:rPr>
-              <w:t>………</w:t>
-            </w:r>
-            <w:r>
-              <w:rPr>
-                <w:rFonts w:ascii="TH SarabunIT๙" w:eastAsia="Calibri" w:hAnsi="TH SarabunIT๙" w:cs="TH SarabunIT๙"/>
+              <w:t>}{/</w:t>
+            </w:r>
+            <w:proofErr w:type="spellStart"/>
+            <w:r>
+              <w:rPr>
+                <w:rFonts w:ascii="TH SarabunIT๙" w:eastAsia="Calibri" w:hAnsi="TH SarabunIT๙" w:cstheme="minorBidi"/>
                 <w:color w:val="000000"/>
                 <w:sz w:val="32"/>
                 <w:szCs w:val="32"/>
-                <w:cs/>
-              </w:rPr>
-              <w:t>...</w:t>
-            </w:r>
-          </w:p>
-        </w:tc>
-        <w:tc>
-          <w:tcPr>
-            <w:tcW w:w="2520" w:type="dxa"/>
-          </w:tcPr>
-          <w:p>
-            <w:pPr>
-              <w:spacing w:after="0" w:line="240" w:lineRule="auto"/>
-              <w:rPr>
-                <w:rFonts w:ascii="TH SarabunIT๙" w:eastAsia="Calibri" w:hAnsi="TH SarabunIT๙" w:cs="TH SarabunIT๙"/>
+              </w:rPr>
+              <w:t>budgetsByYe</w:t>
+            </w:r>
+            <w:r>
+              <w:rPr>
+                <w:rFonts w:ascii="TH SarabunIT๙" w:eastAsia="Calibri" w:hAnsi="TH SarabunIT๙" w:cstheme="minorBidi"/>
                 <w:color w:val="000000"/>
                 <w:sz w:val="32"/>
                 <w:szCs w:val="32"/>
               </w:rPr>
-            </w:pPr>
-          </w:p>
-        </w:tc>
-        <w:tc>
-          <w:tcPr>
-            <w:tcW w:w="4107" w:type="dxa"/>
-          </w:tcPr>
-          <w:p>
-            <w:pPr>
-              <w:spacing w:after="0" w:line="240" w:lineRule="auto"/>
-              <w:rPr>
-                <w:rFonts w:ascii="TH SarabunIT๙" w:eastAsia="Calibri" w:hAnsi="TH SarabunIT๙" w:cs="TH SarabunIT๙"/>
-                <w:color w:val="000000"/>
-                <w:sz w:val="28"/>
-              </w:rPr>
-            </w:pPr>
-            <w:r>
-              <w:rPr>
-                <w:rFonts w:ascii="Segoe UI Symbol" w:eastAsia="Calibri" w:hAnsi="Segoe UI Symbol" w:cs="Segoe UI Symbol" w:hint="cs"/>
-                <w:color w:val="000000"/>
-                <w:sz w:val="28"/>
-                <w:cs/>
-              </w:rPr>
-              <w:t>☐</w:t>
-            </w:r>
-            <w:r>
-              <w:rPr>
-                <w:rFonts w:ascii="TH SarabunIT๙" w:eastAsia="Calibri" w:hAnsi="TH SarabunIT๙" w:cs="TH SarabunIT๙"/>
-                <w:color w:val="000000"/>
-                <w:sz w:val="28"/>
-                <w:cs/>
-              </w:rPr>
-              <w:t>งบประมาณรายจ่ายประจำปี</w:t>
-            </w:r>
-            <w:r>
-              <w:rPr>
-                <w:rFonts w:ascii="TH SarabunIT๙" w:eastAsia="Calibri" w:hAnsi="TH SarabunIT๙" w:cs="TH SarabunIT๙"/>
-                <w:color w:val="000000"/>
-                <w:sz w:val="28"/>
-              </w:rPr>
-              <w:t xml:space="preserve"> </w:t>
-            </w:r>
-            <w:r>
-              <w:rPr>
-                <w:rFonts w:ascii="TH SarabunIT๙" w:eastAsia="Calibri" w:hAnsi="TH SarabunIT๙" w:cs="TH SarabunIT๙"/>
-                <w:color w:val="000000"/>
-                <w:sz w:val="28"/>
-              </w:rPr>
-              <w:t xml:space="preserve">     </w:t>
-            </w:r>
-            <w:r>
-              <w:rPr>
-                <w:rFonts w:ascii="Segoe UI Symbol" w:eastAsia="Calibri" w:hAnsi="Segoe UI Symbol" w:cs="Segoe UI Symbol" w:hint="cs"/>
-                <w:color w:val="000000"/>
-                <w:sz w:val="28"/>
-                <w:cs/>
-              </w:rPr>
-              <w:t>☐</w:t>
-            </w:r>
-            <w:r>
-              <w:rPr>
-                <w:rFonts w:ascii="TH SarabunIT๙" w:eastAsia="Calibri" w:hAnsi="TH SarabunIT๙" w:cs="TH SarabunIT๙"/>
-                <w:color w:val="000000"/>
-                <w:sz w:val="28"/>
-                <w:cs/>
-              </w:rPr>
-              <w:t xml:space="preserve"> งบกลาง</w:t>
-            </w:r>
-          </w:p>
-          <w:p>
-            <w:pPr>
-              <w:spacing w:after="0" w:line="240" w:lineRule="auto"/>
-              <w:rPr>
-                <w:rFonts w:ascii="TH SarabunIT๙" w:eastAsia="Calibri" w:hAnsi="TH SarabunIT๙" w:cs="TH SarabunIT๙"/>
-                <w:color w:val="000000"/>
-                <w:sz w:val="28"/>
-              </w:rPr>
-            </w:pPr>
-            <w:r>
-              <w:rPr>
-                <w:rFonts w:ascii="Segoe UI Symbol" w:eastAsia="Calibri" w:hAnsi="Segoe UI Symbol" w:cs="Segoe UI Symbol" w:hint="cs"/>
-                <w:color w:val="000000"/>
-                <w:sz w:val="28"/>
-                <w:cs/>
-              </w:rPr>
-              <w:t>☐</w:t>
-            </w:r>
-            <w:r>
-              <w:rPr>
-                <w:rFonts w:ascii="TH SarabunIT๙" w:eastAsia="Calibri" w:hAnsi="TH SarabunIT๙" w:cs="TH SarabunIT๙"/>
-                <w:color w:val="000000"/>
-                <w:sz w:val="28"/>
-              </w:rPr>
-              <w:t xml:space="preserve"> </w:t>
-            </w:r>
-            <w:r>
-              <w:rPr>
-                <w:rFonts w:ascii="TH SarabunIT๙" w:eastAsia="Calibri" w:hAnsi="TH SarabunIT๙" w:cs="TH SarabunIT๙"/>
-                <w:color w:val="000000"/>
-                <w:sz w:val="28"/>
-                <w:cs/>
-              </w:rPr>
-              <w:t>งบประมาณรายจ่ายประจำปี (เพิ่มเติม)</w:t>
-            </w:r>
-          </w:p>
-          <w:p>
-            <w:pPr>
-              <w:spacing w:after="0" w:line="240" w:lineRule="auto"/>
-              <w:rPr>
-                <w:rFonts w:ascii="TH SarabunIT๙" w:eastAsia="Calibri" w:hAnsi="TH SarabunIT๙" w:cs="TH SarabunIT๙"/>
+              <w:t>ar</w:t>
+            </w:r>
+            <w:proofErr w:type="spellEnd"/>
+            <w:r>
+              <w:rPr>
+                <w:rFonts w:ascii="TH SarabunIT๙" w:eastAsia="Calibri" w:hAnsi="TH SarabunIT๙" w:cstheme="minorBidi"/>
                 <w:color w:val="000000"/>
                 <w:sz w:val="32"/>
                 <w:szCs w:val="32"/>
               </w:rPr>
-            </w:pPr>
-            <w:r>
-              <w:rPr>
-                <w:rFonts w:ascii="Segoe UI Symbol" w:eastAsia="Calibri" w:hAnsi="Segoe UI Symbol" w:cs="Segoe UI Symbol" w:hint="cs"/>
-                <w:color w:val="000000"/>
-                <w:sz w:val="28"/>
-                <w:cs/>
-              </w:rPr>
-              <w:t>☐</w:t>
-            </w:r>
-            <w:r>
-              <w:rPr>
-                <w:rFonts w:ascii="TH SarabunIT๙" w:eastAsia="Calibri" w:hAnsi="TH SarabunIT๙" w:cs="TH SarabunIT๙"/>
-                <w:color w:val="000000"/>
-                <w:sz w:val="28"/>
-              </w:rPr>
-              <w:t xml:space="preserve"> </w:t>
-            </w:r>
-            <w:r>
-              <w:rPr>
-                <w:rFonts w:ascii="TH SarabunIT๙" w:eastAsia="Calibri" w:hAnsi="TH SarabunIT๙" w:cs="TH SarabunIT๙"/>
-                <w:color w:val="000000"/>
-                <w:sz w:val="28"/>
-                <w:cs/>
-              </w:rPr>
-              <w:t xml:space="preserve">งบแปรญัตติ </w:t>
-            </w:r>
-            <w:r>
-              <w:rPr>
-                <w:rFonts w:ascii="TH SarabunIT๙" w:eastAsia="Calibri" w:hAnsi="TH SarabunIT๙" w:cs="TH SarabunIT๙"/>
-                <w:color w:val="000000"/>
-                <w:sz w:val="28"/>
-              </w:rPr>
-              <w:t xml:space="preserve">         </w:t>
-            </w:r>
-            <w:r>
-              <w:rPr>
-                <w:rFonts w:ascii="Segoe UI Symbol" w:eastAsia="Calibri" w:hAnsi="Segoe UI Symbol" w:cs="Segoe UI Symbol" w:hint="cs"/>
-                <w:color w:val="000000"/>
-                <w:sz w:val="28"/>
-                <w:cs/>
-              </w:rPr>
-              <w:t>☐</w:t>
-            </w:r>
-            <w:r>
-              <w:rPr>
-                <w:rFonts w:ascii="TH SarabunIT๙" w:eastAsia="Calibri" w:hAnsi="TH SarabunIT๙" w:cs="TH SarabunIT๙"/>
-                <w:color w:val="000000"/>
-                <w:sz w:val="28"/>
-                <w:cs/>
-              </w:rPr>
-              <w:t xml:space="preserve"> </w:t>
-            </w:r>
-            <w:r>
-              <w:rPr>
-                <w:rFonts w:ascii="TH SarabunIT๙" w:eastAsia="Calibri" w:hAnsi="TH SarabunIT๙" w:cs="TH SarabunIT๙"/>
-                <w:color w:val="000000"/>
-                <w:sz w:val="28"/>
-                <w:cs/>
-              </w:rPr>
-              <w:t>เงินนอกงบประมาณ</w:t>
-            </w:r>
-            <w:r>
-              <w:rPr>
-                <w:rFonts w:ascii="TH SarabunIT๙" w:eastAsia="Calibri" w:hAnsi="TH SarabunIT๙" w:cs="TH SarabunIT๙"/>
-                <w:color w:val="000000"/>
-                <w:sz w:val="28"/>
-                <w:cs/>
-              </w:rPr>
-              <w:t xml:space="preserve">     </w:t>
-            </w:r>
-            <w:r>
-              <w:rPr>
-                <w:rFonts w:ascii="Segoe UI Symbol" w:eastAsia="Calibri" w:hAnsi="Segoe UI Symbol" w:cs="Segoe UI Symbol" w:hint="cs"/>
-                <w:color w:val="000000"/>
-                <w:sz w:val="28"/>
-                <w:cs/>
-              </w:rPr>
-              <w:t>☐</w:t>
-            </w:r>
-            <w:r>
-              <w:rPr>
-                <w:rFonts w:ascii="TH SarabunIT๙" w:eastAsia="Calibri" w:hAnsi="TH SarabunIT๙" w:cs="TH SarabunIT๙"/>
-                <w:color w:val="000000"/>
-                <w:sz w:val="28"/>
-                <w:cs/>
-              </w:rPr>
-              <w:t>งบประมาณแผ่นดิน</w:t>
-            </w:r>
-            <w:r>
-              <w:rPr>
-                <w:rFonts w:ascii="TH SarabunIT๙" w:eastAsia="Calibri" w:hAnsi="TH SarabunIT๙" w:cs="TH SarabunIT๙"/>
-                <w:color w:val="000000"/>
-                <w:sz w:val="28"/>
-              </w:rPr>
-              <w:t xml:space="preserve">     </w:t>
-            </w:r>
-            <w:r>
-              <w:rPr>
-                <w:rFonts w:ascii="Segoe UI Symbol" w:eastAsia="Calibri" w:hAnsi="Segoe UI Symbol" w:cs="Segoe UI Symbol" w:hint="cs"/>
-                <w:color w:val="000000"/>
-                <w:sz w:val="28"/>
-                <w:cs/>
-              </w:rPr>
-              <w:t>☐</w:t>
-            </w:r>
-            <w:r>
-              <w:rPr>
-                <w:rFonts w:ascii="TH SarabunIT๙" w:eastAsia="Calibri" w:hAnsi="TH SarabunIT๙" w:cs="TH SarabunIT๙"/>
-                <w:color w:val="000000"/>
-                <w:sz w:val="28"/>
-                <w:cs/>
-              </w:rPr>
-              <w:t xml:space="preserve"> ..............................</w:t>
+              <w:t>}</w:t>
             </w:r>
           </w:p>
         </w:tc>
@@ -3582,7 +3368,6 @@
           <w:szCs w:val="32"/>
           <w:cs/>
         </w:rPr>
-        <w:lastRenderedPageBreak/>
         <w:t> ผ่านการพิจารณา ครั้งที่...................</w:t>
       </w:r>
       <w:r>
@@ -3646,6 +3431,7 @@
           <w:szCs w:val="32"/>
           <w:cs/>
         </w:rPr>
+        <w:lastRenderedPageBreak/>
         <w:t>มติที่ประชุม</w:t>
       </w:r>
       <w:r>
@@ -4425,10 +4211,31 @@
         <w:rPr>
           <w:rFonts w:ascii="TH SarabunIT๙" w:hAnsi="TH SarabunIT๙" w:cs="TH SarabunIT๙"/>
           <w:color w:val="000000"/>
-          <w:sz w:val="40"/>
-          <w:szCs w:val="40"/>
-        </w:rPr>
-        <w:sym w:font="Wingdings" w:char="F0A8"/>
+          <w:sz w:val="32"/>
+          <w:szCs w:val="32"/>
+        </w:rPr>
+        <w:t>{</w:t>
+      </w:r>
+      <w:proofErr w:type="spellStart"/>
+      <w:proofErr w:type="gramStart"/>
+      <w:r>
+        <w:rPr>
+          <w:rFonts w:ascii="TH SarabunIT๙" w:hAnsi="TH SarabunIT๙" w:cs="TH SarabunIT๙"/>
+          <w:color w:val="000000"/>
+          <w:sz w:val="32"/>
+          <w:szCs w:val="32"/>
+        </w:rPr>
+        <w:t>chkNew</w:t>
+      </w:r>
+      <w:proofErr w:type="spellEnd"/>
+      <w:r>
+        <w:rPr>
+          <w:rFonts w:ascii="TH SarabunIT๙" w:hAnsi="TH SarabunIT๙" w:cs="TH SarabunIT๙"/>
+          <w:color w:val="000000"/>
+          <w:sz w:val="32"/>
+          <w:szCs w:val="32"/>
+        </w:rPr>
+        <w:t>}</w:t>
       </w:r>
       <w:r>
         <w:rPr>
@@ -4439,6 +4246,16 @@
           <w:cs/>
         </w:rPr>
         <w:t xml:space="preserve">  เป็นโครงการที่จัดหาใหม่</w:t>
+      </w:r>
+      <w:proofErr w:type="gramEnd"/>
+      <w:r>
+        <w:rPr>
+          <w:rFonts w:ascii="TH SarabunIT๙" w:hAnsi="TH SarabunIT๙" w:cs="TH SarabunIT๙"/>
+          <w:color w:val="000000"/>
+          <w:sz w:val="32"/>
+          <w:szCs w:val="32"/>
+        </w:rPr>
+        <w:tab/>
       </w:r>
     </w:p>
     <w:p>
@@ -4465,10 +4282,31 @@
         <w:rPr>
           <w:rFonts w:ascii="TH SarabunIT๙" w:hAnsi="TH SarabunIT๙" w:cs="TH SarabunIT๙"/>
           <w:color w:val="000000"/>
-          <w:sz w:val="40"/>
-          <w:szCs w:val="40"/>
-        </w:rPr>
-        <w:sym w:font="Wingdings" w:char="F0A8"/>
+          <w:sz w:val="32"/>
+          <w:szCs w:val="32"/>
+        </w:rPr>
+        <w:t>{</w:t>
+      </w:r>
+      <w:proofErr w:type="spellStart"/>
+      <w:proofErr w:type="gramStart"/>
+      <w:r>
+        <w:rPr>
+          <w:rFonts w:ascii="TH SarabunIT๙" w:hAnsi="TH SarabunIT๙" w:cs="TH SarabunIT๙"/>
+          <w:color w:val="000000"/>
+          <w:sz w:val="32"/>
+          <w:szCs w:val="32"/>
+        </w:rPr>
+        <w:t>chkReplace</w:t>
+      </w:r>
+      <w:proofErr w:type="spellEnd"/>
+      <w:r>
+        <w:rPr>
+          <w:rFonts w:ascii="TH SarabunIT๙" w:hAnsi="TH SarabunIT๙" w:cs="TH SarabunIT๙"/>
+          <w:color w:val="000000"/>
+          <w:sz w:val="32"/>
+          <w:szCs w:val="32"/>
+        </w:rPr>
+        <w:t>}</w:t>
       </w:r>
       <w:r>
         <w:rPr>
@@ -4489,6 +4327,7 @@
         </w:rPr>
         <w:t>เป็นโครงการที่ทดแทนระบบเดิม</w:t>
       </w:r>
+      <w:proofErr w:type="gramEnd"/>
     </w:p>
     <w:p>
       <w:pPr>
@@ -4512,10 +4351,31 @@
         <w:rPr>
           <w:rFonts w:ascii="TH SarabunIT๙" w:hAnsi="TH SarabunIT๙" w:cs="TH SarabunIT๙"/>
           <w:color w:val="000000"/>
-          <w:sz w:val="40"/>
-          <w:szCs w:val="40"/>
-        </w:rPr>
-        <w:sym w:font="Wingdings" w:char="F0A8"/>
+          <w:sz w:val="32"/>
+          <w:szCs w:val="32"/>
+        </w:rPr>
+        <w:t>{</w:t>
+      </w:r>
+      <w:proofErr w:type="spellStart"/>
+      <w:proofErr w:type="gramStart"/>
+      <w:r>
+        <w:rPr>
+          <w:rFonts w:ascii="TH SarabunIT๙" w:hAnsi="TH SarabunIT๙" w:cs="TH SarabunIT๙"/>
+          <w:color w:val="000000"/>
+          <w:sz w:val="32"/>
+          <w:szCs w:val="32"/>
+        </w:rPr>
+        <w:t>chkPhase</w:t>
+      </w:r>
+      <w:proofErr w:type="spellEnd"/>
+      <w:r>
+        <w:rPr>
+          <w:rFonts w:ascii="TH SarabunIT๙" w:hAnsi="TH SarabunIT๙" w:cs="TH SarabunIT๙"/>
+          <w:color w:val="000000"/>
+          <w:sz w:val="32"/>
+          <w:szCs w:val="32"/>
+        </w:rPr>
+        <w:t>}</w:t>
       </w:r>
       <w:r>
         <w:rPr>
@@ -4534,7 +4394,18 @@
           <w:szCs w:val="32"/>
           <w:cs/>
         </w:rPr>
-        <w:t>เป็นโครงการต่อเนื่อง (</w:t>
+        <w:t>เป็นโครงการต่อเนื่อง</w:t>
+      </w:r>
+      <w:proofErr w:type="gramEnd"/>
+      <w:r>
+        <w:rPr>
+          <w:rFonts w:ascii="TH SarabunIT๙" w:hAnsi="TH SarabunIT๙" w:cs="TH SarabunIT๙"/>
+          <w:color w:val="000000"/>
+          <w:sz w:val="32"/>
+          <w:szCs w:val="32"/>
+          <w:cs/>
+        </w:rPr>
+        <w:t xml:space="preserve"> (</w:t>
       </w:r>
       <w:r>
         <w:rPr>
@@ -4595,6 +4466,7 @@
         </w:rPr>
         <w:t xml:space="preserve"> </w:t>
       </w:r>
+      <w:proofErr w:type="gramStart"/>
       <w:r>
         <w:rPr>
           <w:rFonts w:ascii="TH SarabunIT๙" w:hAnsi="TH SarabunIT๙" w:cs="TH SarabunIT๙"/>
@@ -4602,6 +4474,7 @@
         </w:rPr>
         <w:t>... )</w:t>
       </w:r>
+      <w:proofErr w:type="gramEnd"/>
     </w:p>
     <w:p>
       <w:pPr>
@@ -4680,11 +4553,11 @@
         <w:tblLook w:val="04A0" w:firstRow="1" w:lastRow="0" w:firstColumn="1" w:lastColumn="0" w:noHBand="0" w:noVBand="1"/>
       </w:tblPr>
       <w:tblGrid>
-        <w:gridCol w:w="2689"/>
-        <w:gridCol w:w="1559"/>
-        <w:gridCol w:w="1276"/>
-        <w:gridCol w:w="2551"/>
-        <w:gridCol w:w="1554"/>
+        <w:gridCol w:w="2913"/>
+        <w:gridCol w:w="1316"/>
+        <w:gridCol w:w="1261"/>
+        <w:gridCol w:w="2853"/>
+        <w:gridCol w:w="1286"/>
       </w:tblGrid>
       <w:tr>
         <w:tc>
@@ -4924,12 +4797,36 @@
               <w:spacing w:after="0" w:line="240" w:lineRule="auto"/>
               <w:rPr>
                 <w:rFonts w:ascii="TH SarabunIT๙" w:hAnsi="TH SarabunIT๙" w:cs="TH SarabunIT๙"/>
-                <w:b/>
-                <w:bCs/>
-                <w:color w:val="000000"/>
-                <w:sz w:val="28"/>
-              </w:rPr>
-            </w:pPr>
+                <w:color w:val="000000"/>
+                <w:sz w:val="28"/>
+              </w:rPr>
+            </w:pPr>
+            <w:r>
+              <w:rPr>
+                <w:rFonts w:ascii="TH SarabunIT๙" w:hAnsi="TH SarabunIT๙" w:cs="TH SarabunIT๙"/>
+                <w:color w:val="000000"/>
+                <w:sz w:val="28"/>
+              </w:rPr>
+              <w:t>{#</w:t>
+            </w:r>
+            <w:proofErr w:type="gramStart"/>
+            <w:r>
+              <w:rPr>
+                <w:rFonts w:ascii="TH SarabunIT๙" w:hAnsi="TH SarabunIT๙" w:cs="TH SarabunIT๙"/>
+                <w:color w:val="000000"/>
+                <w:sz w:val="28"/>
+              </w:rPr>
+              <w:t>relatedProjects}{</w:t>
+            </w:r>
+            <w:proofErr w:type="gramEnd"/>
+            <w:r>
+              <w:rPr>
+                <w:rFonts w:ascii="TH SarabunIT๙" w:hAnsi="TH SarabunIT๙" w:cs="TH SarabunIT๙"/>
+                <w:color w:val="000000"/>
+                <w:sz w:val="28"/>
+              </w:rPr>
+              <w:t>projectName}</w:t>
+            </w:r>
           </w:p>
         </w:tc>
         <w:tc>
@@ -4944,12 +4841,18 @@
               <w:spacing w:after="0" w:line="240" w:lineRule="auto"/>
               <w:rPr>
                 <w:rFonts w:ascii="TH SarabunIT๙" w:hAnsi="TH SarabunIT๙" w:cs="TH SarabunIT๙"/>
-                <w:b/>
-                <w:bCs/>
-                <w:color w:val="000000"/>
-                <w:sz w:val="28"/>
-              </w:rPr>
-            </w:pPr>
+                <w:color w:val="000000"/>
+                <w:sz w:val="28"/>
+              </w:rPr>
+            </w:pPr>
+            <w:r>
+              <w:rPr>
+                <w:rFonts w:ascii="TH SarabunIT๙" w:hAnsi="TH SarabunIT๙" w:cs="TH SarabunIT๙"/>
+                <w:color w:val="000000"/>
+                <w:sz w:val="28"/>
+              </w:rPr>
+              <w:t>{agency}</w:t>
+            </w:r>
           </w:p>
         </w:tc>
         <w:tc>
@@ -4964,12 +4867,36 @@
               <w:spacing w:after="0" w:line="240" w:lineRule="auto"/>
               <w:rPr>
                 <w:rFonts w:ascii="TH SarabunIT๙" w:hAnsi="TH SarabunIT๙" w:cs="TH SarabunIT๙"/>
-                <w:b/>
-                <w:bCs/>
-                <w:color w:val="000000"/>
-                <w:sz w:val="28"/>
-              </w:rPr>
-            </w:pPr>
+                <w:color w:val="000000"/>
+                <w:sz w:val="28"/>
+              </w:rPr>
+            </w:pPr>
+            <w:r>
+              <w:rPr>
+                <w:rFonts w:ascii="TH SarabunIT๙" w:hAnsi="TH SarabunIT๙" w:cs="TH SarabunIT๙"/>
+                <w:color w:val="000000"/>
+                <w:sz w:val="28"/>
+              </w:rPr>
+              <w:t>{</w:t>
+            </w:r>
+            <w:proofErr w:type="spellStart"/>
+            <w:r>
+              <w:rPr>
+                <w:rFonts w:ascii="TH SarabunIT๙" w:hAnsi="TH SarabunIT๙" w:cs="TH SarabunIT๙"/>
+                <w:color w:val="000000"/>
+                <w:sz w:val="28"/>
+              </w:rPr>
+              <w:t>fiscalYear</w:t>
+            </w:r>
+            <w:proofErr w:type="spellEnd"/>
+            <w:r>
+              <w:rPr>
+                <w:rFonts w:ascii="TH SarabunIT๙" w:hAnsi="TH SarabunIT๙" w:cs="TH SarabunIT๙"/>
+                <w:color w:val="000000"/>
+                <w:sz w:val="28"/>
+              </w:rPr>
+              <w:t>}</w:t>
+            </w:r>
           </w:p>
         </w:tc>
         <w:tc>
@@ -4984,12 +4911,54 @@
               <w:spacing w:after="0" w:line="240" w:lineRule="auto"/>
               <w:rPr>
                 <w:rFonts w:ascii="TH SarabunIT๙" w:hAnsi="TH SarabunIT๙" w:cs="TH SarabunIT๙"/>
-                <w:b/>
-                <w:bCs/>
-                <w:color w:val="000000"/>
-                <w:sz w:val="28"/>
-              </w:rPr>
-            </w:pPr>
+                <w:color w:val="000000"/>
+                <w:sz w:val="28"/>
+              </w:rPr>
+            </w:pPr>
+            <w:r>
+              <w:rPr>
+                <w:rFonts w:ascii="TH SarabunIT๙" w:hAnsi="TH SarabunIT๙" w:cs="TH SarabunIT๙"/>
+                <w:color w:val="000000"/>
+                <w:sz w:val="28"/>
+              </w:rPr>
+              <w:t>{</w:t>
+            </w:r>
+            <w:proofErr w:type="spellStart"/>
+            <w:r>
+              <w:rPr>
+                <w:rFonts w:ascii="TH SarabunIT๙" w:hAnsi="TH SarabunIT๙" w:cs="TH SarabunIT๙"/>
+                <w:color w:val="000000"/>
+                <w:sz w:val="28"/>
+              </w:rPr>
+              <w:t>relationType</w:t>
+            </w:r>
+            <w:proofErr w:type="spellEnd"/>
+            <w:r>
+              <w:rPr>
+                <w:rFonts w:ascii="TH SarabunIT๙" w:hAnsi="TH SarabunIT๙" w:cs="TH SarabunIT๙"/>
+                <w:color w:val="000000"/>
+                <w:sz w:val="28"/>
+              </w:rPr>
+              <w:t>}{/</w:t>
+            </w:r>
+            <w:proofErr w:type="spellStart"/>
+            <w:r>
+              <w:rPr>
+                <w:rFonts w:ascii="TH SarabunIT๙" w:hAnsi="TH SarabunIT๙" w:cs="TH SarabunIT๙"/>
+                <w:color w:val="000000"/>
+                <w:sz w:val="28"/>
+              </w:rPr>
+              <w:t>relatedProjects</w:t>
+            </w:r>
+            <w:proofErr w:type="spellEnd"/>
+            <w:r>
+              <w:rPr>
+                <w:rFonts w:ascii="TH SarabunIT๙" w:hAnsi="TH SarabunIT๙" w:cs="TH SarabunIT๙"/>
+                <w:color w:val="000000"/>
+                <w:sz w:val="28"/>
+              </w:rPr>
+              <w:t>}</w:t>
+            </w:r>
           </w:p>
         </w:tc>
         <w:tc>
@@ -5004,318 +4973,34 @@
               <w:spacing w:after="0" w:line="240" w:lineRule="auto"/>
               <w:rPr>
                 <w:rFonts w:ascii="TH SarabunIT๙" w:hAnsi="TH SarabunIT๙" w:cs="TH SarabunIT๙"/>
-                <w:b/>
-                <w:bCs/>
-                <w:color w:val="000000"/>
-                <w:sz w:val="28"/>
-              </w:rPr>
-            </w:pPr>
-          </w:p>
-        </w:tc>
-      </w:tr>
-      <w:tr>
-        <w:tc>
-          <w:tcPr>
-            <w:tcW w:w="2689" w:type="dxa"/>
-          </w:tcPr>
-          <w:p>
-            <w:pPr>
-              <w:tabs>
-                <w:tab w:val="left" w:pos="284"/>
-              </w:tabs>
-              <w:spacing w:after="0" w:line="240" w:lineRule="auto"/>
+                <w:color w:val="000000"/>
+                <w:sz w:val="28"/>
+              </w:rPr>
+            </w:pPr>
+            <w:r>
               <w:rPr>
                 <w:rFonts w:ascii="TH SarabunIT๙" w:hAnsi="TH SarabunIT๙" w:cs="TH SarabunIT๙"/>
-                <w:b/>
-                <w:bCs/>
-                <w:color w:val="000000"/>
-                <w:sz w:val="28"/>
-              </w:rPr>
-            </w:pPr>
-          </w:p>
-        </w:tc>
-        <w:tc>
-          <w:tcPr>
-            <w:tcW w:w="1559" w:type="dxa"/>
-          </w:tcPr>
-          <w:p>
-            <w:pPr>
-              <w:tabs>
-                <w:tab w:val="left" w:pos="284"/>
-              </w:tabs>
-              <w:spacing w:after="0" w:line="240" w:lineRule="auto"/>
+                <w:color w:val="000000"/>
+                <w:sz w:val="28"/>
+              </w:rPr>
+              <w:t>{</w:t>
+            </w:r>
+            <w:r>
               <w:rPr>
                 <w:rFonts w:ascii="TH SarabunIT๙" w:hAnsi="TH SarabunIT๙" w:cs="TH SarabunIT๙"/>
-                <w:b/>
-                <w:bCs/>
-                <w:color w:val="000000"/>
-                <w:sz w:val="28"/>
-              </w:rPr>
-            </w:pPr>
-          </w:p>
-        </w:tc>
-        <w:tc>
-          <w:tcPr>
-            <w:tcW w:w="1276" w:type="dxa"/>
-          </w:tcPr>
-          <w:p>
-            <w:pPr>
-              <w:tabs>
-                <w:tab w:val="left" w:pos="284"/>
-              </w:tabs>
-              <w:spacing w:after="0" w:line="240" w:lineRule="auto"/>
+                <w:color w:val="000000"/>
+                <w:sz w:val="28"/>
+              </w:rPr>
+              <w:t>remark</w:t>
+            </w:r>
+            <w:r>
               <w:rPr>
                 <w:rFonts w:ascii="TH SarabunIT๙" w:hAnsi="TH SarabunIT๙" w:cs="TH SarabunIT๙"/>
-                <w:b/>
-                <w:bCs/>
-                <w:color w:val="000000"/>
-                <w:sz w:val="28"/>
-              </w:rPr>
-            </w:pPr>
-          </w:p>
-        </w:tc>
-        <w:tc>
-          <w:tcPr>
-            <w:tcW w:w="2551" w:type="dxa"/>
-          </w:tcPr>
-          <w:p>
-            <w:pPr>
-              <w:tabs>
-                <w:tab w:val="left" w:pos="284"/>
-              </w:tabs>
-              <w:spacing w:after="0" w:line="240" w:lineRule="auto"/>
-              <w:rPr>
-                <w:rFonts w:ascii="TH SarabunIT๙" w:hAnsi="TH SarabunIT๙" w:cs="TH SarabunIT๙"/>
-                <w:b/>
-                <w:bCs/>
-                <w:color w:val="000000"/>
-                <w:sz w:val="28"/>
-              </w:rPr>
-            </w:pPr>
-          </w:p>
-        </w:tc>
-        <w:tc>
-          <w:tcPr>
-            <w:tcW w:w="1554" w:type="dxa"/>
-          </w:tcPr>
-          <w:p>
-            <w:pPr>
-              <w:tabs>
-                <w:tab w:val="left" w:pos="284"/>
-              </w:tabs>
-              <w:spacing w:after="0" w:line="240" w:lineRule="auto"/>
-              <w:rPr>
-                <w:rFonts w:ascii="TH SarabunIT๙" w:hAnsi="TH SarabunIT๙" w:cs="TH SarabunIT๙"/>
-                <w:b/>
-                <w:bCs/>
-                <w:color w:val="000000"/>
-                <w:sz w:val="28"/>
-              </w:rPr>
-            </w:pPr>
-          </w:p>
-        </w:tc>
-      </w:tr>
-      <w:tr>
-        <w:tc>
-          <w:tcPr>
-            <w:tcW w:w="2689" w:type="dxa"/>
-          </w:tcPr>
-          <w:p>
-            <w:pPr>
-              <w:tabs>
-                <w:tab w:val="left" w:pos="284"/>
-              </w:tabs>
-              <w:spacing w:after="0" w:line="240" w:lineRule="auto"/>
-              <w:rPr>
-                <w:rFonts w:ascii="TH SarabunIT๙" w:hAnsi="TH SarabunIT๙" w:cs="TH SarabunIT๙"/>
-                <w:b/>
-                <w:bCs/>
-                <w:color w:val="000000"/>
-                <w:sz w:val="28"/>
-              </w:rPr>
-            </w:pPr>
-          </w:p>
-        </w:tc>
-        <w:tc>
-          <w:tcPr>
-            <w:tcW w:w="1559" w:type="dxa"/>
-          </w:tcPr>
-          <w:p>
-            <w:pPr>
-              <w:tabs>
-                <w:tab w:val="left" w:pos="284"/>
-              </w:tabs>
-              <w:spacing w:after="0" w:line="240" w:lineRule="auto"/>
-              <w:rPr>
-                <w:rFonts w:ascii="TH SarabunIT๙" w:hAnsi="TH SarabunIT๙" w:cs="TH SarabunIT๙"/>
-                <w:b/>
-                <w:bCs/>
-                <w:color w:val="000000"/>
-                <w:sz w:val="28"/>
-              </w:rPr>
-            </w:pPr>
-          </w:p>
-        </w:tc>
-        <w:tc>
-          <w:tcPr>
-            <w:tcW w:w="1276" w:type="dxa"/>
-          </w:tcPr>
-          <w:p>
-            <w:pPr>
-              <w:tabs>
-                <w:tab w:val="left" w:pos="284"/>
-              </w:tabs>
-              <w:spacing w:after="0" w:line="240" w:lineRule="auto"/>
-              <w:rPr>
-                <w:rFonts w:ascii="TH SarabunIT๙" w:hAnsi="TH SarabunIT๙" w:cs="TH SarabunIT๙"/>
-                <w:b/>
-                <w:bCs/>
-                <w:color w:val="000000"/>
-                <w:sz w:val="28"/>
-              </w:rPr>
-            </w:pPr>
-          </w:p>
-        </w:tc>
-        <w:tc>
-          <w:tcPr>
-            <w:tcW w:w="2551" w:type="dxa"/>
-          </w:tcPr>
-          <w:p>
-            <w:pPr>
-              <w:tabs>
-                <w:tab w:val="left" w:pos="284"/>
-              </w:tabs>
-              <w:spacing w:after="0" w:line="240" w:lineRule="auto"/>
-              <w:rPr>
-                <w:rFonts w:ascii="TH SarabunIT๙" w:hAnsi="TH SarabunIT๙" w:cs="TH SarabunIT๙"/>
-                <w:b/>
-                <w:bCs/>
-                <w:color w:val="000000"/>
-                <w:sz w:val="28"/>
-              </w:rPr>
-            </w:pPr>
-          </w:p>
-        </w:tc>
-        <w:tc>
-          <w:tcPr>
-            <w:tcW w:w="1554" w:type="dxa"/>
-          </w:tcPr>
-          <w:p>
-            <w:pPr>
-              <w:tabs>
-                <w:tab w:val="left" w:pos="284"/>
-              </w:tabs>
-              <w:spacing w:after="0" w:line="240" w:lineRule="auto"/>
-              <w:rPr>
-                <w:rFonts w:ascii="TH SarabunIT๙" w:hAnsi="TH SarabunIT๙" w:cs="TH SarabunIT๙"/>
-                <w:b/>
-                <w:bCs/>
-                <w:color w:val="000000"/>
-                <w:sz w:val="28"/>
-              </w:rPr>
-            </w:pPr>
-          </w:p>
-        </w:tc>
-      </w:tr>
-      <w:tr>
-        <w:tc>
-          <w:tcPr>
-            <w:tcW w:w="2689" w:type="dxa"/>
-          </w:tcPr>
-          <w:p>
-            <w:pPr>
-              <w:tabs>
-                <w:tab w:val="left" w:pos="284"/>
-              </w:tabs>
-              <w:spacing w:after="0" w:line="240" w:lineRule="auto"/>
-              <w:rPr>
-                <w:rFonts w:ascii="TH SarabunIT๙" w:hAnsi="TH SarabunIT๙" w:cs="TH SarabunIT๙"/>
-                <w:b/>
-                <w:bCs/>
-                <w:color w:val="000000"/>
-                <w:sz w:val="28"/>
-              </w:rPr>
-            </w:pPr>
-          </w:p>
-        </w:tc>
-        <w:tc>
-          <w:tcPr>
-            <w:tcW w:w="1559" w:type="dxa"/>
-          </w:tcPr>
-          <w:p>
-            <w:pPr>
-              <w:tabs>
-                <w:tab w:val="left" w:pos="284"/>
-              </w:tabs>
-              <w:spacing w:after="0" w:line="240" w:lineRule="auto"/>
-              <w:rPr>
-                <w:rFonts w:ascii="TH SarabunIT๙" w:hAnsi="TH SarabunIT๙" w:cs="TH SarabunIT๙"/>
-                <w:b/>
-                <w:bCs/>
-                <w:color w:val="000000"/>
-                <w:sz w:val="28"/>
-              </w:rPr>
-            </w:pPr>
-          </w:p>
-        </w:tc>
-        <w:tc>
-          <w:tcPr>
-            <w:tcW w:w="1276" w:type="dxa"/>
-          </w:tcPr>
-          <w:p>
-            <w:pPr>
-              <w:tabs>
-                <w:tab w:val="left" w:pos="284"/>
-              </w:tabs>
-              <w:spacing w:after="0" w:line="240" w:lineRule="auto"/>
-              <w:rPr>
-                <w:rFonts w:ascii="TH SarabunIT๙" w:hAnsi="TH SarabunIT๙" w:cs="TH SarabunIT๙"/>
-                <w:b/>
-                <w:bCs/>
-                <w:color w:val="000000"/>
-                <w:sz w:val="28"/>
-              </w:rPr>
-            </w:pPr>
-          </w:p>
-        </w:tc>
-        <w:tc>
-          <w:tcPr>
-            <w:tcW w:w="2551" w:type="dxa"/>
-          </w:tcPr>
-          <w:p>
-            <w:pPr>
-              <w:tabs>
-                <w:tab w:val="left" w:pos="284"/>
-              </w:tabs>
-              <w:spacing w:after="0" w:line="240" w:lineRule="auto"/>
-              <w:rPr>
-                <w:rFonts w:ascii="TH SarabunIT๙" w:hAnsi="TH SarabunIT๙" w:cs="TH SarabunIT๙"/>
-                <w:b/>
-                <w:bCs/>
-                <w:color w:val="000000"/>
-                <w:sz w:val="28"/>
-              </w:rPr>
-            </w:pPr>
-          </w:p>
-        </w:tc>
-        <w:tc>
-          <w:tcPr>
-            <w:tcW w:w="1554" w:type="dxa"/>
-          </w:tcPr>
-          <w:p>
-            <w:pPr>
-              <w:tabs>
-                <w:tab w:val="left" w:pos="284"/>
-              </w:tabs>
-              <w:spacing w:after="0" w:line="240" w:lineRule="auto"/>
-              <w:rPr>
-                <w:rFonts w:ascii="TH SarabunIT๙" w:hAnsi="TH SarabunIT๙" w:cs="TH SarabunIT๙"/>
-                <w:b/>
-                <w:bCs/>
-                <w:color w:val="000000"/>
-                <w:sz w:val="28"/>
-              </w:rPr>
-            </w:pPr>
+                <w:color w:val="000000"/>
+                <w:sz w:val="28"/>
+              </w:rPr>
+              <w:t>}</w:t>
+            </w:r>
           </w:p>
         </w:tc>
       </w:tr>
@@ -5562,7 +5247,6 @@
           <w:szCs w:val="32"/>
           <w:cs/>
         </w:rPr>
-        <w:lastRenderedPageBreak/>
         <w:t xml:space="preserve"> </w:t>
       </w:r>
     </w:p>
@@ -5651,6 +5335,7 @@
           <w:szCs w:val="32"/>
           <w:cs/>
         </w:rPr>
+        <w:lastRenderedPageBreak/>
         <w:t>โดยรวม (</w:t>
       </w:r>
       <w:r>
@@ -7838,7 +7523,6 @@
           <w:szCs w:val="32"/>
           <w:cs/>
         </w:rPr>
-        <w:lastRenderedPageBreak/>
         <w:t>รหัสนโยบาย</w:t>
       </w:r>
       <w:r>
@@ -7915,6 +7599,7 @@
           <w:sz w:val="32"/>
           <w:szCs w:val="32"/>
         </w:rPr>
+        <w:lastRenderedPageBreak/>
         <w:t>…………………………………………………………………………………………………………………………………</w:t>
       </w:r>
     </w:p>
@@ -9865,6 +9550,7 @@
                 <w:szCs w:val="32"/>
                 <w:cs/>
               </w:rPr>
+              <w:lastRenderedPageBreak/>
               <w:t>งบประมาณที่ขอรับการจัดสรร</w:t>
             </w:r>
           </w:p>
@@ -11736,7 +11422,6 @@
                 <w:sz w:val="24"/>
                 <w:szCs w:val="24"/>
               </w:rPr>
-              <w:lastRenderedPageBreak/>
               <w:sym w:font="Wingdings 2" w:char="F0A3"/>
             </w:r>
             <w:r>
@@ -11891,6 +11576,7 @@
                 <w:sz w:val="24"/>
                 <w:szCs w:val="24"/>
               </w:rPr>
+              <w:lastRenderedPageBreak/>
               <w:sym w:font="Wingdings 2" w:char="F0A3"/>
             </w:r>
             <w:r>
@@ -14152,7 +13838,6 @@
           <w:sz w:val="24"/>
           <w:szCs w:val="24"/>
         </w:rPr>
-        <w:lastRenderedPageBreak/>
         <w:t>(</w:t>
       </w:r>
       <w:r>
@@ -14315,6 +14000,7 @@
           <w:szCs w:val="24"/>
           <w:cs/>
         </w:rPr>
+        <w:lastRenderedPageBreak/>
         <w:tab/>
       </w:r>
       <w:r>
@@ -18619,7 +18305,6 @@
           <w:szCs w:val="32"/>
           <w:cs/>
         </w:rPr>
-        <w:lastRenderedPageBreak/>
         <w:t>หน้าที่ความรับผิดชอบของบุคลากรในแต่ละตำแหน่ง (ในกรณีมีค่าใช้จ่ายบุคลากร)</w:t>
       </w:r>
     </w:p>
@@ -18678,6 +18363,7 @@
                 <w:sz w:val="28"/>
                 <w:cs/>
               </w:rPr>
+              <w:lastRenderedPageBreak/>
               <w:t>ลำดับ</w:t>
             </w:r>
           </w:p>
@@ -21310,7 +20996,6 @@
                 <w:szCs w:val="32"/>
                 <w:cs/>
               </w:rPr>
-              <w:lastRenderedPageBreak/>
               <w:t>(บาท)</w:t>
             </w:r>
           </w:p>
@@ -21342,7 +21027,6 @@
                 <w:szCs w:val="32"/>
                 <w:cs/>
               </w:rPr>
-              <w:lastRenderedPageBreak/>
               <w:t xml:space="preserve">รวม </w:t>
             </w:r>
           </w:p>
@@ -21369,7 +21053,6 @@
                 <w:szCs w:val="32"/>
                 <w:cs/>
               </w:rPr>
-              <w:lastRenderedPageBreak/>
               <w:t>(บาท)</w:t>
             </w:r>
           </w:p>
@@ -21402,7 +21085,6 @@
                 <w:szCs w:val="32"/>
                 <w:cs/>
               </w:rPr>
-              <w:lastRenderedPageBreak/>
               <w:t>หมายเหตุ</w:t>
             </w:r>
           </w:p>
@@ -23055,7 +22737,6 @@
           <w:sz w:val="32"/>
           <w:szCs w:val="32"/>
         </w:rPr>
-        <w:lastRenderedPageBreak/>
         <w:t>e-Mail</w:t>
       </w:r>
       <w:r>
@@ -23089,6 +22770,7 @@
           <w:szCs w:val="32"/>
           <w:cs/>
         </w:rPr>
+        <w:lastRenderedPageBreak/>
         <w:tab/>
       </w:r>
       <w:r>
@@ -26377,7 +26059,6 @@
   <w:style w:type="character" w:default="1" w:styleId="DefaultParagraphFont">
     <w:name w:val="Default Paragraph Font"/>
     <w:uiPriority w:val="1"/>
-    <w:semiHidden/>
     <w:unhideWhenUsed/>
   </w:style>
   <w:style w:type="table" w:default="1" w:styleId="TableNormal">

</xml_diff>

<commit_message>
feat: implement enhanced project proposal structure with dynamic fields and rich text areas
</commit_message>
<xml_diff>
--- a/public/templates/project-proposal.docx
+++ b/public/templates/project-proposal.docx
@@ -5656,7 +5656,6 @@
           <w:color w:val="000000"/>
           <w:sz w:val="32"/>
           <w:szCs w:val="32"/>
-          <w:cs/>
         </w:rPr>
       </w:pPr>
     </w:p>
@@ -7190,18 +7189,39 @@
         <w:rPr>
           <w:rFonts w:ascii="TH SarabunIT๙" w:hAnsi="TH SarabunIT๙" w:cs="TH SarabunIT๙"/>
           <w:color w:val="000000"/>
-          <w:sz w:val="32"/>
-          <w:szCs w:val="32"/>
-        </w:rPr>
-      </w:pPr>
-      <w:r>
-        <w:rPr>
-          <w:rFonts w:ascii="TH SarabunIT๙" w:hAnsi="TH SarabunIT๙" w:cs="TH SarabunIT๙"/>
-          <w:color w:val="000000"/>
           <w:sz w:val="40"/>
           <w:szCs w:val="40"/>
         </w:rPr>
-        <w:sym w:font="Wingdings" w:char="F0A8"/>
+      </w:pPr>
+      <w:r>
+        <w:rPr>
+          <w:rFonts w:ascii="TH SarabunIT๙" w:hAnsi="TH SarabunIT๙" w:cs="TH SarabunIT๙"/>
+          <w:color w:val="000000"/>
+          <w:sz w:val="40"/>
+          <w:szCs w:val="40"/>
+        </w:rPr>
+        <w:t>{</w:t>
+      </w:r>
+      <w:proofErr w:type="spellStart"/>
+      <w:proofErr w:type="gramStart"/>
+      <w:r>
+        <w:rPr>
+          <w:rFonts w:ascii="TH SarabunIT๙" w:hAnsi="TH SarabunIT๙" w:cs="TH SarabunIT๙"/>
+          <w:color w:val="000000"/>
+          <w:sz w:val="40"/>
+          <w:szCs w:val="40"/>
+        </w:rPr>
+        <w:t>chkBma</w:t>
+      </w:r>
+      <w:proofErr w:type="spellEnd"/>
+      <w:r>
+        <w:rPr>
+          <w:rFonts w:ascii="TH SarabunIT๙" w:hAnsi="TH SarabunIT๙" w:cs="TH SarabunIT๙"/>
+          <w:color w:val="000000"/>
+          <w:sz w:val="40"/>
+          <w:szCs w:val="40"/>
+        </w:rPr>
+        <w:t>}</w:t>
       </w:r>
       <w:r>
         <w:rPr>
@@ -7222,6 +7242,7 @@
         </w:rPr>
         <w:t>บรรจุในแผนปฏิบัติราชการกรุงเทพมหานครประจำปี</w:t>
       </w:r>
+      <w:proofErr w:type="gramEnd"/>
     </w:p>
     <w:p>
       <w:pPr>
@@ -7230,27 +7251,49 @@
         <w:jc w:val="thaiDistribute"/>
         <w:rPr>
           <w:rFonts w:ascii="TH SarabunIT๙" w:hAnsi="TH SarabunIT๙" w:cs="TH SarabunIT๙"/>
-          <w:sz w:val="32"/>
-          <w:szCs w:val="32"/>
-        </w:rPr>
-      </w:pPr>
-      <w:r>
-        <w:rPr>
-          <w:rFonts w:ascii="TH SarabunIT๙" w:hAnsi="TH SarabunIT๙" w:cs="TH SarabunIT๙"/>
-          <w:color w:val="000000"/>
-          <w:sz w:val="32"/>
-          <w:szCs w:val="32"/>
-        </w:rPr>
-        <w:tab/>
-      </w:r>
-      <w:r>
-        <w:rPr>
-          <w:rFonts w:ascii="TH SarabunIT๙" w:hAnsi="TH SarabunIT๙" w:cs="TH SarabunIT๙"/>
           <w:color w:val="000000"/>
           <w:sz w:val="40"/>
           <w:szCs w:val="40"/>
         </w:rPr>
-        <w:sym w:font="Wingdings" w:char="F0A8"/>
+      </w:pPr>
+      <w:r>
+        <w:rPr>
+          <w:rFonts w:ascii="TH SarabunIT๙" w:hAnsi="TH SarabunIT๙" w:cs="TH SarabunIT๙"/>
+          <w:color w:val="000000"/>
+          <w:sz w:val="32"/>
+          <w:szCs w:val="32"/>
+        </w:rPr>
+        <w:tab/>
+      </w:r>
+      <w:r>
+        <w:rPr>
+          <w:rFonts w:ascii="TH SarabunIT๙" w:hAnsi="TH SarabunIT๙" w:cs="TH SarabunIT๙"/>
+          <w:color w:val="000000"/>
+          <w:sz w:val="40"/>
+          <w:szCs w:val="40"/>
+        </w:rPr>
+        <w:t>{</w:t>
+      </w:r>
+      <w:proofErr w:type="spellStart"/>
+      <w:proofErr w:type="gramStart"/>
+      <w:r>
+        <w:rPr>
+          <w:rFonts w:ascii="TH SarabunIT๙" w:hAnsi="TH SarabunIT๙" w:cs="TH SarabunIT๙"/>
+          <w:color w:val="000000"/>
+          <w:sz w:val="40"/>
+          <w:szCs w:val="40"/>
+        </w:rPr>
+        <w:t>chkAgency</w:t>
+      </w:r>
+      <w:proofErr w:type="spellEnd"/>
+      <w:r>
+        <w:rPr>
+          <w:rFonts w:ascii="TH SarabunIT๙" w:hAnsi="TH SarabunIT๙" w:cs="TH SarabunIT๙"/>
+          <w:color w:val="000000"/>
+          <w:sz w:val="40"/>
+          <w:szCs w:val="40"/>
+        </w:rPr>
+        <w:t>}</w:t>
       </w:r>
       <w:r>
         <w:rPr>
@@ -7270,6 +7313,7 @@
         </w:rPr>
         <w:t>บรรจุในแผนปฏิบัติราชการประจำปีของหน่วยงาน</w:t>
       </w:r>
+      <w:proofErr w:type="gramEnd"/>
     </w:p>
     <w:p>
       <w:pPr>
@@ -7340,17 +7384,39 @@
           <w:sz w:val="32"/>
           <w:szCs w:val="32"/>
         </w:rPr>
-        <w:t>………………………………</w:t>
-      </w:r>
-      <w:r>
-        <w:rPr>
-          <w:rFonts w:ascii="TH SarabunIT๙" w:hAnsi="TH SarabunIT๙" w:cs="TH SarabunIT๙" w:hint="cs"/>
-          <w:color w:val="000000"/>
-          <w:sz w:val="32"/>
-          <w:szCs w:val="32"/>
-          <w:cs/>
-        </w:rPr>
-        <w:t>......</w:t>
+        <w:t xml:space="preserve"> </w:t>
+      </w:r>
+      <w:r>
+        <w:rPr>
+          <w:rFonts w:ascii="TH SarabunIT๙" w:hAnsi="TH SarabunIT๙" w:cs="TH SarabunIT๙"/>
+          <w:color w:val="000000"/>
+          <w:sz w:val="32"/>
+          <w:szCs w:val="32"/>
+          <w:u w:val="dotted"/>
+        </w:rPr>
+        <w:t>{</w:t>
+      </w:r>
+      <w:proofErr w:type="spellStart"/>
+      <w:r>
+        <w:rPr>
+          <w:rFonts w:ascii="TH SarabunIT๙" w:hAnsi="TH SarabunIT๙" w:cs="TH SarabunIT๙"/>
+          <w:color w:val="000000"/>
+          <w:sz w:val="32"/>
+          <w:szCs w:val="32"/>
+          <w:u w:val="dotted"/>
+        </w:rPr>
+        <w:t>agencyStrategy</w:t>
+      </w:r>
+      <w:proofErr w:type="spellEnd"/>
+      <w:r>
+        <w:rPr>
+          <w:rFonts w:ascii="TH SarabunIT๙" w:hAnsi="TH SarabunIT๙" w:cs="TH SarabunIT๙"/>
+          <w:color w:val="000000"/>
+          <w:sz w:val="32"/>
+          <w:szCs w:val="32"/>
+          <w:u w:val="dotted"/>
+        </w:rPr>
+        <w:t>}</w:t>
       </w:r>
     </w:p>
     <w:p>
@@ -7382,37 +7448,39 @@
           <w:sz w:val="32"/>
           <w:szCs w:val="32"/>
         </w:rPr>
-        <w:t>………………………………</w:t>
-      </w:r>
-      <w:r>
-        <w:rPr>
-          <w:rFonts w:ascii="TH SarabunIT๙" w:hAnsi="TH SarabunIT๙" w:cs="TH SarabunIT๙" w:hint="cs"/>
-          <w:color w:val="000000"/>
-          <w:sz w:val="32"/>
-          <w:szCs w:val="32"/>
-          <w:cs/>
-        </w:rPr>
-        <w:t>.....................................................</w:t>
-      </w:r>
-      <w:r>
-        <w:rPr>
-          <w:rFonts w:ascii="TH SarabunIT๙" w:hAnsi="TH SarabunIT๙" w:cs="TH SarabunIT๙" w:hint="cs"/>
-          <w:color w:val="000000"/>
-          <w:sz w:val="32"/>
-          <w:szCs w:val="32"/>
-          <w:cs/>
-        </w:rPr>
-        <w:t>.</w:t>
-      </w:r>
-      <w:r>
-        <w:rPr>
-          <w:rFonts w:ascii="TH SarabunIT๙" w:hAnsi="TH SarabunIT๙" w:cs="TH SarabunIT๙" w:hint="cs"/>
-          <w:color w:val="000000"/>
-          <w:sz w:val="32"/>
-          <w:szCs w:val="32"/>
-          <w:cs/>
-        </w:rPr>
-        <w:t>...........................</w:t>
+        <w:t xml:space="preserve"> </w:t>
+      </w:r>
+      <w:r>
+        <w:rPr>
+          <w:rFonts w:ascii="TH SarabunIT๙" w:hAnsi="TH SarabunIT๙" w:cs="TH SarabunIT๙"/>
+          <w:color w:val="000000"/>
+          <w:sz w:val="32"/>
+          <w:szCs w:val="32"/>
+          <w:u w:val="dotted"/>
+        </w:rPr>
+        <w:t>{</w:t>
+      </w:r>
+      <w:proofErr w:type="spellStart"/>
+      <w:r>
+        <w:rPr>
+          <w:rFonts w:ascii="TH SarabunIT๙" w:hAnsi="TH SarabunIT๙" w:cs="TH SarabunIT๙"/>
+          <w:color w:val="000000"/>
+          <w:sz w:val="32"/>
+          <w:szCs w:val="32"/>
+          <w:u w:val="dotted"/>
+        </w:rPr>
+        <w:t>agencyIssue</w:t>
+      </w:r>
+      <w:proofErr w:type="spellEnd"/>
+      <w:r>
+        <w:rPr>
+          <w:rFonts w:ascii="TH SarabunIT๙" w:hAnsi="TH SarabunIT๙" w:cs="TH SarabunIT๙"/>
+          <w:color w:val="000000"/>
+          <w:sz w:val="32"/>
+          <w:szCs w:val="32"/>
+          <w:u w:val="dotted"/>
+        </w:rPr>
+        <w:t>}</w:t>
       </w:r>
     </w:p>
     <w:p>
@@ -7445,27 +7513,39 @@
           <w:szCs w:val="32"/>
           <w:cs/>
         </w:rPr>
-        <w:t>.............................................................</w:t>
-      </w:r>
-      <w:r>
-        <w:rPr>
-          <w:rFonts w:ascii="TH SarabunIT๙" w:hAnsi="TH SarabunIT๙" w:cs="TH SarabunIT๙" w:hint="cs"/>
-          <w:color w:val="000000"/>
-          <w:sz w:val="32"/>
-          <w:szCs w:val="32"/>
-          <w:cs/>
-        </w:rPr>
-        <w:t>.</w:t>
-      </w:r>
-      <w:r>
-        <w:rPr>
-          <w:rFonts w:ascii="TH SarabunIT๙" w:hAnsi="TH SarabunIT๙" w:cs="TH SarabunIT๙" w:hint="cs"/>
-          <w:color w:val="000000"/>
-          <w:sz w:val="32"/>
-          <w:szCs w:val="32"/>
-          <w:cs/>
-        </w:rPr>
-        <w:t>........................</w:t>
+        <w:t xml:space="preserve"> </w:t>
+      </w:r>
+      <w:r>
+        <w:rPr>
+          <w:rFonts w:ascii="TH SarabunIT๙" w:hAnsi="TH SarabunIT๙" w:cs="TH SarabunIT๙"/>
+          <w:color w:val="000000"/>
+          <w:sz w:val="32"/>
+          <w:szCs w:val="32"/>
+          <w:u w:val="dotted"/>
+        </w:rPr>
+        <w:t>{</w:t>
+      </w:r>
+      <w:proofErr w:type="spellStart"/>
+      <w:r>
+        <w:rPr>
+          <w:rFonts w:ascii="TH SarabunIT๙" w:hAnsi="TH SarabunIT๙" w:cs="TH SarabunIT๙"/>
+          <w:color w:val="000000"/>
+          <w:sz w:val="32"/>
+          <w:szCs w:val="32"/>
+          <w:u w:val="dotted"/>
+        </w:rPr>
+        <w:t>agencyKpi</w:t>
+      </w:r>
+      <w:proofErr w:type="spellEnd"/>
+      <w:r>
+        <w:rPr>
+          <w:rFonts w:ascii="TH SarabunIT๙" w:hAnsi="TH SarabunIT๙" w:cs="TH SarabunIT๙"/>
+          <w:color w:val="000000"/>
+          <w:sz w:val="32"/>
+          <w:szCs w:val="32"/>
+          <w:u w:val="dotted"/>
+        </w:rPr>
+        <w:t>}</w:t>
       </w:r>
     </w:p>
     <w:p>
@@ -7475,17 +7555,36 @@
         <w:jc w:val="thaiDistribute"/>
         <w:rPr>
           <w:rFonts w:ascii="TH SarabunIT๙" w:hAnsi="TH SarabunIT๙" w:cs="TH SarabunIT๙"/>
-          <w:sz w:val="32"/>
-          <w:szCs w:val="32"/>
-        </w:rPr>
-      </w:pPr>
-      <w:r>
-        <w:rPr>
-          <w:rFonts w:ascii="TH SarabunIT๙" w:hAnsi="TH SarabunIT๙" w:cs="TH SarabunIT๙"/>
           <w:sz w:val="40"/>
           <w:szCs w:val="40"/>
         </w:rPr>
-        <w:sym w:font="Wingdings" w:char="F0A8"/>
+      </w:pPr>
+      <w:r>
+        <w:rPr>
+          <w:rFonts w:ascii="TH SarabunIT๙" w:hAnsi="TH SarabunIT๙" w:cs="TH SarabunIT๙"/>
+          <w:sz w:val="40"/>
+          <w:szCs w:val="40"/>
+        </w:rPr>
+        <w:t>{</w:t>
+      </w:r>
+      <w:proofErr w:type="spellStart"/>
+      <w:proofErr w:type="gramStart"/>
+      <w:r>
+        <w:rPr>
+          <w:rFonts w:ascii="TH SarabunIT๙" w:hAnsi="TH SarabunIT๙" w:cs="TH SarabunIT๙"/>
+          <w:sz w:val="40"/>
+          <w:szCs w:val="40"/>
+        </w:rPr>
+        <w:t>chkGov</w:t>
+      </w:r>
+      <w:proofErr w:type="spellEnd"/>
+      <w:r>
+        <w:rPr>
+          <w:rFonts w:ascii="TH SarabunIT๙" w:hAnsi="TH SarabunIT๙" w:cs="TH SarabunIT๙"/>
+          <w:sz w:val="40"/>
+          <w:szCs w:val="40"/>
+        </w:rPr>
+        <w:t>}</w:t>
       </w:r>
       <w:r>
         <w:rPr>
@@ -7504,6 +7603,7 @@
         </w:rPr>
         <w:t>เป็นโครงการตามนโยบายผู้ว่าราชการกรุงเทพมหานคร</w:t>
       </w:r>
+      <w:proofErr w:type="gramEnd"/>
     </w:p>
     <w:p>
       <w:pPr>
@@ -7514,6 +7614,7 @@
           <w:rFonts w:ascii="TH SarabunIT๙" w:hAnsi="TH SarabunIT๙" w:cs="TH SarabunIT๙"/>
           <w:sz w:val="32"/>
           <w:szCs w:val="32"/>
+          <w:u w:val="dotted"/>
         </w:rPr>
       </w:pPr>
       <w:r>
@@ -7531,16 +7632,36 @@
           <w:sz w:val="32"/>
           <w:szCs w:val="32"/>
         </w:rPr>
-        <w:t>………………………………</w:t>
-      </w:r>
-      <w:r>
-        <w:rPr>
-          <w:rFonts w:ascii="TH SarabunIT๙" w:hAnsi="TH SarabunIT๙" w:cs="TH SarabunIT๙" w:hint="cs"/>
-          <w:sz w:val="32"/>
-          <w:szCs w:val="32"/>
-          <w:cs/>
-        </w:rPr>
-        <w:t>......</w:t>
+        <w:t xml:space="preserve"> </w:t>
+      </w:r>
+      <w:r>
+        <w:rPr>
+          <w:rFonts w:ascii="TH SarabunIT๙" w:hAnsi="TH SarabunIT๙" w:cs="TH SarabunIT๙"/>
+          <w:sz w:val="32"/>
+          <w:szCs w:val="32"/>
+          <w:u w:val="dotted"/>
+        </w:rPr>
+        <w:t>{</w:t>
+      </w:r>
+      <w:proofErr w:type="spellStart"/>
+      <w:r>
+        <w:rPr>
+          <w:rFonts w:ascii="TH SarabunIT๙" w:hAnsi="TH SarabunIT๙" w:cs="TH SarabunIT๙"/>
+          <w:sz w:val="32"/>
+          <w:szCs w:val="32"/>
+          <w:u w:val="dotted"/>
+        </w:rPr>
+        <w:t>governorPolicyCode</w:t>
+      </w:r>
+      <w:proofErr w:type="spellEnd"/>
+      <w:r>
+        <w:rPr>
+          <w:rFonts w:ascii="TH SarabunIT๙" w:hAnsi="TH SarabunIT๙" w:cs="TH SarabunIT๙"/>
+          <w:sz w:val="32"/>
+          <w:szCs w:val="32"/>
+          <w:u w:val="dotted"/>
+        </w:rPr>
+        <w:t>}</w:t>
       </w:r>
     </w:p>
     <w:p>
@@ -7552,6 +7673,7 @@
           <w:rFonts w:ascii="TH SarabunIT๙" w:hAnsi="TH SarabunIT๙" w:cs="TH SarabunIT๙"/>
           <w:sz w:val="32"/>
           <w:szCs w:val="32"/>
+          <w:u w:val="dotted"/>
         </w:rPr>
       </w:pPr>
       <w:r>
@@ -7569,52 +7691,37 @@
           <w:sz w:val="32"/>
           <w:szCs w:val="32"/>
         </w:rPr>
-        <w:t>………………………………</w:t>
-      </w:r>
-      <w:r>
-        <w:rPr>
-          <w:rFonts w:ascii="TH SarabunIT๙" w:hAnsi="TH SarabunIT๙" w:cs="TH SarabunIT๙" w:hint="cs"/>
-          <w:sz w:val="32"/>
-          <w:szCs w:val="32"/>
-          <w:cs/>
-        </w:rPr>
-        <w:t>..................................................</w:t>
-      </w:r>
-    </w:p>
-    <w:p>
-      <w:pPr>
-        <w:spacing w:after="120" w:line="240" w:lineRule="auto"/>
-        <w:ind w:left="1418" w:firstLine="562"/>
-        <w:jc w:val="thaiDistribute"/>
-        <w:rPr>
-          <w:rFonts w:ascii="TH SarabunIT๙" w:hAnsi="TH SarabunIT๙" w:cs="TH SarabunIT๙"/>
-          <w:sz w:val="32"/>
-          <w:szCs w:val="32"/>
-        </w:rPr>
-      </w:pPr>
-      <w:r>
-        <w:rPr>
-          <w:rFonts w:ascii="TH SarabunIT๙" w:hAnsi="TH SarabunIT๙" w:cs="TH SarabunIT๙"/>
-          <w:color w:val="000000"/>
-          <w:sz w:val="32"/>
-          <w:szCs w:val="32"/>
-        </w:rPr>
-        <w:lastRenderedPageBreak/>
-        <w:t>…………………………………………………………………………………………………………………………………</w:t>
-      </w:r>
-    </w:p>
-    <w:p>
-      <w:pPr>
-        <w:tabs>
-          <w:tab w:val="left" w:pos="284"/>
-        </w:tabs>
-        <w:spacing w:after="0" w:line="240" w:lineRule="auto"/>
-        <w:rPr>
-          <w:rFonts w:ascii="TH SarabunIT๙" w:hAnsi="TH SarabunIT๙" w:cs="TH SarabunIT๙"/>
-          <w:sz w:val="32"/>
-          <w:szCs w:val="32"/>
-        </w:rPr>
-      </w:pPr>
+        <w:t xml:space="preserve"> </w:t>
+      </w:r>
+      <w:r>
+        <w:rPr>
+          <w:rFonts w:ascii="TH SarabunIT๙" w:hAnsi="TH SarabunIT๙" w:cs="TH SarabunIT๙"/>
+          <w:sz w:val="32"/>
+          <w:szCs w:val="32"/>
+          <w:u w:val="dotted"/>
+        </w:rPr>
+        <w:t>{</w:t>
+      </w:r>
+      <w:proofErr w:type="spellStart"/>
+      <w:r>
+        <w:rPr>
+          <w:rFonts w:ascii="TH SarabunIT๙" w:hAnsi="TH SarabunIT๙" w:cs="TH SarabunIT๙"/>
+          <w:sz w:val="32"/>
+          <w:szCs w:val="32"/>
+          <w:u w:val="dotted"/>
+        </w:rPr>
+        <w:t>governorPolicyName</w:t>
+      </w:r>
+      <w:proofErr w:type="spellEnd"/>
+      <w:r>
+        <w:rPr>
+          <w:rFonts w:ascii="TH SarabunIT๙" w:hAnsi="TH SarabunIT๙" w:cs="TH SarabunIT๙"/>
+          <w:sz w:val="32"/>
+          <w:szCs w:val="32"/>
+          <w:u w:val="dotted"/>
+        </w:rPr>
+        <w:t>}</w:t>
+      </w:r>
     </w:p>
     <w:p>
       <w:pPr>
@@ -7636,6 +7743,7 @@
           <w:sz w:val="32"/>
           <w:szCs w:val="32"/>
         </w:rPr>
+        <w:lastRenderedPageBreak/>
         <w:t>7</w:t>
       </w:r>
       <w:r>
@@ -7707,6 +7815,7 @@
           <w:color w:val="000000"/>
           <w:sz w:val="32"/>
           <w:szCs w:val="32"/>
+          <w:u w:val="dotted"/>
         </w:rPr>
       </w:pPr>
       <w:r>
@@ -7725,7 +7834,6 @@
           <w:color w:val="000000"/>
           <w:sz w:val="32"/>
           <w:szCs w:val="32"/>
-          <w:cs/>
         </w:rPr>
         <w:tab/>
       </w:r>
@@ -7735,61 +7843,40 @@
           <w:color w:val="000000"/>
           <w:sz w:val="32"/>
           <w:szCs w:val="32"/>
-          <w:cs/>
         </w:rPr>
         <w:tab/>
-        <w:t>................................................................................................................................</w:t>
-      </w:r>
-      <w:r>
-        <w:rPr>
-          <w:rFonts w:ascii="TH SarabunIT๙" w:hAnsi="TH SarabunIT๙" w:cs="TH SarabunIT๙" w:hint="cs"/>
-          <w:color w:val="000000"/>
-          <w:sz w:val="32"/>
-          <w:szCs w:val="32"/>
-          <w:cs/>
-        </w:rPr>
-        <w:t>.</w:t>
-      </w:r>
-      <w:r>
-        <w:rPr>
-          <w:rFonts w:ascii="TH SarabunIT๙" w:hAnsi="TH SarabunIT๙" w:cs="TH SarabunIT๙"/>
-          <w:color w:val="000000"/>
-          <w:sz w:val="32"/>
-          <w:szCs w:val="32"/>
-          <w:cs/>
-        </w:rPr>
-        <w:t>............................</w:t>
-      </w:r>
-      <w:r>
-        <w:rPr>
-          <w:rFonts w:ascii="TH SarabunIT๙" w:hAnsi="TH SarabunIT๙" w:cs="TH SarabunIT๙"/>
-          <w:color w:val="000000"/>
-          <w:sz w:val="32"/>
-          <w:szCs w:val="32"/>
-        </w:rPr>
-        <w:t xml:space="preserve"> </w:t>
-      </w:r>
-    </w:p>
-    <w:p>
-      <w:pPr>
-        <w:pStyle w:val="ListParagraph"/>
-        <w:spacing w:after="0" w:line="240" w:lineRule="auto"/>
-        <w:ind w:left="709"/>
-        <w:rPr>
-          <w:rFonts w:ascii="TH SarabunIT๙" w:hAnsi="TH SarabunIT๙" w:cs="TH SarabunIT๙"/>
-          <w:color w:val="000000"/>
-          <w:sz w:val="32"/>
-          <w:szCs w:val="32"/>
-        </w:rPr>
-      </w:pPr>
-      <w:r>
-        <w:rPr>
-          <w:rFonts w:ascii="TH SarabunIT๙" w:hAnsi="TH SarabunIT๙" w:cs="TH SarabunIT๙"/>
-          <w:color w:val="000000"/>
-          <w:sz w:val="32"/>
-          <w:szCs w:val="32"/>
-        </w:rPr>
-        <w:t>………………………………………………………………………………………………………………………………………………………………………………………………………………………………………………………………………………………………………………………………………………………………………………………………………………………………………………………………………………</w:t>
+      </w:r>
+      <w:r>
+        <w:rPr>
+          <w:rFonts w:ascii="TH SarabunIT๙" w:hAnsi="TH SarabunIT๙" w:cs="TH SarabunIT๙"/>
+          <w:color w:val="000000"/>
+          <w:sz w:val="32"/>
+          <w:szCs w:val="32"/>
+          <w:u w:val="dotted"/>
+        </w:rPr>
+        <w:t>{</w:t>
+      </w:r>
+      <w:proofErr w:type="spellStart"/>
+      <w:r>
+        <w:rPr>
+          <w:rFonts w:ascii="TH SarabunIT๙" w:hAnsi="TH SarabunIT๙" w:cs="TH SarabunIT๙"/>
+          <w:color w:val="000000"/>
+          <w:sz w:val="32"/>
+          <w:szCs w:val="32"/>
+          <w:u w:val="dotted"/>
+        </w:rPr>
+        <w:t>obstacleLaws</w:t>
+      </w:r>
+      <w:proofErr w:type="spellEnd"/>
+      <w:r>
+        <w:rPr>
+          <w:rFonts w:ascii="TH SarabunIT๙" w:hAnsi="TH SarabunIT๙" w:cs="TH SarabunIT๙"/>
+          <w:color w:val="000000"/>
+          <w:sz w:val="32"/>
+          <w:szCs w:val="32"/>
+          <w:u w:val="dotted"/>
+        </w:rPr>
+        <w:t>}</w:t>
       </w:r>
     </w:p>
     <w:p>
@@ -7932,6 +8019,7 @@
           <w:color w:val="000000"/>
           <w:sz w:val="32"/>
           <w:szCs w:val="32"/>
+          <w:u w:val="dotted"/>
         </w:rPr>
       </w:pPr>
       <w:r>
@@ -7963,79 +8051,38 @@
           <w:cs/>
         </w:rPr>
         <w:tab/>
-        <w:t>.....................................................................................................................................</w:t>
-      </w:r>
-      <w:r>
-        <w:rPr>
-          <w:rFonts w:ascii="TH SarabunIT๙" w:hAnsi="TH SarabunIT๙" w:cs="TH SarabunIT๙" w:hint="cs"/>
-          <w:color w:val="000000"/>
-          <w:sz w:val="32"/>
-          <w:szCs w:val="32"/>
-          <w:cs/>
-        </w:rPr>
-        <w:t>.</w:t>
-      </w:r>
-      <w:r>
-        <w:rPr>
-          <w:rFonts w:ascii="TH SarabunIT๙" w:hAnsi="TH SarabunIT๙" w:cs="TH SarabunIT๙"/>
-          <w:color w:val="000000"/>
-          <w:sz w:val="32"/>
-          <w:szCs w:val="32"/>
-          <w:cs/>
-        </w:rPr>
-        <w:t>.......................</w:t>
-      </w:r>
-      <w:r>
-        <w:rPr>
-          <w:rFonts w:ascii="TH SarabunIT๙" w:hAnsi="TH SarabunIT๙" w:cs="TH SarabunIT๙"/>
-          <w:color w:val="000000"/>
-          <w:sz w:val="32"/>
-          <w:szCs w:val="32"/>
-        </w:rPr>
-        <w:t xml:space="preserve"> </w:t>
-      </w:r>
-    </w:p>
-    <w:p>
-      <w:pPr>
-        <w:pStyle w:val="ListParagraph"/>
-        <w:spacing w:after="0" w:line="240" w:lineRule="auto"/>
-        <w:ind w:left="709"/>
-        <w:rPr>
-          <w:rFonts w:ascii="TH SarabunIT๙" w:hAnsi="TH SarabunIT๙" w:cs="TH SarabunIT๙"/>
-          <w:color w:val="000000"/>
-          <w:sz w:val="32"/>
-          <w:szCs w:val="32"/>
-        </w:rPr>
-      </w:pPr>
-      <w:r>
-        <w:rPr>
-          <w:rFonts w:ascii="TH SarabunIT๙" w:hAnsi="TH SarabunIT๙" w:cs="TH SarabunIT๙"/>
-          <w:color w:val="000000"/>
-          <w:sz w:val="32"/>
-          <w:szCs w:val="32"/>
-        </w:rPr>
-        <w:t>…………………………………………………………………………………………………………………………………………………………………………………………………………………………………………………………………………………………………………………………………………………………………………………………………………………………………………………………………………………………………………………………………………………………………………………………………………………………………………</w:t>
-      </w:r>
-    </w:p>
-    <w:p>
-      <w:pPr>
-        <w:pStyle w:val="ListParagraph"/>
-        <w:spacing w:after="0" w:line="240" w:lineRule="auto"/>
-        <w:ind w:left="709"/>
-        <w:rPr>
-          <w:rFonts w:ascii="TH SarabunIT๙" w:hAnsi="TH SarabunIT๙" w:cs="TH SarabunIT๙"/>
-          <w:sz w:val="32"/>
-          <w:szCs w:val="32"/>
-        </w:rPr>
-      </w:pPr>
-      <w:r>
-        <w:rPr>
-          <w:rFonts w:ascii="TH SarabunIT๙" w:hAnsi="TH SarabunIT๙" w:cs="TH SarabunIT๙"/>
-          <w:color w:val="000000"/>
-          <w:sz w:val="32"/>
-          <w:szCs w:val="32"/>
-        </w:rPr>
-        <w:t>…………………………………………………………………………………………………………………………………………………………</w:t>
+      </w:r>
+      <w:r>
+        <w:rPr>
+          <w:rFonts w:ascii="TH SarabunIT๙" w:hAnsi="TH SarabunIT๙" w:cs="TH SarabunIT๙"/>
+          <w:color w:val="000000"/>
+          <w:sz w:val="32"/>
+          <w:szCs w:val="32"/>
+          <w:u w:val="dotted"/>
+        </w:rPr>
+        <w:t>{</w:t>
+      </w:r>
+      <w:proofErr w:type="spellStart"/>
+      <w:r>
+        <w:rPr>
+          <w:rFonts w:ascii="TH SarabunIT๙" w:hAnsi="TH SarabunIT๙" w:cs="TH SarabunIT๙"/>
+          <w:color w:val="000000"/>
+          <w:sz w:val="32"/>
+          <w:szCs w:val="32"/>
+          <w:u w:val="dotted"/>
+        </w:rPr>
+        <w:t>appArchitecture</w:t>
+      </w:r>
+      <w:proofErr w:type="spellEnd"/>
+      <w:r>
+        <w:rPr>
+          <w:rFonts w:ascii="TH SarabunIT๙" w:hAnsi="TH SarabunIT๙" w:cs="TH SarabunIT๙"/>
+          <w:color w:val="000000"/>
+          <w:sz w:val="32"/>
+          <w:szCs w:val="32"/>
+          <w:u w:val="dotted"/>
+        </w:rPr>
+        <w:t>}</w:t>
       </w:r>
     </w:p>
     <w:p>
@@ -8171,41 +8218,63 @@
     </w:p>
     <w:p>
       <w:pPr>
-        <w:spacing w:after="0" w:line="240" w:lineRule="auto"/>
-        <w:ind w:left="709" w:firstLine="371"/>
-        <w:rPr>
-          <w:rFonts w:ascii="TH SarabunIT๙" w:hAnsi="TH SarabunIT๙" w:cs="TH SarabunIT๙"/>
-          <w:sz w:val="32"/>
-          <w:szCs w:val="32"/>
-        </w:rPr>
-      </w:pPr>
-      <w:r>
-        <w:rPr>
-          <w:rFonts w:ascii="TH SarabunIT๙" w:hAnsi="TH SarabunIT๙" w:cs="TH SarabunIT๙"/>
-          <w:color w:val="000000"/>
-          <w:sz w:val="32"/>
-          <w:szCs w:val="32"/>
-        </w:rPr>
-        <w:t>……………………………………………………………………………………………………………………………………</w:t>
-      </w:r>
-      <w:r>
-        <w:rPr>
-          <w:rFonts w:ascii="TH SarabunIT๙" w:hAnsi="TH SarabunIT๙" w:cs="TH SarabunIT๙" w:hint="cs"/>
-          <w:color w:val="000000"/>
-          <w:sz w:val="32"/>
-          <w:szCs w:val="32"/>
-          <w:cs/>
-        </w:rPr>
-        <w:t>..</w:t>
-      </w:r>
-      <w:r>
-        <w:rPr>
-          <w:rFonts w:ascii="TH SarabunIT๙" w:hAnsi="TH SarabunIT๙" w:cs="TH SarabunIT๙"/>
-          <w:color w:val="000000"/>
-          <w:sz w:val="32"/>
-          <w:szCs w:val="32"/>
-        </w:rPr>
-        <w:t>………………………………………………………………………………………………………………………………………………………………………</w:t>
+        <w:tabs>
+          <w:tab w:val="left" w:pos="284"/>
+          <w:tab w:val="left" w:pos="993"/>
+        </w:tabs>
+        <w:spacing w:before="120" w:after="0" w:line="240" w:lineRule="auto"/>
+        <w:ind w:left="709"/>
+        <w:rPr>
+          <w:rFonts w:ascii="TH SarabunIT๙" w:hAnsi="TH SarabunIT๙" w:cs="TH SarabunIT๙"/>
+          <w:sz w:val="32"/>
+          <w:szCs w:val="32"/>
+          <w:u w:val="dotted"/>
+        </w:rPr>
+      </w:pPr>
+      <w:r>
+        <w:rPr>
+          <w:rFonts w:ascii="TH SarabunIT๙" w:hAnsi="TH SarabunIT๙" w:cs="TH SarabunIT๙"/>
+          <w:sz w:val="32"/>
+          <w:szCs w:val="32"/>
+        </w:rPr>
+        <w:tab/>
+      </w:r>
+      <w:r>
+        <w:rPr>
+          <w:rFonts w:ascii="TH SarabunIT๙" w:hAnsi="TH SarabunIT๙" w:cs="TH SarabunIT๙"/>
+          <w:sz w:val="32"/>
+          <w:szCs w:val="32"/>
+        </w:rPr>
+        <w:tab/>
+      </w:r>
+      <w:r>
+        <w:rPr>
+          <w:rFonts w:ascii="TH SarabunIT๙" w:hAnsi="TH SarabunIT๙" w:cs="TH SarabunIT๙"/>
+          <w:sz w:val="32"/>
+          <w:szCs w:val="32"/>
+          <w:u w:val="dotted"/>
+        </w:rPr>
+        <w:t>{</w:t>
+      </w:r>
+      <w:proofErr w:type="spellStart"/>
+      <w:r>
+        <w:rPr>
+          <w:rFonts w:ascii="TH SarabunIT๙" w:hAnsi="TH SarabunIT๙" w:cs="TH SarabunIT๙"/>
+          <w:sz w:val="32"/>
+          <w:szCs w:val="32"/>
+          <w:u w:val="dotted"/>
+        </w:rPr>
+        <w:t>dataOwner</w:t>
+      </w:r>
+      <w:proofErr w:type="spellEnd"/>
+      <w:r>
+        <w:rPr>
+          <w:rFonts w:ascii="TH SarabunIT๙" w:hAnsi="TH SarabunIT๙" w:cs="TH SarabunIT๙"/>
+          <w:sz w:val="32"/>
+          <w:szCs w:val="32"/>
+          <w:u w:val="dotted"/>
+        </w:rPr>
+        <w:t>}</w:t>
       </w:r>
     </w:p>
     <w:p>
@@ -8247,24 +8316,63 @@
     </w:p>
     <w:p>
       <w:pPr>
-        <w:pStyle w:val="ListParagraph"/>
-        <w:spacing w:after="0" w:line="240" w:lineRule="auto"/>
-        <w:ind w:left="709" w:firstLine="281"/>
-        <w:rPr>
-          <w:rFonts w:ascii="TH SarabunIT๙" w:hAnsi="TH SarabunIT๙" w:cs="TH SarabunIT๙"/>
-          <w:color w:val="000000"/>
-          <w:sz w:val="32"/>
-          <w:szCs w:val="32"/>
-        </w:rPr>
-      </w:pPr>
-      <w:r>
-        <w:rPr>
-          <w:rFonts w:ascii="TH SarabunIT๙" w:hAnsi="TH SarabunIT๙" w:cs="TH SarabunIT๙"/>
-          <w:color w:val="000000"/>
-          <w:sz w:val="32"/>
-          <w:szCs w:val="32"/>
-        </w:rPr>
-        <w:t>………………………………………………………………………………………………………………………………………………………………………………………………………………………………………………………………………………………………………………</w:t>
+        <w:tabs>
+          <w:tab w:val="left" w:pos="284"/>
+          <w:tab w:val="left" w:pos="993"/>
+        </w:tabs>
+        <w:spacing w:before="120" w:after="0" w:line="240" w:lineRule="auto"/>
+        <w:ind w:left="709"/>
+        <w:rPr>
+          <w:rFonts w:ascii="TH SarabunIT๙" w:hAnsi="TH SarabunIT๙" w:cs="TH SarabunIT๙"/>
+          <w:sz w:val="32"/>
+          <w:szCs w:val="32"/>
+          <w:u w:val="dotted"/>
+        </w:rPr>
+      </w:pPr>
+      <w:r>
+        <w:rPr>
+          <w:rFonts w:ascii="TH SarabunIT๙" w:hAnsi="TH SarabunIT๙" w:cs="TH SarabunIT๙"/>
+          <w:sz w:val="32"/>
+          <w:szCs w:val="32"/>
+        </w:rPr>
+        <w:tab/>
+      </w:r>
+      <w:r>
+        <w:rPr>
+          <w:rFonts w:ascii="TH SarabunIT๙" w:hAnsi="TH SarabunIT๙" w:cs="TH SarabunIT๙"/>
+          <w:sz w:val="32"/>
+          <w:szCs w:val="32"/>
+        </w:rPr>
+        <w:tab/>
+      </w:r>
+      <w:r>
+        <w:rPr>
+          <w:rFonts w:ascii="TH SarabunIT๙" w:hAnsi="TH SarabunIT๙" w:cs="TH SarabunIT๙"/>
+          <w:sz w:val="32"/>
+          <w:szCs w:val="32"/>
+          <w:u w:val="dotted"/>
+        </w:rPr>
+        <w:t>{</w:t>
+      </w:r>
+      <w:proofErr w:type="spellStart"/>
+      <w:r>
+        <w:rPr>
+          <w:rFonts w:ascii="TH SarabunIT๙" w:hAnsi="TH SarabunIT๙" w:cs="TH SarabunIT๙"/>
+          <w:sz w:val="32"/>
+          <w:szCs w:val="32"/>
+          <w:u w:val="dotted"/>
+        </w:rPr>
+        <w:t>dataExchangePlan</w:t>
+      </w:r>
+      <w:proofErr w:type="spellEnd"/>
+      <w:r>
+        <w:rPr>
+          <w:rFonts w:ascii="TH SarabunIT๙" w:hAnsi="TH SarabunIT๙" w:cs="TH SarabunIT๙"/>
+          <w:sz w:val="32"/>
+          <w:szCs w:val="32"/>
+          <w:u w:val="dotted"/>
+        </w:rPr>
+        <w:t>}</w:t>
       </w:r>
     </w:p>
     <w:p>
@@ -9550,7 +9658,6 @@
                 <w:szCs w:val="32"/>
                 <w:cs/>
               </w:rPr>
-              <w:lastRenderedPageBreak/>
               <w:t>งบประมาณที่ขอรับการจัดสรร</w:t>
             </w:r>
           </w:p>
@@ -9841,6 +9948,7 @@
                 <w:szCs w:val="32"/>
                 <w:cs/>
               </w:rPr>
+              <w:lastRenderedPageBreak/>
               <w:t>1.</w:t>
             </w:r>
             <w:r>
@@ -11576,7 +11684,6 @@
                 <w:sz w:val="24"/>
                 <w:szCs w:val="24"/>
               </w:rPr>
-              <w:lastRenderedPageBreak/>
               <w:sym w:font="Wingdings 2" w:char="F0A3"/>
             </w:r>
             <w:r>
@@ -11742,7 +11849,6 @@
                 <w:sz w:val="28"/>
                 <w:cs/>
               </w:rPr>
-              <w:lastRenderedPageBreak/>
               <w:t>รวมทั้งสิ้น</w:t>
             </w:r>
           </w:p>
@@ -11959,6 +12065,7 @@
                 <w:sz w:val="28"/>
                 <w:cs/>
               </w:rPr>
+              <w:lastRenderedPageBreak/>
               <w:t>ลำดับ</w:t>
             </w:r>
           </w:p>
@@ -14000,7 +14107,6 @@
           <w:szCs w:val="24"/>
           <w:cs/>
         </w:rPr>
-        <w:lastRenderedPageBreak/>
         <w:tab/>
       </w:r>
       <w:r>
@@ -14374,6 +14480,7 @@
                 <w:szCs w:val="22"/>
                 <w:cs/>
               </w:rPr>
+              <w:lastRenderedPageBreak/>
               <w:t>ลำดับ</w:t>
             </w:r>
           </w:p>
@@ -18363,7 +18470,6 @@
                 <w:sz w:val="28"/>
                 <w:cs/>
               </w:rPr>
-              <w:lastRenderedPageBreak/>
               <w:t>ลำดับ</w:t>
             </w:r>
           </w:p>
@@ -18820,6 +18926,7 @@
           <w:szCs w:val="32"/>
           <w:cs/>
         </w:rPr>
+        <w:lastRenderedPageBreak/>
         <w:t>หลักสูตร ....................................................................................................................................................</w:t>
       </w:r>
     </w:p>
@@ -21724,6 +21831,7 @@
           <w:szCs w:val="32"/>
           <w:cs/>
         </w:rPr>
+        <w:lastRenderedPageBreak/>
         <w:t>๑๐</w:t>
       </w:r>
       <w:r>
@@ -22770,7 +22878,6 @@
           <w:szCs w:val="32"/>
           <w:cs/>
         </w:rPr>
-        <w:lastRenderedPageBreak/>
         <w:tab/>
       </w:r>
       <w:r>

</xml_diff>

<commit_message>
fix: improve sidebar responsiveness feat: implement Step4 (8.1-8.3)
</commit_message>
<xml_diff>
--- a/public/templates/project-proposal.docx
+++ b/public/templates/project-proposal.docx
@@ -153,7 +153,6 @@
         </w:rPr>
         <w:t>๑. ชื่อโครงกา</w:t>
       </w:r>
-      <w:proofErr w:type="spellStart"/>
       <w:r>
         <w:rPr>
           <w:rFonts w:ascii="TH SarabunIT๙" w:hAnsi="TH SarabunIT๙" w:cs="TH SarabunIT๙" w:hint="cs"/>
@@ -162,19 +161,8 @@
           <w:szCs w:val="32"/>
           <w:cs/>
         </w:rPr>
-        <w:t>ห</w:t>
-      </w:r>
-      <w:r>
-        <w:rPr>
-          <w:rFonts w:ascii="TH SarabunIT๙" w:hAnsi="TH SarabunIT๙" w:cs="TH SarabunIT๙"/>
-          <w:color w:val="000000"/>
-          <w:sz w:val="32"/>
-          <w:szCs w:val="32"/>
-          <w:cs/>
-        </w:rPr>
         <w:t>ร</w:t>
       </w:r>
-      <w:proofErr w:type="spellEnd"/>
     </w:p>
     <w:p>
       <w:pPr>
@@ -237,7 +225,7 @@
       <w:pPr>
         <w:spacing w:before="240" w:after="0" w:line="240" w:lineRule="auto"/>
         <w:rPr>
-          <w:rFonts w:ascii="TH SarabunIT๙" w:hAnsi="TH SarabunIT๙" w:cs="TH SarabunIT๙"/>
+          <w:rFonts w:ascii="TH SarabunIT๙" w:hAnsi="TH SarabunIT๙" w:cs="TH SarabunIT๙" w:hint="cs"/>
           <w:color w:val="000000"/>
           <w:sz w:val="32"/>
           <w:szCs w:val="32"/>
@@ -3925,28 +3913,7 @@
       <w:pPr>
         <w:spacing w:after="0" w:line="240" w:lineRule="auto"/>
         <w:rPr>
-          <w:rFonts w:ascii="TH SarabunIT๙" w:hAnsi="TH SarabunIT๙" w:cs="TH SarabunIT๙"/>
-          <w:color w:val="000000"/>
-          <w:sz w:val="32"/>
-          <w:szCs w:val="32"/>
-        </w:rPr>
-      </w:pPr>
-      <w:r>
-        <w:rPr>
-          <w:rFonts w:ascii="TH SarabunIT๙" w:hAnsi="TH SarabunIT๙" w:cs="TH SarabunIT๙"/>
-          <w:color w:val="000000"/>
-          <w:sz w:val="32"/>
-          <w:szCs w:val="32"/>
-          <w:cs/>
-        </w:rPr>
-        <w:t xml:space="preserve"> </w:t>
-      </w:r>
-    </w:p>
-    <w:p>
-      <w:pPr>
-        <w:spacing w:after="0" w:line="240" w:lineRule="auto"/>
-        <w:rPr>
-          <w:rFonts w:ascii="TH SarabunIT๙" w:hAnsi="TH SarabunIT๙" w:cs="TH SarabunIT๙"/>
+          <w:rFonts w:ascii="TH SarabunIT๙" w:hAnsi="TH SarabunIT๙" w:cs="TH SarabunIT๙" w:hint="cs"/>
           <w:color w:val="000000"/>
           <w:sz w:val="32"/>
           <w:szCs w:val="32"/>
@@ -4544,6 +4511,44 @@
           <w:cs/>
         </w:rPr>
         <w:t>ในตาราง</w:t>
+      </w:r>
+    </w:p>
+    <w:p>
+      <w:pPr>
+        <w:spacing w:after="120" w:line="240" w:lineRule="auto"/>
+        <w:rPr>
+          <w:rFonts w:ascii="TH SarabunIT๙" w:hAnsi="TH SarabunIT๙" w:cs="TH SarabunIT๙"/>
+          <w:color w:val="000000"/>
+          <w:sz w:val="32"/>
+          <w:szCs w:val="32"/>
+        </w:rPr>
+      </w:pPr>
+      <w:r>
+        <w:rPr>
+          <w:rFonts w:ascii="TH SarabunIT๙" w:hAnsi="TH SarabunIT๙" w:cs="TH SarabunIT๙"/>
+          <w:color w:val="000000"/>
+          <w:sz w:val="32"/>
+          <w:szCs w:val="32"/>
+        </w:rPr>
+        <w:t>{#</w:t>
+      </w:r>
+      <w:r>
+        <w:rPr>
+          <w:rFonts w:ascii="TH SarabunIT๙" w:hAnsi="TH SarabunIT๙" w:cs="TH SarabunIT๙"/>
+          <w:color w:val="000000"/>
+          <w:sz w:val="32"/>
+          <w:szCs w:val="32"/>
+        </w:rPr>
+        <w:t>hasRelatedProjects</w:t>
+      </w:r>
+      <w:r>
+        <w:rPr>
+          <w:rFonts w:ascii="TH SarabunIT๙" w:hAnsi="TH SarabunIT๙" w:cs="TH SarabunIT๙"/>
+          <w:color w:val="000000"/>
+          <w:sz w:val="32"/>
+          <w:szCs w:val="32"/>
+        </w:rPr>
+        <w:t>}</w:t>
       </w:r>
     </w:p>
     <w:tbl>
@@ -4554,15 +4559,15 @@
       </w:tblPr>
       <w:tblGrid>
         <w:gridCol w:w="2913"/>
-        <w:gridCol w:w="1316"/>
-        <w:gridCol w:w="1261"/>
-        <w:gridCol w:w="2853"/>
-        <w:gridCol w:w="1286"/>
+        <w:gridCol w:w="1115"/>
+        <w:gridCol w:w="1248"/>
+        <w:gridCol w:w="1983"/>
+        <w:gridCol w:w="2370"/>
       </w:tblGrid>
       <w:tr>
         <w:tc>
           <w:tcPr>
-            <w:tcW w:w="2689" w:type="dxa"/>
+            <w:tcW w:w="2913" w:type="dxa"/>
           </w:tcPr>
           <w:p>
             <w:pPr>
@@ -4626,7 +4631,7 @@
         </w:tc>
         <w:tc>
           <w:tcPr>
-            <w:tcW w:w="1559" w:type="dxa"/>
+            <w:tcW w:w="1316" w:type="dxa"/>
           </w:tcPr>
           <w:p>
             <w:pPr>
@@ -4658,7 +4663,7 @@
         </w:tc>
         <w:tc>
           <w:tcPr>
-            <w:tcW w:w="1276" w:type="dxa"/>
+            <w:tcW w:w="1261" w:type="dxa"/>
           </w:tcPr>
           <w:p>
             <w:pPr>
@@ -4690,7 +4695,7 @@
         </w:tc>
         <w:tc>
           <w:tcPr>
-            <w:tcW w:w="2551" w:type="dxa"/>
+            <w:tcW w:w="2853" w:type="dxa"/>
           </w:tcPr>
           <w:p>
             <w:pPr>
@@ -4753,7 +4758,7 @@
         </w:tc>
         <w:tc>
           <w:tcPr>
-            <w:tcW w:w="1554" w:type="dxa"/>
+            <w:tcW w:w="1286" w:type="dxa"/>
           </w:tcPr>
           <w:p>
             <w:pPr>
@@ -4787,7 +4792,7 @@
       <w:tr>
         <w:tc>
           <w:tcPr>
-            <w:tcW w:w="2689" w:type="dxa"/>
+            <w:tcW w:w="2913" w:type="dxa"/>
           </w:tcPr>
           <w:p>
             <w:pPr>
@@ -4831,7 +4836,7 @@
         </w:tc>
         <w:tc>
           <w:tcPr>
-            <w:tcW w:w="1559" w:type="dxa"/>
+            <w:tcW w:w="1316" w:type="dxa"/>
           </w:tcPr>
           <w:p>
             <w:pPr>
@@ -4857,7 +4862,7 @@
         </w:tc>
         <w:tc>
           <w:tcPr>
-            <w:tcW w:w="1276" w:type="dxa"/>
+            <w:tcW w:w="1261" w:type="dxa"/>
           </w:tcPr>
           <w:p>
             <w:pPr>
@@ -4901,7 +4906,7 @@
         </w:tc>
         <w:tc>
           <w:tcPr>
-            <w:tcW w:w="2551" w:type="dxa"/>
+            <w:tcW w:w="2853" w:type="dxa"/>
           </w:tcPr>
           <w:p>
             <w:pPr>
@@ -4939,31 +4944,13 @@
                 <w:color w:val="000000"/>
                 <w:sz w:val="28"/>
               </w:rPr>
-              <w:t>}{/</w:t>
-            </w:r>
-            <w:proofErr w:type="spellStart"/>
-            <w:r>
-              <w:rPr>
-                <w:rFonts w:ascii="TH SarabunIT๙" w:hAnsi="TH SarabunIT๙" w:cs="TH SarabunIT๙"/>
-                <w:color w:val="000000"/>
-                <w:sz w:val="28"/>
-              </w:rPr>
-              <w:t>relatedProjects</w:t>
-            </w:r>
-            <w:proofErr w:type="spellEnd"/>
-            <w:r>
-              <w:rPr>
-                <w:rFonts w:ascii="TH SarabunIT๙" w:hAnsi="TH SarabunIT๙" w:cs="TH SarabunIT๙"/>
-                <w:color w:val="000000"/>
-                <w:sz w:val="28"/>
-              </w:rPr>
               <w:t>}</w:t>
             </w:r>
           </w:p>
         </w:tc>
         <w:tc>
           <w:tcPr>
-            <w:tcW w:w="1554" w:type="dxa"/>
+            <w:tcW w:w="1286" w:type="dxa"/>
           </w:tcPr>
           <w:p>
             <w:pPr>
@@ -5001,10 +4988,227 @@
               </w:rPr>
               <w:t>}</w:t>
             </w:r>
+            <w:r>
+              <w:rPr>
+                <w:rFonts w:ascii="TH SarabunIT๙" w:hAnsi="TH SarabunIT๙" w:cs="TH SarabunIT๙"/>
+                <w:color w:val="000000"/>
+                <w:sz w:val="28"/>
+              </w:rPr>
+              <w:t>{/</w:t>
+            </w:r>
+            <w:proofErr w:type="spellStart"/>
+            <w:r>
+              <w:rPr>
+                <w:rFonts w:ascii="TH SarabunIT๙" w:hAnsi="TH SarabunIT๙" w:cs="TH SarabunIT๙"/>
+                <w:color w:val="000000"/>
+                <w:sz w:val="28"/>
+              </w:rPr>
+              <w:t>relatedProjects</w:t>
+            </w:r>
+            <w:proofErr w:type="spellEnd"/>
+            <w:r>
+              <w:rPr>
+                <w:rFonts w:ascii="TH SarabunIT๙" w:hAnsi="TH SarabunIT๙" w:cs="TH SarabunIT๙"/>
+                <w:color w:val="000000"/>
+                <w:sz w:val="28"/>
+              </w:rPr>
+              <w:t>}</w:t>
+            </w:r>
           </w:p>
         </w:tc>
       </w:tr>
     </w:tbl>
+    <w:p>
+      <w:pPr>
+        <w:tabs>
+          <w:tab w:val="left" w:pos="284"/>
+        </w:tabs>
+        <w:spacing w:before="240" w:after="0" w:line="240" w:lineRule="auto"/>
+        <w:rPr>
+          <w:rFonts w:ascii="TH SarabunIT๙" w:hAnsi="TH SarabunIT๙" w:cs="TH SarabunIT๙"/>
+          <w:color w:val="000000"/>
+          <w:sz w:val="32"/>
+          <w:szCs w:val="32"/>
+        </w:rPr>
+      </w:pPr>
+      <w:r>
+        <w:rPr>
+          <w:rFonts w:ascii="TH SarabunIT๙" w:hAnsi="TH SarabunIT๙" w:cs="TH SarabunIT๙"/>
+          <w:color w:val="000000"/>
+          <w:sz w:val="32"/>
+          <w:szCs w:val="32"/>
+        </w:rPr>
+        <w:t>{/</w:t>
+      </w:r>
+      <w:proofErr w:type="spellStart"/>
+      <w:r>
+        <w:rPr>
+          <w:rFonts w:ascii="TH SarabunIT๙" w:hAnsi="TH SarabunIT๙" w:cs="TH SarabunIT๙"/>
+          <w:color w:val="000000"/>
+          <w:sz w:val="32"/>
+          <w:szCs w:val="32"/>
+        </w:rPr>
+        <w:t>hasRelatedProjects</w:t>
+      </w:r>
+      <w:proofErr w:type="spellEnd"/>
+      <w:r>
+        <w:rPr>
+          <w:rFonts w:ascii="TH SarabunIT๙" w:hAnsi="TH SarabunIT๙" w:cs="TH SarabunIT๙"/>
+          <w:color w:val="000000"/>
+          <w:sz w:val="32"/>
+          <w:szCs w:val="32"/>
+        </w:rPr>
+        <w:t>}</w:t>
+      </w:r>
+    </w:p>
+    <w:p>
+      <w:pPr>
+        <w:tabs>
+          <w:tab w:val="left" w:pos="284"/>
+        </w:tabs>
+        <w:spacing w:before="240" w:after="0" w:line="240" w:lineRule="auto"/>
+        <w:rPr>
+          <w:rFonts w:ascii="TH SarabunIT๙" w:hAnsi="TH SarabunIT๙" w:cs="TH SarabunIT๙"/>
+          <w:color w:val="000000"/>
+          <w:sz w:val="32"/>
+          <w:szCs w:val="32"/>
+        </w:rPr>
+      </w:pPr>
+      <w:r>
+        <w:rPr>
+          <w:rFonts w:ascii="TH SarabunIT๙" w:hAnsi="TH SarabunIT๙" w:cs="TH SarabunIT๙"/>
+          <w:color w:val="000000"/>
+          <w:sz w:val="32"/>
+          <w:szCs w:val="32"/>
+        </w:rPr>
+        <w:t>{^</w:t>
+      </w:r>
+      <w:proofErr w:type="spellStart"/>
+      <w:r>
+        <w:rPr>
+          <w:rFonts w:ascii="TH SarabunIT๙" w:hAnsi="TH SarabunIT๙" w:cs="TH SarabunIT๙"/>
+          <w:color w:val="000000"/>
+          <w:sz w:val="32"/>
+          <w:szCs w:val="32"/>
+        </w:rPr>
+        <w:t>hasRelatedProjects</w:t>
+      </w:r>
+      <w:proofErr w:type="spellEnd"/>
+      <w:r>
+        <w:rPr>
+          <w:rFonts w:ascii="TH SarabunIT๙" w:hAnsi="TH SarabunIT๙" w:cs="TH SarabunIT๙"/>
+          <w:color w:val="000000"/>
+          <w:sz w:val="32"/>
+          <w:szCs w:val="32"/>
+        </w:rPr>
+        <w:t xml:space="preserve">} </w:t>
+      </w:r>
+    </w:p>
+    <w:p>
+      <w:pPr>
+        <w:tabs>
+          <w:tab w:val="left" w:pos="284"/>
+        </w:tabs>
+        <w:spacing w:before="240" w:after="0" w:line="240" w:lineRule="auto"/>
+        <w:jc w:val="center"/>
+        <w:rPr>
+          <w:rFonts w:ascii="TH SarabunIT๙" w:hAnsi="TH SarabunIT๙" w:cs="TH SarabunIT๙"/>
+          <w:color w:val="000000"/>
+          <w:sz w:val="32"/>
+          <w:szCs w:val="32"/>
+        </w:rPr>
+      </w:pPr>
+      <w:r>
+        <w:rPr>
+          <w:rFonts w:ascii="TH SarabunIT๙" w:hAnsi="TH SarabunIT๙" w:cs="TH SarabunIT๙"/>
+          <w:color w:val="000000"/>
+          <w:sz w:val="32"/>
+          <w:szCs w:val="32"/>
+        </w:rPr>
+        <w:t>-</w:t>
+      </w:r>
+      <w:r>
+        <w:rPr>
+          <w:rFonts w:ascii="TH SarabunIT๙" w:hAnsi="TH SarabunIT๙" w:cs="TH SarabunIT๙"/>
+          <w:color w:val="000000"/>
+          <w:sz w:val="32"/>
+          <w:szCs w:val="32"/>
+        </w:rPr>
+        <w:t xml:space="preserve"> </w:t>
+      </w:r>
+      <w:r>
+        <w:rPr>
+          <w:rFonts w:ascii="TH SarabunIT๙" w:hAnsi="TH SarabunIT๙" w:cs="TH SarabunIT๙"/>
+          <w:color w:val="000000"/>
+          <w:sz w:val="32"/>
+          <w:szCs w:val="32"/>
+          <w:cs/>
+        </w:rPr>
+        <w:t>ไม่มี</w:t>
+      </w:r>
+      <w:r>
+        <w:rPr>
+          <w:rFonts w:ascii="TH SarabunIT๙" w:hAnsi="TH SarabunIT๙" w:cs="TH SarabunIT๙" w:hint="cs"/>
+          <w:color w:val="000000"/>
+          <w:sz w:val="32"/>
+          <w:szCs w:val="32"/>
+          <w:cs/>
+        </w:rPr>
+        <w:t xml:space="preserve"> </w:t>
+      </w:r>
+      <w:r>
+        <w:rPr>
+          <w:rFonts w:ascii="TH SarabunIT๙" w:hAnsi="TH SarabunIT๙" w:cs="TH SarabunIT๙"/>
+          <w:color w:val="000000"/>
+          <w:sz w:val="32"/>
+          <w:szCs w:val="32"/>
+        </w:rPr>
+        <w:t>-</w:t>
+      </w:r>
+    </w:p>
+    <w:p>
+      <w:pPr>
+        <w:tabs>
+          <w:tab w:val="left" w:pos="284"/>
+        </w:tabs>
+        <w:spacing w:before="240" w:after="0" w:line="240" w:lineRule="auto"/>
+        <w:rPr>
+          <w:rFonts w:ascii="TH SarabunIT๙" w:hAnsi="TH SarabunIT๙" w:cs="TH SarabunIT๙"/>
+          <w:color w:val="000000"/>
+          <w:sz w:val="32"/>
+          <w:szCs w:val="32"/>
+        </w:rPr>
+      </w:pPr>
+      <w:r>
+        <w:rPr>
+          <w:rFonts w:ascii="TH SarabunIT๙" w:hAnsi="TH SarabunIT๙" w:cs="TH SarabunIT๙"/>
+          <w:color w:val="000000"/>
+          <w:sz w:val="32"/>
+          <w:szCs w:val="32"/>
+        </w:rPr>
+        <w:t>{/</w:t>
+      </w:r>
+      <w:proofErr w:type="spellStart"/>
+      <w:r>
+        <w:rPr>
+          <w:rFonts w:ascii="TH SarabunIT๙" w:hAnsi="TH SarabunIT๙" w:cs="TH SarabunIT๙"/>
+          <w:color w:val="000000"/>
+          <w:sz w:val="32"/>
+          <w:szCs w:val="32"/>
+        </w:rPr>
+        <w:t>hasRelatedProjects</w:t>
+      </w:r>
+      <w:proofErr w:type="spellEnd"/>
+      <w:r>
+        <w:rPr>
+          <w:rFonts w:ascii="TH SarabunIT๙" w:hAnsi="TH SarabunIT๙" w:cs="TH SarabunIT๙"/>
+          <w:color w:val="000000"/>
+          <w:sz w:val="32"/>
+          <w:szCs w:val="32"/>
+        </w:rPr>
+        <w:t>}</w:t>
+      </w:r>
+    </w:p>
     <w:p>
       <w:pPr>
         <w:tabs>
@@ -5066,6 +5270,7 @@
           <w:sz w:val="32"/>
           <w:szCs w:val="32"/>
         </w:rPr>
+        <w:lastRenderedPageBreak/>
         <w:tab/>
       </w:r>
       <w:r>
@@ -5335,7 +5540,6 @@
           <w:szCs w:val="32"/>
           <w:cs/>
         </w:rPr>
-        <w:lastRenderedPageBreak/>
         <w:t>โดยรวม (</w:t>
       </w:r>
       <w:r>
@@ -5628,6 +5832,113 @@
           <w:szCs w:val="32"/>
         </w:rPr>
       </w:pPr>
+      <w:r>
+        <w:rPr>
+          <w:rFonts w:ascii="TH SarabunIT๙" w:hAnsi="TH SarabunIT๙" w:cs="TH SarabunIT๙"/>
+          <w:color w:val="000000"/>
+          <w:sz w:val="32"/>
+          <w:szCs w:val="32"/>
+          <w:cs/>
+        </w:rPr>
+        <w:tab/>
+      </w:r>
+      <w:r>
+        <w:rPr>
+          <w:rFonts w:ascii="TH SarabunIT๙" w:hAnsi="TH SarabunIT๙" w:cs="TH SarabunIT๙"/>
+          <w:color w:val="000000"/>
+          <w:sz w:val="32"/>
+          <w:szCs w:val="32"/>
+          <w:cs/>
+        </w:rPr>
+        <w:t>๖</w:t>
+      </w:r>
+      <w:r>
+        <w:rPr>
+          <w:rFonts w:ascii="TH SarabunIT๙" w:hAnsi="TH SarabunIT๙" w:cs="TH SarabunIT๙"/>
+          <w:color w:val="000000"/>
+          <w:sz w:val="32"/>
+          <w:szCs w:val="32"/>
+          <w:cs/>
+        </w:rPr>
+        <w:t>.</w:t>
+      </w:r>
+      <w:r>
+        <w:rPr>
+          <w:rFonts w:ascii="TH SarabunIT๙" w:hAnsi="TH SarabunIT๙" w:cs="TH SarabunIT๙" w:hint="cs"/>
+          <w:color w:val="000000"/>
+          <w:sz w:val="32"/>
+          <w:szCs w:val="32"/>
+          <w:cs/>
+        </w:rPr>
+        <w:t>3</w:t>
+      </w:r>
+      <w:r>
+        <w:rPr>
+          <w:rFonts w:ascii="TH SarabunIT๙" w:hAnsi="TH SarabunIT๙" w:cs="TH SarabunIT๙"/>
+          <w:color w:val="000000"/>
+          <w:sz w:val="32"/>
+          <w:szCs w:val="32"/>
+          <w:cs/>
+        </w:rPr>
+        <w:t xml:space="preserve"> คอมพิวเตอร์และอุปกรณ์ที่มีอยู่ในปัจจุบันของ</w:t>
+      </w:r>
+      <w:r>
+        <w:rPr>
+          <w:rFonts w:ascii="TH SarabunIT๙" w:hAnsi="TH SarabunIT๙" w:cs="TH SarabunIT๙"/>
+          <w:sz w:val="32"/>
+          <w:szCs w:val="32"/>
+          <w:cs/>
+        </w:rPr>
+        <w:t>ส่วนราชการ (เฉพาะกรณีโครงการที่มีการจัดหาครุภัณฑ์)</w:t>
+      </w:r>
+      <w:r>
+        <w:rPr>
+          <w:rFonts w:ascii="TH SarabunIT๙" w:hAnsi="TH SarabunIT๙" w:cs="TH SarabunIT๙"/>
+          <w:sz w:val="32"/>
+          <w:szCs w:val="32"/>
+          <w:cs/>
+        </w:rPr>
+        <w:br/>
+      </w:r>
+      <w:r>
+        <w:rPr>
+          <w:rFonts w:ascii="TH SarabunIT๙" w:hAnsi="TH SarabunIT๙" w:cs="TH SarabunIT๙"/>
+          <w:color w:val="000000"/>
+          <w:sz w:val="32"/>
+          <w:szCs w:val="32"/>
+          <w:cs/>
+        </w:rPr>
+        <w:t>(ให้ระบุรายการอุปกรณ์ของ</w:t>
+      </w:r>
+      <w:r>
+        <w:rPr>
+          <w:rFonts w:ascii="TH SarabunIT๙" w:hAnsi="TH SarabunIT๙" w:cs="TH SarabunIT๙"/>
+          <w:sz w:val="32"/>
+          <w:szCs w:val="32"/>
+          <w:cs/>
+        </w:rPr>
+        <w:t>ส่วนราชการ</w:t>
+      </w:r>
+      <w:r>
+        <w:rPr>
+          <w:rFonts w:ascii="TH SarabunIT๙" w:hAnsi="TH SarabunIT๙" w:cs="TH SarabunIT๙"/>
+          <w:color w:val="000000"/>
+          <w:sz w:val="32"/>
+          <w:szCs w:val="32"/>
+          <w:cs/>
+        </w:rPr>
+        <w:t>ที่มีอยู่ในปัจจุบัน สถานที่ติดตั้งของระบบ ส่วนที่รับผิดชอบ)</w:t>
+      </w:r>
+      <w:r>
+        <w:rPr>
+          <w:rFonts w:ascii="TH SarabunIT๙" w:hAnsi="TH SarabunIT๙" w:cs="TH SarabunIT๙"/>
+          <w:color w:val="000000"/>
+          <w:sz w:val="32"/>
+          <w:szCs w:val="32"/>
+          <w:cs/>
+        </w:rPr>
+        <w:tab/>
+      </w:r>
     </w:p>
     <w:p>
       <w:pPr>
@@ -5639,173 +5950,6 @@
         <w:rPr>
           <w:rFonts w:ascii="TH SarabunIT๙" w:hAnsi="TH SarabunIT๙" w:cs="TH SarabunIT๙"/>
           <w:color w:val="000000"/>
-          <w:sz w:val="32"/>
-          <w:szCs w:val="32"/>
-        </w:rPr>
-      </w:pPr>
-    </w:p>
-    <w:p>
-      <w:pPr>
-        <w:tabs>
-          <w:tab w:val="left" w:pos="284"/>
-        </w:tabs>
-        <w:spacing w:after="0" w:line="240" w:lineRule="auto"/>
-        <w:ind w:left="728" w:hanging="728"/>
-        <w:rPr>
-          <w:rFonts w:ascii="TH SarabunIT๙" w:hAnsi="TH SarabunIT๙" w:cs="TH SarabunIT๙"/>
-          <w:color w:val="000000"/>
-          <w:sz w:val="32"/>
-          <w:szCs w:val="32"/>
-        </w:rPr>
-      </w:pPr>
-    </w:p>
-    <w:p>
-      <w:pPr>
-        <w:tabs>
-          <w:tab w:val="left" w:pos="284"/>
-        </w:tabs>
-        <w:spacing w:after="0" w:line="240" w:lineRule="auto"/>
-        <w:ind w:left="728" w:hanging="728"/>
-        <w:rPr>
-          <w:rFonts w:ascii="TH SarabunIT๙" w:hAnsi="TH SarabunIT๙" w:cs="TH SarabunIT๙"/>
-          <w:color w:val="000000"/>
-          <w:sz w:val="32"/>
-          <w:szCs w:val="32"/>
-        </w:rPr>
-      </w:pPr>
-    </w:p>
-    <w:p>
-      <w:pPr>
-        <w:tabs>
-          <w:tab w:val="left" w:pos="284"/>
-        </w:tabs>
-        <w:spacing w:after="0" w:line="240" w:lineRule="auto"/>
-        <w:ind w:left="728" w:hanging="728"/>
-        <w:rPr>
-          <w:rFonts w:ascii="TH SarabunIT๙" w:hAnsi="TH SarabunIT๙" w:cs="TH SarabunIT๙"/>
-          <w:color w:val="000000"/>
-          <w:sz w:val="32"/>
-          <w:szCs w:val="32"/>
-        </w:rPr>
-      </w:pPr>
-      <w:r>
-        <w:rPr>
-          <w:rFonts w:ascii="TH SarabunIT๙" w:hAnsi="TH SarabunIT๙" w:cs="TH SarabunIT๙"/>
-          <w:color w:val="000000"/>
-          <w:sz w:val="32"/>
-          <w:szCs w:val="32"/>
-          <w:cs/>
-        </w:rPr>
-        <w:tab/>
-      </w:r>
-      <w:r>
-        <w:rPr>
-          <w:rFonts w:ascii="TH SarabunIT๙" w:hAnsi="TH SarabunIT๙" w:cs="TH SarabunIT๙"/>
-          <w:color w:val="000000"/>
-          <w:sz w:val="32"/>
-          <w:szCs w:val="32"/>
-          <w:cs/>
-        </w:rPr>
-        <w:t>๖</w:t>
-      </w:r>
-      <w:r>
-        <w:rPr>
-          <w:rFonts w:ascii="TH SarabunIT๙" w:hAnsi="TH SarabunIT๙" w:cs="TH SarabunIT๙"/>
-          <w:color w:val="000000"/>
-          <w:sz w:val="32"/>
-          <w:szCs w:val="32"/>
-          <w:cs/>
-        </w:rPr>
-        <w:t>.</w:t>
-      </w:r>
-      <w:r>
-        <w:rPr>
-          <w:rFonts w:ascii="TH SarabunIT๙" w:hAnsi="TH SarabunIT๙" w:cs="TH SarabunIT๙" w:hint="cs"/>
-          <w:color w:val="000000"/>
-          <w:sz w:val="32"/>
-          <w:szCs w:val="32"/>
-          <w:cs/>
-        </w:rPr>
-        <w:t>3</w:t>
-      </w:r>
-      <w:r>
-        <w:rPr>
-          <w:rFonts w:ascii="TH SarabunIT๙" w:hAnsi="TH SarabunIT๙" w:cs="TH SarabunIT๙"/>
-          <w:color w:val="000000"/>
-          <w:sz w:val="32"/>
-          <w:szCs w:val="32"/>
-          <w:cs/>
-        </w:rPr>
-        <w:t xml:space="preserve"> คอมพิวเตอร์และอุปกรณ์ที่มีอยู่ในปัจจุบันของ</w:t>
-      </w:r>
-      <w:r>
-        <w:rPr>
-          <w:rFonts w:ascii="TH SarabunIT๙" w:hAnsi="TH SarabunIT๙" w:cs="TH SarabunIT๙"/>
-          <w:sz w:val="32"/>
-          <w:szCs w:val="32"/>
-          <w:cs/>
-        </w:rPr>
-        <w:t>ส่วนราชการ (เฉพาะกรณีโครงการที่มีการจัดหาครุภัณฑ์)</w:t>
-      </w:r>
-      <w:r>
-        <w:rPr>
-          <w:rFonts w:ascii="TH SarabunIT๙" w:hAnsi="TH SarabunIT๙" w:cs="TH SarabunIT๙"/>
-          <w:sz w:val="32"/>
-          <w:szCs w:val="32"/>
-          <w:cs/>
-        </w:rPr>
-        <w:br/>
-      </w:r>
-      <w:r>
-        <w:rPr>
-          <w:rFonts w:ascii="TH SarabunIT๙" w:hAnsi="TH SarabunIT๙" w:cs="TH SarabunIT๙"/>
-          <w:color w:val="000000"/>
-          <w:sz w:val="32"/>
-          <w:szCs w:val="32"/>
-          <w:cs/>
-        </w:rPr>
-        <w:t>(ให้ระบุรายการอุปกรณ์ของ</w:t>
-      </w:r>
-      <w:r>
-        <w:rPr>
-          <w:rFonts w:ascii="TH SarabunIT๙" w:hAnsi="TH SarabunIT๙" w:cs="TH SarabunIT๙"/>
-          <w:sz w:val="32"/>
-          <w:szCs w:val="32"/>
-          <w:cs/>
-        </w:rPr>
-        <w:t>ส่วนราชการ</w:t>
-      </w:r>
-      <w:r>
-        <w:rPr>
-          <w:rFonts w:ascii="TH SarabunIT๙" w:hAnsi="TH SarabunIT๙" w:cs="TH SarabunIT๙"/>
-          <w:color w:val="000000"/>
-          <w:sz w:val="32"/>
-          <w:szCs w:val="32"/>
-          <w:cs/>
-        </w:rPr>
-        <w:t>ที่มีอยู่ในปัจจุบัน สถานที่ติดตั้งของระบบ ส่วนที่รับผิดชอบ)</w:t>
-      </w:r>
-      <w:r>
-        <w:rPr>
-          <w:rFonts w:ascii="TH SarabunIT๙" w:hAnsi="TH SarabunIT๙" w:cs="TH SarabunIT๙"/>
-          <w:color w:val="000000"/>
-          <w:sz w:val="32"/>
-          <w:szCs w:val="32"/>
-          <w:cs/>
-        </w:rPr>
-        <w:tab/>
-      </w:r>
-    </w:p>
-    <w:p>
-      <w:pPr>
-        <w:tabs>
-          <w:tab w:val="left" w:pos="284"/>
-        </w:tabs>
-        <w:spacing w:after="0" w:line="240" w:lineRule="auto"/>
-        <w:ind w:left="728" w:hanging="728"/>
-        <w:rPr>
-          <w:rFonts w:ascii="TH SarabunIT๙" w:hAnsi="TH SarabunIT๙" w:cs="TH SarabunIT๙"/>
-          <w:color w:val="000000"/>
           <w:sz w:val="14"/>
           <w:szCs w:val="14"/>
         </w:rPr>
@@ -5842,6 +5986,44 @@
           <w:cs/>
         </w:rPr>
         <w:t>ตารางแสดงอัตรากำลังของหน่วยงาน / ส่วนราชการ</w:t>
+      </w:r>
+    </w:p>
+    <w:p>
+      <w:pPr>
+        <w:tabs>
+          <w:tab w:val="left" w:pos="270"/>
+        </w:tabs>
+        <w:spacing w:after="120" w:line="240" w:lineRule="auto"/>
+        <w:ind w:left="720" w:hanging="14"/>
+        <w:rPr>
+          <w:rFonts w:ascii="TH SarabunIT๙" w:hAnsi="TH SarabunIT๙" w:cs="TH SarabunIT๙"/>
+          <w:sz w:val="32"/>
+          <w:szCs w:val="32"/>
+        </w:rPr>
+      </w:pPr>
+      <w:r>
+        <w:rPr>
+          <w:rFonts w:ascii="TH SarabunIT๙" w:hAnsi="TH SarabunIT๙" w:cs="TH SarabunIT๙"/>
+          <w:sz w:val="32"/>
+          <w:szCs w:val="32"/>
+        </w:rPr>
+        <w:t>{#</w:t>
+      </w:r>
+      <w:r>
+        <w:rPr>
+          <w:rFonts w:ascii="TH SarabunIT๙" w:hAnsi="TH SarabunIT๙" w:cs="TH SarabunIT๙"/>
+          <w:sz w:val="32"/>
+          <w:szCs w:val="32"/>
+        </w:rPr>
+        <w:t>hasManpower</w:t>
+      </w:r>
+      <w:r>
+        <w:rPr>
+          <w:rFonts w:ascii="TH SarabunIT๙" w:hAnsi="TH SarabunIT๙" w:cs="TH SarabunIT๙"/>
+          <w:sz w:val="32"/>
+          <w:szCs w:val="32"/>
+        </w:rPr>
+        <w:t>}</w:t>
       </w:r>
     </w:p>
     <w:tbl>
@@ -5852,10 +6034,10 @@
         <w:tblLook w:val="04A0" w:firstRow="1" w:lastRow="0" w:firstColumn="1" w:lastColumn="0" w:noHBand="0" w:noVBand="1"/>
       </w:tblPr>
       <w:tblGrid>
-        <w:gridCol w:w="2245"/>
-        <w:gridCol w:w="1417"/>
+        <w:gridCol w:w="2690"/>
+        <w:gridCol w:w="1588"/>
         <w:gridCol w:w="1842"/>
-        <w:gridCol w:w="1701"/>
+        <w:gridCol w:w="2239"/>
       </w:tblGrid>
       <w:tr>
         <w:tc>
@@ -6015,6 +6197,48 @@
                 <w:szCs w:val="32"/>
               </w:rPr>
             </w:pPr>
+            <w:r>
+              <w:rPr>
+                <w:rFonts w:ascii="TH SarabunIT๙" w:hAnsi="TH SarabunIT๙" w:cs="TH SarabunIT๙"/>
+                <w:sz w:val="32"/>
+                <w:szCs w:val="32"/>
+              </w:rPr>
+              <w:t>{#</w:t>
+            </w:r>
+            <w:proofErr w:type="gramStart"/>
+            <w:r>
+              <w:rPr>
+                <w:rFonts w:ascii="TH SarabunIT๙" w:hAnsi="TH SarabunIT๙" w:cs="TH SarabunIT๙"/>
+                <w:sz w:val="32"/>
+                <w:szCs w:val="32"/>
+              </w:rPr>
+              <w:t>manpower</w:t>
+            </w:r>
+            <w:r>
+              <w:rPr>
+                <w:rFonts w:ascii="TH SarabunIT๙" w:hAnsi="TH SarabunIT๙" w:cs="TH SarabunIT๙"/>
+                <w:sz w:val="32"/>
+                <w:szCs w:val="32"/>
+              </w:rPr>
+              <w:t>}{</w:t>
+            </w:r>
+            <w:proofErr w:type="gramEnd"/>
+            <w:r>
+              <w:rPr>
+                <w:rFonts w:ascii="TH SarabunIT๙" w:hAnsi="TH SarabunIT๙" w:cs="TH SarabunIT๙"/>
+                <w:sz w:val="32"/>
+                <w:szCs w:val="32"/>
+              </w:rPr>
+              <w:t>agencyPart</w:t>
+            </w:r>
+            <w:r>
+              <w:rPr>
+                <w:rFonts w:ascii="TH SarabunIT๙" w:hAnsi="TH SarabunIT๙" w:cs="TH SarabunIT๙"/>
+                <w:sz w:val="32"/>
+                <w:szCs w:val="32"/>
+              </w:rPr>
+              <w:t>}</w:t>
+            </w:r>
           </w:p>
         </w:tc>
         <w:tc>
@@ -6034,6 +6258,32 @@
                 <w:szCs w:val="32"/>
               </w:rPr>
             </w:pPr>
+            <w:r>
+              <w:rPr>
+                <w:rFonts w:ascii="TH SarabunIT๙" w:hAnsi="TH SarabunIT๙" w:cs="TH SarabunIT๙"/>
+                <w:sz w:val="32"/>
+                <w:szCs w:val="32"/>
+              </w:rPr>
+              <w:t>{</w:t>
+            </w:r>
+            <w:proofErr w:type="spellStart"/>
+            <w:r>
+              <w:rPr>
+                <w:rFonts w:ascii="TH SarabunIT๙" w:hAnsi="TH SarabunIT๙" w:cs="TH SarabunIT๙"/>
+                <w:sz w:val="32"/>
+                <w:szCs w:val="32"/>
+              </w:rPr>
+              <w:t>positionLimit</w:t>
+            </w:r>
+            <w:proofErr w:type="spellEnd"/>
+            <w:r>
+              <w:rPr>
+                <w:rFonts w:ascii="TH SarabunIT๙" w:hAnsi="TH SarabunIT๙" w:cs="TH SarabunIT๙"/>
+                <w:sz w:val="32"/>
+                <w:szCs w:val="32"/>
+              </w:rPr>
+              <w:t>}</w:t>
+            </w:r>
           </w:p>
         </w:tc>
         <w:tc>
@@ -6053,6 +6303,30 @@
                 <w:szCs w:val="32"/>
               </w:rPr>
             </w:pPr>
+            <w:r>
+              <w:rPr>
+                <w:rFonts w:ascii="TH SarabunIT๙" w:hAnsi="TH SarabunIT๙" w:cs="TH SarabunIT๙"/>
+                <w:sz w:val="32"/>
+                <w:szCs w:val="32"/>
+              </w:rPr>
+              <w:t>{</w:t>
+            </w:r>
+            <w:r>
+              <w:rPr>
+                <w:rFonts w:ascii="TH SarabunIT๙" w:hAnsi="TH SarabunIT๙" w:cs="TH SarabunIT๙"/>
+                <w:sz w:val="32"/>
+                <w:szCs w:val="32"/>
+              </w:rPr>
+              <w:t>occupied</w:t>
+            </w:r>
+            <w:r>
+              <w:rPr>
+                <w:rFonts w:ascii="TH SarabunIT๙" w:hAnsi="TH SarabunIT๙" w:cs="TH SarabunIT๙"/>
+                <w:sz w:val="32"/>
+                <w:szCs w:val="32"/>
+              </w:rPr>
+              <w:t>}</w:t>
+            </w:r>
           </w:p>
         </w:tc>
         <w:tc>
@@ -6072,10 +6346,252 @@
                 <w:szCs w:val="32"/>
               </w:rPr>
             </w:pPr>
+            <w:r>
+              <w:rPr>
+                <w:rFonts w:ascii="TH SarabunIT๙" w:hAnsi="TH SarabunIT๙" w:cs="TH SarabunIT๙"/>
+                <w:sz w:val="32"/>
+                <w:szCs w:val="32"/>
+              </w:rPr>
+              <w:t>{</w:t>
+            </w:r>
+            <w:r>
+              <w:rPr>
+                <w:rFonts w:ascii="TH SarabunIT๙" w:hAnsi="TH SarabunIT๙" w:cs="TH SarabunIT๙"/>
+                <w:sz w:val="32"/>
+                <w:szCs w:val="32"/>
+              </w:rPr>
+              <w:t>vacant</w:t>
+            </w:r>
+            <w:r>
+              <w:rPr>
+                <w:rFonts w:ascii="TH SarabunIT๙" w:hAnsi="TH SarabunIT๙" w:cs="TH SarabunIT๙"/>
+                <w:sz w:val="32"/>
+                <w:szCs w:val="32"/>
+              </w:rPr>
+              <w:t>}{/manpower}</w:t>
+            </w:r>
           </w:p>
         </w:tc>
       </w:tr>
     </w:tbl>
+    <w:p>
+      <w:pPr>
+        <w:tabs>
+          <w:tab w:val="left" w:pos="270"/>
+        </w:tabs>
+        <w:spacing w:after="120" w:line="240" w:lineRule="auto"/>
+        <w:rPr>
+          <w:rFonts w:ascii="TH SarabunIT๙" w:hAnsi="TH SarabunIT๙" w:cs="TH SarabunIT๙"/>
+          <w:sz w:val="32"/>
+          <w:szCs w:val="32"/>
+        </w:rPr>
+      </w:pPr>
+      <w:r>
+        <w:rPr>
+          <w:rFonts w:ascii="TH SarabunIT๙" w:hAnsi="TH SarabunIT๙" w:cs="TH SarabunIT๙"/>
+          <w:sz w:val="32"/>
+          <w:szCs w:val="32"/>
+        </w:rPr>
+        <w:tab/>
+      </w:r>
+      <w:r>
+        <w:rPr>
+          <w:rFonts w:ascii="TH SarabunIT๙" w:hAnsi="TH SarabunIT๙" w:cs="TH SarabunIT๙"/>
+          <w:sz w:val="32"/>
+          <w:szCs w:val="32"/>
+        </w:rPr>
+        <w:tab/>
+      </w:r>
+      <w:r>
+        <w:rPr>
+          <w:rFonts w:ascii="TH SarabunIT๙" w:hAnsi="TH SarabunIT๙" w:cs="TH SarabunIT๙"/>
+          <w:sz w:val="32"/>
+          <w:szCs w:val="32"/>
+        </w:rPr>
+        <w:t>{</w:t>
+      </w:r>
+      <w:r>
+        <w:rPr>
+          <w:rFonts w:ascii="TH SarabunIT๙" w:hAnsi="TH SarabunIT๙" w:cs="TH SarabunIT๙"/>
+          <w:sz w:val="32"/>
+          <w:szCs w:val="32"/>
+        </w:rPr>
+        <w:t>/</w:t>
+      </w:r>
+      <w:proofErr w:type="spellStart"/>
+      <w:r>
+        <w:rPr>
+          <w:rFonts w:ascii="TH SarabunIT๙" w:hAnsi="TH SarabunIT๙" w:cs="TH SarabunIT๙"/>
+          <w:sz w:val="32"/>
+          <w:szCs w:val="32"/>
+        </w:rPr>
+        <w:t>hasManpower</w:t>
+      </w:r>
+      <w:proofErr w:type="spellEnd"/>
+      <w:r>
+        <w:rPr>
+          <w:rFonts w:ascii="TH SarabunIT๙" w:hAnsi="TH SarabunIT๙" w:cs="TH SarabunIT๙"/>
+          <w:sz w:val="32"/>
+          <w:szCs w:val="32"/>
+        </w:rPr>
+        <w:t>}</w:t>
+      </w:r>
+    </w:p>
+    <w:p>
+      <w:pPr>
+        <w:tabs>
+          <w:tab w:val="left" w:pos="270"/>
+        </w:tabs>
+        <w:spacing w:after="120" w:line="240" w:lineRule="auto"/>
+        <w:ind w:left="720" w:hanging="14"/>
+        <w:rPr>
+          <w:rFonts w:ascii="TH SarabunIT๙" w:hAnsi="TH SarabunIT๙" w:cs="TH SarabunIT๙"/>
+          <w:sz w:val="32"/>
+          <w:szCs w:val="32"/>
+        </w:rPr>
+      </w:pPr>
+      <w:r>
+        <w:rPr>
+          <w:rFonts w:ascii="TH SarabunIT๙" w:hAnsi="TH SarabunIT๙" w:cs="TH SarabunIT๙"/>
+          <w:sz w:val="32"/>
+          <w:szCs w:val="32"/>
+        </w:rPr>
+        <w:t>{</w:t>
+      </w:r>
+      <w:r>
+        <w:rPr>
+          <w:rFonts w:ascii="TH SarabunIT๙" w:hAnsi="TH SarabunIT๙" w:cs="TH SarabunIT๙"/>
+          <w:sz w:val="32"/>
+          <w:szCs w:val="32"/>
+        </w:rPr>
+        <w:t>^</w:t>
+      </w:r>
+      <w:proofErr w:type="spellStart"/>
+      <w:r>
+        <w:rPr>
+          <w:rFonts w:ascii="TH SarabunIT๙" w:hAnsi="TH SarabunIT๙" w:cs="TH SarabunIT๙"/>
+          <w:sz w:val="32"/>
+          <w:szCs w:val="32"/>
+        </w:rPr>
+        <w:t>hasManpower</w:t>
+      </w:r>
+      <w:proofErr w:type="spellEnd"/>
+      <w:r>
+        <w:rPr>
+          <w:rFonts w:ascii="TH SarabunIT๙" w:hAnsi="TH SarabunIT๙" w:cs="TH SarabunIT๙"/>
+          <w:sz w:val="32"/>
+          <w:szCs w:val="32"/>
+        </w:rPr>
+        <w:t>}</w:t>
+      </w:r>
+    </w:p>
+    <w:p>
+      <w:pPr>
+        <w:tabs>
+          <w:tab w:val="left" w:pos="270"/>
+        </w:tabs>
+        <w:spacing w:after="120" w:line="240" w:lineRule="auto"/>
+        <w:ind w:left="720" w:hanging="14"/>
+        <w:jc w:val="center"/>
+        <w:rPr>
+          <w:rFonts w:ascii="TH SarabunIT๙" w:hAnsi="TH SarabunIT๙" w:cs="TH SarabunIT๙"/>
+          <w:sz w:val="32"/>
+          <w:szCs w:val="32"/>
+        </w:rPr>
+      </w:pPr>
+      <w:r>
+        <w:rPr>
+          <w:rFonts w:ascii="TH SarabunIT๙" w:hAnsi="TH SarabunIT๙" w:cs="TH SarabunIT๙"/>
+          <w:sz w:val="32"/>
+          <w:szCs w:val="32"/>
+        </w:rPr>
+        <w:t xml:space="preserve">“- </w:t>
+      </w:r>
+      <w:r>
+        <w:rPr>
+          <w:rFonts w:ascii="TH SarabunIT๙" w:hAnsi="TH SarabunIT๙" w:cs="TH SarabunIT๙" w:hint="cs"/>
+          <w:sz w:val="32"/>
+          <w:szCs w:val="32"/>
+          <w:cs/>
+        </w:rPr>
+        <w:t xml:space="preserve">ไม่มี </w:t>
+      </w:r>
+      <w:r>
+        <w:rPr>
+          <w:rFonts w:ascii="TH SarabunIT๙" w:hAnsi="TH SarabunIT๙" w:cs="TH SarabunIT๙"/>
+          <w:sz w:val="32"/>
+          <w:szCs w:val="32"/>
+        </w:rPr>
+        <w:t>-”</w:t>
+      </w:r>
+    </w:p>
+    <w:p>
+      <w:pPr>
+        <w:tabs>
+          <w:tab w:val="left" w:pos="270"/>
+        </w:tabs>
+        <w:spacing w:after="120" w:line="240" w:lineRule="auto"/>
+        <w:ind w:left="720" w:hanging="14"/>
+        <w:rPr>
+          <w:rFonts w:ascii="TH SarabunIT๙" w:hAnsi="TH SarabunIT๙" w:cs="TH SarabunIT๙"/>
+          <w:sz w:val="32"/>
+          <w:szCs w:val="32"/>
+        </w:rPr>
+      </w:pPr>
+      <w:r>
+        <w:rPr>
+          <w:rFonts w:ascii="TH SarabunIT๙" w:hAnsi="TH SarabunIT๙" w:cs="TH SarabunIT๙"/>
+          <w:sz w:val="32"/>
+          <w:szCs w:val="32"/>
+        </w:rPr>
+        <w:t>{/</w:t>
+      </w:r>
+      <w:proofErr w:type="spellStart"/>
+      <w:r>
+        <w:rPr>
+          <w:rFonts w:ascii="TH SarabunIT๙" w:hAnsi="TH SarabunIT๙" w:cs="TH SarabunIT๙"/>
+          <w:sz w:val="32"/>
+          <w:szCs w:val="32"/>
+        </w:rPr>
+        <w:t>hasManpower</w:t>
+      </w:r>
+      <w:proofErr w:type="spellEnd"/>
+      <w:r>
+        <w:rPr>
+          <w:rFonts w:ascii="TH SarabunIT๙" w:hAnsi="TH SarabunIT๙" w:cs="TH SarabunIT๙"/>
+          <w:sz w:val="32"/>
+          <w:szCs w:val="32"/>
+        </w:rPr>
+        <w:t>}</w:t>
+      </w:r>
+    </w:p>
+    <w:p>
+      <w:pPr>
+        <w:tabs>
+          <w:tab w:val="left" w:pos="270"/>
+        </w:tabs>
+        <w:spacing w:after="120" w:line="240" w:lineRule="auto"/>
+        <w:ind w:left="720" w:hanging="14"/>
+        <w:rPr>
+          <w:rFonts w:ascii="TH SarabunIT๙" w:hAnsi="TH SarabunIT๙" w:cs="TH SarabunIT๙"/>
+          <w:sz w:val="32"/>
+          <w:szCs w:val="32"/>
+        </w:rPr>
+      </w:pPr>
+    </w:p>
+    <w:p>
+      <w:pPr>
+        <w:tabs>
+          <w:tab w:val="left" w:pos="270"/>
+        </w:tabs>
+        <w:spacing w:after="120" w:line="240" w:lineRule="auto"/>
+        <w:rPr>
+          <w:rFonts w:ascii="TH SarabunIT๙" w:hAnsi="TH SarabunIT๙" w:cs="TH SarabunIT๙"/>
+          <w:sz w:val="32"/>
+          <w:szCs w:val="32"/>
+        </w:rPr>
+      </w:pPr>
+    </w:p>
     <w:p>
       <w:pPr>
         <w:tabs>
@@ -6111,6 +6627,44 @@
           <w:cs/>
         </w:rPr>
         <w:t>ตารางแสดงรายการครุภัณฑ์คอมพิวเตอร์ที่มีอยู่ในปัจจุบัน</w:t>
+      </w:r>
+    </w:p>
+    <w:p>
+      <w:pPr>
+        <w:tabs>
+          <w:tab w:val="left" w:pos="270"/>
+        </w:tabs>
+        <w:spacing w:after="120" w:line="240" w:lineRule="auto"/>
+        <w:ind w:left="720" w:hanging="14"/>
+        <w:rPr>
+          <w:rFonts w:ascii="TH SarabunIT๙" w:hAnsi="TH SarabunIT๙" w:cs="TH SarabunIT๙"/>
+          <w:sz w:val="32"/>
+          <w:szCs w:val="32"/>
+        </w:rPr>
+      </w:pPr>
+      <w:r>
+        <w:rPr>
+          <w:rFonts w:ascii="TH SarabunIT๙" w:hAnsi="TH SarabunIT๙" w:cs="TH SarabunIT๙"/>
+          <w:sz w:val="32"/>
+          <w:szCs w:val="32"/>
+        </w:rPr>
+        <w:t>{#</w:t>
+      </w:r>
+      <w:r>
+        <w:rPr>
+          <w:rFonts w:ascii="TH SarabunIT๙" w:hAnsi="TH SarabunIT๙" w:cs="TH SarabunIT๙"/>
+          <w:sz w:val="32"/>
+          <w:szCs w:val="32"/>
+        </w:rPr>
+        <w:t>hasEquipment</w:t>
+      </w:r>
+      <w:r>
+        <w:rPr>
+          <w:rFonts w:ascii="TH SarabunIT๙" w:hAnsi="TH SarabunIT๙" w:cs="TH SarabunIT๙"/>
+          <w:sz w:val="32"/>
+          <w:szCs w:val="32"/>
+        </w:rPr>
+        <w:t>}</w:t>
       </w:r>
     </w:p>
     <w:tbl>
@@ -6121,12 +6675,12 @@
         <w:tblLook w:val="04A0" w:firstRow="1" w:lastRow="0" w:firstColumn="1" w:lastColumn="0" w:noHBand="0" w:noVBand="1"/>
       </w:tblPr>
       <w:tblGrid>
-        <w:gridCol w:w="1613"/>
-        <w:gridCol w:w="1198"/>
-        <w:gridCol w:w="1134"/>
-        <w:gridCol w:w="2410"/>
-        <w:gridCol w:w="1417"/>
-        <w:gridCol w:w="1129"/>
+        <w:gridCol w:w="2742"/>
+        <w:gridCol w:w="994"/>
+        <w:gridCol w:w="961"/>
+        <w:gridCol w:w="813"/>
+        <w:gridCol w:w="951"/>
+        <w:gridCol w:w="2440"/>
       </w:tblGrid>
       <w:tr>
         <w:tc>
@@ -6374,6 +6928,43 @@
                 <w:sz w:val="28"/>
               </w:rPr>
             </w:pPr>
+            <w:r>
+              <w:rPr>
+                <w:rFonts w:ascii="TH SarabunIT๙" w:hAnsi="TH SarabunIT๙" w:cs="TH SarabunIT๙"/>
+                <w:sz w:val="28"/>
+              </w:rPr>
+              <w:t>{#</w:t>
+            </w:r>
+            <w:proofErr w:type="gramStart"/>
+            <w:r>
+              <w:rPr>
+                <w:rFonts w:ascii="TH SarabunIT๙" w:hAnsi="TH SarabunIT๙" w:cs="TH SarabunIT๙"/>
+                <w:sz w:val="28"/>
+              </w:rPr>
+              <w:t>existingEquipment</w:t>
+            </w:r>
+            <w:r>
+              <w:rPr>
+                <w:rFonts w:ascii="TH SarabunIT๙" w:hAnsi="TH SarabunIT๙" w:cs="TH SarabunIT๙"/>
+                <w:sz w:val="28"/>
+              </w:rPr>
+              <w:t>}{</w:t>
+            </w:r>
+            <w:proofErr w:type="gramEnd"/>
+            <w:r>
+              <w:rPr>
+                <w:rFonts w:ascii="TH SarabunIT๙" w:hAnsi="TH SarabunIT๙" w:cs="TH SarabunIT๙"/>
+                <w:sz w:val="28"/>
+              </w:rPr>
+              <w:t>itemName</w:t>
+            </w:r>
+            <w:r>
+              <w:rPr>
+                <w:rFonts w:ascii="TH SarabunIT๙" w:hAnsi="TH SarabunIT๙" w:cs="TH SarabunIT๙"/>
+                <w:sz w:val="28"/>
+              </w:rPr>
+              <w:t>}</w:t>
+            </w:r>
           </w:p>
         </w:tc>
         <w:tc>
@@ -6392,6 +6983,29 @@
                 <w:sz w:val="28"/>
               </w:rPr>
             </w:pPr>
+            <w:r>
+              <w:rPr>
+                <w:rFonts w:ascii="TH SarabunIT๙" w:hAnsi="TH SarabunIT๙" w:cs="TH SarabunIT๙"/>
+                <w:sz w:val="28"/>
+              </w:rPr>
+              <w:t>{</w:t>
+            </w:r>
+            <w:proofErr w:type="spellStart"/>
+            <w:r>
+              <w:rPr>
+                <w:rFonts w:ascii="TH SarabunIT๙" w:hAnsi="TH SarabunIT๙" w:cs="TH SarabunIT๙"/>
+                <w:sz w:val="28"/>
+              </w:rPr>
+              <w:t>ageYears</w:t>
+            </w:r>
+            <w:proofErr w:type="spellEnd"/>
+            <w:r>
+              <w:rPr>
+                <w:rFonts w:ascii="TH SarabunIT๙" w:hAnsi="TH SarabunIT๙" w:cs="TH SarabunIT๙"/>
+                <w:sz w:val="28"/>
+              </w:rPr>
+              <w:t>}</w:t>
+            </w:r>
           </w:p>
         </w:tc>
         <w:tc>
@@ -6410,6 +7024,27 @@
                 <w:sz w:val="28"/>
               </w:rPr>
             </w:pPr>
+            <w:r>
+              <w:rPr>
+                <w:rFonts w:ascii="TH SarabunIT๙" w:hAnsi="TH SarabunIT๙" w:cs="TH SarabunIT๙"/>
+                <w:sz w:val="28"/>
+              </w:rPr>
+              <w:t>{</w:t>
+            </w:r>
+            <w:r>
+              <w:rPr>
+                <w:rFonts w:ascii="TH SarabunIT๙" w:hAnsi="TH SarabunIT๙" w:cs="TH SarabunIT๙"/>
+                <w:sz w:val="28"/>
+              </w:rPr>
+              <w:t>quantity</w:t>
+            </w:r>
+            <w:r>
+              <w:rPr>
+                <w:rFonts w:ascii="TH SarabunIT๙" w:hAnsi="TH SarabunIT๙" w:cs="TH SarabunIT๙"/>
+                <w:sz w:val="28"/>
+              </w:rPr>
+              <w:t>}</w:t>
+            </w:r>
           </w:p>
         </w:tc>
         <w:tc>
@@ -6428,6 +7063,27 @@
                 <w:sz w:val="28"/>
               </w:rPr>
             </w:pPr>
+            <w:r>
+              <w:rPr>
+                <w:rFonts w:ascii="TH SarabunIT๙" w:hAnsi="TH SarabunIT๙" w:cs="TH SarabunIT๙"/>
+                <w:sz w:val="28"/>
+              </w:rPr>
+              <w:t>{</w:t>
+            </w:r>
+            <w:r>
+              <w:rPr>
+                <w:rFonts w:ascii="TH SarabunIT๙" w:hAnsi="TH SarabunIT๙" w:cs="TH SarabunIT๙"/>
+                <w:sz w:val="28"/>
+              </w:rPr>
+              <w:t>user</w:t>
+            </w:r>
+            <w:r>
+              <w:rPr>
+                <w:rFonts w:ascii="TH SarabunIT๙" w:hAnsi="TH SarabunIT๙" w:cs="TH SarabunIT๙"/>
+                <w:sz w:val="28"/>
+              </w:rPr>
+              <w:t>}</w:t>
+            </w:r>
           </w:p>
         </w:tc>
         <w:tc>
@@ -6446,6 +7102,27 @@
                 <w:sz w:val="28"/>
               </w:rPr>
             </w:pPr>
+            <w:r>
+              <w:rPr>
+                <w:rFonts w:ascii="TH SarabunIT๙" w:hAnsi="TH SarabunIT๙" w:cs="TH SarabunIT๙"/>
+                <w:sz w:val="28"/>
+              </w:rPr>
+              <w:t>{</w:t>
+            </w:r>
+            <w:r>
+              <w:rPr>
+                <w:rFonts w:ascii="TH SarabunIT๙" w:hAnsi="TH SarabunIT๙" w:cs="TH SarabunIT๙"/>
+                <w:sz w:val="28"/>
+              </w:rPr>
+              <w:t>location</w:t>
+            </w:r>
+            <w:r>
+              <w:rPr>
+                <w:rFonts w:ascii="TH SarabunIT๙" w:hAnsi="TH SarabunIT๙" w:cs="TH SarabunIT๙"/>
+                <w:sz w:val="28"/>
+              </w:rPr>
+              <w:t>}</w:t>
+            </w:r>
           </w:p>
         </w:tc>
         <w:tc>
@@ -6465,445 +7142,57 @@
                 <w:cs/>
               </w:rPr>
             </w:pPr>
-          </w:p>
-        </w:tc>
-      </w:tr>
-      <w:tr>
-        <w:tc>
-          <w:tcPr>
-            <w:tcW w:w="1613" w:type="dxa"/>
-          </w:tcPr>
-          <w:p>
-            <w:pPr>
-              <w:tabs>
-                <w:tab w:val="left" w:pos="270"/>
-              </w:tabs>
-              <w:spacing w:after="0" w:line="240" w:lineRule="auto"/>
+            <w:r>
               <w:rPr>
                 <w:rFonts w:ascii="TH SarabunIT๙" w:hAnsi="TH SarabunIT๙" w:cs="TH SarabunIT๙"/>
                 <w:sz w:val="28"/>
               </w:rPr>
-            </w:pPr>
-          </w:p>
-        </w:tc>
-        <w:tc>
-          <w:tcPr>
-            <w:tcW w:w="1198" w:type="dxa"/>
-          </w:tcPr>
-          <w:p>
-            <w:pPr>
-              <w:tabs>
-                <w:tab w:val="left" w:pos="270"/>
-              </w:tabs>
-              <w:spacing w:after="0" w:line="240" w:lineRule="auto"/>
-              <w:jc w:val="center"/>
+              <w:t>{</w:t>
+            </w:r>
+            <w:r>
               <w:rPr>
                 <w:rFonts w:ascii="TH SarabunIT๙" w:hAnsi="TH SarabunIT๙" w:cs="TH SarabunIT๙"/>
                 <w:sz w:val="28"/>
-                <w:cs/>
-              </w:rPr>
-            </w:pPr>
-          </w:p>
-        </w:tc>
-        <w:tc>
-          <w:tcPr>
-            <w:tcW w:w="1134" w:type="dxa"/>
-          </w:tcPr>
-          <w:p>
-            <w:pPr>
-              <w:tabs>
-                <w:tab w:val="left" w:pos="270"/>
-              </w:tabs>
-              <w:spacing w:after="0" w:line="240" w:lineRule="auto"/>
-              <w:jc w:val="center"/>
+              </w:rPr>
+              <w:t>remark</w:t>
+            </w:r>
+            <w:r>
               <w:rPr>
                 <w:rFonts w:ascii="TH SarabunIT๙" w:hAnsi="TH SarabunIT๙" w:cs="TH SarabunIT๙"/>
                 <w:sz w:val="28"/>
               </w:rPr>
-            </w:pPr>
-          </w:p>
-        </w:tc>
-        <w:tc>
-          <w:tcPr>
-            <w:tcW w:w="2410" w:type="dxa"/>
-          </w:tcPr>
-          <w:p>
-            <w:pPr>
-              <w:tabs>
-                <w:tab w:val="left" w:pos="270"/>
-              </w:tabs>
-              <w:spacing w:after="0" w:line="240" w:lineRule="auto"/>
-              <w:jc w:val="center"/>
+              <w:t>}</w:t>
+            </w:r>
+            <w:r>
               <w:rPr>
                 <w:rFonts w:ascii="TH SarabunIT๙" w:hAnsi="TH SarabunIT๙" w:cs="TH SarabunIT๙"/>
                 <w:sz w:val="28"/>
               </w:rPr>
-            </w:pPr>
-          </w:p>
-        </w:tc>
-        <w:tc>
-          <w:tcPr>
-            <w:tcW w:w="1417" w:type="dxa"/>
-          </w:tcPr>
-          <w:p>
-            <w:pPr>
-              <w:tabs>
-                <w:tab w:val="left" w:pos="270"/>
-              </w:tabs>
-              <w:spacing w:after="0" w:line="240" w:lineRule="auto"/>
-              <w:jc w:val="center"/>
+              <w:t>{</w:t>
+            </w:r>
+            <w:r>
               <w:rPr>
                 <w:rFonts w:ascii="TH SarabunIT๙" w:hAnsi="TH SarabunIT๙" w:cs="TH SarabunIT๙"/>
                 <w:sz w:val="28"/>
               </w:rPr>
-            </w:pPr>
-          </w:p>
-        </w:tc>
-        <w:tc>
-          <w:tcPr>
-            <w:tcW w:w="1129" w:type="dxa"/>
-          </w:tcPr>
-          <w:p>
-            <w:pPr>
-              <w:tabs>
-                <w:tab w:val="left" w:pos="270"/>
-              </w:tabs>
-              <w:spacing w:after="0" w:line="240" w:lineRule="auto"/>
-              <w:jc w:val="center"/>
+              <w:t>/</w:t>
+            </w:r>
+            <w:proofErr w:type="spellStart"/>
+            <w:r>
               <w:rPr>
                 <w:rFonts w:ascii="TH SarabunIT๙" w:hAnsi="TH SarabunIT๙" w:cs="TH SarabunIT๙"/>
                 <w:sz w:val="28"/>
-                <w:cs/>
-              </w:rPr>
-            </w:pPr>
-          </w:p>
-        </w:tc>
-      </w:tr>
-      <w:tr>
-        <w:tc>
-          <w:tcPr>
-            <w:tcW w:w="1613" w:type="dxa"/>
-          </w:tcPr>
-          <w:p>
-            <w:pPr>
-              <w:tabs>
-                <w:tab w:val="left" w:pos="270"/>
-              </w:tabs>
-              <w:spacing w:after="0" w:line="240" w:lineRule="auto"/>
+              </w:rPr>
+              <w:t>existingEquipment</w:t>
+            </w:r>
+            <w:proofErr w:type="spellEnd"/>
+            <w:r>
               <w:rPr>
                 <w:rFonts w:ascii="TH SarabunIT๙" w:hAnsi="TH SarabunIT๙" w:cs="TH SarabunIT๙"/>
                 <w:sz w:val="28"/>
               </w:rPr>
-            </w:pPr>
-          </w:p>
-        </w:tc>
-        <w:tc>
-          <w:tcPr>
-            <w:tcW w:w="1198" w:type="dxa"/>
-          </w:tcPr>
-          <w:p>
-            <w:pPr>
-              <w:tabs>
-                <w:tab w:val="left" w:pos="270"/>
-              </w:tabs>
-              <w:spacing w:after="0" w:line="240" w:lineRule="auto"/>
-              <w:jc w:val="center"/>
-              <w:rPr>
-                <w:rFonts w:ascii="TH SarabunIT๙" w:hAnsi="TH SarabunIT๙" w:cs="TH SarabunIT๙"/>
-                <w:sz w:val="28"/>
-              </w:rPr>
-            </w:pPr>
-          </w:p>
-        </w:tc>
-        <w:tc>
-          <w:tcPr>
-            <w:tcW w:w="1134" w:type="dxa"/>
-          </w:tcPr>
-          <w:p>
-            <w:pPr>
-              <w:tabs>
-                <w:tab w:val="left" w:pos="270"/>
-              </w:tabs>
-              <w:spacing w:after="0" w:line="240" w:lineRule="auto"/>
-              <w:jc w:val="center"/>
-              <w:rPr>
-                <w:rFonts w:ascii="TH SarabunIT๙" w:hAnsi="TH SarabunIT๙" w:cs="TH SarabunIT๙"/>
-                <w:sz w:val="28"/>
-              </w:rPr>
-            </w:pPr>
-          </w:p>
-        </w:tc>
-        <w:tc>
-          <w:tcPr>
-            <w:tcW w:w="2410" w:type="dxa"/>
-          </w:tcPr>
-          <w:p>
-            <w:pPr>
-              <w:tabs>
-                <w:tab w:val="left" w:pos="270"/>
-              </w:tabs>
-              <w:spacing w:after="0" w:line="240" w:lineRule="auto"/>
-              <w:jc w:val="center"/>
-              <w:rPr>
-                <w:rFonts w:ascii="TH SarabunIT๙" w:hAnsi="TH SarabunIT๙" w:cs="TH SarabunIT๙"/>
-                <w:sz w:val="28"/>
-              </w:rPr>
-            </w:pPr>
-          </w:p>
-        </w:tc>
-        <w:tc>
-          <w:tcPr>
-            <w:tcW w:w="1417" w:type="dxa"/>
-          </w:tcPr>
-          <w:p>
-            <w:pPr>
-              <w:tabs>
-                <w:tab w:val="left" w:pos="270"/>
-              </w:tabs>
-              <w:spacing w:after="0" w:line="240" w:lineRule="auto"/>
-              <w:jc w:val="center"/>
-              <w:rPr>
-                <w:rFonts w:ascii="TH SarabunIT๙" w:hAnsi="TH SarabunIT๙" w:cs="TH SarabunIT๙"/>
-                <w:sz w:val="28"/>
-              </w:rPr>
-            </w:pPr>
-          </w:p>
-        </w:tc>
-        <w:tc>
-          <w:tcPr>
-            <w:tcW w:w="1129" w:type="dxa"/>
-          </w:tcPr>
-          <w:p>
-            <w:pPr>
-              <w:tabs>
-                <w:tab w:val="left" w:pos="270"/>
-              </w:tabs>
-              <w:spacing w:after="0" w:line="240" w:lineRule="auto"/>
-              <w:jc w:val="center"/>
-              <w:rPr>
-                <w:rFonts w:ascii="TH SarabunIT๙" w:hAnsi="TH SarabunIT๙" w:cs="TH SarabunIT๙"/>
-                <w:sz w:val="28"/>
-                <w:cs/>
-              </w:rPr>
-            </w:pPr>
-          </w:p>
-        </w:tc>
-      </w:tr>
-      <w:tr>
-        <w:tc>
-          <w:tcPr>
-            <w:tcW w:w="1613" w:type="dxa"/>
-          </w:tcPr>
-          <w:p>
-            <w:pPr>
-              <w:tabs>
-                <w:tab w:val="left" w:pos="270"/>
-              </w:tabs>
-              <w:spacing w:after="0" w:line="240" w:lineRule="auto"/>
-              <w:rPr>
-                <w:rFonts w:ascii="TH SarabunIT๙" w:hAnsi="TH SarabunIT๙" w:cs="TH SarabunIT๙"/>
-                <w:sz w:val="28"/>
-              </w:rPr>
-            </w:pPr>
-          </w:p>
-        </w:tc>
-        <w:tc>
-          <w:tcPr>
-            <w:tcW w:w="1198" w:type="dxa"/>
-          </w:tcPr>
-          <w:p>
-            <w:pPr>
-              <w:tabs>
-                <w:tab w:val="left" w:pos="270"/>
-              </w:tabs>
-              <w:spacing w:after="0" w:line="240" w:lineRule="auto"/>
-              <w:jc w:val="center"/>
-              <w:rPr>
-                <w:rFonts w:ascii="TH SarabunIT๙" w:hAnsi="TH SarabunIT๙" w:cs="TH SarabunIT๙"/>
-                <w:sz w:val="28"/>
-              </w:rPr>
-            </w:pPr>
-          </w:p>
-        </w:tc>
-        <w:tc>
-          <w:tcPr>
-            <w:tcW w:w="1134" w:type="dxa"/>
-          </w:tcPr>
-          <w:p>
-            <w:pPr>
-              <w:tabs>
-                <w:tab w:val="left" w:pos="270"/>
-              </w:tabs>
-              <w:spacing w:after="0" w:line="240" w:lineRule="auto"/>
-              <w:jc w:val="center"/>
-              <w:rPr>
-                <w:rFonts w:ascii="TH SarabunIT๙" w:hAnsi="TH SarabunIT๙" w:cs="TH SarabunIT๙"/>
-                <w:sz w:val="28"/>
-              </w:rPr>
-            </w:pPr>
-          </w:p>
-        </w:tc>
-        <w:tc>
-          <w:tcPr>
-            <w:tcW w:w="2410" w:type="dxa"/>
-          </w:tcPr>
-          <w:p>
-            <w:pPr>
-              <w:tabs>
-                <w:tab w:val="left" w:pos="270"/>
-              </w:tabs>
-              <w:spacing w:after="0" w:line="240" w:lineRule="auto"/>
-              <w:jc w:val="center"/>
-              <w:rPr>
-                <w:rFonts w:ascii="TH SarabunIT๙" w:hAnsi="TH SarabunIT๙" w:cs="TH SarabunIT๙"/>
-                <w:sz w:val="28"/>
-              </w:rPr>
-            </w:pPr>
-          </w:p>
-        </w:tc>
-        <w:tc>
-          <w:tcPr>
-            <w:tcW w:w="1417" w:type="dxa"/>
-          </w:tcPr>
-          <w:p>
-            <w:pPr>
-              <w:tabs>
-                <w:tab w:val="left" w:pos="270"/>
-              </w:tabs>
-              <w:spacing w:after="0" w:line="240" w:lineRule="auto"/>
-              <w:jc w:val="center"/>
-              <w:rPr>
-                <w:rFonts w:ascii="TH SarabunIT๙" w:hAnsi="TH SarabunIT๙" w:cs="TH SarabunIT๙"/>
-                <w:sz w:val="28"/>
-              </w:rPr>
-            </w:pPr>
-          </w:p>
-        </w:tc>
-        <w:tc>
-          <w:tcPr>
-            <w:tcW w:w="1129" w:type="dxa"/>
-          </w:tcPr>
-          <w:p>
-            <w:pPr>
-              <w:tabs>
-                <w:tab w:val="left" w:pos="270"/>
-              </w:tabs>
-              <w:spacing w:after="0" w:line="240" w:lineRule="auto"/>
-              <w:jc w:val="center"/>
-              <w:rPr>
-                <w:rFonts w:ascii="TH SarabunIT๙" w:hAnsi="TH SarabunIT๙" w:cs="TH SarabunIT๙"/>
-                <w:sz w:val="28"/>
-              </w:rPr>
-            </w:pPr>
-          </w:p>
-        </w:tc>
-      </w:tr>
-      <w:tr>
-        <w:tc>
-          <w:tcPr>
-            <w:tcW w:w="1613" w:type="dxa"/>
-          </w:tcPr>
-          <w:p>
-            <w:pPr>
-              <w:tabs>
-                <w:tab w:val="left" w:pos="270"/>
-              </w:tabs>
-              <w:spacing w:after="0" w:line="240" w:lineRule="auto"/>
-              <w:rPr>
-                <w:rFonts w:ascii="TH SarabunIT๙" w:hAnsi="TH SarabunIT๙" w:cs="TH SarabunIT๙"/>
-                <w:sz w:val="28"/>
-              </w:rPr>
-            </w:pPr>
-          </w:p>
-        </w:tc>
-        <w:tc>
-          <w:tcPr>
-            <w:tcW w:w="1198" w:type="dxa"/>
-          </w:tcPr>
-          <w:p>
-            <w:pPr>
-              <w:tabs>
-                <w:tab w:val="left" w:pos="270"/>
-              </w:tabs>
-              <w:spacing w:after="0" w:line="240" w:lineRule="auto"/>
-              <w:jc w:val="center"/>
-              <w:rPr>
-                <w:rFonts w:ascii="TH SarabunIT๙" w:hAnsi="TH SarabunIT๙" w:cs="TH SarabunIT๙"/>
-                <w:sz w:val="28"/>
-              </w:rPr>
-            </w:pPr>
-          </w:p>
-        </w:tc>
-        <w:tc>
-          <w:tcPr>
-            <w:tcW w:w="1134" w:type="dxa"/>
-          </w:tcPr>
-          <w:p>
-            <w:pPr>
-              <w:tabs>
-                <w:tab w:val="left" w:pos="270"/>
-              </w:tabs>
-              <w:spacing w:after="0" w:line="240" w:lineRule="auto"/>
-              <w:jc w:val="center"/>
-              <w:rPr>
-                <w:rFonts w:ascii="TH SarabunIT๙" w:hAnsi="TH SarabunIT๙" w:cs="TH SarabunIT๙"/>
-                <w:sz w:val="28"/>
-              </w:rPr>
-            </w:pPr>
-          </w:p>
-        </w:tc>
-        <w:tc>
-          <w:tcPr>
-            <w:tcW w:w="2410" w:type="dxa"/>
-          </w:tcPr>
-          <w:p>
-            <w:pPr>
-              <w:tabs>
-                <w:tab w:val="left" w:pos="270"/>
-              </w:tabs>
-              <w:spacing w:after="0" w:line="240" w:lineRule="auto"/>
-              <w:jc w:val="center"/>
-              <w:rPr>
-                <w:rFonts w:ascii="TH SarabunIT๙" w:hAnsi="TH SarabunIT๙" w:cs="TH SarabunIT๙"/>
-                <w:sz w:val="28"/>
-              </w:rPr>
-            </w:pPr>
-          </w:p>
-        </w:tc>
-        <w:tc>
-          <w:tcPr>
-            <w:tcW w:w="1417" w:type="dxa"/>
-          </w:tcPr>
-          <w:p>
-            <w:pPr>
-              <w:tabs>
-                <w:tab w:val="left" w:pos="270"/>
-              </w:tabs>
-              <w:spacing w:after="0" w:line="240" w:lineRule="auto"/>
-              <w:jc w:val="center"/>
-              <w:rPr>
-                <w:rFonts w:ascii="TH SarabunIT๙" w:hAnsi="TH SarabunIT๙" w:cs="TH SarabunIT๙"/>
-                <w:sz w:val="28"/>
-              </w:rPr>
-            </w:pPr>
-          </w:p>
-        </w:tc>
-        <w:tc>
-          <w:tcPr>
-            <w:tcW w:w="1129" w:type="dxa"/>
-          </w:tcPr>
-          <w:p>
-            <w:pPr>
-              <w:tabs>
-                <w:tab w:val="left" w:pos="270"/>
-              </w:tabs>
-              <w:spacing w:after="0" w:line="240" w:lineRule="auto"/>
-              <w:jc w:val="center"/>
-              <w:rPr>
-                <w:rFonts w:ascii="TH SarabunIT๙" w:hAnsi="TH SarabunIT๙" w:cs="TH SarabunIT๙"/>
-                <w:sz w:val="28"/>
-              </w:rPr>
-            </w:pPr>
+              <w:t>}</w:t>
+            </w:r>
           </w:p>
         </w:tc>
       </w:tr>
@@ -6914,11 +7203,176 @@
           <w:tab w:val="left" w:pos="270"/>
         </w:tabs>
         <w:spacing w:after="0" w:line="240" w:lineRule="auto"/>
-        <w:ind w:left="728" w:hanging="728"/>
-        <w:rPr>
-          <w:rFonts w:ascii="TH SarabunIT๙" w:hAnsi="TH SarabunIT๙" w:cs="TH SarabunIT๙"/>
-          <w:strike/>
-          <w:color w:val="FF0000"/>
+        <w:rPr>
+          <w:rFonts w:ascii="TH SarabunIT๙" w:hAnsi="TH SarabunIT๙" w:cs="TH SarabunIT๙"/>
+          <w:sz w:val="32"/>
+          <w:szCs w:val="32"/>
+        </w:rPr>
+      </w:pPr>
+      <w:r>
+        <w:rPr>
+          <w:rFonts w:ascii="TH SarabunIT๙" w:hAnsi="TH SarabunIT๙" w:cs="TH SarabunIT๙"/>
+          <w:sz w:val="32"/>
+          <w:szCs w:val="32"/>
+        </w:rPr>
+        <w:tab/>
+      </w:r>
+      <w:r>
+        <w:rPr>
+          <w:rFonts w:ascii="TH SarabunIT๙" w:hAnsi="TH SarabunIT๙" w:cs="TH SarabunIT๙"/>
+          <w:sz w:val="32"/>
+          <w:szCs w:val="32"/>
+        </w:rPr>
+        <w:tab/>
+        <w:t>{/</w:t>
+      </w:r>
+      <w:proofErr w:type="spellStart"/>
+      <w:r>
+        <w:rPr>
+          <w:rFonts w:ascii="TH SarabunIT๙" w:hAnsi="TH SarabunIT๙" w:cs="TH SarabunIT๙"/>
+          <w:sz w:val="32"/>
+          <w:szCs w:val="32"/>
+        </w:rPr>
+        <w:t>hasEquipment</w:t>
+      </w:r>
+      <w:proofErr w:type="spellEnd"/>
+      <w:r>
+        <w:rPr>
+          <w:rFonts w:ascii="TH SarabunIT๙" w:hAnsi="TH SarabunIT๙" w:cs="TH SarabunIT๙"/>
+          <w:sz w:val="32"/>
+          <w:szCs w:val="32"/>
+        </w:rPr>
+        <w:t>}</w:t>
+      </w:r>
+    </w:p>
+    <w:p>
+      <w:pPr>
+        <w:tabs>
+          <w:tab w:val="left" w:pos="270"/>
+        </w:tabs>
+        <w:spacing w:after="120" w:line="240" w:lineRule="auto"/>
+        <w:ind w:left="720" w:hanging="14"/>
+        <w:rPr>
+          <w:rFonts w:ascii="TH SarabunIT๙" w:hAnsi="TH SarabunIT๙" w:cs="TH SarabunIT๙"/>
+          <w:sz w:val="32"/>
+          <w:szCs w:val="32"/>
+        </w:rPr>
+      </w:pPr>
+      <w:r>
+        <w:rPr>
+          <w:rFonts w:ascii="TH SarabunIT๙" w:hAnsi="TH SarabunIT๙" w:cs="TH SarabunIT๙"/>
+          <w:sz w:val="32"/>
+          <w:szCs w:val="32"/>
+        </w:rPr>
+        <w:t>{^</w:t>
+      </w:r>
+      <w:proofErr w:type="spellStart"/>
+      <w:r>
+        <w:rPr>
+          <w:rFonts w:ascii="TH SarabunIT๙" w:hAnsi="TH SarabunIT๙" w:cs="TH SarabunIT๙"/>
+          <w:sz w:val="32"/>
+          <w:szCs w:val="32"/>
+        </w:rPr>
+        <w:t>hasEquipment</w:t>
+      </w:r>
+      <w:proofErr w:type="spellEnd"/>
+      <w:r>
+        <w:rPr>
+          <w:rFonts w:ascii="TH SarabunIT๙" w:hAnsi="TH SarabunIT๙" w:cs="TH SarabunIT๙"/>
+          <w:sz w:val="32"/>
+          <w:szCs w:val="32"/>
+        </w:rPr>
+        <w:t>}</w:t>
+      </w:r>
+    </w:p>
+    <w:p>
+      <w:pPr>
+        <w:tabs>
+          <w:tab w:val="left" w:pos="270"/>
+        </w:tabs>
+        <w:spacing w:after="120" w:line="240" w:lineRule="auto"/>
+        <w:ind w:left="720" w:hanging="14"/>
+        <w:jc w:val="center"/>
+        <w:rPr>
+          <w:rFonts w:ascii="TH SarabunIT๙" w:hAnsi="TH SarabunIT๙" w:cs="TH SarabunIT๙"/>
+          <w:sz w:val="32"/>
+          <w:szCs w:val="32"/>
+        </w:rPr>
+      </w:pPr>
+      <w:r>
+        <w:rPr>
+          <w:rFonts w:ascii="TH SarabunIT๙" w:hAnsi="TH SarabunIT๙" w:cs="TH SarabunIT๙"/>
+          <w:sz w:val="32"/>
+          <w:szCs w:val="32"/>
+        </w:rPr>
+        <w:t xml:space="preserve">“- </w:t>
+      </w:r>
+      <w:r>
+        <w:rPr>
+          <w:rFonts w:ascii="TH SarabunIT๙" w:hAnsi="TH SarabunIT๙" w:cs="TH SarabunIT๙" w:hint="cs"/>
+          <w:sz w:val="32"/>
+          <w:szCs w:val="32"/>
+          <w:cs/>
+        </w:rPr>
+        <w:t xml:space="preserve">ไม่มี </w:t>
+      </w:r>
+      <w:r>
+        <w:rPr>
+          <w:rFonts w:ascii="TH SarabunIT๙" w:hAnsi="TH SarabunIT๙" w:cs="TH SarabunIT๙"/>
+          <w:sz w:val="32"/>
+          <w:szCs w:val="32"/>
+        </w:rPr>
+        <w:t>-”</w:t>
+      </w:r>
+    </w:p>
+    <w:p>
+      <w:pPr>
+        <w:tabs>
+          <w:tab w:val="left" w:pos="270"/>
+        </w:tabs>
+        <w:spacing w:after="120" w:line="240" w:lineRule="auto"/>
+        <w:ind w:left="720" w:hanging="14"/>
+        <w:rPr>
+          <w:rFonts w:ascii="TH SarabunIT๙" w:hAnsi="TH SarabunIT๙" w:cs="TH SarabunIT๙"/>
+          <w:sz w:val="32"/>
+          <w:szCs w:val="32"/>
+        </w:rPr>
+      </w:pPr>
+      <w:r>
+        <w:rPr>
+          <w:rFonts w:ascii="TH SarabunIT๙" w:hAnsi="TH SarabunIT๙" w:cs="TH SarabunIT๙"/>
+          <w:sz w:val="32"/>
+          <w:szCs w:val="32"/>
+        </w:rPr>
+        <w:t>{/</w:t>
+      </w:r>
+      <w:proofErr w:type="spellStart"/>
+      <w:r>
+        <w:rPr>
+          <w:rFonts w:ascii="TH SarabunIT๙" w:hAnsi="TH SarabunIT๙" w:cs="TH SarabunIT๙"/>
+          <w:sz w:val="32"/>
+          <w:szCs w:val="32"/>
+        </w:rPr>
+        <w:t>hasEquipment</w:t>
+      </w:r>
+      <w:proofErr w:type="spellEnd"/>
+      <w:r>
+        <w:rPr>
+          <w:rFonts w:ascii="TH SarabunIT๙" w:hAnsi="TH SarabunIT๙" w:cs="TH SarabunIT๙"/>
+          <w:sz w:val="32"/>
+          <w:szCs w:val="32"/>
+        </w:rPr>
+        <w:t>}</w:t>
+      </w:r>
+    </w:p>
+    <w:p>
+      <w:pPr>
+        <w:tabs>
+          <w:tab w:val="left" w:pos="270"/>
+        </w:tabs>
+        <w:spacing w:after="0" w:line="240" w:lineRule="auto"/>
+        <w:rPr>
+          <w:rFonts w:ascii="TH SarabunIT๙" w:hAnsi="TH SarabunIT๙" w:cs="TH SarabunIT๙"/>
           <w:sz w:val="32"/>
           <w:szCs w:val="32"/>
         </w:rPr>
@@ -6945,6 +7399,7 @@
           <w:sz w:val="32"/>
           <w:szCs w:val="32"/>
         </w:rPr>
+        <w:lastRenderedPageBreak/>
         <w:t>7</w:t>
       </w:r>
       <w:r>
@@ -7743,7 +8198,6 @@
           <w:sz w:val="32"/>
           <w:szCs w:val="32"/>
         </w:rPr>
-        <w:lastRenderedPageBreak/>
         <w:t>7</w:t>
       </w:r>
       <w:r>
@@ -8576,7 +9030,6 @@
           <w:rFonts w:ascii="TH SarabunIT๙" w:hAnsi="TH SarabunIT๙" w:cs="TH SarabunIT๙"/>
           <w:sz w:val="32"/>
           <w:szCs w:val="32"/>
-          <w:cs/>
         </w:rPr>
       </w:pPr>
       <w:r>
@@ -9948,7 +10401,6 @@
                 <w:szCs w:val="32"/>
                 <w:cs/>
               </w:rPr>
-              <w:lastRenderedPageBreak/>
               <w:t>1.</w:t>
             </w:r>
             <w:r>
@@ -10004,22 +10456,40 @@
                 <w:szCs w:val="32"/>
               </w:rPr>
             </w:pPr>
-          </w:p>
-        </w:tc>
-      </w:tr>
-      <w:tr>
-        <w:tc>
-          <w:tcPr>
-            <w:tcW w:w="6374" w:type="dxa"/>
-          </w:tcPr>
-          <w:p>
-            <w:pPr>
-              <w:spacing w:after="0" w:line="240" w:lineRule="auto"/>
+            <w:proofErr w:type="spellStart"/>
+            <w:r>
               <w:rPr>
                 <w:rFonts w:ascii="TH SarabunIT๙" w:hAnsi="TH SarabunIT๙" w:cs="TH SarabunIT๙"/>
                 <w:sz w:val="32"/>
                 <w:szCs w:val="32"/>
               </w:rPr>
+              <w:t>Calulated</w:t>
+            </w:r>
+            <w:proofErr w:type="spellEnd"/>
+            <w:r>
+              <w:rPr>
+                <w:rFonts w:ascii="TH SarabunIT๙" w:hAnsi="TH SarabunIT๙" w:cs="TH SarabunIT๙"/>
+                <w:sz w:val="32"/>
+                <w:szCs w:val="32"/>
+              </w:rPr>
+              <w:t xml:space="preserve"> or Manual </w:t>
+            </w:r>
+          </w:p>
+        </w:tc>
+      </w:tr>
+      <w:tr>
+        <w:tc>
+          <w:tcPr>
+            <w:tcW w:w="6374" w:type="dxa"/>
+          </w:tcPr>
+          <w:p>
+            <w:pPr>
+              <w:spacing w:after="0" w:line="240" w:lineRule="auto"/>
+              <w:rPr>
+                <w:rFonts w:ascii="TH SarabunIT๙" w:hAnsi="TH SarabunIT๙" w:cs="TH SarabunIT๙"/>
+                <w:sz w:val="32"/>
+                <w:szCs w:val="32"/>
+              </w:rPr>
             </w:pPr>
             <w:r>
               <w:rPr>
@@ -10044,7 +10514,7 @@
             <w:pPr>
               <w:spacing w:after="0" w:line="240" w:lineRule="auto"/>
               <w:rPr>
-                <w:rFonts w:ascii="TH SarabunIT๙" w:hAnsi="TH SarabunIT๙" w:cs="TH SarabunIT๙"/>
+                <w:rFonts w:ascii="TH SarabunIT๙" w:hAnsi="TH SarabunIT๙" w:cs="TH SarabunIT๙" w:hint="cs"/>
                 <w:sz w:val="32"/>
                 <w:szCs w:val="32"/>
                 <w:cs/>
@@ -10070,9 +10540,10 @@
               <w:spacing w:after="0" w:line="240" w:lineRule="auto"/>
               <w:jc w:val="right"/>
               <w:rPr>
-                <w:rFonts w:ascii="TH SarabunIT๙" w:hAnsi="TH SarabunIT๙" w:cs="TH SarabunIT๙"/>
+                <w:rFonts w:ascii="TH SarabunIT๙" w:hAnsi="TH SarabunIT๙" w:cs="TH SarabunIT๙" w:hint="cs"/>
                 <w:sz w:val="32"/>
                 <w:szCs w:val="32"/>
+                <w:cs/>
               </w:rPr>
             </w:pPr>
           </w:p>
@@ -11530,6 +12001,7 @@
                 <w:sz w:val="24"/>
                 <w:szCs w:val="24"/>
               </w:rPr>
+              <w:lastRenderedPageBreak/>
               <w:sym w:font="Wingdings 2" w:char="F0A3"/>
             </w:r>
             <w:r>
@@ -11849,6 +12321,7 @@
                 <w:sz w:val="28"/>
                 <w:cs/>
               </w:rPr>
+              <w:lastRenderedPageBreak/>
               <w:t>รวมทั้งสิ้น</w:t>
             </w:r>
           </w:p>
@@ -12065,7 +12538,6 @@
                 <w:sz w:val="28"/>
                 <w:cs/>
               </w:rPr>
-              <w:lastRenderedPageBreak/>
               <w:t>ลำดับ</w:t>
             </w:r>
           </w:p>
@@ -13945,6 +14417,7 @@
           <w:sz w:val="24"/>
           <w:szCs w:val="24"/>
         </w:rPr>
+        <w:lastRenderedPageBreak/>
         <w:t>(</w:t>
       </w:r>
       <w:r>
@@ -14313,13 +14786,14 @@
         <w:spacing w:after="0" w:line="240" w:lineRule="auto"/>
         <w:ind w:left="1170"/>
         <w:rPr>
-          <w:rFonts w:ascii="TH SarabunPSK" w:hAnsi="TH SarabunPSK" w:cs="TH SarabunPSK"/>
+          <w:rFonts w:ascii="TH SarabunPSK" w:hAnsi="TH SarabunPSK" w:cs="TH SarabunPSK" w:hint="cs"/>
           <w:i/>
           <w:iCs/>
           <w:color w:val="000000"/>
           <w:kern w:val="32"/>
           <w:sz w:val="24"/>
           <w:szCs w:val="24"/>
+          <w:cs/>
         </w:rPr>
       </w:pPr>
     </w:p>
@@ -14480,7 +14954,6 @@
                 <w:szCs w:val="22"/>
                 <w:cs/>
               </w:rPr>
-              <w:lastRenderedPageBreak/>
               <w:t>ลำดับ</w:t>
             </w:r>
           </w:p>
@@ -18412,6 +18885,7 @@
           <w:szCs w:val="32"/>
           <w:cs/>
         </w:rPr>
+        <w:lastRenderedPageBreak/>
         <w:t>หน้าที่ความรับผิดชอบของบุคลากรในแต่ละตำแหน่ง (ในกรณีมีค่าใช้จ่ายบุคลากร)</w:t>
       </w:r>
     </w:p>
@@ -18926,7 +19400,6 @@
           <w:szCs w:val="32"/>
           <w:cs/>
         </w:rPr>
-        <w:lastRenderedPageBreak/>
         <w:t>หลักสูตร ....................................................................................................................................................</w:t>
       </w:r>
     </w:p>
@@ -21103,6 +21576,7 @@
                 <w:szCs w:val="32"/>
                 <w:cs/>
               </w:rPr>
+              <w:lastRenderedPageBreak/>
               <w:t>(บาท)</w:t>
             </w:r>
           </w:p>
@@ -21134,6 +21608,7 @@
                 <w:szCs w:val="32"/>
                 <w:cs/>
               </w:rPr>
+              <w:lastRenderedPageBreak/>
               <w:t xml:space="preserve">รวม </w:t>
             </w:r>
           </w:p>
@@ -21160,6 +21635,7 @@
                 <w:szCs w:val="32"/>
                 <w:cs/>
               </w:rPr>
+              <w:lastRenderedPageBreak/>
               <w:t>(บาท)</w:t>
             </w:r>
           </w:p>
@@ -21192,6 +21668,7 @@
                 <w:szCs w:val="32"/>
                 <w:cs/>
               </w:rPr>
+              <w:lastRenderedPageBreak/>
               <w:t>หมายเหตุ</w:t>
             </w:r>
           </w:p>
@@ -21831,7 +22308,6 @@
           <w:szCs w:val="32"/>
           <w:cs/>
         </w:rPr>
-        <w:lastRenderedPageBreak/>
         <w:t>๑๐</w:t>
       </w:r>
       <w:r>
@@ -22482,52 +22958,6 @@
       <w:pPr>
         <w:spacing w:before="240" w:after="0" w:line="240" w:lineRule="auto"/>
         <w:rPr>
-          <w:rFonts w:ascii="TH SarabunIT๙" w:hAnsi="TH SarabunIT๙" w:cs="TH SarabunIT๙"/>
-          <w:b/>
-          <w:bCs/>
-          <w:color w:val="000000"/>
-          <w:sz w:val="32"/>
-          <w:szCs w:val="32"/>
-        </w:rPr>
-      </w:pPr>
-      <w:r>
-        <w:rPr>
-          <w:rFonts w:ascii="TH SarabunIT๙" w:hAnsi="TH SarabunIT๙" w:cs="TH SarabunIT๙"/>
-          <w:b/>
-          <w:bCs/>
-          <w:color w:val="000000"/>
-          <w:sz w:val="32"/>
-          <w:szCs w:val="32"/>
-          <w:cs/>
-        </w:rPr>
-        <w:t>๑</w:t>
-      </w:r>
-      <w:r>
-        <w:rPr>
-          <w:rFonts w:ascii="TH SarabunIT๙" w:hAnsi="TH SarabunIT๙" w:cs="TH SarabunIT๙"/>
-          <w:b/>
-          <w:bCs/>
-          <w:color w:val="000000"/>
-          <w:sz w:val="32"/>
-          <w:szCs w:val="32"/>
-          <w:cs/>
-        </w:rPr>
-        <w:t>2</w:t>
-      </w:r>
-      <w:r>
-        <w:rPr>
-          <w:rFonts w:ascii="TH SarabunIT๙" w:hAnsi="TH SarabunIT๙" w:cs="TH SarabunIT๙"/>
-          <w:b/>
-          <w:bCs/>
-          <w:color w:val="000000"/>
-          <w:sz w:val="32"/>
-          <w:szCs w:val="32"/>
-          <w:cs/>
-        </w:rPr>
-        <w:t xml:space="preserve">. </w:t>
-      </w:r>
-      <w:r>
-        <w:rPr>
           <w:rFonts w:ascii="TH SarabunIT๙" w:hAnsi="TH SarabunIT๙" w:cs="TH SarabunIT๙" w:hint="cs"/>
           <w:b/>
           <w:bCs/>
@@ -22536,7 +22966,77 @@
           <w:szCs w:val="32"/>
           <w:cs/>
         </w:rPr>
-        <w:t>เอกสารนำเสนอโครงการ</w:t>
+      </w:pPr>
+      <w:r>
+        <w:rPr>
+          <w:rFonts w:ascii="TH SarabunIT๙" w:hAnsi="TH SarabunIT๙" w:cs="TH SarabunIT๙"/>
+          <w:b/>
+          <w:bCs/>
+          <w:color w:val="000000"/>
+          <w:sz w:val="32"/>
+          <w:szCs w:val="32"/>
+          <w:cs/>
+        </w:rPr>
+        <w:t>๑</w:t>
+      </w:r>
+      <w:r>
+        <w:rPr>
+          <w:rFonts w:ascii="TH SarabunIT๙" w:hAnsi="TH SarabunIT๙" w:cs="TH SarabunIT๙"/>
+          <w:b/>
+          <w:bCs/>
+          <w:color w:val="000000"/>
+          <w:sz w:val="32"/>
+          <w:szCs w:val="32"/>
+          <w:cs/>
+        </w:rPr>
+        <w:t>2</w:t>
+      </w:r>
+      <w:r>
+        <w:rPr>
+          <w:rFonts w:ascii="TH SarabunIT๙" w:hAnsi="TH SarabunIT๙" w:cs="TH SarabunIT๙"/>
+          <w:b/>
+          <w:bCs/>
+          <w:color w:val="000000"/>
+          <w:sz w:val="32"/>
+          <w:szCs w:val="32"/>
+          <w:cs/>
+        </w:rPr>
+        <w:t xml:space="preserve">. </w:t>
+      </w:r>
+      <w:r>
+        <w:rPr>
+          <w:rFonts w:ascii="TH SarabunIT๙" w:hAnsi="TH SarabunIT๙" w:cs="TH SarabunIT๙" w:hint="cs"/>
+          <w:b/>
+          <w:bCs/>
+          <w:color w:val="000000"/>
+          <w:sz w:val="32"/>
+          <w:szCs w:val="32"/>
+          <w:cs/>
+        </w:rPr>
+        <w:t>โครงการนี้อยู่ใน</w:t>
+      </w:r>
+      <w:r>
+        <w:rPr>
+          <w:rFonts w:ascii="TH SarabunIT๙" w:hAnsi="TH SarabunIT๙" w:cs="TH SarabunIT๙"/>
+          <w:b/>
+          <w:bCs/>
+          <w:color w:val="000000"/>
+          <w:sz w:val="32"/>
+          <w:szCs w:val="32"/>
+        </w:rPr>
+        <w:t xml:space="preserve"> Roadmap </w:t>
+      </w:r>
+      <w:r>
+        <w:rPr>
+          <w:rFonts w:ascii="TH SarabunIT๙" w:hAnsi="TH SarabunIT๙" w:cs="TH SarabunIT๙" w:hint="cs"/>
+          <w:b/>
+          <w:bCs/>
+          <w:color w:val="000000"/>
+          <w:sz w:val="32"/>
+          <w:szCs w:val="32"/>
+          <w:cs/>
+        </w:rPr>
+        <w:t>ของหน่วยงานหรือไม่</w:t>
       </w:r>
     </w:p>
     <w:p>
@@ -22544,10 +23044,11 @@
         <w:spacing w:after="0" w:line="240" w:lineRule="auto"/>
         <w:ind w:firstLine="567"/>
         <w:rPr>
-          <w:rFonts w:ascii="TH SarabunIT๙" w:hAnsi="TH SarabunIT๙" w:cs="TH SarabunIT๙"/>
-          <w:color w:val="000000"/>
-          <w:sz w:val="32"/>
-          <w:szCs w:val="32"/>
+          <w:rFonts w:ascii="TH SarabunIT๙" w:hAnsi="TH SarabunIT๙" w:cs="TH SarabunIT๙" w:hint="cs"/>
+          <w:color w:val="000000"/>
+          <w:sz w:val="32"/>
+          <w:szCs w:val="32"/>
+          <w:cs/>
         </w:rPr>
       </w:pPr>
       <w:r>
@@ -22567,16 +23068,17 @@
           <w:szCs w:val="32"/>
           <w:cs/>
         </w:rPr>
-        <w:t xml:space="preserve"> เอกสารสรุปโครงการ </w:t>
-      </w:r>
-      <w:r>
-        <w:rPr>
-          <w:rFonts w:ascii="TH SarabunIT๙" w:hAnsi="TH SarabunIT๙" w:cs="TH SarabunIT๙"/>
-          <w:color w:val="000000"/>
-          <w:sz w:val="32"/>
-          <w:szCs w:val="32"/>
-        </w:rPr>
-        <w:t>One Page</w:t>
+        <w:t xml:space="preserve"> </w:t>
+      </w:r>
+      <w:r>
+        <w:rPr>
+          <w:rFonts w:ascii="TH SarabunIT๙" w:hAnsi="TH SarabunIT๙" w:cs="TH SarabunIT๙" w:hint="cs"/>
+          <w:color w:val="000000"/>
+          <w:sz w:val="32"/>
+          <w:szCs w:val="32"/>
+          <w:cs/>
+        </w:rPr>
+        <w:t>อยู่</w:t>
       </w:r>
     </w:p>
     <w:p>
@@ -22584,7 +23086,7 @@
         <w:spacing w:after="0" w:line="240" w:lineRule="auto"/>
         <w:ind w:firstLine="567"/>
         <w:rPr>
-          <w:rFonts w:ascii="TH SarabunIT๙" w:hAnsi="TH SarabunIT๙" w:cs="TH SarabunIT๙"/>
+          <w:rFonts w:ascii="TH SarabunIT๙" w:hAnsi="TH SarabunIT๙" w:cs="TH SarabunIT๙" w:hint="cs"/>
           <w:color w:val="000000"/>
           <w:sz w:val="32"/>
           <w:szCs w:val="32"/>
@@ -22617,66 +23119,7 @@
           <w:szCs w:val="32"/>
           <w:cs/>
         </w:rPr>
-        <w:t>เอกสารนำเสนอประโยชน์ที่</w:t>
-      </w:r>
-      <w:r>
-        <w:rPr>
-          <w:rFonts w:ascii="TH SarabunIT๙" w:hAnsi="TH SarabunIT๙" w:cs="TH SarabunIT๙" w:hint="cs"/>
-          <w:color w:val="000000"/>
-          <w:sz w:val="32"/>
-          <w:szCs w:val="32"/>
-          <w:cs/>
-        </w:rPr>
-        <w:t>คาดว่าจะ</w:t>
-      </w:r>
-      <w:r>
-        <w:rPr>
-          <w:rFonts w:ascii="TH SarabunIT๙" w:hAnsi="TH SarabunIT๙" w:cs="TH SarabunIT๙" w:hint="cs"/>
-          <w:color w:val="000000"/>
-          <w:sz w:val="32"/>
-          <w:szCs w:val="32"/>
-          <w:cs/>
-        </w:rPr>
-        <w:t>ได้จากการ</w:t>
-      </w:r>
-      <w:r>
-        <w:rPr>
-          <w:rFonts w:ascii="TH SarabunIT๙" w:hAnsi="TH SarabunIT๙" w:cs="TH SarabunIT๙" w:hint="cs"/>
-          <w:color w:val="000000"/>
-          <w:sz w:val="32"/>
-          <w:szCs w:val="32"/>
-          <w:cs/>
-        </w:rPr>
-        <w:t>ดำเนินการ</w:t>
-      </w:r>
-      <w:r>
-        <w:rPr>
-          <w:rFonts w:ascii="TH SarabunIT๙" w:hAnsi="TH SarabunIT๙" w:cs="TH SarabunIT๙" w:hint="cs"/>
-          <w:color w:val="000000"/>
-          <w:sz w:val="32"/>
-          <w:szCs w:val="32"/>
-          <w:cs/>
-        </w:rPr>
-        <w:t xml:space="preserve"> ก่อนทำ-หลังทำ (</w:t>
-      </w:r>
-      <w:r>
-        <w:rPr>
-          <w:rFonts w:ascii="TH SarabunIT๙" w:hAnsi="TH SarabunIT๙" w:cs="TH SarabunIT๙"/>
-          <w:color w:val="000000"/>
-          <w:sz w:val="32"/>
-          <w:szCs w:val="32"/>
-        </w:rPr>
-        <w:t>Before and After</w:t>
-      </w:r>
-      <w:r>
-        <w:rPr>
-          <w:rFonts w:ascii="TH SarabunIT๙" w:hAnsi="TH SarabunIT๙" w:cs="TH SarabunIT๙" w:hint="cs"/>
-          <w:color w:val="000000"/>
-          <w:sz w:val="32"/>
-          <w:szCs w:val="32"/>
-          <w:cs/>
-        </w:rPr>
-        <w:t>)</w:t>
+        <w:t>ไม่อยู่</w:t>
       </w:r>
     </w:p>
     <w:p>
@@ -22845,6 +23288,7 @@
           <w:sz w:val="32"/>
           <w:szCs w:val="32"/>
         </w:rPr>
+        <w:lastRenderedPageBreak/>
         <w:t>e-Mail</w:t>
       </w:r>
       <w:r>
@@ -26159,6 +26603,7 @@
   <w:style w:type="paragraph" w:default="1" w:styleId="Normal">
     <w:name w:val="Normal"/>
     <w:qFormat/>
+    <w:rsid w:val="00F04576"/>
     <w:pPr>
       <w:spacing w:after="200" w:line="276" w:lineRule="auto"/>
     </w:pPr>

</xml_diff>

<commit_message>
Refactor Project Steps 3, 5, and Types for Improved File Upload and Document Generation
- Updated ProjectStep3 component to handle single file uploads with descriptions, including image previews and validation.
- Changed file upload logic to support only image files and updated related error handling.
- Refactored ProjectStep5 to streamline document generation, including new loading states and improved form validation.
- Enhanced types in project types file to reflect changes in file handling and validation requirements.
- Updated document generation logic to convert images to Base64 for inclusion in the generated Word document.
</commit_message>
<xml_diff>
--- a/public/templates/project-proposal.docx
+++ b/public/templates/project-proposal.docx
@@ -8960,6 +8960,94 @@
           <w:tab w:val="left" w:pos="284"/>
         </w:tabs>
         <w:spacing w:after="0" w:line="240" w:lineRule="auto"/>
+        <w:jc w:val="center"/>
+        <w:rPr>
+          <w:rFonts w:ascii="TH SarabunIT๙" w:hAnsi="TH SarabunIT๙" w:cs="TH SarabunIT๙"/>
+          <w:sz w:val="32"/>
+          <w:szCs w:val="32"/>
+        </w:rPr>
+      </w:pPr>
+      <w:r>
+        <w:rPr>
+          <w:rFonts w:ascii="TH SarabunIT๙" w:hAnsi="TH SarabunIT๙" w:cs="TH SarabunIT๙"/>
+          <w:sz w:val="32"/>
+          <w:szCs w:val="32"/>
+        </w:rPr>
+        <w:t>{%</w:t>
+      </w:r>
+      <w:proofErr w:type="spellStart"/>
+      <w:r>
+        <w:rPr>
+          <w:rFonts w:ascii="TH SarabunIT๙" w:hAnsi="TH SarabunIT๙" w:cs="TH SarabunIT๙"/>
+          <w:sz w:val="32"/>
+          <w:szCs w:val="32"/>
+        </w:rPr>
+        <w:t>systemImage</w:t>
+      </w:r>
+      <w:proofErr w:type="spellEnd"/>
+      <w:r>
+        <w:rPr>
+          <w:rFonts w:ascii="TH SarabunIT๙" w:hAnsi="TH SarabunIT๙" w:cs="TH SarabunIT๙"/>
+          <w:sz w:val="32"/>
+          <w:szCs w:val="32"/>
+        </w:rPr>
+        <w:t>}</w:t>
+      </w:r>
+    </w:p>
+    <w:p>
+      <w:pPr>
+        <w:tabs>
+          <w:tab w:val="left" w:pos="284"/>
+        </w:tabs>
+        <w:spacing w:after="0" w:line="240" w:lineRule="auto"/>
+        <w:rPr>
+          <w:rFonts w:ascii="TH SarabunIT๙" w:hAnsi="TH SarabunIT๙" w:cs="TH SarabunIT๙"/>
+          <w:sz w:val="32"/>
+          <w:szCs w:val="32"/>
+        </w:rPr>
+      </w:pPr>
+      <w:r>
+        <w:rPr>
+          <w:rFonts w:ascii="TH SarabunIT๙" w:hAnsi="TH SarabunIT๙" w:cs="TH SarabunIT๙"/>
+          <w:sz w:val="32"/>
+          <w:szCs w:val="32"/>
+          <w:cs/>
+        </w:rPr>
+        <w:t>คำอธิบาย:</w:t>
+      </w:r>
+      <w:r>
+        <w:rPr>
+          <w:rFonts w:ascii="TH SarabunIT๙" w:hAnsi="TH SarabunIT๙" w:cs="TH SarabunIT๙"/>
+          <w:sz w:val="32"/>
+          <w:szCs w:val="32"/>
+        </w:rPr>
+        <w:t xml:space="preserve"> {</w:t>
+      </w:r>
+      <w:proofErr w:type="spellStart"/>
+      <w:r>
+        <w:rPr>
+          <w:rFonts w:ascii="TH SarabunIT๙" w:hAnsi="TH SarabunIT๙" w:cs="TH SarabunIT๙"/>
+          <w:sz w:val="32"/>
+          <w:szCs w:val="32"/>
+        </w:rPr>
+        <w:t>systemDesc</w:t>
+      </w:r>
+      <w:proofErr w:type="spellEnd"/>
+      <w:r>
+        <w:rPr>
+          <w:rFonts w:ascii="TH SarabunIT๙" w:hAnsi="TH SarabunIT๙" w:cs="TH SarabunIT๙"/>
+          <w:sz w:val="32"/>
+          <w:szCs w:val="32"/>
+        </w:rPr>
+        <w:t>}</w:t>
+      </w:r>
+    </w:p>
+    <w:p>
+      <w:pPr>
+        <w:tabs>
+          <w:tab w:val="left" w:pos="284"/>
+        </w:tabs>
+        <w:spacing w:after="0" w:line="240" w:lineRule="auto"/>
         <w:rPr>
           <w:rFonts w:ascii="TH SarabunIT๙" w:hAnsi="TH SarabunIT๙" w:cs="TH SarabunIT๙"/>
           <w:sz w:val="32"/>
@@ -9018,6 +9106,107 @@
         </w:rPr>
         <w:t>)</w:t>
       </w:r>
+    </w:p>
+    <w:p>
+      <w:pPr>
+        <w:tabs>
+          <w:tab w:val="left" w:pos="284"/>
+        </w:tabs>
+        <w:spacing w:after="0" w:line="240" w:lineRule="auto"/>
+        <w:jc w:val="center"/>
+        <w:rPr>
+          <w:rFonts w:ascii="TH SarabunIT๙" w:hAnsi="TH SarabunIT๙" w:cs="TH SarabunIT๙"/>
+          <w:sz w:val="32"/>
+          <w:szCs w:val="32"/>
+        </w:rPr>
+      </w:pPr>
+      <w:r>
+        <w:rPr>
+          <w:rFonts w:ascii="TH SarabunIT๙" w:hAnsi="TH SarabunIT๙" w:cs="TH SarabunIT๙"/>
+          <w:sz w:val="32"/>
+          <w:szCs w:val="32"/>
+        </w:rPr>
+        <w:t>{%</w:t>
+      </w:r>
+      <w:proofErr w:type="spellStart"/>
+      <w:r>
+        <w:rPr>
+          <w:rFonts w:ascii="TH SarabunIT๙" w:hAnsi="TH SarabunIT๙" w:cs="TH SarabunIT๙"/>
+          <w:sz w:val="32"/>
+          <w:szCs w:val="32"/>
+        </w:rPr>
+        <w:t>networkImage</w:t>
+      </w:r>
+      <w:proofErr w:type="spellEnd"/>
+      <w:r>
+        <w:rPr>
+          <w:rFonts w:ascii="TH SarabunIT๙" w:hAnsi="TH SarabunIT๙" w:cs="TH SarabunIT๙"/>
+          <w:sz w:val="32"/>
+          <w:szCs w:val="32"/>
+        </w:rPr>
+        <w:t xml:space="preserve">} </w:t>
+      </w:r>
+    </w:p>
+    <w:p>
+      <w:pPr>
+        <w:tabs>
+          <w:tab w:val="left" w:pos="284"/>
+        </w:tabs>
+        <w:spacing w:after="0" w:line="240" w:lineRule="auto"/>
+        <w:rPr>
+          <w:rFonts w:ascii="TH SarabunIT๙" w:hAnsi="TH SarabunIT๙" w:cs="TH SarabunIT๙"/>
+          <w:sz w:val="32"/>
+          <w:szCs w:val="32"/>
+        </w:rPr>
+      </w:pPr>
+      <w:r>
+        <w:rPr>
+          <w:rFonts w:ascii="TH SarabunIT๙" w:hAnsi="TH SarabunIT๙" w:cs="TH SarabunIT๙"/>
+          <w:sz w:val="32"/>
+          <w:szCs w:val="32"/>
+          <w:cs/>
+        </w:rPr>
+        <w:t>คำอธิบาย:</w:t>
+      </w:r>
+      <w:r>
+        <w:rPr>
+          <w:rFonts w:ascii="TH SarabunIT๙" w:hAnsi="TH SarabunIT๙" w:cs="TH SarabunIT๙"/>
+          <w:sz w:val="32"/>
+          <w:szCs w:val="32"/>
+        </w:rPr>
+        <w:t xml:space="preserve"> {</w:t>
+      </w:r>
+      <w:proofErr w:type="spellStart"/>
+      <w:r>
+        <w:rPr>
+          <w:rFonts w:ascii="TH SarabunIT๙" w:hAnsi="TH SarabunIT๙" w:cs="TH SarabunIT๙"/>
+          <w:sz w:val="32"/>
+          <w:szCs w:val="32"/>
+        </w:rPr>
+        <w:t>networkImageDesc</w:t>
+      </w:r>
+      <w:proofErr w:type="spellEnd"/>
+      <w:r>
+        <w:rPr>
+          <w:rFonts w:ascii="TH SarabunIT๙" w:hAnsi="TH SarabunIT๙" w:cs="TH SarabunIT๙"/>
+          <w:sz w:val="32"/>
+          <w:szCs w:val="32"/>
+        </w:rPr>
+        <w:t>}</w:t>
+      </w:r>
+    </w:p>
+    <w:p>
+      <w:pPr>
+        <w:tabs>
+          <w:tab w:val="left" w:pos="284"/>
+        </w:tabs>
+        <w:spacing w:after="0" w:line="240" w:lineRule="auto"/>
+        <w:rPr>
+          <w:rFonts w:ascii="TH SarabunIT๙" w:hAnsi="TH SarabunIT๙" w:cs="TH SarabunIT๙"/>
+          <w:sz w:val="32"/>
+          <w:szCs w:val="32"/>
+        </w:rPr>
+      </w:pPr>
     </w:p>
     <w:p>
       <w:pPr>
@@ -9248,6 +9437,7 @@
                 <w:szCs w:val="32"/>
                 <w:cs/>
               </w:rPr>
+              <w:lastRenderedPageBreak/>
               <w:t>ลำดับ</w:t>
             </w:r>
           </w:p>
@@ -11646,6 +11836,7 @@
                 <w:szCs w:val="24"/>
                 <w:cs/>
               </w:rPr>
+              <w:lastRenderedPageBreak/>
               <w:t>โครงการ</w:t>
             </w:r>
             <w:r>
@@ -11770,6 +11961,7 @@
                 <w:sz w:val="28"/>
                 <w:cs/>
               </w:rPr>
+              <w:lastRenderedPageBreak/>
               <w:t>2.</w:t>
             </w:r>
           </w:p>
@@ -12001,7 +12193,6 @@
                 <w:sz w:val="24"/>
                 <w:szCs w:val="24"/>
               </w:rPr>
-              <w:lastRenderedPageBreak/>
               <w:sym w:font="Wingdings 2" w:char="F0A3"/>
             </w:r>
             <w:r>
@@ -12321,7 +12512,6 @@
                 <w:sz w:val="28"/>
                 <w:cs/>
               </w:rPr>
-              <w:lastRenderedPageBreak/>
               <w:t>รวมทั้งสิ้น</w:t>
             </w:r>
           </w:p>
@@ -14417,7 +14607,6 @@
           <w:sz w:val="24"/>
           <w:szCs w:val="24"/>
         </w:rPr>
-        <w:lastRenderedPageBreak/>
         <w:t>(</w:t>
       </w:r>
       <w:r>
@@ -18885,7 +19074,6 @@
           <w:szCs w:val="32"/>
           <w:cs/>
         </w:rPr>
-        <w:lastRenderedPageBreak/>
         <w:t>หน้าที่ความรับผิดชอบของบุคลากรในแต่ละตำแหน่ง (ในกรณีมีค่าใช้จ่ายบุคลากร)</w:t>
       </w:r>
     </w:p>
@@ -21257,6 +21445,7 @@
                 <w:sz w:val="28"/>
                 <w:cs/>
               </w:rPr>
+              <w:lastRenderedPageBreak/>
               <w:t>รวมทั้งสิ้น</w:t>
             </w:r>
           </w:p>
@@ -21404,6 +21593,31 @@
         </w:rPr>
         <w:t xml:space="preserve"> ค่ายานพาหนะ ฯลฯ)</w:t>
       </w:r>
+      <w:r>
+        <w:rPr>
+          <w:rFonts w:ascii="TH SarabunIT๙" w:hAnsi="TH SarabunIT๙" w:cs="TH SarabunIT๙"/>
+          <w:b/>
+          <w:bCs/>
+          <w:color w:val="000000"/>
+          <w:sz w:val="32"/>
+          <w:szCs w:val="32"/>
+        </w:rPr>
+        <w:tab/>
+      </w:r>
+    </w:p>
+    <w:p>
+      <w:pPr>
+        <w:spacing w:before="240" w:after="120" w:line="240" w:lineRule="auto"/>
+        <w:ind w:firstLine="446"/>
+        <w:rPr>
+          <w:rFonts w:ascii="TH SarabunIT๙" w:hAnsi="TH SarabunIT๙" w:cs="TH SarabunIT๙"/>
+          <w:b/>
+          <w:bCs/>
+          <w:color w:val="000000"/>
+          <w:sz w:val="32"/>
+          <w:szCs w:val="32"/>
+        </w:rPr>
+      </w:pPr>
     </w:p>
     <w:tbl>
       <w:tblPr>
@@ -21576,7 +21790,6 @@
                 <w:szCs w:val="32"/>
                 <w:cs/>
               </w:rPr>
-              <w:lastRenderedPageBreak/>
               <w:t>(บาท)</w:t>
             </w:r>
           </w:p>
@@ -21608,7 +21821,6 @@
                 <w:szCs w:val="32"/>
                 <w:cs/>
               </w:rPr>
-              <w:lastRenderedPageBreak/>
               <w:t xml:space="preserve">รวม </w:t>
             </w:r>
           </w:p>
@@ -21635,7 +21847,6 @@
                 <w:szCs w:val="32"/>
                 <w:cs/>
               </w:rPr>
-              <w:lastRenderedPageBreak/>
               <w:t>(บาท)</w:t>
             </w:r>
           </w:p>
@@ -21668,7 +21879,6 @@
                 <w:szCs w:val="32"/>
                 <w:cs/>
               </w:rPr>
-              <w:lastRenderedPageBreak/>
               <w:t>หมายเหตุ</w:t>
             </w:r>
           </w:p>
@@ -22417,12 +22627,13 @@
               <w:spacing w:before="120" w:after="120" w:line="240" w:lineRule="auto"/>
               <w:jc w:val="center"/>
               <w:rPr>
-                <w:rFonts w:ascii="TH SarabunIT๙" w:hAnsi="TH SarabunIT๙" w:cs="TH SarabunIT๙"/>
+                <w:rFonts w:ascii="TH SarabunIT๙" w:hAnsi="TH SarabunIT๙" w:cs="TH SarabunIT๙" w:hint="cs"/>
                 <w:b/>
                 <w:bCs/>
                 <w:color w:val="000000"/>
                 <w:sz w:val="32"/>
                 <w:szCs w:val="32"/>
+                <w:cs/>
               </w:rPr>
             </w:pPr>
             <w:r>
@@ -23288,7 +23499,6 @@
           <w:sz w:val="32"/>
           <w:szCs w:val="32"/>
         </w:rPr>
-        <w:lastRenderedPageBreak/>
         <w:t>e-Mail</w:t>
       </w:r>
       <w:r>

</xml_diff>

<commit_message>
feat: add project and user pages with basic structure
</commit_message>
<xml_diff>
--- a/public/templates/project-proposal.docx
+++ b/public/templates/project-proposal.docx
@@ -3729,27 +3729,6 @@
           <w:color w:val="000000"/>
           <w:sz w:val="32"/>
           <w:szCs w:val="32"/>
-          <w:cs/>
-        </w:rPr>
-        <w:tab/>
-      </w:r>
-      <w:r>
-        <w:rPr>
-          <w:rFonts w:ascii="TH SarabunIT๙" w:hAnsi="TH SarabunIT๙" w:cs="TH SarabunIT๙" w:hint="cs"/>
-          <w:color w:val="000000"/>
-          <w:sz w:val="32"/>
-          <w:szCs w:val="32"/>
-          <w:u w:val="dotted"/>
-          <w:cs/>
-        </w:rPr>
-        <w:t xml:space="preserve"> </w:t>
-      </w:r>
-      <w:r>
-        <w:rPr>
-          <w:rFonts w:ascii="TH SarabunIT๙" w:hAnsi="TH SarabunIT๙" w:cs="TH SarabunIT๙"/>
-          <w:color w:val="000000"/>
-          <w:sz w:val="32"/>
-          <w:szCs w:val="32"/>
           <w:u w:val="dotted"/>
         </w:rPr>
         <w:t>{background}</w:t>
@@ -3820,16 +3799,6 @@
           <w:u w:val="dotted"/>
         </w:rPr>
       </w:pPr>
-      <w:r>
-        <w:rPr>
-          <w:rFonts w:ascii="TH SarabunIT๙" w:hAnsi="TH SarabunIT๙" w:cs="TH SarabunIT๙"/>
-          <w:color w:val="000000"/>
-          <w:sz w:val="32"/>
-          <w:szCs w:val="32"/>
-          <w:cs/>
-        </w:rPr>
-        <w:tab/>
-      </w:r>
       <w:r>
         <w:rPr>
           <w:rFonts w:ascii="TH SarabunIT๙" w:hAnsi="TH SarabunIT๙" w:cs="TH SarabunIT๙"/>
@@ -3884,16 +3853,6 @@
           <w:color w:val="000000"/>
           <w:sz w:val="32"/>
           <w:szCs w:val="32"/>
-          <w:cs/>
-        </w:rPr>
-        <w:tab/>
-      </w:r>
-      <w:r>
-        <w:rPr>
-          <w:rFonts w:ascii="TH SarabunIT๙" w:hAnsi="TH SarabunIT๙" w:cs="TH SarabunIT๙"/>
-          <w:color w:val="000000"/>
-          <w:sz w:val="32"/>
-          <w:szCs w:val="32"/>
           <w:u w:val="dotted"/>
         </w:rPr>
         <w:t>{target}</w:t>
@@ -3974,16 +3933,6 @@
           <w:u w:val="dotted"/>
         </w:rPr>
       </w:pPr>
-      <w:r>
-        <w:rPr>
-          <w:rFonts w:ascii="TH SarabunIT๙" w:hAnsi="TH SarabunIT๙" w:cs="TH SarabunIT๙"/>
-          <w:color w:val="000000"/>
-          <w:sz w:val="32"/>
-          <w:szCs w:val="32"/>
-          <w:cs/>
-        </w:rPr>
-        <w:tab/>
-      </w:r>
       <w:r>
         <w:rPr>
           <w:rFonts w:ascii="TH SarabunIT๙" w:hAnsi="TH SarabunIT๙" w:cs="TH SarabunIT๙"/>
@@ -8962,9 +8911,10 @@
         <w:spacing w:after="0" w:line="240" w:lineRule="auto"/>
         <w:jc w:val="center"/>
         <w:rPr>
-          <w:rFonts w:ascii="TH SarabunIT๙" w:hAnsi="TH SarabunIT๙" w:cs="TH SarabunIT๙"/>
-          <w:sz w:val="32"/>
-          <w:szCs w:val="32"/>
+          <w:rFonts w:ascii="TH SarabunIT๙" w:hAnsi="TH SarabunIT๙" w:cs="TH SarabunIT๙" w:hint="cs"/>
+          <w:sz w:val="32"/>
+          <w:szCs w:val="32"/>
+          <w:cs/>
         </w:rPr>
       </w:pPr>
       <w:r>

</xml_diff>

<commit_message>
feat: enhance project proposal template with detailed cost structures and validation schemas (8.1 and 8.2 zod + docs)
</commit_message>
<xml_diff>
--- a/public/templates/project-proposal.docx
+++ b/public/templates/project-proposal.docx
@@ -225,7 +225,7 @@
       <w:pPr>
         <w:spacing w:before="240" w:after="0" w:line="240" w:lineRule="auto"/>
         <w:rPr>
-          <w:rFonts w:ascii="TH SarabunIT๙" w:hAnsi="TH SarabunIT๙" w:cs="TH SarabunIT๙" w:hint="cs"/>
+          <w:rFonts w:ascii="TH SarabunIT๙" w:hAnsi="TH SarabunIT๙" w:cs="TH SarabunIT๙"/>
           <w:color w:val="000000"/>
           <w:sz w:val="32"/>
           <w:szCs w:val="32"/>
@@ -1102,7 +1102,7 @@
             <w:pPr>
               <w:spacing w:after="0" w:line="240" w:lineRule="auto"/>
               <w:rPr>
-                <w:rFonts w:ascii="TH SarabunIT๙" w:eastAsia="Calibri" w:hAnsi="TH SarabunIT๙" w:cs="TH SarabunIT๙" w:hint="cs"/>
+                <w:rFonts w:ascii="TH SarabunIT๙" w:eastAsia="Calibri" w:hAnsi="TH SarabunIT๙" w:cs="TH SarabunIT๙"/>
                 <w:color w:val="000000"/>
                 <w:sz w:val="32"/>
                 <w:szCs w:val="32"/>
@@ -3872,7 +3872,7 @@
       <w:pPr>
         <w:spacing w:after="0" w:line="240" w:lineRule="auto"/>
         <w:rPr>
-          <w:rFonts w:ascii="TH SarabunIT๙" w:hAnsi="TH SarabunIT๙" w:cs="TH SarabunIT๙" w:hint="cs"/>
+          <w:rFonts w:ascii="TH SarabunIT๙" w:hAnsi="TH SarabunIT๙" w:cs="TH SarabunIT๙"/>
           <w:color w:val="000000"/>
           <w:sz w:val="32"/>
           <w:szCs w:val="32"/>
@@ -4919,23 +4919,7 @@
                 <w:color w:val="000000"/>
                 <w:sz w:val="28"/>
               </w:rPr>
-              <w:t>{</w:t>
-            </w:r>
-            <w:r>
-              <w:rPr>
-                <w:rFonts w:ascii="TH SarabunIT๙" w:hAnsi="TH SarabunIT๙" w:cs="TH SarabunIT๙"/>
-                <w:color w:val="000000"/>
-                <w:sz w:val="28"/>
-              </w:rPr>
-              <w:t>remark</w:t>
-            </w:r>
-            <w:r>
-              <w:rPr>
-                <w:rFonts w:ascii="TH SarabunIT๙" w:hAnsi="TH SarabunIT๙" w:cs="TH SarabunIT๙"/>
-                <w:color w:val="000000"/>
-                <w:sz w:val="28"/>
-              </w:rPr>
-              <w:t>}</w:t>
+              <w:t>{remark}</w:t>
             </w:r>
             <w:r>
               <w:rPr>
@@ -6350,22 +6334,7 @@
           <w:szCs w:val="32"/>
         </w:rPr>
         <w:tab/>
-      </w:r>
-      <w:r>
-        <w:rPr>
-          <w:rFonts w:ascii="TH SarabunIT๙" w:hAnsi="TH SarabunIT๙" w:cs="TH SarabunIT๙"/>
-          <w:sz w:val="32"/>
-          <w:szCs w:val="32"/>
-        </w:rPr>
-        <w:t>{</w:t>
-      </w:r>
-      <w:r>
-        <w:rPr>
-          <w:rFonts w:ascii="TH SarabunIT๙" w:hAnsi="TH SarabunIT๙" w:cs="TH SarabunIT๙"/>
-          <w:sz w:val="32"/>
-          <w:szCs w:val="32"/>
-        </w:rPr>
-        <w:t>/</w:t>
+        <w:t>{/</w:t>
       </w:r>
       <w:proofErr w:type="spellStart"/>
       <w:r>
@@ -6405,15 +6374,7 @@
           <w:sz w:val="32"/>
           <w:szCs w:val="32"/>
         </w:rPr>
-        <w:t>{</w:t>
-      </w:r>
-      <w:r>
-        <w:rPr>
-          <w:rFonts w:ascii="TH SarabunIT๙" w:hAnsi="TH SarabunIT๙" w:cs="TH SarabunIT๙"/>
-          <w:sz w:val="32"/>
-          <w:szCs w:val="32"/>
-        </w:rPr>
-        <w:t>^</w:t>
+        <w:t>{^</w:t>
       </w:r>
       <w:proofErr w:type="spellStart"/>
       <w:r>
@@ -7117,14 +7078,7 @@
                 <w:rFonts w:ascii="TH SarabunIT๙" w:hAnsi="TH SarabunIT๙" w:cs="TH SarabunIT๙"/>
                 <w:sz w:val="28"/>
               </w:rPr>
-              <w:t>{</w:t>
-            </w:r>
-            <w:r>
-              <w:rPr>
-                <w:rFonts w:ascii="TH SarabunIT๙" w:hAnsi="TH SarabunIT๙" w:cs="TH SarabunIT๙"/>
-                <w:sz w:val="28"/>
-              </w:rPr>
-              <w:t>/</w:t>
+              <w:t>{/</w:t>
             </w:r>
             <w:proofErr w:type="spellStart"/>
             <w:r>
@@ -8911,7 +8865,7 @@
         <w:spacing w:after="0" w:line="240" w:lineRule="auto"/>
         <w:jc w:val="center"/>
         <w:rPr>
-          <w:rFonts w:ascii="TH SarabunIT๙" w:hAnsi="TH SarabunIT๙" w:cs="TH SarabunIT๙" w:hint="cs"/>
+          <w:rFonts w:ascii="TH SarabunIT๙" w:hAnsi="TH SarabunIT๙" w:cs="TH SarabunIT๙"/>
           <w:sz w:val="32"/>
           <w:szCs w:val="32"/>
           <w:cs/>
@@ -10654,7 +10608,7 @@
             <w:pPr>
               <w:spacing w:after="0" w:line="240" w:lineRule="auto"/>
               <w:rPr>
-                <w:rFonts w:ascii="TH SarabunIT๙" w:hAnsi="TH SarabunIT๙" w:cs="TH SarabunIT๙" w:hint="cs"/>
+                <w:rFonts w:ascii="TH SarabunIT๙" w:hAnsi="TH SarabunIT๙" w:cs="TH SarabunIT๙"/>
                 <w:sz w:val="32"/>
                 <w:szCs w:val="32"/>
                 <w:cs/>
@@ -10680,7 +10634,7 @@
               <w:spacing w:after="0" w:line="240" w:lineRule="auto"/>
               <w:jc w:val="right"/>
               <w:rPr>
-                <w:rFonts w:ascii="TH SarabunIT๙" w:hAnsi="TH SarabunIT๙" w:cs="TH SarabunIT๙" w:hint="cs"/>
+                <w:rFonts w:ascii="TH SarabunIT๙" w:hAnsi="TH SarabunIT๙" w:cs="TH SarabunIT๙"/>
                 <w:sz w:val="32"/>
                 <w:szCs w:val="32"/>
                 <w:cs/>
@@ -10996,9 +10950,20 @@
           <w:szCs w:val="32"/>
         </w:rPr>
       </w:pPr>
-      <w:r>
-        <w:rPr>
-          <w:rFonts w:ascii="TH SarabunIT๙" w:hAnsi="TH SarabunIT๙" w:cs="TH SarabunIT๙"/>
+    </w:p>
+    <w:p>
+      <w:pPr>
+        <w:pStyle w:val="ListParagraph"/>
+        <w:widowControl w:val="0"/>
+        <w:tabs>
+          <w:tab w:val="left" w:pos="164"/>
+        </w:tabs>
+        <w:suppressAutoHyphens/>
+        <w:spacing w:before="240" w:after="120" w:line="240" w:lineRule="auto"/>
+        <w:ind w:hanging="720"/>
+        <w:contextualSpacing w:val="0"/>
+        <w:rPr>
+          <w:rFonts w:ascii="TH SarabunIT๙" w:hAnsi="TH SarabunIT๙" w:cs="TH SarabunIT๙" w:hint="cs"/>
           <w:b/>
           <w:bCs/>
           <w:color w:val="000000"/>
@@ -11006,8 +10971,7 @@
           <w:szCs w:val="32"/>
           <w:cs/>
         </w:rPr>
-        <w:t>๘.</w:t>
-      </w:r>
+      </w:pPr>
       <w:r>
         <w:rPr>
           <w:rFonts w:ascii="TH SarabunIT๙" w:hAnsi="TH SarabunIT๙" w:cs="TH SarabunIT๙"/>
@@ -11016,8 +10980,9 @@
           <w:color w:val="000000"/>
           <w:sz w:val="32"/>
           <w:szCs w:val="32"/>
-        </w:rPr>
-        <w:t>1</w:t>
+          <w:cs/>
+        </w:rPr>
+        <w:t>๘.</w:t>
       </w:r>
       <w:r>
         <w:rPr>
@@ -11027,9 +10992,64 @@
           <w:color w:val="000000"/>
           <w:sz w:val="32"/>
           <w:szCs w:val="32"/>
+        </w:rPr>
+        <w:t>1</w:t>
+      </w:r>
+      <w:r>
+        <w:rPr>
+          <w:rFonts w:ascii="TH SarabunIT๙" w:hAnsi="TH SarabunIT๙" w:cs="TH SarabunIT๙"/>
+          <w:b/>
+          <w:bCs/>
+          <w:color w:val="000000"/>
+          <w:sz w:val="32"/>
+          <w:szCs w:val="32"/>
           <w:cs/>
         </w:rPr>
         <w:t xml:space="preserve"> ค่าใช้จ่ายครุภัณฑ์คอมพิวเตอร์ที่จัดหาในโครงการ</w:t>
+      </w:r>
+      <w:r>
+        <w:rPr>
+          <w:rFonts w:ascii="TH SarabunIT๙" w:hAnsi="TH SarabunIT๙" w:cs="TH SarabunIT๙"/>
+          <w:b/>
+          <w:bCs/>
+          <w:color w:val="000000"/>
+          <w:sz w:val="32"/>
+          <w:szCs w:val="32"/>
+        </w:rPr>
+        <w:t xml:space="preserve"> </w:t>
+      </w:r>
+      <w:r>
+        <w:rPr>
+          <w:rFonts w:ascii="TH SarabunIT๙" w:hAnsi="TH SarabunIT๙" w:cs="TH SarabunIT๙"/>
+          <w:b/>
+          <w:bCs/>
+          <w:color w:val="000000"/>
+          <w:sz w:val="32"/>
+          <w:szCs w:val="32"/>
+        </w:rPr>
+        <w:t>{</w:t>
+      </w:r>
+      <w:r>
+        <w:rPr>
+          <w:rFonts w:ascii="TH SarabunIT๙" w:hAnsi="TH SarabunIT๙" w:cs="TH SarabunIT๙"/>
+          <w:b/>
+          <w:bCs/>
+          <w:color w:val="000000"/>
+          <w:sz w:val="32"/>
+          <w:szCs w:val="32"/>
+        </w:rPr>
+        <w:t>#</w:t>
+      </w:r>
+      <w:r>
+        <w:rPr>
+          <w:rFonts w:ascii="TH SarabunIT๙" w:hAnsi="TH SarabunIT๙" w:cs="TH SarabunIT๙"/>
+          <w:b/>
+          <w:bCs/>
+          <w:color w:val="000000"/>
+          <w:sz w:val="32"/>
+          <w:szCs w:val="32"/>
+        </w:rPr>
+        <w:t>hasHardwareCosts}</w:t>
       </w:r>
     </w:p>
     <w:tbl>
@@ -11046,17 +11066,17 @@
         <w:tblLook w:val="04A0" w:firstRow="1" w:lastRow="0" w:firstColumn="1" w:lastColumn="0" w:noHBand="0" w:noVBand="1"/>
       </w:tblPr>
       <w:tblGrid>
-        <w:gridCol w:w="725"/>
-        <w:gridCol w:w="3235"/>
-        <w:gridCol w:w="847"/>
-        <w:gridCol w:w="1488"/>
-        <w:gridCol w:w="1440"/>
-        <w:gridCol w:w="2154"/>
+        <w:gridCol w:w="2362"/>
+        <w:gridCol w:w="1866"/>
+        <w:gridCol w:w="1028"/>
+        <w:gridCol w:w="1353"/>
+        <w:gridCol w:w="1200"/>
+        <w:gridCol w:w="2080"/>
       </w:tblGrid>
       <w:tr>
         <w:tc>
           <w:tcPr>
-            <w:tcW w:w="725" w:type="dxa"/>
+            <w:tcW w:w="2362" w:type="dxa"/>
           </w:tcPr>
           <w:p>
             <w:pPr>
@@ -11087,7 +11107,7 @@
         </w:tc>
         <w:tc>
           <w:tcPr>
-            <w:tcW w:w="3235" w:type="dxa"/>
+            <w:tcW w:w="1866" w:type="dxa"/>
           </w:tcPr>
           <w:p>
             <w:pPr>
@@ -11119,7 +11139,7 @@
         </w:tc>
         <w:tc>
           <w:tcPr>
-            <w:tcW w:w="847" w:type="dxa"/>
+            <w:tcW w:w="1028" w:type="dxa"/>
           </w:tcPr>
           <w:p>
             <w:pPr>
@@ -11150,7 +11170,7 @@
         </w:tc>
         <w:tc>
           <w:tcPr>
-            <w:tcW w:w="1488" w:type="dxa"/>
+            <w:tcW w:w="1353" w:type="dxa"/>
           </w:tcPr>
           <w:p>
             <w:pPr>
@@ -11208,7 +11228,7 @@
         </w:tc>
         <w:tc>
           <w:tcPr>
-            <w:tcW w:w="1440" w:type="dxa"/>
+            <w:tcW w:w="1200" w:type="dxa"/>
           </w:tcPr>
           <w:p>
             <w:pPr>
@@ -11265,7 +11285,7 @@
         </w:tc>
         <w:tc>
           <w:tcPr>
-            <w:tcW w:w="2154" w:type="dxa"/>
+            <w:tcW w:w="2080" w:type="dxa"/>
           </w:tcPr>
           <w:p>
             <w:pPr>
@@ -11338,7 +11358,7 @@
         </w:trPr>
         <w:tc>
           <w:tcPr>
-            <w:tcW w:w="725" w:type="dxa"/>
+            <w:tcW w:w="2362" w:type="dxa"/>
           </w:tcPr>
           <w:p>
             <w:pPr>
@@ -11356,49 +11376,112 @@
             </w:pPr>
             <w:r>
               <w:rPr>
-                <w:rFonts w:ascii="TH SarabunIT๙" w:eastAsia="Calibri" w:hAnsi="TH SarabunIT๙" w:cs="TH SarabunIT๙" w:hint="cs"/>
-                <w:color w:val="000000"/>
-                <w:sz w:val="28"/>
-                <w:cs/>
-              </w:rPr>
-              <w:t>1.</w:t>
-            </w:r>
-          </w:p>
-        </w:tc>
-        <w:tc>
-          <w:tcPr>
-            <w:tcW w:w="3235" w:type="dxa"/>
-          </w:tcPr>
-          <w:p>
-            <w:pPr>
-              <w:spacing w:after="0" w:line="240" w:lineRule="auto"/>
-              <w:rPr>
-                <w:rFonts w:ascii="TH SarabunIT๙" w:eastAsia="Calibri" w:hAnsi="TH SarabunIT๙" w:cs="TH SarabunIT๙"/>
-                <w:color w:val="000000"/>
-                <w:sz w:val="28"/>
-              </w:rPr>
-            </w:pPr>
-          </w:p>
-        </w:tc>
-        <w:tc>
-          <w:tcPr>
-            <w:tcW w:w="847" w:type="dxa"/>
-          </w:tcPr>
-          <w:p>
-            <w:pPr>
-              <w:spacing w:after="0" w:line="240" w:lineRule="auto"/>
-              <w:jc w:val="center"/>
-              <w:rPr>
-                <w:rFonts w:ascii="TH SarabunIT๙" w:eastAsia="Calibri" w:hAnsi="TH SarabunIT๙" w:cs="TH SarabunIT๙"/>
-                <w:color w:val="000000"/>
-                <w:sz w:val="28"/>
-              </w:rPr>
-            </w:pPr>
-          </w:p>
-        </w:tc>
-        <w:tc>
-          <w:tcPr>
-            <w:tcW w:w="1488" w:type="dxa"/>
+                <w:rFonts w:ascii="TH SarabunIT๙" w:eastAsia="Calibri" w:hAnsi="TH SarabunIT๙" w:cs="TH SarabunIT๙"/>
+                <w:b/>
+                <w:bCs/>
+                <w:color w:val="000000"/>
+                <w:sz w:val="28"/>
+              </w:rPr>
+              <w:t>{#</w:t>
+            </w:r>
+            <w:proofErr w:type="gramStart"/>
+            <w:r>
+              <w:rPr>
+                <w:rFonts w:ascii="TH SarabunIT๙" w:eastAsia="Calibri" w:hAnsi="TH SarabunIT๙" w:cs="TH SarabunIT๙"/>
+                <w:b/>
+                <w:bCs/>
+                <w:color w:val="000000"/>
+                <w:sz w:val="28"/>
+              </w:rPr>
+              <w:t>hardwareCosts}</w:t>
+            </w:r>
+            <w:r>
+              <w:rPr>
+                <w:rFonts w:ascii="TH SarabunIT๙" w:eastAsia="Calibri" w:hAnsi="TH SarabunIT๙" w:cs="TH SarabunIT๙"/>
+                <w:color w:val="000000"/>
+                <w:sz w:val="28"/>
+              </w:rPr>
+              <w:t>{</w:t>
+            </w:r>
+            <w:proofErr w:type="gramEnd"/>
+            <w:r>
+              <w:rPr>
+                <w:rFonts w:ascii="TH SarabunIT๙" w:eastAsia="Calibri" w:hAnsi="TH SarabunIT๙" w:cs="TH SarabunIT๙"/>
+                <w:color w:val="000000"/>
+                <w:sz w:val="28"/>
+              </w:rPr>
+              <w:t>index}</w:t>
+            </w:r>
+          </w:p>
+        </w:tc>
+        <w:tc>
+          <w:tcPr>
+            <w:tcW w:w="1866" w:type="dxa"/>
+          </w:tcPr>
+          <w:p>
+            <w:pPr>
+              <w:spacing w:after="0" w:line="240" w:lineRule="auto"/>
+              <w:rPr>
+                <w:rFonts w:ascii="TH SarabunIT๙" w:eastAsia="Calibri" w:hAnsi="TH SarabunIT๙" w:cs="TH SarabunIT๙"/>
+                <w:color w:val="000000"/>
+                <w:sz w:val="28"/>
+              </w:rPr>
+            </w:pPr>
+            <w:r>
+              <w:rPr>
+                <w:rFonts w:ascii="TH SarabunIT๙" w:eastAsia="Calibri" w:hAnsi="TH SarabunIT๙" w:cs="TH SarabunIT๙"/>
+                <w:color w:val="000000"/>
+                <w:sz w:val="28"/>
+              </w:rPr>
+              <w:t>{</w:t>
+            </w:r>
+            <w:proofErr w:type="spellStart"/>
+            <w:r>
+              <w:rPr>
+                <w:rFonts w:ascii="TH SarabunIT๙" w:eastAsia="Calibri" w:hAnsi="TH SarabunIT๙" w:cs="TH SarabunIT๙"/>
+                <w:color w:val="000000"/>
+                <w:sz w:val="28"/>
+              </w:rPr>
+              <w:t>itemName</w:t>
+            </w:r>
+            <w:proofErr w:type="spellEnd"/>
+            <w:r>
+              <w:rPr>
+                <w:rFonts w:ascii="TH SarabunIT๙" w:eastAsia="Calibri" w:hAnsi="TH SarabunIT๙" w:cs="TH SarabunIT๙"/>
+                <w:color w:val="000000"/>
+                <w:sz w:val="28"/>
+              </w:rPr>
+              <w:t>}</w:t>
+            </w:r>
+          </w:p>
+        </w:tc>
+        <w:tc>
+          <w:tcPr>
+            <w:tcW w:w="1028" w:type="dxa"/>
+          </w:tcPr>
+          <w:p>
+            <w:pPr>
+              <w:spacing w:after="0" w:line="240" w:lineRule="auto"/>
+              <w:jc w:val="center"/>
+              <w:rPr>
+                <w:rFonts w:ascii="TH SarabunIT๙" w:eastAsia="Calibri" w:hAnsi="TH SarabunIT๙" w:cs="TH SarabunIT๙"/>
+                <w:color w:val="000000"/>
+                <w:sz w:val="28"/>
+              </w:rPr>
+            </w:pPr>
+            <w:r>
+              <w:rPr>
+                <w:rFonts w:ascii="TH SarabunIT๙" w:eastAsia="Calibri" w:hAnsi="TH SarabunIT๙" w:cs="TH SarabunIT๙"/>
+                <w:color w:val="000000"/>
+                <w:sz w:val="28"/>
+              </w:rPr>
+              <w:t>{quantity}</w:t>
+            </w:r>
+          </w:p>
+        </w:tc>
+        <w:tc>
+          <w:tcPr>
+            <w:tcW w:w="1353" w:type="dxa"/>
           </w:tcPr>
           <w:p>
             <w:pPr>
@@ -11410,11 +11493,37 @@
                 <w:sz w:val="28"/>
               </w:rPr>
             </w:pPr>
-          </w:p>
-        </w:tc>
-        <w:tc>
-          <w:tcPr>
-            <w:tcW w:w="1440" w:type="dxa"/>
+            <w:r>
+              <w:rPr>
+                <w:rFonts w:ascii="TH SarabunIT๙" w:eastAsia="Calibri" w:hAnsi="TH SarabunIT๙" w:cs="TH SarabunIT๙"/>
+                <w:color w:val="000000"/>
+                <w:sz w:val="28"/>
+              </w:rPr>
+              <w:t>{</w:t>
+            </w:r>
+            <w:proofErr w:type="spellStart"/>
+            <w:r>
+              <w:rPr>
+                <w:rFonts w:ascii="TH SarabunIT๙" w:eastAsia="Calibri" w:hAnsi="TH SarabunIT๙" w:cs="TH SarabunIT๙"/>
+                <w:color w:val="000000"/>
+                <w:sz w:val="28"/>
+              </w:rPr>
+              <w:t>unitPriceStr</w:t>
+            </w:r>
+            <w:proofErr w:type="spellEnd"/>
+            <w:r>
+              <w:rPr>
+                <w:rFonts w:ascii="TH SarabunIT๙" w:eastAsia="Calibri" w:hAnsi="TH SarabunIT๙" w:cs="TH SarabunIT๙"/>
+                <w:color w:val="000000"/>
+                <w:sz w:val="28"/>
+              </w:rPr>
+              <w:t>}</w:t>
+            </w:r>
+          </w:p>
+        </w:tc>
+        <w:tc>
+          <w:tcPr>
+            <w:tcW w:w="1200" w:type="dxa"/>
           </w:tcPr>
           <w:p>
             <w:pPr>
@@ -11426,11 +11535,37 @@
                 <w:sz w:val="28"/>
               </w:rPr>
             </w:pPr>
-          </w:p>
-        </w:tc>
-        <w:tc>
-          <w:tcPr>
-            <w:tcW w:w="2154" w:type="dxa"/>
+            <w:r>
+              <w:rPr>
+                <w:rFonts w:ascii="TH SarabunIT๙" w:eastAsia="Calibri" w:hAnsi="TH SarabunIT๙" w:cs="TH SarabunIT๙"/>
+                <w:color w:val="000000"/>
+                <w:sz w:val="28"/>
+              </w:rPr>
+              <w:t>{</w:t>
+            </w:r>
+            <w:proofErr w:type="spellStart"/>
+            <w:r>
+              <w:rPr>
+                <w:rFonts w:ascii="TH SarabunIT๙" w:eastAsia="Calibri" w:hAnsi="TH SarabunIT๙" w:cs="TH SarabunIT๙"/>
+                <w:color w:val="000000"/>
+                <w:sz w:val="28"/>
+              </w:rPr>
+              <w:t>rowTotal</w:t>
+            </w:r>
+            <w:proofErr w:type="spellEnd"/>
+            <w:r>
+              <w:rPr>
+                <w:rFonts w:ascii="TH SarabunIT๙" w:eastAsia="Calibri" w:hAnsi="TH SarabunIT๙" w:cs="TH SarabunIT๙"/>
+                <w:color w:val="000000"/>
+                <w:sz w:val="28"/>
+              </w:rPr>
+              <w:t>}</w:t>
+            </w:r>
+          </w:p>
+        </w:tc>
+        <w:tc>
+          <w:tcPr>
+            <w:tcW w:w="2080" w:type="dxa"/>
           </w:tcPr>
           <w:p>
             <w:pPr>
@@ -11449,39 +11584,38 @@
                 <w:sz w:val="24"/>
                 <w:szCs w:val="24"/>
               </w:rPr>
-              <w:sym w:font="Wingdings 2" w:char="F0A3"/>
-            </w:r>
+              <w:t>{</w:t>
+            </w:r>
+            <w:proofErr w:type="spellStart"/>
             <w:r>
               <w:rPr>
                 <w:rFonts w:ascii="TH SarabunPSK" w:eastAsia="Calibri" w:hAnsi="TH SarabunPSK" w:cs="TH SarabunPSK"/>
                 <w:color w:val="000000"/>
                 <w:sz w:val="24"/>
                 <w:szCs w:val="24"/>
-                <w:cs/>
-              </w:rPr>
-              <w:t xml:space="preserve"> </w:t>
-            </w:r>
-            <w:r>
-              <w:rPr>
-                <w:rFonts w:ascii="TH SarabunPSK" w:eastAsia="Calibri" w:hAnsi="TH SarabunPSK" w:cs="TH SarabunPSK" w:hint="cs"/>
+              </w:rPr>
+              <w:t>chkMdes</w:t>
+            </w:r>
+            <w:proofErr w:type="spellEnd"/>
+            <w:r>
+              <w:rPr>
+                <w:rFonts w:ascii="TH SarabunPSK" w:eastAsia="Calibri" w:hAnsi="TH SarabunPSK" w:cs="TH SarabunPSK"/>
                 <w:color w:val="000000"/>
                 <w:sz w:val="24"/>
                 <w:szCs w:val="24"/>
-                <w:cs/>
-              </w:rPr>
-              <w:t>กระทรวงดิจิทัลฯ</w:t>
-            </w:r>
-          </w:p>
-          <w:p>
-            <w:pPr>
-              <w:spacing w:after="0" w:line="240" w:lineRule="auto"/>
+              </w:rPr>
+              <w:t>}</w:t>
+            </w:r>
+            <w:r>
               <w:rPr>
                 <w:rFonts w:ascii="TH SarabunPSK" w:eastAsia="Calibri" w:hAnsi="TH SarabunPSK" w:cs="TH SarabunPSK"/>
                 <w:color w:val="000000"/>
                 <w:sz w:val="24"/>
                 <w:szCs w:val="24"/>
-              </w:rPr>
-            </w:pPr>
+                <w:cs/>
+              </w:rPr>
+              <w:t xml:space="preserve"> </w:t>
+            </w:r>
             <w:r>
               <w:rPr>
                 <w:rFonts w:ascii="TH SarabunPSK" w:eastAsia="Calibri" w:hAnsi="TH SarabunPSK" w:cs="TH SarabunPSK" w:hint="cs"/>
@@ -11490,18 +11624,19 @@
                 <w:szCs w:val="24"/>
                 <w:cs/>
               </w:rPr>
-              <w:t>ฉบับเดือน</w:t>
-            </w:r>
-            <w:r>
-              <w:rPr>
-                <w:rFonts w:ascii="TH SarabunPSK" w:eastAsia="Calibri" w:hAnsi="TH SarabunPSK" w:cs="TH SarabunPSK" w:hint="cs"/>
+              <w:t>กระทรวงดิจิทัลฯ</w:t>
+            </w:r>
+          </w:p>
+          <w:p>
+            <w:pPr>
+              <w:spacing w:after="0" w:line="240" w:lineRule="auto"/>
+              <w:rPr>
+                <w:rFonts w:ascii="TH SarabunPSK" w:eastAsia="Calibri" w:hAnsi="TH SarabunPSK" w:cs="TH SarabunPSK"/>
                 <w:color w:val="000000"/>
                 <w:sz w:val="24"/>
                 <w:szCs w:val="24"/>
-                <w:cs/>
-              </w:rPr>
-              <w:t>..............</w:t>
-            </w:r>
+              </w:rPr>
+            </w:pPr>
             <w:r>
               <w:rPr>
                 <w:rFonts w:ascii="TH SarabunPSK" w:eastAsia="Calibri" w:hAnsi="TH SarabunPSK" w:cs="TH SarabunPSK" w:hint="cs"/>
@@ -11510,7 +11645,7 @@
                 <w:szCs w:val="24"/>
                 <w:cs/>
               </w:rPr>
-              <w:t>...พ.ศ.</w:t>
+              <w:t>ฉบับเดือน</w:t>
             </w:r>
             <w:r>
               <w:rPr>
@@ -11520,49 +11655,46 @@
                 <w:szCs w:val="24"/>
                 <w:cs/>
               </w:rPr>
-              <w:t>.....</w:t>
-            </w:r>
-            <w:r>
-              <w:rPr>
-                <w:rFonts w:ascii="TH SarabunPSK" w:eastAsia="Calibri" w:hAnsi="TH SarabunPSK" w:cs="TH SarabunPSK" w:hint="cs"/>
+              <w:t xml:space="preserve"> </w:t>
+            </w:r>
+            <w:r>
+              <w:rPr>
+                <w:rFonts w:ascii="TH SarabunPSK" w:eastAsia="Calibri" w:hAnsi="TH SarabunPSK" w:cs="TH SarabunPSK"/>
                 <w:color w:val="000000"/>
                 <w:sz w:val="24"/>
                 <w:szCs w:val="24"/>
-                <w:cs/>
-              </w:rPr>
-              <w:t>..</w:t>
-            </w:r>
-          </w:p>
-          <w:p>
-            <w:pPr>
-              <w:spacing w:after="0" w:line="240" w:lineRule="auto"/>
+              </w:rPr>
+              <w:t>{</w:t>
+            </w:r>
+            <w:proofErr w:type="spellStart"/>
+            <w:r>
               <w:rPr>
                 <w:rFonts w:ascii="TH SarabunPSK" w:eastAsia="Calibri" w:hAnsi="TH SarabunPSK" w:cs="TH SarabunPSK"/>
                 <w:color w:val="000000"/>
                 <w:sz w:val="24"/>
                 <w:szCs w:val="24"/>
-                <w:cs/>
-              </w:rPr>
-            </w:pPr>
-            <w:r>
-              <w:rPr>
-                <w:rFonts w:ascii="TH SarabunPSK" w:eastAsia="Calibri" w:hAnsi="TH SarabunPSK" w:cs="TH SarabunPSK" w:hint="cs"/>
+              </w:rPr>
+              <w:t>mdesMonth</w:t>
+            </w:r>
+            <w:proofErr w:type="spellEnd"/>
+            <w:r>
+              <w:rPr>
+                <w:rFonts w:ascii="TH SarabunPSK" w:eastAsia="Calibri" w:hAnsi="TH SarabunPSK" w:cs="TH SarabunPSK"/>
                 <w:color w:val="000000"/>
                 <w:sz w:val="24"/>
                 <w:szCs w:val="24"/>
-                <w:cs/>
-              </w:rPr>
-              <w:t>รายการที่</w:t>
-            </w:r>
-            <w:r>
-              <w:rPr>
-                <w:rFonts w:ascii="TH SarabunPSK" w:eastAsia="Calibri" w:hAnsi="TH SarabunPSK" w:cs="TH SarabunPSK" w:hint="cs"/>
+              </w:rPr>
+              <w:t>}</w:t>
+            </w:r>
+            <w:r>
+              <w:rPr>
+                <w:rFonts w:ascii="TH SarabunPSK" w:eastAsia="Calibri" w:hAnsi="TH SarabunPSK" w:cs="TH SarabunPSK"/>
                 <w:color w:val="000000"/>
                 <w:sz w:val="24"/>
                 <w:szCs w:val="24"/>
-                <w:cs/>
-              </w:rPr>
-              <w:t>......</w:t>
+                <w:u w:val="dotted"/>
+              </w:rPr>
+              <w:t xml:space="preserve"> </w:t>
             </w:r>
             <w:r>
               <w:rPr>
@@ -11572,19 +11704,18 @@
                 <w:szCs w:val="24"/>
                 <w:cs/>
               </w:rPr>
-              <w:t>..........................</w:t>
-            </w:r>
-          </w:p>
-          <w:p>
-            <w:pPr>
-              <w:spacing w:after="0" w:line="240" w:lineRule="auto"/>
-              <w:rPr>
-                <w:rFonts w:ascii="TH SarabunPSK" w:eastAsia="Calibri" w:hAnsi="TH SarabunPSK" w:cs="TH SarabunPSK"/>
+              <w:t>พ.ศ.</w:t>
+            </w:r>
+            <w:r>
+              <w:rPr>
+                <w:rFonts w:ascii="TH SarabunPSK" w:eastAsia="Calibri" w:hAnsi="TH SarabunPSK" w:cs="TH SarabunPSK" w:hint="cs"/>
                 <w:color w:val="000000"/>
                 <w:sz w:val="24"/>
                 <w:szCs w:val="24"/>
-              </w:rPr>
-            </w:pPr>
+                <w:cs/>
+              </w:rPr>
+              <w:t xml:space="preserve"> </w:t>
+            </w:r>
             <w:r>
               <w:rPr>
                 <w:rFonts w:ascii="TH SarabunPSK" w:eastAsia="Calibri" w:hAnsi="TH SarabunPSK" w:cs="TH SarabunPSK"/>
@@ -11592,7 +11723,129 @@
                 <w:sz w:val="24"/>
                 <w:szCs w:val="24"/>
               </w:rPr>
-              <w:sym w:font="Wingdings 2" w:char="F0A3"/>
+              <w:t>{</w:t>
+            </w:r>
+            <w:proofErr w:type="spellStart"/>
+            <w:r>
+              <w:rPr>
+                <w:rFonts w:ascii="TH SarabunPSK" w:eastAsia="Calibri" w:hAnsi="TH SarabunPSK" w:cs="TH SarabunPSK"/>
+                <w:color w:val="000000"/>
+                <w:sz w:val="24"/>
+                <w:szCs w:val="24"/>
+              </w:rPr>
+              <w:t>mdesYear</w:t>
+            </w:r>
+            <w:proofErr w:type="spellEnd"/>
+            <w:r>
+              <w:rPr>
+                <w:rFonts w:ascii="TH SarabunPSK" w:eastAsia="Calibri" w:hAnsi="TH SarabunPSK" w:cs="TH SarabunPSK"/>
+                <w:color w:val="000000"/>
+                <w:sz w:val="24"/>
+                <w:szCs w:val="24"/>
+              </w:rPr>
+              <w:t>}</w:t>
+            </w:r>
+          </w:p>
+          <w:p>
+            <w:pPr>
+              <w:spacing w:after="0" w:line="240" w:lineRule="auto"/>
+              <w:rPr>
+                <w:rFonts w:ascii="TH SarabunPSK" w:eastAsia="Calibri" w:hAnsi="TH SarabunPSK" w:cs="TH SarabunPSK"/>
+                <w:color w:val="000000"/>
+                <w:sz w:val="24"/>
+                <w:szCs w:val="24"/>
+                <w:cs/>
+              </w:rPr>
+            </w:pPr>
+            <w:r>
+              <w:rPr>
+                <w:rFonts w:ascii="TH SarabunPSK" w:eastAsia="Calibri" w:hAnsi="TH SarabunPSK" w:cs="TH SarabunPSK" w:hint="cs"/>
+                <w:color w:val="000000"/>
+                <w:sz w:val="24"/>
+                <w:szCs w:val="24"/>
+                <w:cs/>
+              </w:rPr>
+              <w:t>รายการที่</w:t>
+            </w:r>
+            <w:r>
+              <w:rPr>
+                <w:rFonts w:ascii="TH SarabunPSK" w:eastAsia="Calibri" w:hAnsi="TH SarabunPSK" w:cs="TH SarabunPSK" w:hint="cs"/>
+                <w:color w:val="000000"/>
+                <w:sz w:val="24"/>
+                <w:szCs w:val="24"/>
+                <w:cs/>
+              </w:rPr>
+              <w:t xml:space="preserve"> </w:t>
+            </w:r>
+            <w:r>
+              <w:rPr>
+                <w:rFonts w:ascii="TH SarabunPSK" w:eastAsia="Calibri" w:hAnsi="TH SarabunPSK" w:cs="TH SarabunPSK"/>
+                <w:color w:val="000000"/>
+                <w:sz w:val="24"/>
+                <w:szCs w:val="24"/>
+              </w:rPr>
+              <w:t>{</w:t>
+            </w:r>
+            <w:proofErr w:type="spellStart"/>
+            <w:r>
+              <w:rPr>
+                <w:rFonts w:ascii="TH SarabunPSK" w:eastAsia="Calibri" w:hAnsi="TH SarabunPSK" w:cs="TH SarabunPSK"/>
+                <w:color w:val="000000"/>
+                <w:sz w:val="24"/>
+                <w:szCs w:val="24"/>
+              </w:rPr>
+              <w:t>mdesItemNo</w:t>
+            </w:r>
+            <w:proofErr w:type="spellEnd"/>
+            <w:r>
+              <w:rPr>
+                <w:rFonts w:ascii="TH SarabunPSK" w:eastAsia="Calibri" w:hAnsi="TH SarabunPSK" w:cs="TH SarabunPSK"/>
+                <w:color w:val="000000"/>
+                <w:sz w:val="24"/>
+                <w:szCs w:val="24"/>
+              </w:rPr>
+              <w:t>}</w:t>
+            </w:r>
+          </w:p>
+          <w:p>
+            <w:pPr>
+              <w:spacing w:after="0" w:line="240" w:lineRule="auto"/>
+              <w:rPr>
+                <w:rFonts w:ascii="TH SarabunPSK" w:eastAsia="Calibri" w:hAnsi="TH SarabunPSK" w:cs="TH SarabunPSK"/>
+                <w:color w:val="000000"/>
+                <w:sz w:val="24"/>
+                <w:szCs w:val="24"/>
+              </w:rPr>
+            </w:pPr>
+            <w:r>
+              <w:rPr>
+                <w:rFonts w:ascii="TH SarabunPSK" w:eastAsia="Calibri" w:hAnsi="TH SarabunPSK" w:cs="TH SarabunPSK"/>
+                <w:color w:val="000000"/>
+                <w:sz w:val="24"/>
+                <w:szCs w:val="24"/>
+              </w:rPr>
+              <w:lastRenderedPageBreak/>
+              <w:t>{</w:t>
+            </w:r>
+            <w:proofErr w:type="spellStart"/>
+            <w:r>
+              <w:rPr>
+                <w:rFonts w:ascii="TH SarabunPSK" w:eastAsia="Calibri" w:hAnsi="TH SarabunPSK" w:cs="TH SarabunPSK"/>
+                <w:color w:val="000000"/>
+                <w:sz w:val="24"/>
+                <w:szCs w:val="24"/>
+              </w:rPr>
+              <w:t>chkMarket</w:t>
+            </w:r>
+            <w:proofErr w:type="spellEnd"/>
+            <w:r>
+              <w:rPr>
+                <w:rFonts w:ascii="TH SarabunPSK" w:eastAsia="Calibri" w:hAnsi="TH SarabunPSK" w:cs="TH SarabunPSK"/>
+                <w:color w:val="000000"/>
+                <w:sz w:val="24"/>
+                <w:szCs w:val="24"/>
+              </w:rPr>
+              <w:t>}</w:t>
             </w:r>
             <w:r>
               <w:rPr>
@@ -11623,7 +11876,7 @@
                 <w:szCs w:val="24"/>
                 <w:cs/>
               </w:rPr>
-              <w:t>ฯ</w:t>
+              <w:t>ฯ จำนวน</w:t>
             </w:r>
             <w:r>
               <w:rPr>
@@ -11634,48 +11887,50 @@
                 <w:szCs w:val="24"/>
                 <w:cs/>
               </w:rPr>
-              <w:t xml:space="preserve"> จำนวน</w:t>
-            </w:r>
-            <w:r>
-              <w:rPr>
-                <w:rFonts w:ascii="TH SarabunPSK" w:eastAsia="Calibri" w:hAnsi="TH SarabunPSK" w:cs="TH SarabunPSK" w:hint="cs"/>
-                <w:color w:val="000000"/>
+              <w:t xml:space="preserve"> </w:t>
+            </w:r>
+            <w:r>
+              <w:rPr>
+                <w:rFonts w:ascii="TH SarabunPSK" w:hAnsi="TH SarabunPSK" w:cs="TH SarabunPSK"/>
+                <w:color w:val="000000"/>
+                <w:kern w:val="32"/>
                 <w:sz w:val="24"/>
                 <w:szCs w:val="24"/>
-                <w:cs/>
-              </w:rPr>
-              <w:t>.....</w:t>
-            </w:r>
-            <w:r>
-              <w:rPr>
-                <w:rFonts w:ascii="TH SarabunPSK" w:eastAsia="Calibri" w:hAnsi="TH SarabunPSK" w:cs="TH SarabunPSK" w:hint="cs"/>
-                <w:color w:val="000000"/>
+              </w:rPr>
+              <w:t>{</w:t>
+            </w:r>
+            <w:proofErr w:type="spellStart"/>
+            <w:r>
+              <w:rPr>
+                <w:rFonts w:ascii="TH SarabunPSK" w:hAnsi="TH SarabunPSK" w:cs="TH SarabunPSK"/>
+                <w:color w:val="000000"/>
+                <w:kern w:val="32"/>
                 <w:sz w:val="24"/>
                 <w:szCs w:val="24"/>
-                <w:cs/>
-              </w:rPr>
-              <w:t>ราย</w:t>
-            </w:r>
-          </w:p>
-          <w:p>
-            <w:pPr>
-              <w:spacing w:after="0" w:line="240" w:lineRule="auto"/>
-              <w:rPr>
-                <w:rFonts w:ascii="TH SarabunPSK" w:eastAsia="Calibri" w:hAnsi="TH SarabunPSK" w:cs="TH SarabunPSK"/>
-                <w:color w:val="000000"/>
+              </w:rPr>
+              <w:t>marketCount</w:t>
+            </w:r>
+            <w:proofErr w:type="spellEnd"/>
+            <w:r>
+              <w:rPr>
+                <w:rFonts w:ascii="TH SarabunPSK" w:hAnsi="TH SarabunPSK" w:cs="TH SarabunPSK"/>
+                <w:color w:val="000000"/>
+                <w:kern w:val="32"/>
                 <w:sz w:val="24"/>
                 <w:szCs w:val="24"/>
               </w:rPr>
-            </w:pPr>
-            <w:r>
-              <w:rPr>
-                <w:rFonts w:ascii="TH SarabunPSK" w:eastAsia="Calibri" w:hAnsi="TH SarabunPSK" w:cs="TH SarabunPSK" w:hint="cs"/>
-                <w:color w:val="000000"/>
+              <w:t>}</w:t>
+            </w:r>
+            <w:r>
+              <w:rPr>
+                <w:rFonts w:ascii="TH SarabunPSK" w:hAnsi="TH SarabunPSK" w:cs="TH SarabunPSK" w:hint="cs"/>
+                <w:color w:val="000000"/>
+                <w:kern w:val="32"/>
                 <w:sz w:val="24"/>
                 <w:szCs w:val="24"/>
                 <w:cs/>
               </w:rPr>
-              <w:t>ใช้ของบริษัท</w:t>
+              <w:t xml:space="preserve"> </w:t>
             </w:r>
             <w:r>
               <w:rPr>
@@ -11685,69 +11940,69 @@
                 <w:szCs w:val="24"/>
                 <w:cs/>
               </w:rPr>
-              <w:t>.</w:t>
-            </w:r>
-            <w:r>
-              <w:rPr>
-                <w:rFonts w:ascii="TH SarabunPSK" w:eastAsia="Calibri" w:hAnsi="TH SarabunPSK" w:cs="TH SarabunPSK" w:hint="cs"/>
+              <w:t>ราย</w:t>
+            </w:r>
+          </w:p>
+          <w:p>
+            <w:pPr>
+              <w:spacing w:after="0" w:line="240" w:lineRule="auto"/>
+              <w:rPr>
+                <w:rFonts w:ascii="TH SarabunPSK" w:eastAsia="Calibri" w:hAnsi="TH SarabunPSK" w:cs="TH SarabunPSK"/>
                 <w:color w:val="000000"/>
                 <w:sz w:val="24"/>
                 <w:szCs w:val="24"/>
-                <w:cs/>
-              </w:rPr>
-              <w:t>..........................</w:t>
-            </w:r>
-          </w:p>
-          <w:p>
-            <w:pPr>
-              <w:spacing w:after="0" w:line="240" w:lineRule="auto"/>
-              <w:rPr>
-                <w:rFonts w:ascii="TH SarabunPSK" w:eastAsia="Calibri" w:hAnsi="TH SarabunPSK" w:cs="TH SarabunPSK"/>
+              </w:rPr>
+            </w:pPr>
+            <w:r>
+              <w:rPr>
+                <w:rFonts w:ascii="TH SarabunPSK" w:eastAsia="Calibri" w:hAnsi="TH SarabunPSK" w:cs="TH SarabunPSK" w:hint="cs"/>
                 <w:color w:val="000000"/>
                 <w:sz w:val="24"/>
                 <w:szCs w:val="24"/>
-              </w:rPr>
-            </w:pPr>
-            <w:r>
-              <w:rPr>
-                <w:rFonts w:ascii="TH SarabunPSK" w:eastAsia="Calibri" w:hAnsi="TH SarabunPSK" w:cs="TH SarabunPSK" w:hint="cs"/>
+                <w:cs/>
+              </w:rPr>
+              <w:t>ใช้ของบริษัท</w:t>
+            </w:r>
+            <w:r>
+              <w:rPr>
+                <w:rFonts w:ascii="TH SarabunPSK" w:eastAsia="Calibri" w:hAnsi="TH SarabunPSK" w:cs="TH SarabunPSK"/>
                 <w:color w:val="000000"/>
                 <w:sz w:val="24"/>
                 <w:szCs w:val="24"/>
-                <w:cs/>
-              </w:rPr>
-              <w:t>..</w:t>
-            </w:r>
-            <w:r>
-              <w:rPr>
-                <w:rFonts w:ascii="TH SarabunPSK" w:eastAsia="Calibri" w:hAnsi="TH SarabunPSK" w:cs="TH SarabunPSK" w:hint="cs"/>
+              </w:rPr>
+              <w:t xml:space="preserve"> {</w:t>
+            </w:r>
+            <w:proofErr w:type="spellStart"/>
+            <w:r>
+              <w:rPr>
+                <w:rFonts w:ascii="TH SarabunPSK" w:eastAsia="Calibri" w:hAnsi="TH SarabunPSK" w:cs="TH SarabunPSK"/>
                 <w:color w:val="000000"/>
                 <w:sz w:val="24"/>
                 <w:szCs w:val="24"/>
-                <w:cs/>
-              </w:rPr>
-              <w:t>.............................................</w:t>
-            </w:r>
-          </w:p>
-          <w:p>
-            <w:pPr>
-              <w:spacing w:after="0" w:line="240" w:lineRule="auto"/>
+              </w:rPr>
+              <w:t>marketCompany</w:t>
+            </w:r>
+            <w:proofErr w:type="spellEnd"/>
+            <w:r>
               <w:rPr>
                 <w:rFonts w:ascii="TH SarabunPSK" w:eastAsia="Calibri" w:hAnsi="TH SarabunPSK" w:cs="TH SarabunPSK"/>
                 <w:color w:val="000000"/>
                 <w:sz w:val="24"/>
                 <w:szCs w:val="24"/>
               </w:rPr>
-            </w:pPr>
-            <w:r>
+              <w:t xml:space="preserve">} </w:t>
+            </w:r>
+          </w:p>
+          <w:p>
+            <w:pPr>
+              <w:spacing w:after="0" w:line="240" w:lineRule="auto"/>
               <w:rPr>
                 <w:rFonts w:ascii="TH SarabunPSK" w:eastAsia="Calibri" w:hAnsi="TH SarabunPSK" w:cs="TH SarabunPSK"/>
                 <w:color w:val="000000"/>
                 <w:sz w:val="24"/>
                 <w:szCs w:val="24"/>
               </w:rPr>
-              <w:sym w:font="Wingdings 2" w:char="F0A3"/>
-            </w:r>
+            </w:pPr>
             <w:r>
               <w:rPr>
                 <w:rFonts w:ascii="TH SarabunPSK" w:eastAsia="Calibri" w:hAnsi="TH SarabunPSK" w:cs="TH SarabunPSK"/>
@@ -11755,39 +12010,36 @@
                 <w:sz w:val="24"/>
                 <w:szCs w:val="24"/>
               </w:rPr>
-              <w:t xml:space="preserve"> </w:t>
-            </w:r>
-            <w:r>
-              <w:rPr>
-                <w:rFonts w:ascii="TH SarabunPSK" w:eastAsia="Calibri" w:hAnsi="TH SarabunPSK" w:cs="TH SarabunPSK" w:hint="cs"/>
+              <w:t>{</w:t>
+            </w:r>
+            <w:proofErr w:type="spellStart"/>
+            <w:r>
+              <w:rPr>
+                <w:rFonts w:ascii="TH SarabunPSK" w:eastAsia="Calibri" w:hAnsi="TH SarabunPSK" w:cs="TH SarabunPSK"/>
                 <w:color w:val="000000"/>
                 <w:sz w:val="24"/>
                 <w:szCs w:val="24"/>
-                <w:cs/>
-              </w:rPr>
-              <w:t>ราคาที่เคยจัดหาฯ</w:t>
-            </w:r>
-          </w:p>
-          <w:p>
-            <w:pPr>
-              <w:spacing w:after="0" w:line="240" w:lineRule="auto"/>
+              </w:rPr>
+              <w:t>chkPrev</w:t>
+            </w:r>
+            <w:proofErr w:type="spellEnd"/>
+            <w:r>
               <w:rPr>
                 <w:rFonts w:ascii="TH SarabunPSK" w:eastAsia="Calibri" w:hAnsi="TH SarabunPSK" w:cs="TH SarabunPSK"/>
                 <w:color w:val="000000"/>
                 <w:sz w:val="24"/>
                 <w:szCs w:val="24"/>
               </w:rPr>
-            </w:pPr>
-            <w:r>
-              <w:rPr>
-                <w:rFonts w:ascii="TH SarabunPSK" w:eastAsia="Calibri" w:hAnsi="TH SarabunPSK" w:cs="TH SarabunPSK" w:hint="cs"/>
+              <w:t>}</w:t>
+            </w:r>
+            <w:r>
+              <w:rPr>
+                <w:rFonts w:ascii="TH SarabunPSK" w:eastAsia="Calibri" w:hAnsi="TH SarabunPSK" w:cs="TH SarabunPSK"/>
                 <w:color w:val="000000"/>
                 <w:sz w:val="24"/>
                 <w:szCs w:val="24"/>
-                <w:cs/>
-              </w:rPr>
-              <w:lastRenderedPageBreak/>
-              <w:t>โครงการ</w:t>
+              </w:rPr>
+              <w:t xml:space="preserve"> </w:t>
             </w:r>
             <w:r>
               <w:rPr>
@@ -11797,29 +12049,29 @@
                 <w:szCs w:val="24"/>
                 <w:cs/>
               </w:rPr>
-              <w:t>..</w:t>
-            </w:r>
-            <w:r>
-              <w:rPr>
-                <w:rFonts w:ascii="TH SarabunPSK" w:eastAsia="Calibri" w:hAnsi="TH SarabunPSK" w:cs="TH SarabunPSK" w:hint="cs"/>
+              <w:t>ราคาที่เคยจัดหาฯ</w:t>
+            </w:r>
+          </w:p>
+          <w:p>
+            <w:pPr>
+              <w:spacing w:after="0" w:line="240" w:lineRule="auto"/>
+              <w:rPr>
+                <w:rFonts w:ascii="TH SarabunPSK" w:eastAsia="Calibri" w:hAnsi="TH SarabunPSK" w:cs="TH SarabunPSK"/>
                 <w:color w:val="000000"/>
                 <w:sz w:val="24"/>
                 <w:szCs w:val="24"/>
-                <w:cs/>
-              </w:rPr>
-              <w:t>...............................</w:t>
-            </w:r>
-          </w:p>
-          <w:p>
-            <w:pPr>
-              <w:spacing w:after="0" w:line="240" w:lineRule="auto"/>
-              <w:rPr>
-                <w:rFonts w:ascii="TH SarabunPSK" w:eastAsia="Calibri" w:hAnsi="TH SarabunPSK" w:cs="TH SarabunPSK"/>
+              </w:rPr>
+            </w:pPr>
+            <w:r>
+              <w:rPr>
+                <w:rFonts w:ascii="TH SarabunPSK" w:eastAsia="Calibri" w:hAnsi="TH SarabunPSK" w:cs="TH SarabunPSK" w:hint="cs"/>
                 <w:color w:val="000000"/>
                 <w:sz w:val="24"/>
                 <w:szCs w:val="24"/>
-              </w:rPr>
-            </w:pPr>
+                <w:cs/>
+              </w:rPr>
+              <w:t>โครงการ</w:t>
+            </w:r>
             <w:r>
               <w:rPr>
                 <w:rFonts w:ascii="TH SarabunPSK" w:eastAsia="Calibri" w:hAnsi="TH SarabunPSK" w:cs="TH SarabunPSK" w:hint="cs"/>
@@ -11828,56 +12080,218 @@
                 <w:szCs w:val="24"/>
                 <w:cs/>
               </w:rPr>
-              <w:t>.</w:t>
-            </w:r>
-            <w:r>
-              <w:rPr>
-                <w:rFonts w:ascii="TH SarabunPSK" w:eastAsia="Calibri" w:hAnsi="TH SarabunPSK" w:cs="TH SarabunPSK" w:hint="cs"/>
+              <w:t xml:space="preserve"> </w:t>
+            </w:r>
+            <w:r>
+              <w:rPr>
+                <w:rFonts w:ascii="TH SarabunPSK" w:eastAsia="Calibri" w:hAnsi="TH SarabunPSK" w:cs="TH SarabunPSK"/>
                 <w:color w:val="000000"/>
                 <w:sz w:val="24"/>
                 <w:szCs w:val="24"/>
-                <w:cs/>
-              </w:rPr>
-              <w:t>..............................พ.ศ...........</w:t>
-            </w:r>
-          </w:p>
-          <w:p>
-            <w:pPr>
-              <w:spacing w:after="0" w:line="240" w:lineRule="auto"/>
-              <w:rPr>
-                <w:rFonts w:ascii="TH SarabunIT๙" w:eastAsia="Calibri" w:hAnsi="TH SarabunIT๙" w:cs="TH SarabunIT๙"/>
-                <w:color w:val="000000"/>
-                <w:sz w:val="28"/>
-              </w:rPr>
-            </w:pPr>
-            <w:r>
-              <w:rPr>
-                <w:rFonts w:ascii="TH SarabunPSK" w:eastAsia="Calibri" w:hAnsi="TH SarabunPSK" w:cs="TH SarabunPSK" w:hint="cs"/>
+              </w:rPr>
+              <w:t>{</w:t>
+            </w:r>
+            <w:proofErr w:type="spellStart"/>
+            <w:r>
+              <w:rPr>
+                <w:rFonts w:ascii="TH SarabunPSK" w:eastAsia="Calibri" w:hAnsi="TH SarabunPSK" w:cs="TH SarabunPSK"/>
                 <w:color w:val="000000"/>
                 <w:sz w:val="24"/>
                 <w:szCs w:val="24"/>
               </w:rPr>
-              <w:sym w:font="Wingdings 2" w:char="F0A3"/>
-            </w:r>
-            <w:r>
-              <w:rPr>
-                <w:rFonts w:ascii="TH SarabunPSK" w:eastAsia="Calibri" w:hAnsi="TH SarabunPSK" w:cs="TH SarabunPSK" w:hint="cs"/>
+              <w:t>prevProject</w:t>
+            </w:r>
+            <w:proofErr w:type="spellEnd"/>
+            <w:r>
+              <w:rPr>
+                <w:rFonts w:ascii="TH SarabunPSK" w:eastAsia="Calibri" w:hAnsi="TH SarabunPSK" w:cs="TH SarabunPSK"/>
                 <w:color w:val="000000"/>
                 <w:sz w:val="24"/>
                 <w:szCs w:val="24"/>
-                <w:cs/>
-              </w:rPr>
-              <w:t xml:space="preserve"> อื่นๆ......................</w:t>
-            </w:r>
-            <w:r>
-              <w:rPr>
-                <w:rFonts w:ascii="TH SarabunPSK" w:eastAsia="Calibri" w:hAnsi="TH SarabunPSK" w:cs="TH SarabunPSK" w:hint="cs"/>
+              </w:rPr>
+              <w:t>}</w:t>
+            </w:r>
+          </w:p>
+          <w:p>
+            <w:pPr>
+              <w:spacing w:after="0" w:line="240" w:lineRule="auto"/>
+              <w:rPr>
+                <w:rFonts w:ascii="TH SarabunPSK" w:eastAsia="Calibri" w:hAnsi="TH SarabunPSK" w:cs="TH SarabunPSK"/>
                 <w:color w:val="000000"/>
                 <w:sz w:val="24"/>
                 <w:szCs w:val="24"/>
-                <w:cs/>
-              </w:rPr>
-              <w:t>...........</w:t>
+              </w:rPr>
+            </w:pPr>
+            <w:r>
+              <w:rPr>
+                <w:rFonts w:ascii="TH SarabunPSK" w:eastAsia="Calibri" w:hAnsi="TH SarabunPSK" w:cs="TH SarabunPSK" w:hint="cs"/>
+                <w:color w:val="000000"/>
+                <w:sz w:val="24"/>
+                <w:szCs w:val="24"/>
+                <w:cs/>
+              </w:rPr>
+              <w:t>พ.ศ.</w:t>
+            </w:r>
+            <w:r>
+              <w:rPr>
+                <w:rFonts w:ascii="TH SarabunPSK" w:eastAsia="Calibri" w:hAnsi="TH SarabunPSK" w:cs="TH SarabunPSK" w:hint="cs"/>
+                <w:color w:val="000000"/>
+                <w:sz w:val="24"/>
+                <w:szCs w:val="24"/>
+                <w:cs/>
+              </w:rPr>
+              <w:t xml:space="preserve"> </w:t>
+            </w:r>
+            <w:r>
+              <w:rPr>
+                <w:rFonts w:ascii="TH SarabunPSK" w:eastAsia="Calibri" w:hAnsi="TH SarabunPSK" w:cs="TH SarabunPSK"/>
+                <w:color w:val="000000"/>
+                <w:sz w:val="24"/>
+                <w:szCs w:val="24"/>
+              </w:rPr>
+              <w:t>{</w:t>
+            </w:r>
+            <w:proofErr w:type="spellStart"/>
+            <w:r>
+              <w:rPr>
+                <w:rFonts w:ascii="TH SarabunPSK" w:eastAsia="Calibri" w:hAnsi="TH SarabunPSK" w:cs="TH SarabunPSK"/>
+                <w:color w:val="000000"/>
+                <w:sz w:val="24"/>
+                <w:szCs w:val="24"/>
+              </w:rPr>
+              <w:t>prevYear</w:t>
+            </w:r>
+            <w:proofErr w:type="spellEnd"/>
+            <w:r>
+              <w:rPr>
+                <w:rFonts w:ascii="TH SarabunPSK" w:eastAsia="Calibri" w:hAnsi="TH SarabunPSK" w:cs="TH SarabunPSK"/>
+                <w:color w:val="000000"/>
+                <w:sz w:val="24"/>
+                <w:szCs w:val="24"/>
+              </w:rPr>
+              <w:t>}</w:t>
+            </w:r>
+          </w:p>
+          <w:p>
+            <w:pPr>
+              <w:spacing w:after="0" w:line="240" w:lineRule="auto"/>
+              <w:rPr>
+                <w:rFonts w:ascii="TH SarabunIT๙" w:eastAsia="Calibri" w:hAnsi="TH SarabunIT๙" w:cs="TH SarabunIT๙"/>
+                <w:color w:val="000000"/>
+                <w:sz w:val="28"/>
+              </w:rPr>
+            </w:pPr>
+            <w:r>
+              <w:rPr>
+                <w:rFonts w:ascii="TH SarabunPSK" w:eastAsia="Calibri" w:hAnsi="TH SarabunPSK" w:cs="TH SarabunPSK"/>
+                <w:color w:val="000000"/>
+                <w:sz w:val="24"/>
+                <w:szCs w:val="24"/>
+              </w:rPr>
+              <w:t>{</w:t>
+            </w:r>
+            <w:proofErr w:type="spellStart"/>
+            <w:r>
+              <w:rPr>
+                <w:rFonts w:ascii="TH SarabunPSK" w:eastAsia="Calibri" w:hAnsi="TH SarabunPSK" w:cs="TH SarabunPSK"/>
+                <w:color w:val="000000"/>
+                <w:sz w:val="24"/>
+                <w:szCs w:val="24"/>
+              </w:rPr>
+              <w:t>chkOther</w:t>
+            </w:r>
+            <w:proofErr w:type="spellEnd"/>
+            <w:r>
+              <w:rPr>
+                <w:rFonts w:ascii="TH SarabunPSK" w:eastAsia="Calibri" w:hAnsi="TH SarabunPSK" w:cs="TH SarabunPSK"/>
+                <w:color w:val="000000"/>
+                <w:sz w:val="24"/>
+                <w:szCs w:val="24"/>
+              </w:rPr>
+              <w:t>}</w:t>
+            </w:r>
+            <w:r>
+              <w:rPr>
+                <w:rFonts w:ascii="TH SarabunPSK" w:eastAsia="Calibri" w:hAnsi="TH SarabunPSK" w:cs="TH SarabunPSK" w:hint="cs"/>
+                <w:color w:val="000000"/>
+                <w:sz w:val="24"/>
+                <w:szCs w:val="24"/>
+                <w:cs/>
+              </w:rPr>
+              <w:t xml:space="preserve"> อื่นๆ</w:t>
+            </w:r>
+            <w:r>
+              <w:rPr>
+                <w:rFonts w:ascii="TH SarabunPSK" w:eastAsia="Calibri" w:hAnsi="TH SarabunPSK" w:cs="TH SarabunPSK" w:hint="cs"/>
+                <w:color w:val="000000"/>
+                <w:sz w:val="24"/>
+                <w:szCs w:val="24"/>
+                <w:cs/>
+              </w:rPr>
+              <w:t xml:space="preserve"> </w:t>
+            </w:r>
+            <w:r>
+              <w:rPr>
+                <w:rFonts w:ascii="TH SarabunPSK" w:eastAsia="Calibri" w:hAnsi="TH SarabunPSK" w:cs="TH SarabunPSK"/>
+                <w:color w:val="000000"/>
+                <w:sz w:val="24"/>
+                <w:szCs w:val="24"/>
+              </w:rPr>
+              <w:t>{</w:t>
+            </w:r>
+            <w:proofErr w:type="spellStart"/>
+            <w:r>
+              <w:rPr>
+                <w:rFonts w:ascii="TH SarabunPSK" w:eastAsia="Calibri" w:hAnsi="TH SarabunPSK" w:cs="TH SarabunPSK"/>
+                <w:color w:val="000000"/>
+                <w:sz w:val="24"/>
+                <w:szCs w:val="24"/>
+              </w:rPr>
+              <w:t>otherDetail</w:t>
+            </w:r>
+            <w:proofErr w:type="spellEnd"/>
+            <w:r>
+              <w:rPr>
+                <w:rFonts w:ascii="TH SarabunPSK" w:eastAsia="Calibri" w:hAnsi="TH SarabunPSK" w:cs="TH SarabunPSK"/>
+                <w:color w:val="000000"/>
+                <w:sz w:val="24"/>
+                <w:szCs w:val="24"/>
+              </w:rPr>
+              <w:t>}</w:t>
+            </w:r>
+            <w:r>
+              <w:rPr>
+                <w:rFonts w:ascii="TH SarabunIT๙" w:eastAsia="Calibri" w:hAnsi="TH SarabunIT๙" w:cs="TH SarabunIT๙"/>
+                <w:color w:val="000000"/>
+                <w:sz w:val="28"/>
+              </w:rPr>
+              <w:t xml:space="preserve"> </w:t>
+            </w:r>
+            <w:r>
+              <w:rPr>
+                <w:rFonts w:ascii="TH SarabunIT๙" w:eastAsia="Calibri" w:hAnsi="TH SarabunIT๙" w:cs="TH SarabunIT๙"/>
+                <w:color w:val="000000"/>
+                <w:sz w:val="28"/>
+              </w:rPr>
+              <w:t>{/</w:t>
+            </w:r>
+            <w:proofErr w:type="spellStart"/>
+            <w:r>
+              <w:rPr>
+                <w:rFonts w:ascii="TH SarabunIT๙" w:eastAsia="Calibri" w:hAnsi="TH SarabunIT๙" w:cs="TH SarabunIT๙"/>
+                <w:color w:val="000000"/>
+                <w:sz w:val="28"/>
+              </w:rPr>
+              <w:t>hardwareCosts</w:t>
+            </w:r>
+            <w:proofErr w:type="spellEnd"/>
+            <w:r>
+              <w:rPr>
+                <w:rFonts w:ascii="TH SarabunIT๙" w:eastAsia="Calibri" w:hAnsi="TH SarabunIT๙" w:cs="TH SarabunIT๙"/>
+                <w:color w:val="000000"/>
+                <w:sz w:val="28"/>
+              </w:rPr>
+              <w:t>}</w:t>
             </w:r>
           </w:p>
         </w:tc>
@@ -11888,68 +12302,38 @@
         </w:trPr>
         <w:tc>
           <w:tcPr>
-            <w:tcW w:w="725" w:type="dxa"/>
-          </w:tcPr>
-          <w:p>
-            <w:pPr>
-              <w:tabs>
-                <w:tab w:val="left" w:pos="90"/>
-              </w:tabs>
-              <w:spacing w:after="0" w:line="240" w:lineRule="auto"/>
-              <w:ind w:left="180" w:hanging="180"/>
-              <w:jc w:val="center"/>
-              <w:rPr>
-                <w:rFonts w:ascii="TH SarabunIT๙" w:eastAsia="Calibri" w:hAnsi="TH SarabunIT๙" w:cs="TH SarabunIT๙"/>
-                <w:color w:val="000000"/>
-                <w:sz w:val="28"/>
-              </w:rPr>
-            </w:pPr>
-            <w:r>
-              <w:rPr>
-                <w:rFonts w:ascii="TH SarabunIT๙" w:eastAsia="Calibri" w:hAnsi="TH SarabunIT๙" w:cs="TH SarabunIT๙" w:hint="cs"/>
+            <w:tcW w:w="6609" w:type="dxa"/>
+            <w:gridSpan w:val="4"/>
+          </w:tcPr>
+          <w:p>
+            <w:pPr>
+              <w:spacing w:after="0" w:line="240" w:lineRule="auto"/>
+              <w:jc w:val="right"/>
+              <w:rPr>
+                <w:rFonts w:ascii="TH SarabunIT๙" w:eastAsia="Calibri" w:hAnsi="TH SarabunIT๙" w:cs="TH SarabunIT๙"/>
+                <w:b/>
+                <w:bCs/>
+                <w:color w:val="000000"/>
+                <w:sz w:val="28"/>
+              </w:rPr>
+            </w:pPr>
+            <w:r>
+              <w:rPr>
+                <w:rFonts w:ascii="TH SarabunIT๙" w:eastAsia="Calibri" w:hAnsi="TH SarabunIT๙" w:cs="TH SarabunIT๙"/>
+                <w:b/>
+                <w:bCs/>
                 <w:color w:val="000000"/>
                 <w:sz w:val="28"/>
                 <w:cs/>
               </w:rPr>
               <w:lastRenderedPageBreak/>
-              <w:t>2.</w:t>
-            </w:r>
-          </w:p>
-        </w:tc>
-        <w:tc>
-          <w:tcPr>
-            <w:tcW w:w="3235" w:type="dxa"/>
-          </w:tcPr>
-          <w:p>
-            <w:pPr>
-              <w:spacing w:after="0" w:line="240" w:lineRule="auto"/>
-              <w:rPr>
-                <w:rFonts w:ascii="TH SarabunIT๙" w:eastAsia="Calibri" w:hAnsi="TH SarabunIT๙" w:cs="TH SarabunIT๙"/>
-                <w:color w:val="000000"/>
-                <w:sz w:val="28"/>
-              </w:rPr>
-            </w:pPr>
-          </w:p>
-        </w:tc>
-        <w:tc>
-          <w:tcPr>
-            <w:tcW w:w="847" w:type="dxa"/>
-          </w:tcPr>
-          <w:p>
-            <w:pPr>
-              <w:spacing w:after="0" w:line="240" w:lineRule="auto"/>
-              <w:jc w:val="center"/>
-              <w:rPr>
-                <w:rFonts w:ascii="TH SarabunIT๙" w:eastAsia="Calibri" w:hAnsi="TH SarabunIT๙" w:cs="TH SarabunIT๙"/>
-                <w:color w:val="000000"/>
-                <w:sz w:val="28"/>
-              </w:rPr>
-            </w:pPr>
-          </w:p>
-        </w:tc>
-        <w:tc>
-          <w:tcPr>
-            <w:tcW w:w="1488" w:type="dxa"/>
+              <w:t>รวมทั้งสิ้น</w:t>
+            </w:r>
+          </w:p>
+        </w:tc>
+        <w:tc>
+          <w:tcPr>
+            <w:tcW w:w="1200" w:type="dxa"/>
           </w:tcPr>
           <w:p>
             <w:pPr>
@@ -11965,526 +12349,7 @@
         </w:tc>
         <w:tc>
           <w:tcPr>
-            <w:tcW w:w="1440" w:type="dxa"/>
-          </w:tcPr>
-          <w:p>
-            <w:pPr>
-              <w:spacing w:after="0" w:line="240" w:lineRule="auto"/>
-              <w:jc w:val="right"/>
-              <w:rPr>
-                <w:rFonts w:ascii="TH SarabunIT๙" w:eastAsia="Calibri" w:hAnsi="TH SarabunIT๙" w:cs="TH SarabunIT๙"/>
-                <w:color w:val="000000"/>
-                <w:sz w:val="28"/>
-              </w:rPr>
-            </w:pPr>
-          </w:p>
-        </w:tc>
-        <w:tc>
-          <w:tcPr>
-            <w:tcW w:w="2154" w:type="dxa"/>
-          </w:tcPr>
-          <w:p>
-            <w:pPr>
-              <w:spacing w:after="0" w:line="240" w:lineRule="auto"/>
-              <w:rPr>
-                <w:rFonts w:ascii="TH SarabunPSK" w:eastAsia="Calibri" w:hAnsi="TH SarabunPSK" w:cs="TH SarabunPSK"/>
-                <w:color w:val="000000"/>
-                <w:sz w:val="24"/>
-                <w:szCs w:val="24"/>
-              </w:rPr>
-            </w:pPr>
-            <w:r>
-              <w:rPr>
-                <w:rFonts w:ascii="TH SarabunPSK" w:eastAsia="Calibri" w:hAnsi="TH SarabunPSK" w:cs="TH SarabunPSK"/>
-                <w:color w:val="000000"/>
-                <w:sz w:val="24"/>
-                <w:szCs w:val="24"/>
-              </w:rPr>
-              <w:sym w:font="Wingdings 2" w:char="F0A3"/>
-            </w:r>
-            <w:r>
-              <w:rPr>
-                <w:rFonts w:ascii="TH SarabunPSK" w:eastAsia="Calibri" w:hAnsi="TH SarabunPSK" w:cs="TH SarabunPSK"/>
-                <w:color w:val="000000"/>
-                <w:sz w:val="24"/>
-                <w:szCs w:val="24"/>
-                <w:cs/>
-              </w:rPr>
-              <w:t xml:space="preserve"> </w:t>
-            </w:r>
-            <w:r>
-              <w:rPr>
-                <w:rFonts w:ascii="TH SarabunPSK" w:eastAsia="Calibri" w:hAnsi="TH SarabunPSK" w:cs="TH SarabunPSK" w:hint="cs"/>
-                <w:color w:val="000000"/>
-                <w:sz w:val="24"/>
-                <w:szCs w:val="24"/>
-                <w:cs/>
-              </w:rPr>
-              <w:t>กระทรวงดิจิทัลฯ</w:t>
-            </w:r>
-          </w:p>
-          <w:p>
-            <w:pPr>
-              <w:spacing w:after="0" w:line="240" w:lineRule="auto"/>
-              <w:rPr>
-                <w:rFonts w:ascii="TH SarabunPSK" w:eastAsia="Calibri" w:hAnsi="TH SarabunPSK" w:cs="TH SarabunPSK"/>
-                <w:color w:val="000000"/>
-                <w:sz w:val="24"/>
-                <w:szCs w:val="24"/>
-              </w:rPr>
-            </w:pPr>
-            <w:r>
-              <w:rPr>
-                <w:rFonts w:ascii="TH SarabunPSK" w:eastAsia="Calibri" w:hAnsi="TH SarabunPSK" w:cs="TH SarabunPSK" w:hint="cs"/>
-                <w:color w:val="000000"/>
-                <w:sz w:val="24"/>
-                <w:szCs w:val="24"/>
-                <w:cs/>
-              </w:rPr>
-              <w:t>ฉบับเดือน</w:t>
-            </w:r>
-            <w:r>
-              <w:rPr>
-                <w:rFonts w:ascii="TH SarabunPSK" w:eastAsia="Calibri" w:hAnsi="TH SarabunPSK" w:cs="TH SarabunPSK" w:hint="cs"/>
-                <w:color w:val="000000"/>
-                <w:sz w:val="24"/>
-                <w:szCs w:val="24"/>
-                <w:cs/>
-              </w:rPr>
-              <w:t>..............</w:t>
-            </w:r>
-            <w:r>
-              <w:rPr>
-                <w:rFonts w:ascii="TH SarabunPSK" w:eastAsia="Calibri" w:hAnsi="TH SarabunPSK" w:cs="TH SarabunPSK" w:hint="cs"/>
-                <w:color w:val="000000"/>
-                <w:sz w:val="24"/>
-                <w:szCs w:val="24"/>
-                <w:cs/>
-              </w:rPr>
-              <w:t>...พ.ศ.</w:t>
-            </w:r>
-            <w:r>
-              <w:rPr>
-                <w:rFonts w:ascii="TH SarabunPSK" w:eastAsia="Calibri" w:hAnsi="TH SarabunPSK" w:cs="TH SarabunPSK" w:hint="cs"/>
-                <w:color w:val="000000"/>
-                <w:sz w:val="24"/>
-                <w:szCs w:val="24"/>
-                <w:cs/>
-              </w:rPr>
-              <w:t>.....</w:t>
-            </w:r>
-            <w:r>
-              <w:rPr>
-                <w:rFonts w:ascii="TH SarabunPSK" w:eastAsia="Calibri" w:hAnsi="TH SarabunPSK" w:cs="TH SarabunPSK" w:hint="cs"/>
-                <w:color w:val="000000"/>
-                <w:sz w:val="24"/>
-                <w:szCs w:val="24"/>
-                <w:cs/>
-              </w:rPr>
-              <w:t>..</w:t>
-            </w:r>
-          </w:p>
-          <w:p>
-            <w:pPr>
-              <w:spacing w:after="0" w:line="240" w:lineRule="auto"/>
-              <w:rPr>
-                <w:rFonts w:ascii="TH SarabunPSK" w:eastAsia="Calibri" w:hAnsi="TH SarabunPSK" w:cs="TH SarabunPSK"/>
-                <w:color w:val="000000"/>
-                <w:sz w:val="24"/>
-                <w:szCs w:val="24"/>
-                <w:cs/>
-              </w:rPr>
-            </w:pPr>
-            <w:r>
-              <w:rPr>
-                <w:rFonts w:ascii="TH SarabunPSK" w:eastAsia="Calibri" w:hAnsi="TH SarabunPSK" w:cs="TH SarabunPSK" w:hint="cs"/>
-                <w:color w:val="000000"/>
-                <w:sz w:val="24"/>
-                <w:szCs w:val="24"/>
-                <w:cs/>
-              </w:rPr>
-              <w:t>รายการที่</w:t>
-            </w:r>
-            <w:r>
-              <w:rPr>
-                <w:rFonts w:ascii="TH SarabunPSK" w:eastAsia="Calibri" w:hAnsi="TH SarabunPSK" w:cs="TH SarabunPSK" w:hint="cs"/>
-                <w:color w:val="000000"/>
-                <w:sz w:val="24"/>
-                <w:szCs w:val="24"/>
-                <w:cs/>
-              </w:rPr>
-              <w:t>......</w:t>
-            </w:r>
-            <w:r>
-              <w:rPr>
-                <w:rFonts w:ascii="TH SarabunPSK" w:eastAsia="Calibri" w:hAnsi="TH SarabunPSK" w:cs="TH SarabunPSK" w:hint="cs"/>
-                <w:color w:val="000000"/>
-                <w:sz w:val="24"/>
-                <w:szCs w:val="24"/>
-                <w:cs/>
-              </w:rPr>
-              <w:t>..........................</w:t>
-            </w:r>
-          </w:p>
-          <w:p>
-            <w:pPr>
-              <w:spacing w:after="0" w:line="240" w:lineRule="auto"/>
-              <w:rPr>
-                <w:rFonts w:ascii="TH SarabunPSK" w:eastAsia="Calibri" w:hAnsi="TH SarabunPSK" w:cs="TH SarabunPSK"/>
-                <w:color w:val="000000"/>
-                <w:sz w:val="24"/>
-                <w:szCs w:val="24"/>
-              </w:rPr>
-            </w:pPr>
-            <w:r>
-              <w:rPr>
-                <w:rFonts w:ascii="TH SarabunPSK" w:eastAsia="Calibri" w:hAnsi="TH SarabunPSK" w:cs="TH SarabunPSK"/>
-                <w:color w:val="000000"/>
-                <w:sz w:val="24"/>
-                <w:szCs w:val="24"/>
-              </w:rPr>
-              <w:sym w:font="Wingdings 2" w:char="F0A3"/>
-            </w:r>
-            <w:r>
-              <w:rPr>
-                <w:rFonts w:ascii="TH SarabunPSK" w:eastAsia="Calibri" w:hAnsi="TH SarabunPSK" w:cs="TH SarabunPSK"/>
-                <w:color w:val="000000"/>
-                <w:sz w:val="24"/>
-                <w:szCs w:val="24"/>
-              </w:rPr>
-              <w:t xml:space="preserve"> </w:t>
-            </w:r>
-            <w:r>
-              <w:rPr>
-                <w:rFonts w:ascii="TH SarabunPSK" w:hAnsi="TH SarabunPSK" w:cs="TH SarabunPSK"/>
-                <w:color w:val="000000"/>
-                <w:kern w:val="32"/>
-                <w:sz w:val="24"/>
-                <w:szCs w:val="24"/>
-                <w:cs/>
-              </w:rPr>
-              <w:t>สืบราคา</w:t>
-            </w:r>
-            <w:r>
-              <w:rPr>
-                <w:rFonts w:ascii="TH SarabunPSK" w:hAnsi="TH SarabunPSK" w:cs="TH SarabunPSK" w:hint="cs"/>
-                <w:color w:val="000000"/>
-                <w:kern w:val="32"/>
-                <w:sz w:val="24"/>
-                <w:szCs w:val="24"/>
-                <w:cs/>
-              </w:rPr>
-              <w:t>ฯ</w:t>
-            </w:r>
-            <w:r>
-              <w:rPr>
-                <w:rFonts w:ascii="TH SarabunPSK" w:hAnsi="TH SarabunPSK" w:cs="TH SarabunPSK" w:hint="cs"/>
-                <w:color w:val="000000"/>
-                <w:kern w:val="32"/>
-                <w:sz w:val="24"/>
-                <w:szCs w:val="24"/>
-                <w:cs/>
-              </w:rPr>
-              <w:t xml:space="preserve"> จำนวน</w:t>
-            </w:r>
-            <w:r>
-              <w:rPr>
-                <w:rFonts w:ascii="TH SarabunPSK" w:eastAsia="Calibri" w:hAnsi="TH SarabunPSK" w:cs="TH SarabunPSK" w:hint="cs"/>
-                <w:color w:val="000000"/>
-                <w:sz w:val="24"/>
-                <w:szCs w:val="24"/>
-                <w:cs/>
-              </w:rPr>
-              <w:t>.....</w:t>
-            </w:r>
-            <w:r>
-              <w:rPr>
-                <w:rFonts w:ascii="TH SarabunPSK" w:eastAsia="Calibri" w:hAnsi="TH SarabunPSK" w:cs="TH SarabunPSK" w:hint="cs"/>
-                <w:color w:val="000000"/>
-                <w:sz w:val="24"/>
-                <w:szCs w:val="24"/>
-                <w:cs/>
-              </w:rPr>
-              <w:t>ราย</w:t>
-            </w:r>
-          </w:p>
-          <w:p>
-            <w:pPr>
-              <w:spacing w:after="0" w:line="240" w:lineRule="auto"/>
-              <w:rPr>
-                <w:rFonts w:ascii="TH SarabunPSK" w:eastAsia="Calibri" w:hAnsi="TH SarabunPSK" w:cs="TH SarabunPSK"/>
-                <w:color w:val="000000"/>
-                <w:sz w:val="24"/>
-                <w:szCs w:val="24"/>
-              </w:rPr>
-            </w:pPr>
-            <w:r>
-              <w:rPr>
-                <w:rFonts w:ascii="TH SarabunPSK" w:eastAsia="Calibri" w:hAnsi="TH SarabunPSK" w:cs="TH SarabunPSK" w:hint="cs"/>
-                <w:color w:val="000000"/>
-                <w:sz w:val="24"/>
-                <w:szCs w:val="24"/>
-                <w:cs/>
-              </w:rPr>
-              <w:t>ใช้ของบริษัท</w:t>
-            </w:r>
-            <w:r>
-              <w:rPr>
-                <w:rFonts w:ascii="TH SarabunPSK" w:eastAsia="Calibri" w:hAnsi="TH SarabunPSK" w:cs="TH SarabunPSK" w:hint="cs"/>
-                <w:color w:val="000000"/>
-                <w:sz w:val="24"/>
-                <w:szCs w:val="24"/>
-                <w:cs/>
-              </w:rPr>
-              <w:t>.</w:t>
-            </w:r>
-            <w:r>
-              <w:rPr>
-                <w:rFonts w:ascii="TH SarabunPSK" w:eastAsia="Calibri" w:hAnsi="TH SarabunPSK" w:cs="TH SarabunPSK" w:hint="cs"/>
-                <w:color w:val="000000"/>
-                <w:sz w:val="24"/>
-                <w:szCs w:val="24"/>
-                <w:cs/>
-              </w:rPr>
-              <w:t>..........................</w:t>
-            </w:r>
-          </w:p>
-          <w:p>
-            <w:pPr>
-              <w:spacing w:after="0" w:line="240" w:lineRule="auto"/>
-              <w:rPr>
-                <w:rFonts w:ascii="TH SarabunPSK" w:eastAsia="Calibri" w:hAnsi="TH SarabunPSK" w:cs="TH SarabunPSK"/>
-                <w:color w:val="000000"/>
-                <w:sz w:val="24"/>
-                <w:szCs w:val="24"/>
-              </w:rPr>
-            </w:pPr>
-            <w:r>
-              <w:rPr>
-                <w:rFonts w:ascii="TH SarabunPSK" w:eastAsia="Calibri" w:hAnsi="TH SarabunPSK" w:cs="TH SarabunPSK" w:hint="cs"/>
-                <w:color w:val="000000"/>
-                <w:sz w:val="24"/>
-                <w:szCs w:val="24"/>
-                <w:cs/>
-              </w:rPr>
-              <w:t>..</w:t>
-            </w:r>
-            <w:r>
-              <w:rPr>
-                <w:rFonts w:ascii="TH SarabunPSK" w:eastAsia="Calibri" w:hAnsi="TH SarabunPSK" w:cs="TH SarabunPSK" w:hint="cs"/>
-                <w:color w:val="000000"/>
-                <w:sz w:val="24"/>
-                <w:szCs w:val="24"/>
-                <w:cs/>
-              </w:rPr>
-              <w:t>.............................................</w:t>
-            </w:r>
-          </w:p>
-          <w:p>
-            <w:pPr>
-              <w:spacing w:after="0" w:line="240" w:lineRule="auto"/>
-              <w:rPr>
-                <w:rFonts w:ascii="TH SarabunPSK" w:eastAsia="Calibri" w:hAnsi="TH SarabunPSK" w:cs="TH SarabunPSK"/>
-                <w:color w:val="000000"/>
-                <w:sz w:val="24"/>
-                <w:szCs w:val="24"/>
-              </w:rPr>
-            </w:pPr>
-            <w:r>
-              <w:rPr>
-                <w:rFonts w:ascii="TH SarabunPSK" w:eastAsia="Calibri" w:hAnsi="TH SarabunPSK" w:cs="TH SarabunPSK"/>
-                <w:color w:val="000000"/>
-                <w:sz w:val="24"/>
-                <w:szCs w:val="24"/>
-              </w:rPr>
-              <w:sym w:font="Wingdings 2" w:char="F0A3"/>
-            </w:r>
-            <w:r>
-              <w:rPr>
-                <w:rFonts w:ascii="TH SarabunPSK" w:eastAsia="Calibri" w:hAnsi="TH SarabunPSK" w:cs="TH SarabunPSK"/>
-                <w:color w:val="000000"/>
-                <w:sz w:val="24"/>
-                <w:szCs w:val="24"/>
-              </w:rPr>
-              <w:t xml:space="preserve"> </w:t>
-            </w:r>
-            <w:r>
-              <w:rPr>
-                <w:rFonts w:ascii="TH SarabunPSK" w:eastAsia="Calibri" w:hAnsi="TH SarabunPSK" w:cs="TH SarabunPSK" w:hint="cs"/>
-                <w:color w:val="000000"/>
-                <w:sz w:val="24"/>
-                <w:szCs w:val="24"/>
-                <w:cs/>
-              </w:rPr>
-              <w:t>ราคาที่เคยจัดหาฯ</w:t>
-            </w:r>
-          </w:p>
-          <w:p>
-            <w:pPr>
-              <w:spacing w:after="0" w:line="240" w:lineRule="auto"/>
-              <w:rPr>
-                <w:rFonts w:ascii="TH SarabunPSK" w:eastAsia="Calibri" w:hAnsi="TH SarabunPSK" w:cs="TH SarabunPSK"/>
-                <w:color w:val="000000"/>
-                <w:sz w:val="24"/>
-                <w:szCs w:val="24"/>
-              </w:rPr>
-            </w:pPr>
-            <w:r>
-              <w:rPr>
-                <w:rFonts w:ascii="TH SarabunPSK" w:eastAsia="Calibri" w:hAnsi="TH SarabunPSK" w:cs="TH SarabunPSK" w:hint="cs"/>
-                <w:color w:val="000000"/>
-                <w:sz w:val="24"/>
-                <w:szCs w:val="24"/>
-                <w:cs/>
-              </w:rPr>
-              <w:t>โครงการ</w:t>
-            </w:r>
-            <w:r>
-              <w:rPr>
-                <w:rFonts w:ascii="TH SarabunPSK" w:eastAsia="Calibri" w:hAnsi="TH SarabunPSK" w:cs="TH SarabunPSK" w:hint="cs"/>
-                <w:color w:val="000000"/>
-                <w:sz w:val="24"/>
-                <w:szCs w:val="24"/>
-                <w:cs/>
-              </w:rPr>
-              <w:t>..</w:t>
-            </w:r>
-            <w:r>
-              <w:rPr>
-                <w:rFonts w:ascii="TH SarabunPSK" w:eastAsia="Calibri" w:hAnsi="TH SarabunPSK" w:cs="TH SarabunPSK" w:hint="cs"/>
-                <w:color w:val="000000"/>
-                <w:sz w:val="24"/>
-                <w:szCs w:val="24"/>
-                <w:cs/>
-              </w:rPr>
-              <w:t>...............................</w:t>
-            </w:r>
-          </w:p>
-          <w:p>
-            <w:pPr>
-              <w:spacing w:after="0" w:line="240" w:lineRule="auto"/>
-              <w:rPr>
-                <w:rFonts w:ascii="TH SarabunPSK" w:eastAsia="Calibri" w:hAnsi="TH SarabunPSK" w:cs="TH SarabunPSK"/>
-                <w:color w:val="000000"/>
-                <w:sz w:val="24"/>
-                <w:szCs w:val="24"/>
-              </w:rPr>
-            </w:pPr>
-            <w:r>
-              <w:rPr>
-                <w:rFonts w:ascii="TH SarabunPSK" w:eastAsia="Calibri" w:hAnsi="TH SarabunPSK" w:cs="TH SarabunPSK" w:hint="cs"/>
-                <w:color w:val="000000"/>
-                <w:sz w:val="24"/>
-                <w:szCs w:val="24"/>
-                <w:cs/>
-              </w:rPr>
-              <w:t>.</w:t>
-            </w:r>
-            <w:r>
-              <w:rPr>
-                <w:rFonts w:ascii="TH SarabunPSK" w:eastAsia="Calibri" w:hAnsi="TH SarabunPSK" w:cs="TH SarabunPSK" w:hint="cs"/>
-                <w:color w:val="000000"/>
-                <w:sz w:val="24"/>
-                <w:szCs w:val="24"/>
-                <w:cs/>
-              </w:rPr>
-              <w:t>..............................พ.ศ...........</w:t>
-            </w:r>
-          </w:p>
-          <w:p>
-            <w:pPr>
-              <w:spacing w:after="0" w:line="240" w:lineRule="auto"/>
-              <w:rPr>
-                <w:rFonts w:ascii="TH SarabunIT๙" w:eastAsia="Calibri" w:hAnsi="TH SarabunIT๙" w:cs="TH SarabunIT๙"/>
-                <w:color w:val="000000"/>
-                <w:sz w:val="28"/>
-              </w:rPr>
-            </w:pPr>
-            <w:r>
-              <w:rPr>
-                <w:rFonts w:ascii="TH SarabunPSK" w:eastAsia="Calibri" w:hAnsi="TH SarabunPSK" w:cs="TH SarabunPSK" w:hint="cs"/>
-                <w:color w:val="000000"/>
-                <w:sz w:val="24"/>
-                <w:szCs w:val="24"/>
-              </w:rPr>
-              <w:sym w:font="Wingdings 2" w:char="F0A3"/>
-            </w:r>
-            <w:r>
-              <w:rPr>
-                <w:rFonts w:ascii="TH SarabunPSK" w:eastAsia="Calibri" w:hAnsi="TH SarabunPSK" w:cs="TH SarabunPSK" w:hint="cs"/>
-                <w:color w:val="000000"/>
-                <w:sz w:val="24"/>
-                <w:szCs w:val="24"/>
-                <w:cs/>
-              </w:rPr>
-              <w:t xml:space="preserve"> อื่นๆ......................</w:t>
-            </w:r>
-            <w:r>
-              <w:rPr>
-                <w:rFonts w:ascii="TH SarabunPSK" w:eastAsia="Calibri" w:hAnsi="TH SarabunPSK" w:cs="TH SarabunPSK" w:hint="cs"/>
-                <w:color w:val="000000"/>
-                <w:sz w:val="24"/>
-                <w:szCs w:val="24"/>
-                <w:cs/>
-              </w:rPr>
-              <w:t>...........</w:t>
-            </w:r>
-          </w:p>
-        </w:tc>
-      </w:tr>
-      <w:tr>
-        <w:trPr>
-          <w:trHeight w:val="174"/>
-        </w:trPr>
-        <w:tc>
-          <w:tcPr>
-            <w:tcW w:w="6295" w:type="dxa"/>
-            <w:gridSpan w:val="4"/>
-          </w:tcPr>
-          <w:p>
-            <w:pPr>
-              <w:spacing w:after="0" w:line="240" w:lineRule="auto"/>
-              <w:jc w:val="right"/>
-              <w:rPr>
-                <w:rFonts w:ascii="TH SarabunIT๙" w:eastAsia="Calibri" w:hAnsi="TH SarabunIT๙" w:cs="TH SarabunIT๙"/>
-                <w:b/>
-                <w:bCs/>
-                <w:color w:val="000000"/>
-                <w:sz w:val="28"/>
-              </w:rPr>
-            </w:pPr>
-            <w:r>
-              <w:rPr>
-                <w:rFonts w:ascii="TH SarabunIT๙" w:eastAsia="Calibri" w:hAnsi="TH SarabunIT๙" w:cs="TH SarabunIT๙"/>
-                <w:b/>
-                <w:bCs/>
-                <w:color w:val="000000"/>
-                <w:sz w:val="28"/>
-                <w:cs/>
-              </w:rPr>
-              <w:t>รวมทั้งสิ้น</w:t>
-            </w:r>
-          </w:p>
-        </w:tc>
-        <w:tc>
-          <w:tcPr>
-            <w:tcW w:w="1440" w:type="dxa"/>
-          </w:tcPr>
-          <w:p>
-            <w:pPr>
-              <w:spacing w:after="0" w:line="240" w:lineRule="auto"/>
-              <w:jc w:val="right"/>
-              <w:rPr>
-                <w:rFonts w:ascii="TH SarabunIT๙" w:eastAsia="Calibri" w:hAnsi="TH SarabunIT๙" w:cs="TH SarabunIT๙"/>
-                <w:color w:val="000000"/>
-                <w:sz w:val="28"/>
-              </w:rPr>
-            </w:pPr>
-          </w:p>
-        </w:tc>
-        <w:tc>
-          <w:tcPr>
-            <w:tcW w:w="2154" w:type="dxa"/>
+            <w:tcW w:w="2080" w:type="dxa"/>
           </w:tcPr>
           <w:p>
             <w:pPr>
@@ -12511,6 +12376,7 @@
         <w:spacing w:before="240" w:after="120" w:line="240" w:lineRule="auto"/>
         <w:ind w:hanging="720"/>
         <w:contextualSpacing w:val="0"/>
+        <w:jc w:val="center"/>
         <w:rPr>
           <w:rFonts w:ascii="TH SarabunIT๙" w:hAnsi="TH SarabunIT๙" w:cs="TH SarabunIT๙"/>
           <w:b/>
@@ -12520,6 +12386,41 @@
           <w:szCs w:val="32"/>
         </w:rPr>
       </w:pPr>
+      <w:r>
+        <w:rPr>
+          <w:rFonts w:ascii="TH SarabunIT๙" w:hAnsi="TH SarabunIT๙" w:cs="TH SarabunIT๙"/>
+          <w:b/>
+          <w:bCs/>
+          <w:color w:val="000000"/>
+          <w:sz w:val="32"/>
+          <w:szCs w:val="32"/>
+        </w:rPr>
+        <w:t>{/</w:t>
+      </w:r>
+      <w:proofErr w:type="spellStart"/>
+      <w:r>
+        <w:rPr>
+          <w:rFonts w:ascii="TH SarabunIT๙" w:hAnsi="TH SarabunIT๙" w:cs="TH SarabunIT๙"/>
+          <w:b/>
+          <w:bCs/>
+          <w:color w:val="000000"/>
+          <w:sz w:val="32"/>
+          <w:szCs w:val="32"/>
+        </w:rPr>
+        <w:t>hasHardwareCosts</w:t>
+      </w:r>
+      <w:proofErr w:type="spellEnd"/>
+      <w:r>
+        <w:rPr>
+          <w:rFonts w:ascii="TH SarabunIT๙" w:hAnsi="TH SarabunIT๙" w:cs="TH SarabunIT๙"/>
+          <w:b/>
+          <w:bCs/>
+          <w:color w:val="000000"/>
+          <w:sz w:val="32"/>
+          <w:szCs w:val="32"/>
+        </w:rPr>
+        <w:t xml:space="preserve">} </w:t>
+      </w:r>
     </w:p>
     <w:p>
       <w:pPr>
@@ -12532,6 +12433,7 @@
         <w:spacing w:before="240" w:after="120" w:line="240" w:lineRule="auto"/>
         <w:ind w:hanging="720"/>
         <w:contextualSpacing w:val="0"/>
+        <w:jc w:val="center"/>
         <w:rPr>
           <w:rFonts w:ascii="TH SarabunIT๙" w:hAnsi="TH SarabunIT๙" w:cs="TH SarabunIT๙"/>
           <w:b/>
@@ -12541,6 +12443,99 @@
           <w:szCs w:val="32"/>
         </w:rPr>
       </w:pPr>
+      <w:r>
+        <w:rPr>
+          <w:rFonts w:ascii="TH SarabunIT๙" w:hAnsi="TH SarabunIT๙" w:cs="TH SarabunIT๙"/>
+          <w:b/>
+          <w:bCs/>
+          <w:color w:val="000000"/>
+          <w:sz w:val="32"/>
+          <w:szCs w:val="32"/>
+        </w:rPr>
+        <w:t>{^</w:t>
+      </w:r>
+      <w:proofErr w:type="spellStart"/>
+      <w:r>
+        <w:rPr>
+          <w:rFonts w:ascii="TH SarabunIT๙" w:hAnsi="TH SarabunIT๙" w:cs="TH SarabunIT๙"/>
+          <w:b/>
+          <w:bCs/>
+          <w:color w:val="000000"/>
+          <w:sz w:val="32"/>
+          <w:szCs w:val="32"/>
+        </w:rPr>
+        <w:t>hasHardwareCosts</w:t>
+      </w:r>
+      <w:proofErr w:type="spellEnd"/>
+      <w:r>
+        <w:rPr>
+          <w:rFonts w:ascii="TH SarabunIT๙" w:hAnsi="TH SarabunIT๙" w:cs="TH SarabunIT๙"/>
+          <w:b/>
+          <w:bCs/>
+          <w:color w:val="000000"/>
+          <w:sz w:val="32"/>
+          <w:szCs w:val="32"/>
+        </w:rPr>
+        <w:t>}</w:t>
+      </w:r>
+      <w:r>
+        <w:rPr>
+          <w:rFonts w:ascii="TH SarabunIT๙" w:hAnsi="TH SarabunIT๙" w:cs="TH SarabunIT๙"/>
+          <w:b/>
+          <w:bCs/>
+          <w:color w:val="000000"/>
+          <w:sz w:val="32"/>
+          <w:szCs w:val="32"/>
+        </w:rPr>
+        <w:t xml:space="preserve"> -</w:t>
+      </w:r>
+      <w:r>
+        <w:rPr>
+          <w:rFonts w:ascii="TH SarabunIT๙" w:hAnsi="TH SarabunIT๙" w:cs="TH SarabunIT๙"/>
+          <w:b/>
+          <w:bCs/>
+          <w:color w:val="000000"/>
+          <w:sz w:val="32"/>
+          <w:szCs w:val="32"/>
+          <w:cs/>
+        </w:rPr>
+        <w:t>ไม่มี-</w:t>
+      </w:r>
+      <w:r>
+        <w:rPr>
+          <w:rFonts w:ascii="TH SarabunIT๙" w:hAnsi="TH SarabunIT๙" w:cs="TH SarabunIT๙"/>
+          <w:b/>
+          <w:bCs/>
+          <w:color w:val="000000"/>
+          <w:sz w:val="32"/>
+          <w:szCs w:val="32"/>
+        </w:rPr>
+        <w:t xml:space="preserve"> {/</w:t>
+      </w:r>
+      <w:proofErr w:type="spellStart"/>
+      <w:r>
+        <w:rPr>
+          <w:rFonts w:ascii="TH SarabunIT๙" w:hAnsi="TH SarabunIT๙" w:cs="TH SarabunIT๙"/>
+          <w:b/>
+          <w:bCs/>
+          <w:color w:val="000000"/>
+          <w:sz w:val="32"/>
+          <w:szCs w:val="32"/>
+        </w:rPr>
+        <w:t>hasHardwareCosts</w:t>
+      </w:r>
+      <w:proofErr w:type="spellEnd"/>
+      <w:r>
+        <w:rPr>
+          <w:rFonts w:ascii="TH SarabunIT๙" w:hAnsi="TH SarabunIT๙" w:cs="TH SarabunIT๙"/>
+          <w:b/>
+          <w:bCs/>
+          <w:color w:val="000000"/>
+          <w:sz w:val="32"/>
+          <w:szCs w:val="32"/>
+        </w:rPr>
+        <w:t>}</w:t>
+      </w:r>
     </w:p>
     <w:p>
       <w:pPr>
@@ -12575,12 +12570,13 @@
         <w:ind w:hanging="720"/>
         <w:contextualSpacing w:val="0"/>
         <w:rPr>
-          <w:rFonts w:ascii="TH SarabunIT๙" w:hAnsi="TH SarabunIT๙" w:cs="TH SarabunIT๙"/>
+          <w:rFonts w:ascii="TH SarabunIT๙" w:hAnsi="TH SarabunIT๙" w:cs="TH SarabunIT๙" w:hint="cs"/>
           <w:b/>
           <w:bCs/>
           <w:color w:val="000000"/>
           <w:sz w:val="32"/>
           <w:szCs w:val="32"/>
+          <w:cs/>
         </w:rPr>
       </w:pPr>
       <w:r>
@@ -12629,11 +12625,55 @@
           <w:cs/>
         </w:rPr>
         <w:t xml:space="preserve"> ค่าใช้จ่ายซอฟต์แวร์และเครื่องมือที่จัดหาในโครงการ</w:t>
+      </w:r>
+      <w:r>
+        <w:rPr>
+          <w:rFonts w:ascii="TH SarabunIT๙" w:hAnsi="TH SarabunIT๙" w:cs="TH SarabunIT๙"/>
+          <w:b/>
+          <w:bCs/>
+          <w:color w:val="000000"/>
+          <w:sz w:val="32"/>
+          <w:szCs w:val="32"/>
+        </w:rPr>
+        <w:t xml:space="preserve"> </w:t>
+      </w:r>
+      <w:r>
+        <w:rPr>
+          <w:rFonts w:ascii="TH SarabunIT๙" w:hAnsi="TH SarabunIT๙" w:cs="TH SarabunIT๙"/>
+          <w:b/>
+          <w:bCs/>
+          <w:color w:val="000000"/>
+          <w:sz w:val="32"/>
+          <w:szCs w:val="32"/>
+        </w:rPr>
+        <w:t>{#has</w:t>
+      </w:r>
+      <w:r>
+        <w:rPr>
+          <w:rFonts w:ascii="TH SarabunIT๙" w:hAnsi="TH SarabunIT๙" w:cs="TH SarabunIT๙"/>
+          <w:b/>
+          <w:bCs/>
+          <w:color w:val="000000"/>
+          <w:sz w:val="32"/>
+          <w:szCs w:val="32"/>
+        </w:rPr>
+        <w:t>Soft</w:t>
+      </w:r>
+      <w:r>
+        <w:rPr>
+          <w:rFonts w:ascii="TH SarabunIT๙" w:hAnsi="TH SarabunIT๙" w:cs="TH SarabunIT๙"/>
+          <w:b/>
+          <w:bCs/>
+          <w:color w:val="000000"/>
+          <w:sz w:val="32"/>
+          <w:szCs w:val="32"/>
+        </w:rPr>
+        <w:t>wareCosts}</w:t>
       </w:r>
     </w:p>
     <w:tbl>
       <w:tblPr>
-        <w:tblW w:w="9855" w:type="dxa"/>
+        <w:tblW w:w="9889" w:type="dxa"/>
         <w:tblBorders>
           <w:top w:val="single" w:sz="4" w:space="0" w:color="000000"/>
           <w:left w:val="single" w:sz="4" w:space="0" w:color="000000"/>
@@ -12645,37 +12685,39 @@
         <w:tblLook w:val="04A0" w:firstRow="1" w:lastRow="0" w:firstColumn="1" w:lastColumn="0" w:noHBand="0" w:noVBand="1"/>
       </w:tblPr>
       <w:tblGrid>
-        <w:gridCol w:w="812"/>
-        <w:gridCol w:w="3143"/>
-        <w:gridCol w:w="810"/>
-        <w:gridCol w:w="1530"/>
-        <w:gridCol w:w="1440"/>
-        <w:gridCol w:w="2120"/>
+        <w:gridCol w:w="2362"/>
+        <w:gridCol w:w="1866"/>
+        <w:gridCol w:w="1028"/>
+        <w:gridCol w:w="1353"/>
+        <w:gridCol w:w="1200"/>
+        <w:gridCol w:w="2080"/>
       </w:tblGrid>
       <w:tr>
         <w:tc>
           <w:tcPr>
-            <w:tcW w:w="812" w:type="dxa"/>
-          </w:tcPr>
-          <w:p>
-            <w:pPr>
-              <w:spacing w:before="60" w:after="60" w:line="240" w:lineRule="auto"/>
-              <w:jc w:val="center"/>
-              <w:rPr>
-                <w:rFonts w:ascii="TH SarabunIT๙" w:eastAsia="Calibri" w:hAnsi="TH SarabunIT๙" w:cs="TH SarabunIT๙"/>
-                <w:b/>
-                <w:bCs/>
-                <w:color w:val="000000"/>
-                <w:sz w:val="28"/>
-              </w:rPr>
-            </w:pPr>
-            <w:r>
-              <w:rPr>
-                <w:rFonts w:ascii="TH SarabunIT๙" w:eastAsia="Calibri" w:hAnsi="TH SarabunIT๙" w:cs="TH SarabunIT๙"/>
-                <w:b/>
-                <w:bCs/>
-                <w:color w:val="000000"/>
-                <w:sz w:val="28"/>
+            <w:tcW w:w="2362" w:type="dxa"/>
+          </w:tcPr>
+          <w:p>
+            <w:pPr>
+              <w:spacing w:after="0" w:line="240" w:lineRule="auto"/>
+              <w:jc w:val="center"/>
+              <w:rPr>
+                <w:rFonts w:ascii="TH SarabunIT๙" w:eastAsia="Calibri" w:hAnsi="TH SarabunIT๙" w:cs="TH SarabunIT๙"/>
+                <w:b/>
+                <w:bCs/>
+                <w:color w:val="000000"/>
+                <w:sz w:val="32"/>
+                <w:szCs w:val="32"/>
+              </w:rPr>
+            </w:pPr>
+            <w:r>
+              <w:rPr>
+                <w:rFonts w:ascii="TH SarabunIT๙" w:eastAsia="Calibri" w:hAnsi="TH SarabunIT๙" w:cs="TH SarabunIT๙"/>
+                <w:b/>
+                <w:bCs/>
+                <w:color w:val="000000"/>
+                <w:sz w:val="32"/>
+                <w:szCs w:val="32"/>
                 <w:cs/>
               </w:rPr>
               <w:t>ลำดับ</w:t>
@@ -12684,57 +12726,61 @@
         </w:tc>
         <w:tc>
           <w:tcPr>
-            <w:tcW w:w="3143" w:type="dxa"/>
-          </w:tcPr>
-          <w:p>
-            <w:pPr>
-              <w:spacing w:before="60" w:after="60" w:line="240" w:lineRule="auto"/>
-              <w:jc w:val="center"/>
-              <w:rPr>
-                <w:rFonts w:ascii="TH SarabunIT๙" w:eastAsia="Calibri" w:hAnsi="TH SarabunIT๙" w:cs="TH SarabunIT๙"/>
-                <w:b/>
-                <w:bCs/>
-                <w:color w:val="000000"/>
-                <w:sz w:val="28"/>
-              </w:rPr>
-            </w:pPr>
-            <w:r>
-              <w:rPr>
-                <w:rFonts w:ascii="TH SarabunIT๙" w:eastAsia="Calibri" w:hAnsi="TH SarabunIT๙" w:cs="TH SarabunIT๙"/>
-                <w:b/>
-                <w:bCs/>
-                <w:color w:val="000000"/>
-                <w:sz w:val="28"/>
-                <w:cs/>
-              </w:rPr>
-              <w:t>ชื่อซอฟต์แวร์</w:t>
-            </w:r>
-          </w:p>
-        </w:tc>
-        <w:tc>
-          <w:tcPr>
-            <w:tcW w:w="810" w:type="dxa"/>
-          </w:tcPr>
-          <w:p>
-            <w:pPr>
-              <w:spacing w:before="60" w:after="60" w:line="240" w:lineRule="auto"/>
-              <w:jc w:val="center"/>
-              <w:rPr>
-                <w:rFonts w:ascii="TH SarabunIT๙" w:eastAsia="Calibri" w:hAnsi="TH SarabunIT๙" w:cs="TH SarabunIT๙"/>
-                <w:b/>
-                <w:bCs/>
-                <w:color w:val="000000"/>
-                <w:sz w:val="28"/>
-                <w:cs/>
-              </w:rPr>
-            </w:pPr>
-            <w:r>
-              <w:rPr>
-                <w:rFonts w:ascii="TH SarabunIT๙" w:eastAsia="Calibri" w:hAnsi="TH SarabunIT๙" w:cs="TH SarabunIT๙"/>
-                <w:b/>
-                <w:bCs/>
-                <w:color w:val="000000"/>
-                <w:sz w:val="28"/>
+            <w:tcW w:w="1866" w:type="dxa"/>
+          </w:tcPr>
+          <w:p>
+            <w:pPr>
+              <w:spacing w:after="0" w:line="240" w:lineRule="auto"/>
+              <w:jc w:val="center"/>
+              <w:rPr>
+                <w:rFonts w:ascii="TH SarabunIT๙" w:eastAsia="Calibri" w:hAnsi="TH SarabunIT๙" w:cs="TH SarabunIT๙"/>
+                <w:b/>
+                <w:bCs/>
+                <w:color w:val="000000"/>
+                <w:sz w:val="32"/>
+                <w:szCs w:val="32"/>
+                <w:cs/>
+              </w:rPr>
+            </w:pPr>
+            <w:r>
+              <w:rPr>
+                <w:rFonts w:ascii="TH SarabunIT๙" w:eastAsia="Calibri" w:hAnsi="TH SarabunIT๙" w:cs="TH SarabunIT๙"/>
+                <w:b/>
+                <w:bCs/>
+                <w:color w:val="000000"/>
+                <w:sz w:val="32"/>
+                <w:szCs w:val="32"/>
+                <w:cs/>
+              </w:rPr>
+              <w:t>รายการ</w:t>
+            </w:r>
+          </w:p>
+        </w:tc>
+        <w:tc>
+          <w:tcPr>
+            <w:tcW w:w="1028" w:type="dxa"/>
+          </w:tcPr>
+          <w:p>
+            <w:pPr>
+              <w:spacing w:after="0" w:line="240" w:lineRule="auto"/>
+              <w:jc w:val="center"/>
+              <w:rPr>
+                <w:rFonts w:ascii="TH SarabunIT๙" w:eastAsia="Calibri" w:hAnsi="TH SarabunIT๙" w:cs="TH SarabunIT๙"/>
+                <w:b/>
+                <w:bCs/>
+                <w:color w:val="000000"/>
+                <w:sz w:val="32"/>
+                <w:szCs w:val="32"/>
+              </w:rPr>
+            </w:pPr>
+            <w:r>
+              <w:rPr>
+                <w:rFonts w:ascii="TH SarabunIT๙" w:eastAsia="Calibri" w:hAnsi="TH SarabunIT๙" w:cs="TH SarabunIT๙"/>
+                <w:b/>
+                <w:bCs/>
+                <w:color w:val="000000"/>
+                <w:sz w:val="32"/>
+                <w:szCs w:val="32"/>
                 <w:cs/>
               </w:rPr>
               <w:t>จำนวน</w:t>
@@ -12743,66 +12789,122 @@
         </w:tc>
         <w:tc>
           <w:tcPr>
-            <w:tcW w:w="1530" w:type="dxa"/>
-          </w:tcPr>
-          <w:p>
-            <w:pPr>
-              <w:spacing w:before="60" w:after="60" w:line="240" w:lineRule="auto"/>
-              <w:jc w:val="center"/>
-              <w:rPr>
-                <w:rFonts w:ascii="TH SarabunIT๙" w:eastAsia="Calibri" w:hAnsi="TH SarabunIT๙" w:cs="TH SarabunIT๙"/>
-                <w:b/>
-                <w:bCs/>
-                <w:color w:val="000000"/>
-                <w:sz w:val="28"/>
-              </w:rPr>
-            </w:pPr>
-            <w:r>
-              <w:rPr>
-                <w:rFonts w:ascii="TH SarabunIT๙" w:eastAsia="Calibri" w:hAnsi="TH SarabunIT๙" w:cs="TH SarabunIT๙"/>
-                <w:b/>
-                <w:bCs/>
-                <w:color w:val="000000"/>
-                <w:sz w:val="28"/>
-                <w:cs/>
-              </w:rPr>
-              <w:t>ราคาต่อหน่วย (บาท)</w:t>
-            </w:r>
-          </w:p>
-        </w:tc>
-        <w:tc>
-          <w:tcPr>
-            <w:tcW w:w="1440" w:type="dxa"/>
-          </w:tcPr>
-          <w:p>
-            <w:pPr>
-              <w:spacing w:before="60" w:after="60" w:line="240" w:lineRule="auto"/>
-              <w:jc w:val="center"/>
-              <w:rPr>
-                <w:rFonts w:ascii="TH SarabunIT๙" w:eastAsia="Calibri" w:hAnsi="TH SarabunIT๙" w:cs="TH SarabunIT๙"/>
-                <w:b/>
-                <w:bCs/>
-                <w:color w:val="000000"/>
-                <w:sz w:val="28"/>
-                <w:cs/>
-              </w:rPr>
-            </w:pPr>
-            <w:r>
-              <w:rPr>
-                <w:rFonts w:ascii="TH SarabunIT๙" w:eastAsia="Calibri" w:hAnsi="TH SarabunIT๙" w:cs="TH SarabunIT๙"/>
-                <w:b/>
-                <w:bCs/>
-                <w:color w:val="000000"/>
-                <w:sz w:val="28"/>
-                <w:cs/>
-              </w:rPr>
-              <w:t>จำนวนเงิน (บาท)</w:t>
-            </w:r>
-          </w:p>
-        </w:tc>
-        <w:tc>
-          <w:tcPr>
-            <w:tcW w:w="2120" w:type="dxa"/>
+            <w:tcW w:w="1353" w:type="dxa"/>
+          </w:tcPr>
+          <w:p>
+            <w:pPr>
+              <w:spacing w:after="0" w:line="240" w:lineRule="auto"/>
+              <w:jc w:val="center"/>
+              <w:rPr>
+                <w:rFonts w:ascii="TH SarabunIT๙" w:eastAsia="Calibri" w:hAnsi="TH SarabunIT๙" w:cs="TH SarabunIT๙"/>
+                <w:b/>
+                <w:bCs/>
+                <w:color w:val="000000"/>
+                <w:sz w:val="32"/>
+                <w:szCs w:val="32"/>
+              </w:rPr>
+            </w:pPr>
+            <w:r>
+              <w:rPr>
+                <w:rFonts w:ascii="TH SarabunIT๙" w:eastAsia="Calibri" w:hAnsi="TH SarabunIT๙" w:cs="TH SarabunIT๙"/>
+                <w:b/>
+                <w:bCs/>
+                <w:color w:val="000000"/>
+                <w:sz w:val="32"/>
+                <w:szCs w:val="32"/>
+                <w:cs/>
+              </w:rPr>
+              <w:t>ราคาต่อหน่วย</w:t>
+            </w:r>
+          </w:p>
+          <w:p>
+            <w:pPr>
+              <w:spacing w:after="0" w:line="240" w:lineRule="auto"/>
+              <w:jc w:val="center"/>
+              <w:rPr>
+                <w:rFonts w:ascii="TH SarabunIT๙" w:eastAsia="Calibri" w:hAnsi="TH SarabunIT๙" w:cs="TH SarabunIT๙"/>
+                <w:b/>
+                <w:bCs/>
+                <w:color w:val="000000"/>
+                <w:sz w:val="32"/>
+                <w:szCs w:val="32"/>
+                <w:cs/>
+              </w:rPr>
+            </w:pPr>
+            <w:r>
+              <w:rPr>
+                <w:rFonts w:ascii="TH SarabunIT๙" w:eastAsia="Calibri" w:hAnsi="TH SarabunIT๙" w:cs="TH SarabunIT๙"/>
+                <w:b/>
+                <w:bCs/>
+                <w:color w:val="000000"/>
+                <w:sz w:val="32"/>
+                <w:szCs w:val="32"/>
+                <w:cs/>
+              </w:rPr>
+              <w:t>(บาท)</w:t>
+            </w:r>
+          </w:p>
+        </w:tc>
+        <w:tc>
+          <w:tcPr>
+            <w:tcW w:w="1200" w:type="dxa"/>
+          </w:tcPr>
+          <w:p>
+            <w:pPr>
+              <w:spacing w:after="0" w:line="240" w:lineRule="auto"/>
+              <w:jc w:val="center"/>
+              <w:rPr>
+                <w:rFonts w:ascii="TH SarabunIT๙" w:eastAsia="Calibri" w:hAnsi="TH SarabunIT๙" w:cs="TH SarabunIT๙"/>
+                <w:b/>
+                <w:bCs/>
+                <w:color w:val="000000"/>
+                <w:sz w:val="32"/>
+                <w:szCs w:val="32"/>
+              </w:rPr>
+            </w:pPr>
+            <w:r>
+              <w:rPr>
+                <w:rFonts w:ascii="TH SarabunIT๙" w:eastAsia="Calibri" w:hAnsi="TH SarabunIT๙" w:cs="TH SarabunIT๙"/>
+                <w:b/>
+                <w:bCs/>
+                <w:color w:val="000000"/>
+                <w:sz w:val="32"/>
+                <w:szCs w:val="32"/>
+                <w:cs/>
+              </w:rPr>
+              <w:t xml:space="preserve">รวม </w:t>
+            </w:r>
+          </w:p>
+          <w:p>
+            <w:pPr>
+              <w:spacing w:after="0" w:line="240" w:lineRule="auto"/>
+              <w:jc w:val="center"/>
+              <w:rPr>
+                <w:rFonts w:ascii="TH SarabunIT๙" w:eastAsia="Calibri" w:hAnsi="TH SarabunIT๙" w:cs="TH SarabunIT๙"/>
+                <w:b/>
+                <w:bCs/>
+                <w:color w:val="000000"/>
+                <w:sz w:val="32"/>
+                <w:szCs w:val="32"/>
+              </w:rPr>
+            </w:pPr>
+            <w:r>
+              <w:rPr>
+                <w:rFonts w:ascii="TH SarabunIT๙" w:eastAsia="Calibri" w:hAnsi="TH SarabunIT๙" w:cs="TH SarabunIT๙"/>
+                <w:b/>
+                <w:bCs/>
+                <w:color w:val="000000"/>
+                <w:sz w:val="32"/>
+                <w:szCs w:val="32"/>
+                <w:cs/>
+              </w:rPr>
+              <w:t>(บาท)</w:t>
+            </w:r>
+          </w:p>
+        </w:tc>
+        <w:tc>
+          <w:tcPr>
+            <w:tcW w:w="2080" w:type="dxa"/>
           </w:tcPr>
           <w:p>
             <w:pPr>
@@ -12842,14 +12944,15 @@
           </w:p>
           <w:p>
             <w:pPr>
-              <w:spacing w:before="60" w:after="60" w:line="240" w:lineRule="auto"/>
-              <w:jc w:val="center"/>
-              <w:rPr>
-                <w:rFonts w:ascii="TH SarabunIT๙" w:eastAsia="Calibri" w:hAnsi="TH SarabunIT๙" w:cs="TH SarabunIT๙"/>
-                <w:b/>
-                <w:bCs/>
-                <w:color w:val="000000"/>
-                <w:sz w:val="28"/>
+              <w:spacing w:after="0" w:line="240" w:lineRule="auto"/>
+              <w:jc w:val="center"/>
+              <w:rPr>
+                <w:rFonts w:ascii="TH SarabunIT๙" w:eastAsia="Calibri" w:hAnsi="TH SarabunIT๙" w:cs="TH SarabunIT๙"/>
+                <w:b/>
+                <w:bCs/>
+                <w:color w:val="000000"/>
+                <w:sz w:val="32"/>
+                <w:szCs w:val="32"/>
                 <w:cs/>
               </w:rPr>
             </w:pPr>
@@ -12869,9 +12972,12 @@
         </w:tc>
       </w:tr>
       <w:tr>
-        <w:tc>
-          <w:tcPr>
-            <w:tcW w:w="812" w:type="dxa"/>
+        <w:trPr>
+          <w:trHeight w:val="174"/>
+        </w:trPr>
+        <w:tc>
+          <w:tcPr>
+            <w:tcW w:w="2362" w:type="dxa"/>
           </w:tcPr>
           <w:p>
             <w:pPr>
@@ -12889,82 +12995,206 @@
             </w:pPr>
             <w:r>
               <w:rPr>
-                <w:rFonts w:ascii="TH SarabunIT๙" w:eastAsia="Calibri" w:hAnsi="TH SarabunIT๙" w:cs="TH SarabunIT๙" w:hint="cs"/>
-                <w:color w:val="000000"/>
-                <w:sz w:val="28"/>
-                <w:cs/>
-              </w:rPr>
-              <w:t>1.</w:t>
-            </w:r>
-          </w:p>
-        </w:tc>
-        <w:tc>
-          <w:tcPr>
-            <w:tcW w:w="3143" w:type="dxa"/>
-          </w:tcPr>
-          <w:p>
-            <w:pPr>
-              <w:spacing w:after="0" w:line="240" w:lineRule="auto"/>
-              <w:jc w:val="center"/>
-              <w:rPr>
-                <w:rFonts w:ascii="TH SarabunIT๙" w:eastAsia="Calibri" w:hAnsi="TH SarabunIT๙" w:cs="TH SarabunIT๙"/>
-                <w:color w:val="000000"/>
-                <w:sz w:val="28"/>
-              </w:rPr>
-            </w:pPr>
-          </w:p>
-        </w:tc>
-        <w:tc>
-          <w:tcPr>
-            <w:tcW w:w="810" w:type="dxa"/>
-          </w:tcPr>
-          <w:p>
-            <w:pPr>
-              <w:spacing w:after="0" w:line="240" w:lineRule="auto"/>
-              <w:jc w:val="center"/>
-              <w:rPr>
-                <w:rFonts w:ascii="TH SarabunIT๙" w:eastAsia="Calibri" w:hAnsi="TH SarabunIT๙" w:cs="TH SarabunIT๙"/>
-                <w:color w:val="000000"/>
-                <w:sz w:val="28"/>
-              </w:rPr>
-            </w:pPr>
-          </w:p>
-        </w:tc>
-        <w:tc>
-          <w:tcPr>
-            <w:tcW w:w="1530" w:type="dxa"/>
-          </w:tcPr>
-          <w:p>
-            <w:pPr>
-              <w:spacing w:after="0" w:line="240" w:lineRule="auto"/>
-              <w:jc w:val="center"/>
-              <w:rPr>
-                <w:rFonts w:ascii="TH SarabunIT๙" w:eastAsia="Calibri" w:hAnsi="TH SarabunIT๙" w:cs="TH SarabunIT๙"/>
-                <w:color w:val="000000"/>
-                <w:sz w:val="28"/>
-              </w:rPr>
-            </w:pPr>
-          </w:p>
-        </w:tc>
-        <w:tc>
-          <w:tcPr>
-            <w:tcW w:w="1440" w:type="dxa"/>
-          </w:tcPr>
-          <w:p>
-            <w:pPr>
-              <w:spacing w:after="0" w:line="240" w:lineRule="auto"/>
-              <w:jc w:val="center"/>
-              <w:rPr>
-                <w:rFonts w:ascii="TH SarabunIT๙" w:eastAsia="Calibri" w:hAnsi="TH SarabunIT๙" w:cs="TH SarabunIT๙"/>
-                <w:color w:val="000000"/>
-                <w:sz w:val="28"/>
-              </w:rPr>
-            </w:pPr>
-          </w:p>
-        </w:tc>
-        <w:tc>
-          <w:tcPr>
-            <w:tcW w:w="2120" w:type="dxa"/>
+                <w:rFonts w:ascii="TH SarabunIT๙" w:eastAsia="Calibri" w:hAnsi="TH SarabunIT๙" w:cs="TH SarabunIT๙"/>
+                <w:b/>
+                <w:bCs/>
+                <w:color w:val="000000"/>
+                <w:sz w:val="28"/>
+              </w:rPr>
+              <w:t>{#</w:t>
+            </w:r>
+            <w:proofErr w:type="gramStart"/>
+            <w:r>
+              <w:rPr>
+                <w:rFonts w:ascii="TH SarabunIT๙" w:eastAsia="Calibri" w:hAnsi="TH SarabunIT๙" w:cs="TH SarabunIT๙"/>
+                <w:b/>
+                <w:bCs/>
+                <w:color w:val="000000"/>
+                <w:sz w:val="28"/>
+              </w:rPr>
+              <w:t>soft</w:t>
+            </w:r>
+            <w:r>
+              <w:rPr>
+                <w:rFonts w:ascii="TH SarabunIT๙" w:eastAsia="Calibri" w:hAnsi="TH SarabunIT๙" w:cs="TH SarabunIT๙"/>
+                <w:b/>
+                <w:bCs/>
+                <w:color w:val="000000"/>
+                <w:sz w:val="28"/>
+              </w:rPr>
+              <w:t>wareCosts}</w:t>
+            </w:r>
+            <w:r>
+              <w:rPr>
+                <w:rFonts w:ascii="TH SarabunIT๙" w:eastAsia="Calibri" w:hAnsi="TH SarabunIT๙" w:cs="TH SarabunIT๙"/>
+                <w:color w:val="000000"/>
+                <w:sz w:val="28"/>
+              </w:rPr>
+              <w:t>{</w:t>
+            </w:r>
+            <w:proofErr w:type="gramEnd"/>
+            <w:r>
+              <w:rPr>
+                <w:rFonts w:ascii="TH SarabunIT๙" w:eastAsia="Calibri" w:hAnsi="TH SarabunIT๙" w:cs="TH SarabunIT๙"/>
+                <w:color w:val="000000"/>
+                <w:sz w:val="28"/>
+              </w:rPr>
+              <w:t>index}</w:t>
+            </w:r>
+          </w:p>
+        </w:tc>
+        <w:tc>
+          <w:tcPr>
+            <w:tcW w:w="1866" w:type="dxa"/>
+          </w:tcPr>
+          <w:p>
+            <w:pPr>
+              <w:spacing w:after="0" w:line="240" w:lineRule="auto"/>
+              <w:rPr>
+                <w:rFonts w:ascii="TH SarabunIT๙" w:eastAsia="Calibri" w:hAnsi="TH SarabunIT๙" w:cs="TH SarabunIT๙"/>
+                <w:color w:val="000000"/>
+                <w:sz w:val="28"/>
+              </w:rPr>
+            </w:pPr>
+            <w:r>
+              <w:rPr>
+                <w:rFonts w:ascii="TH SarabunIT๙" w:eastAsia="Calibri" w:hAnsi="TH SarabunIT๙" w:cs="TH SarabunIT๙"/>
+                <w:color w:val="000000"/>
+                <w:sz w:val="28"/>
+              </w:rPr>
+              <w:t>{</w:t>
+            </w:r>
+            <w:proofErr w:type="spellStart"/>
+            <w:r>
+              <w:rPr>
+                <w:rFonts w:ascii="TH SarabunIT๙" w:eastAsia="Calibri" w:hAnsi="TH SarabunIT๙" w:cs="TH SarabunIT๙"/>
+                <w:color w:val="000000"/>
+                <w:sz w:val="28"/>
+              </w:rPr>
+              <w:t>itemName</w:t>
+            </w:r>
+            <w:proofErr w:type="spellEnd"/>
+            <w:r>
+              <w:rPr>
+                <w:rFonts w:ascii="TH SarabunIT๙" w:eastAsia="Calibri" w:hAnsi="TH SarabunIT๙" w:cs="TH SarabunIT๙"/>
+                <w:color w:val="000000"/>
+                <w:sz w:val="28"/>
+              </w:rPr>
+              <w:t>}</w:t>
+            </w:r>
+          </w:p>
+        </w:tc>
+        <w:tc>
+          <w:tcPr>
+            <w:tcW w:w="1028" w:type="dxa"/>
+          </w:tcPr>
+          <w:p>
+            <w:pPr>
+              <w:spacing w:after="0" w:line="240" w:lineRule="auto"/>
+              <w:jc w:val="center"/>
+              <w:rPr>
+                <w:rFonts w:ascii="TH SarabunIT๙" w:eastAsia="Calibri" w:hAnsi="TH SarabunIT๙" w:cs="TH SarabunIT๙"/>
+                <w:color w:val="000000"/>
+                <w:sz w:val="28"/>
+              </w:rPr>
+            </w:pPr>
+            <w:r>
+              <w:rPr>
+                <w:rFonts w:ascii="TH SarabunIT๙" w:eastAsia="Calibri" w:hAnsi="TH SarabunIT๙" w:cs="TH SarabunIT๙"/>
+                <w:color w:val="000000"/>
+                <w:sz w:val="28"/>
+              </w:rPr>
+              <w:t>{quantity}</w:t>
+            </w:r>
+          </w:p>
+        </w:tc>
+        <w:tc>
+          <w:tcPr>
+            <w:tcW w:w="1353" w:type="dxa"/>
+          </w:tcPr>
+          <w:p>
+            <w:pPr>
+              <w:spacing w:after="0" w:line="240" w:lineRule="auto"/>
+              <w:jc w:val="right"/>
+              <w:rPr>
+                <w:rFonts w:ascii="TH SarabunIT๙" w:eastAsia="Calibri" w:hAnsi="TH SarabunIT๙" w:cs="TH SarabunIT๙"/>
+                <w:color w:val="000000"/>
+                <w:sz w:val="28"/>
+              </w:rPr>
+            </w:pPr>
+            <w:r>
+              <w:rPr>
+                <w:rFonts w:ascii="TH SarabunIT๙" w:eastAsia="Calibri" w:hAnsi="TH SarabunIT๙" w:cs="TH SarabunIT๙"/>
+                <w:color w:val="000000"/>
+                <w:sz w:val="28"/>
+              </w:rPr>
+              <w:t>{</w:t>
+            </w:r>
+            <w:proofErr w:type="spellStart"/>
+            <w:r>
+              <w:rPr>
+                <w:rFonts w:ascii="TH SarabunIT๙" w:eastAsia="Calibri" w:hAnsi="TH SarabunIT๙" w:cs="TH SarabunIT๙"/>
+                <w:color w:val="000000"/>
+                <w:sz w:val="28"/>
+              </w:rPr>
+              <w:t>unitPriceStr</w:t>
+            </w:r>
+            <w:proofErr w:type="spellEnd"/>
+            <w:r>
+              <w:rPr>
+                <w:rFonts w:ascii="TH SarabunIT๙" w:eastAsia="Calibri" w:hAnsi="TH SarabunIT๙" w:cs="TH SarabunIT๙"/>
+                <w:color w:val="000000"/>
+                <w:sz w:val="28"/>
+              </w:rPr>
+              <w:t>}</w:t>
+            </w:r>
+          </w:p>
+        </w:tc>
+        <w:tc>
+          <w:tcPr>
+            <w:tcW w:w="1200" w:type="dxa"/>
+          </w:tcPr>
+          <w:p>
+            <w:pPr>
+              <w:spacing w:after="0" w:line="240" w:lineRule="auto"/>
+              <w:jc w:val="right"/>
+              <w:rPr>
+                <w:rFonts w:ascii="TH SarabunIT๙" w:eastAsia="Calibri" w:hAnsi="TH SarabunIT๙" w:cs="TH SarabunIT๙"/>
+                <w:color w:val="000000"/>
+                <w:sz w:val="28"/>
+              </w:rPr>
+            </w:pPr>
+            <w:r>
+              <w:rPr>
+                <w:rFonts w:ascii="TH SarabunIT๙" w:eastAsia="Calibri" w:hAnsi="TH SarabunIT๙" w:cs="TH SarabunIT๙"/>
+                <w:color w:val="000000"/>
+                <w:sz w:val="28"/>
+              </w:rPr>
+              <w:t>{</w:t>
+            </w:r>
+            <w:proofErr w:type="spellStart"/>
+            <w:r>
+              <w:rPr>
+                <w:rFonts w:ascii="TH SarabunIT๙" w:eastAsia="Calibri" w:hAnsi="TH SarabunIT๙" w:cs="TH SarabunIT๙"/>
+                <w:color w:val="000000"/>
+                <w:sz w:val="28"/>
+              </w:rPr>
+              <w:t>rowTotal</w:t>
+            </w:r>
+            <w:proofErr w:type="spellEnd"/>
+            <w:r>
+              <w:rPr>
+                <w:rFonts w:ascii="TH SarabunIT๙" w:eastAsia="Calibri" w:hAnsi="TH SarabunIT๙" w:cs="TH SarabunIT๙"/>
+                <w:color w:val="000000"/>
+                <w:sz w:val="28"/>
+              </w:rPr>
+              <w:t>}</w:t>
+            </w:r>
+          </w:p>
+        </w:tc>
+        <w:tc>
+          <w:tcPr>
+            <w:tcW w:w="2080" w:type="dxa"/>
           </w:tcPr>
           <w:p>
             <w:pPr>
@@ -12983,39 +13213,38 @@
                 <w:sz w:val="24"/>
                 <w:szCs w:val="24"/>
               </w:rPr>
-              <w:sym w:font="Wingdings 2" w:char="F0A3"/>
-            </w:r>
+              <w:t>{</w:t>
+            </w:r>
+            <w:proofErr w:type="spellStart"/>
             <w:r>
               <w:rPr>
                 <w:rFonts w:ascii="TH SarabunPSK" w:eastAsia="Calibri" w:hAnsi="TH SarabunPSK" w:cs="TH SarabunPSK"/>
                 <w:color w:val="000000"/>
                 <w:sz w:val="24"/>
                 <w:szCs w:val="24"/>
-                <w:cs/>
-              </w:rPr>
-              <w:t xml:space="preserve"> </w:t>
-            </w:r>
-            <w:r>
-              <w:rPr>
-                <w:rFonts w:ascii="TH SarabunPSK" w:eastAsia="Calibri" w:hAnsi="TH SarabunPSK" w:cs="TH SarabunPSK" w:hint="cs"/>
+              </w:rPr>
+              <w:t>chkMdes</w:t>
+            </w:r>
+            <w:proofErr w:type="spellEnd"/>
+            <w:r>
+              <w:rPr>
+                <w:rFonts w:ascii="TH SarabunPSK" w:eastAsia="Calibri" w:hAnsi="TH SarabunPSK" w:cs="TH SarabunPSK"/>
                 <w:color w:val="000000"/>
                 <w:sz w:val="24"/>
                 <w:szCs w:val="24"/>
-                <w:cs/>
-              </w:rPr>
-              <w:t>กระทรวงดิจิทัลฯ</w:t>
-            </w:r>
-          </w:p>
-          <w:p>
-            <w:pPr>
-              <w:spacing w:after="0" w:line="240" w:lineRule="auto"/>
+              </w:rPr>
+              <w:t>}</w:t>
+            </w:r>
+            <w:r>
               <w:rPr>
                 <w:rFonts w:ascii="TH SarabunPSK" w:eastAsia="Calibri" w:hAnsi="TH SarabunPSK" w:cs="TH SarabunPSK"/>
                 <w:color w:val="000000"/>
                 <w:sz w:val="24"/>
                 <w:szCs w:val="24"/>
-              </w:rPr>
-            </w:pPr>
+                <w:cs/>
+              </w:rPr>
+              <w:t xml:space="preserve"> </w:t>
+            </w:r>
             <w:r>
               <w:rPr>
                 <w:rFonts w:ascii="TH SarabunPSK" w:eastAsia="Calibri" w:hAnsi="TH SarabunPSK" w:cs="TH SarabunPSK" w:hint="cs"/>
@@ -13024,18 +13253,19 @@
                 <w:szCs w:val="24"/>
                 <w:cs/>
               </w:rPr>
-              <w:t>ฉบับเดือน</w:t>
-            </w:r>
-            <w:r>
-              <w:rPr>
-                <w:rFonts w:ascii="TH SarabunPSK" w:eastAsia="Calibri" w:hAnsi="TH SarabunPSK" w:cs="TH SarabunPSK" w:hint="cs"/>
+              <w:t>กระทรวงดิจิทัลฯ</w:t>
+            </w:r>
+          </w:p>
+          <w:p>
+            <w:pPr>
+              <w:spacing w:after="0" w:line="240" w:lineRule="auto"/>
+              <w:rPr>
+                <w:rFonts w:ascii="TH SarabunPSK" w:eastAsia="Calibri" w:hAnsi="TH SarabunPSK" w:cs="TH SarabunPSK"/>
                 <w:color w:val="000000"/>
                 <w:sz w:val="24"/>
                 <w:szCs w:val="24"/>
-                <w:cs/>
-              </w:rPr>
-              <w:t>..............</w:t>
-            </w:r>
+              </w:rPr>
+            </w:pPr>
             <w:r>
               <w:rPr>
                 <w:rFonts w:ascii="TH SarabunPSK" w:eastAsia="Calibri" w:hAnsi="TH SarabunPSK" w:cs="TH SarabunPSK" w:hint="cs"/>
@@ -13044,49 +13274,46 @@
                 <w:szCs w:val="24"/>
                 <w:cs/>
               </w:rPr>
-              <w:t>...พ.ศ.</w:t>
-            </w:r>
-            <w:r>
-              <w:rPr>
-                <w:rFonts w:ascii="TH SarabunPSK" w:eastAsia="Calibri" w:hAnsi="TH SarabunPSK" w:cs="TH SarabunPSK" w:hint="cs"/>
+              <w:t xml:space="preserve">ฉบับเดือน </w:t>
+            </w:r>
+            <w:r>
+              <w:rPr>
+                <w:rFonts w:ascii="TH SarabunPSK" w:eastAsia="Calibri" w:hAnsi="TH SarabunPSK" w:cs="TH SarabunPSK"/>
                 <w:color w:val="000000"/>
                 <w:sz w:val="24"/>
                 <w:szCs w:val="24"/>
-                <w:cs/>
-              </w:rPr>
-              <w:t>.....</w:t>
-            </w:r>
-            <w:r>
-              <w:rPr>
-                <w:rFonts w:ascii="TH SarabunPSK" w:eastAsia="Calibri" w:hAnsi="TH SarabunPSK" w:cs="TH SarabunPSK" w:hint="cs"/>
+              </w:rPr>
+              <w:t>{</w:t>
+            </w:r>
+            <w:proofErr w:type="spellStart"/>
+            <w:r>
+              <w:rPr>
+                <w:rFonts w:ascii="TH SarabunPSK" w:eastAsia="Calibri" w:hAnsi="TH SarabunPSK" w:cs="TH SarabunPSK"/>
                 <w:color w:val="000000"/>
                 <w:sz w:val="24"/>
                 <w:szCs w:val="24"/>
-                <w:cs/>
-              </w:rPr>
-              <w:t>..</w:t>
-            </w:r>
-          </w:p>
-          <w:p>
-            <w:pPr>
-              <w:spacing w:after="0" w:line="240" w:lineRule="auto"/>
+              </w:rPr>
+              <w:t>mdesMonth</w:t>
+            </w:r>
+            <w:proofErr w:type="spellEnd"/>
+            <w:r>
               <w:rPr>
                 <w:rFonts w:ascii="TH SarabunPSK" w:eastAsia="Calibri" w:hAnsi="TH SarabunPSK" w:cs="TH SarabunPSK"/>
                 <w:color w:val="000000"/>
                 <w:sz w:val="24"/>
                 <w:szCs w:val="24"/>
-                <w:cs/>
-              </w:rPr>
-            </w:pPr>
-            <w:r>
-              <w:rPr>
-                <w:rFonts w:ascii="TH SarabunPSK" w:eastAsia="Calibri" w:hAnsi="TH SarabunPSK" w:cs="TH SarabunPSK" w:hint="cs"/>
+              </w:rPr>
+              <w:t>}</w:t>
+            </w:r>
+            <w:r>
+              <w:rPr>
+                <w:rFonts w:ascii="TH SarabunPSK" w:eastAsia="Calibri" w:hAnsi="TH SarabunPSK" w:cs="TH SarabunPSK"/>
                 <w:color w:val="000000"/>
                 <w:sz w:val="24"/>
                 <w:szCs w:val="24"/>
-                <w:cs/>
-              </w:rPr>
-              <w:t>รายการที่</w:t>
+                <w:u w:val="dotted"/>
+              </w:rPr>
+              <w:t xml:space="preserve"> </w:t>
             </w:r>
             <w:r>
               <w:rPr>
@@ -13096,29 +13323,28 @@
                 <w:szCs w:val="24"/>
                 <w:cs/>
               </w:rPr>
-              <w:t>......</w:t>
-            </w:r>
-            <w:r>
-              <w:rPr>
-                <w:rFonts w:ascii="TH SarabunPSK" w:eastAsia="Calibri" w:hAnsi="TH SarabunPSK" w:cs="TH SarabunPSK" w:hint="cs"/>
+              <w:t xml:space="preserve">พ.ศ. </w:t>
+            </w:r>
+            <w:r>
+              <w:rPr>
+                <w:rFonts w:ascii="TH SarabunPSK" w:eastAsia="Calibri" w:hAnsi="TH SarabunPSK" w:cs="TH SarabunPSK"/>
                 <w:color w:val="000000"/>
                 <w:sz w:val="24"/>
                 <w:szCs w:val="24"/>
-                <w:cs/>
-              </w:rPr>
-              <w:t>..........................</w:t>
-            </w:r>
-          </w:p>
-          <w:p>
-            <w:pPr>
-              <w:spacing w:after="0" w:line="240" w:lineRule="auto"/>
+              </w:rPr>
+              <w:t>{</w:t>
+            </w:r>
+            <w:proofErr w:type="spellStart"/>
+            <w:r>
               <w:rPr>
                 <w:rFonts w:ascii="TH SarabunPSK" w:eastAsia="Calibri" w:hAnsi="TH SarabunPSK" w:cs="TH SarabunPSK"/>
                 <w:color w:val="000000"/>
                 <w:sz w:val="24"/>
                 <w:szCs w:val="24"/>
               </w:rPr>
-            </w:pPr>
+              <w:t>mdesYear</w:t>
+            </w:r>
+            <w:proofErr w:type="spellEnd"/>
             <w:r>
               <w:rPr>
                 <w:rFonts w:ascii="TH SarabunPSK" w:eastAsia="Calibri" w:hAnsi="TH SarabunPSK" w:cs="TH SarabunPSK"/>
@@ -13126,16 +13352,98 @@
                 <w:sz w:val="24"/>
                 <w:szCs w:val="24"/>
               </w:rPr>
-              <w:sym w:font="Wingdings 2" w:char="F0A3"/>
-            </w:r>
-            <w:r>
+              <w:t>}</w:t>
+            </w:r>
+          </w:p>
+          <w:p>
+            <w:pPr>
+              <w:spacing w:after="0" w:line="240" w:lineRule="auto"/>
               <w:rPr>
                 <w:rFonts w:ascii="TH SarabunPSK" w:eastAsia="Calibri" w:hAnsi="TH SarabunPSK" w:cs="TH SarabunPSK"/>
                 <w:color w:val="000000"/>
                 <w:sz w:val="24"/>
                 <w:szCs w:val="24"/>
-              </w:rPr>
-              <w:t xml:space="preserve"> </w:t>
+                <w:cs/>
+              </w:rPr>
+            </w:pPr>
+            <w:r>
+              <w:rPr>
+                <w:rFonts w:ascii="TH SarabunPSK" w:eastAsia="Calibri" w:hAnsi="TH SarabunPSK" w:cs="TH SarabunPSK" w:hint="cs"/>
+                <w:color w:val="000000"/>
+                <w:sz w:val="24"/>
+                <w:szCs w:val="24"/>
+                <w:cs/>
+              </w:rPr>
+              <w:t xml:space="preserve">รายการที่ </w:t>
+            </w:r>
+            <w:r>
+              <w:rPr>
+                <w:rFonts w:ascii="TH SarabunPSK" w:eastAsia="Calibri" w:hAnsi="TH SarabunPSK" w:cs="TH SarabunPSK"/>
+                <w:color w:val="000000"/>
+                <w:sz w:val="24"/>
+                <w:szCs w:val="24"/>
+              </w:rPr>
+              <w:t>{</w:t>
+            </w:r>
+            <w:proofErr w:type="spellStart"/>
+            <w:r>
+              <w:rPr>
+                <w:rFonts w:ascii="TH SarabunPSK" w:eastAsia="Calibri" w:hAnsi="TH SarabunPSK" w:cs="TH SarabunPSK"/>
+                <w:color w:val="000000"/>
+                <w:sz w:val="24"/>
+                <w:szCs w:val="24"/>
+              </w:rPr>
+              <w:t>mdesItemNo</w:t>
+            </w:r>
+            <w:proofErr w:type="spellEnd"/>
+            <w:r>
+              <w:rPr>
+                <w:rFonts w:ascii="TH SarabunPSK" w:eastAsia="Calibri" w:hAnsi="TH SarabunPSK" w:cs="TH SarabunPSK"/>
+                <w:color w:val="000000"/>
+                <w:sz w:val="24"/>
+                <w:szCs w:val="24"/>
+              </w:rPr>
+              <w:t>}</w:t>
+            </w:r>
+          </w:p>
+          <w:p>
+            <w:pPr>
+              <w:spacing w:after="0" w:line="240" w:lineRule="auto"/>
+              <w:rPr>
+                <w:rFonts w:ascii="TH SarabunPSK" w:eastAsia="Calibri" w:hAnsi="TH SarabunPSK" w:cs="TH SarabunPSK"/>
+                <w:color w:val="000000"/>
+                <w:sz w:val="24"/>
+                <w:szCs w:val="24"/>
+              </w:rPr>
+            </w:pPr>
+            <w:r>
+              <w:rPr>
+                <w:rFonts w:ascii="TH SarabunPSK" w:eastAsia="Calibri" w:hAnsi="TH SarabunPSK" w:cs="TH SarabunPSK"/>
+                <w:color w:val="000000"/>
+                <w:sz w:val="24"/>
+                <w:szCs w:val="24"/>
+              </w:rPr>
+              <w:t>{</w:t>
+            </w:r>
+            <w:proofErr w:type="spellStart"/>
+            <w:r>
+              <w:rPr>
+                <w:rFonts w:ascii="TH SarabunPSK" w:eastAsia="Calibri" w:hAnsi="TH SarabunPSK" w:cs="TH SarabunPSK"/>
+                <w:color w:val="000000"/>
+                <w:sz w:val="24"/>
+                <w:szCs w:val="24"/>
+              </w:rPr>
+              <w:t>chkMarket</w:t>
+            </w:r>
+            <w:proofErr w:type="spellEnd"/>
+            <w:r>
+              <w:rPr>
+                <w:rFonts w:ascii="TH SarabunPSK" w:eastAsia="Calibri" w:hAnsi="TH SarabunPSK" w:cs="TH SarabunPSK"/>
+                <w:color w:val="000000"/>
+                <w:sz w:val="24"/>
+                <w:szCs w:val="24"/>
+              </w:rPr>
+              <w:t xml:space="preserve">} </w:t>
             </w:r>
             <w:r>
               <w:rPr>
@@ -13157,593 +13465,19 @@
                 <w:szCs w:val="24"/>
                 <w:cs/>
               </w:rPr>
-              <w:t>ฯ</w:t>
-            </w:r>
-            <w:r>
-              <w:rPr>
-                <w:rFonts w:ascii="TH SarabunPSK" w:hAnsi="TH SarabunPSK" w:cs="TH SarabunPSK" w:hint="cs"/>
+              <w:t xml:space="preserve">ฯ จำนวน </w:t>
+            </w:r>
+            <w:r>
+              <w:rPr>
+                <w:rFonts w:ascii="TH SarabunPSK" w:hAnsi="TH SarabunPSK" w:cs="TH SarabunPSK"/>
                 <w:color w:val="000000"/>
                 <w:kern w:val="32"/>
                 <w:sz w:val="24"/>
                 <w:szCs w:val="24"/>
-                <w:cs/>
-              </w:rPr>
-              <w:t xml:space="preserve"> จำนวน</w:t>
-            </w:r>
-            <w:r>
-              <w:rPr>
-                <w:rFonts w:ascii="TH SarabunPSK" w:eastAsia="Calibri" w:hAnsi="TH SarabunPSK" w:cs="TH SarabunPSK" w:hint="cs"/>
-                <w:color w:val="000000"/>
-                <w:sz w:val="24"/>
-                <w:szCs w:val="24"/>
-                <w:cs/>
-              </w:rPr>
-              <w:t>.....</w:t>
-            </w:r>
-            <w:r>
-              <w:rPr>
-                <w:rFonts w:ascii="TH SarabunPSK" w:eastAsia="Calibri" w:hAnsi="TH SarabunPSK" w:cs="TH SarabunPSK" w:hint="cs"/>
-                <w:color w:val="000000"/>
-                <w:sz w:val="24"/>
-                <w:szCs w:val="24"/>
-                <w:cs/>
-              </w:rPr>
-              <w:t>ราย</w:t>
-            </w:r>
-          </w:p>
-          <w:p>
-            <w:pPr>
-              <w:spacing w:after="0" w:line="240" w:lineRule="auto"/>
-              <w:rPr>
-                <w:rFonts w:ascii="TH SarabunPSK" w:eastAsia="Calibri" w:hAnsi="TH SarabunPSK" w:cs="TH SarabunPSK"/>
-                <w:color w:val="000000"/>
-                <w:sz w:val="24"/>
-                <w:szCs w:val="24"/>
-              </w:rPr>
-            </w:pPr>
-            <w:r>
-              <w:rPr>
-                <w:rFonts w:ascii="TH SarabunPSK" w:eastAsia="Calibri" w:hAnsi="TH SarabunPSK" w:cs="TH SarabunPSK" w:hint="cs"/>
-                <w:color w:val="000000"/>
-                <w:sz w:val="24"/>
-                <w:szCs w:val="24"/>
-                <w:cs/>
-              </w:rPr>
-              <w:t>ใช้ของบริษัท</w:t>
-            </w:r>
-            <w:r>
-              <w:rPr>
-                <w:rFonts w:ascii="TH SarabunPSK" w:eastAsia="Calibri" w:hAnsi="TH SarabunPSK" w:cs="TH SarabunPSK" w:hint="cs"/>
-                <w:color w:val="000000"/>
-                <w:sz w:val="24"/>
-                <w:szCs w:val="24"/>
-                <w:cs/>
-              </w:rPr>
-              <w:t>.</w:t>
-            </w:r>
-            <w:r>
-              <w:rPr>
-                <w:rFonts w:ascii="TH SarabunPSK" w:eastAsia="Calibri" w:hAnsi="TH SarabunPSK" w:cs="TH SarabunPSK" w:hint="cs"/>
-                <w:color w:val="000000"/>
-                <w:sz w:val="24"/>
-                <w:szCs w:val="24"/>
-                <w:cs/>
-              </w:rPr>
-              <w:t>..........................</w:t>
-            </w:r>
-          </w:p>
-          <w:p>
-            <w:pPr>
-              <w:spacing w:after="0" w:line="240" w:lineRule="auto"/>
-              <w:rPr>
-                <w:rFonts w:ascii="TH SarabunPSK" w:eastAsia="Calibri" w:hAnsi="TH SarabunPSK" w:cs="TH SarabunPSK"/>
-                <w:color w:val="000000"/>
-                <w:sz w:val="24"/>
-                <w:szCs w:val="24"/>
-              </w:rPr>
-            </w:pPr>
-            <w:r>
-              <w:rPr>
-                <w:rFonts w:ascii="TH SarabunPSK" w:eastAsia="Calibri" w:hAnsi="TH SarabunPSK" w:cs="TH SarabunPSK" w:hint="cs"/>
-                <w:color w:val="000000"/>
-                <w:sz w:val="24"/>
-                <w:szCs w:val="24"/>
-                <w:cs/>
-              </w:rPr>
-              <w:t>..</w:t>
-            </w:r>
-            <w:r>
-              <w:rPr>
-                <w:rFonts w:ascii="TH SarabunPSK" w:eastAsia="Calibri" w:hAnsi="TH SarabunPSK" w:cs="TH SarabunPSK" w:hint="cs"/>
-                <w:color w:val="000000"/>
-                <w:sz w:val="24"/>
-                <w:szCs w:val="24"/>
-                <w:cs/>
-              </w:rPr>
-              <w:t>.............................................</w:t>
-            </w:r>
-          </w:p>
-          <w:p>
-            <w:pPr>
-              <w:spacing w:after="0" w:line="240" w:lineRule="auto"/>
-              <w:rPr>
-                <w:rFonts w:ascii="TH SarabunPSK" w:eastAsia="Calibri" w:hAnsi="TH SarabunPSK" w:cs="TH SarabunPSK"/>
-                <w:color w:val="000000"/>
-                <w:sz w:val="24"/>
-                <w:szCs w:val="24"/>
-              </w:rPr>
-            </w:pPr>
-            <w:r>
-              <w:rPr>
-                <w:rFonts w:ascii="TH SarabunPSK" w:eastAsia="Calibri" w:hAnsi="TH SarabunPSK" w:cs="TH SarabunPSK"/>
-                <w:color w:val="000000"/>
-                <w:sz w:val="24"/>
-                <w:szCs w:val="24"/>
-              </w:rPr>
-              <w:sym w:font="Wingdings 2" w:char="F0A3"/>
-            </w:r>
-            <w:r>
-              <w:rPr>
-                <w:rFonts w:ascii="TH SarabunPSK" w:eastAsia="Calibri" w:hAnsi="TH SarabunPSK" w:cs="TH SarabunPSK"/>
-                <w:color w:val="000000"/>
-                <w:sz w:val="24"/>
-                <w:szCs w:val="24"/>
-              </w:rPr>
-              <w:t xml:space="preserve"> </w:t>
-            </w:r>
-            <w:r>
-              <w:rPr>
-                <w:rFonts w:ascii="TH SarabunPSK" w:eastAsia="Calibri" w:hAnsi="TH SarabunPSK" w:cs="TH SarabunPSK" w:hint="cs"/>
-                <w:color w:val="000000"/>
-                <w:sz w:val="24"/>
-                <w:szCs w:val="24"/>
-                <w:cs/>
-              </w:rPr>
-              <w:t>ราคาที่เคยจัดหาฯ</w:t>
-            </w:r>
-          </w:p>
-          <w:p>
-            <w:pPr>
-              <w:spacing w:after="0" w:line="240" w:lineRule="auto"/>
-              <w:rPr>
-                <w:rFonts w:ascii="TH SarabunPSK" w:eastAsia="Calibri" w:hAnsi="TH SarabunPSK" w:cs="TH SarabunPSK"/>
-                <w:color w:val="000000"/>
-                <w:sz w:val="24"/>
-                <w:szCs w:val="24"/>
-              </w:rPr>
-            </w:pPr>
-            <w:r>
-              <w:rPr>
-                <w:rFonts w:ascii="TH SarabunPSK" w:eastAsia="Calibri" w:hAnsi="TH SarabunPSK" w:cs="TH SarabunPSK" w:hint="cs"/>
-                <w:color w:val="000000"/>
-                <w:sz w:val="24"/>
-                <w:szCs w:val="24"/>
-                <w:cs/>
-              </w:rPr>
-              <w:t>โครงการ</w:t>
-            </w:r>
-            <w:r>
-              <w:rPr>
-                <w:rFonts w:ascii="TH SarabunPSK" w:eastAsia="Calibri" w:hAnsi="TH SarabunPSK" w:cs="TH SarabunPSK" w:hint="cs"/>
-                <w:color w:val="000000"/>
-                <w:sz w:val="24"/>
-                <w:szCs w:val="24"/>
-                <w:cs/>
-              </w:rPr>
-              <w:t>..</w:t>
-            </w:r>
-            <w:r>
-              <w:rPr>
-                <w:rFonts w:ascii="TH SarabunPSK" w:eastAsia="Calibri" w:hAnsi="TH SarabunPSK" w:cs="TH SarabunPSK" w:hint="cs"/>
-                <w:color w:val="000000"/>
-                <w:sz w:val="24"/>
-                <w:szCs w:val="24"/>
-                <w:cs/>
-              </w:rPr>
-              <w:t>.......................</w:t>
-            </w:r>
-            <w:r>
-              <w:rPr>
-                <w:rFonts w:ascii="TH SarabunPSK" w:eastAsia="Calibri" w:hAnsi="TH SarabunPSK" w:cs="TH SarabunPSK"/>
-                <w:color w:val="000000"/>
-                <w:sz w:val="24"/>
-                <w:szCs w:val="24"/>
-              </w:rPr>
-              <w:t>.</w:t>
-            </w:r>
-            <w:r>
-              <w:rPr>
-                <w:rFonts w:ascii="TH SarabunPSK" w:eastAsia="Calibri" w:hAnsi="TH SarabunPSK" w:cs="TH SarabunPSK" w:hint="cs"/>
-                <w:color w:val="000000"/>
-                <w:sz w:val="24"/>
-                <w:szCs w:val="24"/>
-                <w:cs/>
-              </w:rPr>
-              <w:t>........</w:t>
-            </w:r>
-          </w:p>
-          <w:p>
-            <w:pPr>
-              <w:spacing w:after="0" w:line="240" w:lineRule="auto"/>
-              <w:rPr>
-                <w:rFonts w:ascii="TH SarabunPSK" w:eastAsia="Calibri" w:hAnsi="TH SarabunPSK" w:cs="TH SarabunPSK"/>
-                <w:color w:val="000000"/>
-                <w:sz w:val="24"/>
-                <w:szCs w:val="24"/>
-              </w:rPr>
-            </w:pPr>
-            <w:r>
-              <w:rPr>
-                <w:rFonts w:ascii="TH SarabunPSK" w:eastAsia="Calibri" w:hAnsi="TH SarabunPSK" w:cs="TH SarabunPSK" w:hint="cs"/>
-                <w:color w:val="000000"/>
-                <w:sz w:val="24"/>
-                <w:szCs w:val="24"/>
-                <w:cs/>
-              </w:rPr>
-              <w:t>.</w:t>
-            </w:r>
-            <w:r>
-              <w:rPr>
-                <w:rFonts w:ascii="TH SarabunPSK" w:eastAsia="Calibri" w:hAnsi="TH SarabunPSK" w:cs="TH SarabunPSK" w:hint="cs"/>
-                <w:color w:val="000000"/>
-                <w:sz w:val="24"/>
-                <w:szCs w:val="24"/>
-                <w:cs/>
-              </w:rPr>
-              <w:t>..........................</w:t>
-            </w:r>
-            <w:r>
-              <w:rPr>
-                <w:rFonts w:ascii="TH SarabunPSK" w:eastAsia="Calibri" w:hAnsi="TH SarabunPSK" w:cs="TH SarabunPSK" w:hint="cs"/>
-                <w:color w:val="000000"/>
-                <w:sz w:val="24"/>
-                <w:szCs w:val="24"/>
-                <w:cs/>
-              </w:rPr>
-              <w:t>...</w:t>
-            </w:r>
-            <w:r>
-              <w:rPr>
-                <w:rFonts w:ascii="TH SarabunPSK" w:eastAsia="Calibri" w:hAnsi="TH SarabunPSK" w:cs="TH SarabunPSK" w:hint="cs"/>
-                <w:color w:val="000000"/>
-                <w:sz w:val="24"/>
-                <w:szCs w:val="24"/>
-                <w:cs/>
-              </w:rPr>
-              <w:t>.</w:t>
-            </w:r>
-            <w:r>
-              <w:rPr>
-                <w:rFonts w:ascii="TH SarabunPSK" w:eastAsia="Calibri" w:hAnsi="TH SarabunPSK" w:cs="TH SarabunPSK" w:hint="cs"/>
-                <w:color w:val="000000"/>
-                <w:sz w:val="24"/>
-                <w:szCs w:val="24"/>
-                <w:cs/>
-              </w:rPr>
-              <w:t>พ.ศ</w:t>
-            </w:r>
-            <w:r>
-              <w:rPr>
-                <w:rFonts w:ascii="TH SarabunPSK" w:eastAsia="Calibri" w:hAnsi="TH SarabunPSK" w:cs="TH SarabunPSK" w:hint="cs"/>
-                <w:color w:val="000000"/>
-                <w:sz w:val="24"/>
-                <w:szCs w:val="24"/>
-                <w:cs/>
-              </w:rPr>
-              <w:t>...........</w:t>
-            </w:r>
-          </w:p>
-          <w:p>
-            <w:pPr>
-              <w:spacing w:after="0" w:line="240" w:lineRule="auto"/>
-              <w:jc w:val="center"/>
-              <w:rPr>
-                <w:rFonts w:ascii="TH SarabunIT๙" w:eastAsia="Calibri" w:hAnsi="TH SarabunIT๙" w:cs="TH SarabunIT๙"/>
-                <w:color w:val="000000"/>
-                <w:sz w:val="28"/>
-              </w:rPr>
-            </w:pPr>
-            <w:r>
-              <w:rPr>
-                <w:rFonts w:ascii="TH SarabunPSK" w:eastAsia="Calibri" w:hAnsi="TH SarabunPSK" w:cs="TH SarabunPSK" w:hint="cs"/>
-                <w:color w:val="000000"/>
-                <w:sz w:val="24"/>
-                <w:szCs w:val="24"/>
-              </w:rPr>
-              <w:sym w:font="Wingdings 2" w:char="F0A3"/>
-            </w:r>
-            <w:r>
-              <w:rPr>
-                <w:rFonts w:ascii="TH SarabunPSK" w:eastAsia="Calibri" w:hAnsi="TH SarabunPSK" w:cs="TH SarabunPSK" w:hint="cs"/>
-                <w:color w:val="000000"/>
-                <w:sz w:val="24"/>
-                <w:szCs w:val="24"/>
-                <w:cs/>
-              </w:rPr>
-              <w:t xml:space="preserve"> อื่นๆ......................</w:t>
-            </w:r>
-            <w:r>
-              <w:rPr>
-                <w:rFonts w:ascii="TH SarabunPSK" w:eastAsia="Calibri" w:hAnsi="TH SarabunPSK" w:cs="TH SarabunPSK" w:hint="cs"/>
-                <w:color w:val="000000"/>
-                <w:sz w:val="24"/>
-                <w:szCs w:val="24"/>
-                <w:cs/>
-              </w:rPr>
-              <w:t>...........</w:t>
-            </w:r>
-          </w:p>
-        </w:tc>
-      </w:tr>
-      <w:tr>
-        <w:tc>
-          <w:tcPr>
-            <w:tcW w:w="812" w:type="dxa"/>
-          </w:tcPr>
-          <w:p>
-            <w:pPr>
-              <w:tabs>
-                <w:tab w:val="left" w:pos="90"/>
-              </w:tabs>
-              <w:spacing w:after="0" w:line="240" w:lineRule="auto"/>
-              <w:ind w:left="180" w:hanging="180"/>
-              <w:jc w:val="center"/>
-              <w:rPr>
-                <w:rFonts w:ascii="TH SarabunIT๙" w:eastAsia="Calibri" w:hAnsi="TH SarabunIT๙" w:cs="TH SarabunIT๙"/>
-                <w:color w:val="000000"/>
-                <w:sz w:val="28"/>
-              </w:rPr>
-            </w:pPr>
-            <w:r>
-              <w:rPr>
-                <w:rFonts w:ascii="TH SarabunIT๙" w:eastAsia="Calibri" w:hAnsi="TH SarabunIT๙" w:cs="TH SarabunIT๙" w:hint="cs"/>
-                <w:color w:val="000000"/>
-                <w:sz w:val="28"/>
-                <w:cs/>
-              </w:rPr>
-              <w:t>2.</w:t>
-            </w:r>
-          </w:p>
-        </w:tc>
-        <w:tc>
-          <w:tcPr>
-            <w:tcW w:w="3143" w:type="dxa"/>
-          </w:tcPr>
-          <w:p>
-            <w:pPr>
-              <w:spacing w:after="0" w:line="240" w:lineRule="auto"/>
-              <w:jc w:val="center"/>
-              <w:rPr>
-                <w:rFonts w:ascii="TH SarabunIT๙" w:eastAsia="Calibri" w:hAnsi="TH SarabunIT๙" w:cs="TH SarabunIT๙"/>
-                <w:color w:val="000000"/>
-                <w:sz w:val="28"/>
-              </w:rPr>
-            </w:pPr>
-          </w:p>
-        </w:tc>
-        <w:tc>
-          <w:tcPr>
-            <w:tcW w:w="810" w:type="dxa"/>
-          </w:tcPr>
-          <w:p>
-            <w:pPr>
-              <w:spacing w:after="0" w:line="240" w:lineRule="auto"/>
-              <w:jc w:val="center"/>
-              <w:rPr>
-                <w:rFonts w:ascii="TH SarabunIT๙" w:eastAsia="Calibri" w:hAnsi="TH SarabunIT๙" w:cs="TH SarabunIT๙"/>
-                <w:color w:val="000000"/>
-                <w:sz w:val="28"/>
-              </w:rPr>
-            </w:pPr>
-          </w:p>
-        </w:tc>
-        <w:tc>
-          <w:tcPr>
-            <w:tcW w:w="1530" w:type="dxa"/>
-          </w:tcPr>
-          <w:p>
-            <w:pPr>
-              <w:spacing w:after="0" w:line="240" w:lineRule="auto"/>
-              <w:jc w:val="center"/>
-              <w:rPr>
-                <w:rFonts w:ascii="TH SarabunIT๙" w:eastAsia="Calibri" w:hAnsi="TH SarabunIT๙" w:cs="TH SarabunIT๙"/>
-                <w:color w:val="000000"/>
-                <w:sz w:val="28"/>
-              </w:rPr>
-            </w:pPr>
-          </w:p>
-        </w:tc>
-        <w:tc>
-          <w:tcPr>
-            <w:tcW w:w="1440" w:type="dxa"/>
-          </w:tcPr>
-          <w:p>
-            <w:pPr>
-              <w:spacing w:after="0" w:line="240" w:lineRule="auto"/>
-              <w:jc w:val="center"/>
-              <w:rPr>
-                <w:rFonts w:ascii="TH SarabunIT๙" w:eastAsia="Calibri" w:hAnsi="TH SarabunIT๙" w:cs="TH SarabunIT๙"/>
-                <w:color w:val="000000"/>
-                <w:sz w:val="28"/>
-              </w:rPr>
-            </w:pPr>
-          </w:p>
-        </w:tc>
-        <w:tc>
-          <w:tcPr>
-            <w:tcW w:w="2120" w:type="dxa"/>
-          </w:tcPr>
-          <w:p>
-            <w:pPr>
-              <w:spacing w:after="0" w:line="240" w:lineRule="auto"/>
-              <w:rPr>
-                <w:rFonts w:ascii="TH SarabunPSK" w:eastAsia="Calibri" w:hAnsi="TH SarabunPSK" w:cs="TH SarabunPSK"/>
-                <w:color w:val="000000"/>
-                <w:sz w:val="24"/>
-                <w:szCs w:val="24"/>
-              </w:rPr>
-            </w:pPr>
-            <w:r>
-              <w:rPr>
-                <w:rFonts w:ascii="TH SarabunPSK" w:eastAsia="Calibri" w:hAnsi="TH SarabunPSK" w:cs="TH SarabunPSK"/>
-                <w:color w:val="000000"/>
-                <w:sz w:val="24"/>
-                <w:szCs w:val="24"/>
-              </w:rPr>
-              <w:sym w:font="Wingdings 2" w:char="F0A3"/>
-            </w:r>
-            <w:r>
-              <w:rPr>
-                <w:rFonts w:ascii="TH SarabunPSK" w:eastAsia="Calibri" w:hAnsi="TH SarabunPSK" w:cs="TH SarabunPSK"/>
-                <w:color w:val="000000"/>
-                <w:sz w:val="24"/>
-                <w:szCs w:val="24"/>
-                <w:cs/>
-              </w:rPr>
-              <w:t xml:space="preserve"> </w:t>
-            </w:r>
-            <w:r>
-              <w:rPr>
-                <w:rFonts w:ascii="TH SarabunPSK" w:eastAsia="Calibri" w:hAnsi="TH SarabunPSK" w:cs="TH SarabunPSK" w:hint="cs"/>
-                <w:color w:val="000000"/>
-                <w:sz w:val="24"/>
-                <w:szCs w:val="24"/>
-                <w:cs/>
-              </w:rPr>
-              <w:t>กระทรวงดิจิทัลฯ</w:t>
-            </w:r>
-          </w:p>
-          <w:p>
-            <w:pPr>
-              <w:spacing w:after="0" w:line="240" w:lineRule="auto"/>
-              <w:rPr>
-                <w:rFonts w:ascii="TH SarabunPSK" w:eastAsia="Calibri" w:hAnsi="TH SarabunPSK" w:cs="TH SarabunPSK"/>
-                <w:color w:val="000000"/>
-                <w:sz w:val="24"/>
-                <w:szCs w:val="24"/>
-              </w:rPr>
-            </w:pPr>
-            <w:r>
-              <w:rPr>
-                <w:rFonts w:ascii="TH SarabunPSK" w:eastAsia="Calibri" w:hAnsi="TH SarabunPSK" w:cs="TH SarabunPSK" w:hint="cs"/>
-                <w:color w:val="000000"/>
-                <w:sz w:val="24"/>
-                <w:szCs w:val="24"/>
-                <w:cs/>
-              </w:rPr>
-              <w:t>ฉบับเดือน</w:t>
-            </w:r>
-            <w:r>
-              <w:rPr>
-                <w:rFonts w:ascii="TH SarabunPSK" w:eastAsia="Calibri" w:hAnsi="TH SarabunPSK" w:cs="TH SarabunPSK" w:hint="cs"/>
-                <w:color w:val="000000"/>
-                <w:sz w:val="24"/>
-                <w:szCs w:val="24"/>
-                <w:cs/>
-              </w:rPr>
-              <w:t>..............</w:t>
-            </w:r>
-            <w:r>
-              <w:rPr>
-                <w:rFonts w:ascii="TH SarabunPSK" w:eastAsia="Calibri" w:hAnsi="TH SarabunPSK" w:cs="TH SarabunPSK" w:hint="cs"/>
-                <w:color w:val="000000"/>
-                <w:sz w:val="24"/>
-                <w:szCs w:val="24"/>
-                <w:cs/>
-              </w:rPr>
-              <w:t>...พ.ศ.</w:t>
-            </w:r>
-            <w:r>
-              <w:rPr>
-                <w:rFonts w:ascii="TH SarabunPSK" w:eastAsia="Calibri" w:hAnsi="TH SarabunPSK" w:cs="TH SarabunPSK" w:hint="cs"/>
-                <w:color w:val="000000"/>
-                <w:sz w:val="24"/>
-                <w:szCs w:val="24"/>
-                <w:cs/>
-              </w:rPr>
-              <w:t>.....</w:t>
-            </w:r>
-            <w:r>
-              <w:rPr>
-                <w:rFonts w:ascii="TH SarabunPSK" w:eastAsia="Calibri" w:hAnsi="TH SarabunPSK" w:cs="TH SarabunPSK" w:hint="cs"/>
-                <w:color w:val="000000"/>
-                <w:sz w:val="24"/>
-                <w:szCs w:val="24"/>
-                <w:cs/>
-              </w:rPr>
-              <w:t>..</w:t>
-            </w:r>
-          </w:p>
-          <w:p>
-            <w:pPr>
-              <w:spacing w:after="0" w:line="240" w:lineRule="auto"/>
-              <w:rPr>
-                <w:rFonts w:ascii="TH SarabunPSK" w:eastAsia="Calibri" w:hAnsi="TH SarabunPSK" w:cs="TH SarabunPSK"/>
-                <w:color w:val="000000"/>
-                <w:sz w:val="24"/>
-                <w:szCs w:val="24"/>
-                <w:cs/>
-              </w:rPr>
-            </w:pPr>
-            <w:r>
-              <w:rPr>
-                <w:rFonts w:ascii="TH SarabunPSK" w:eastAsia="Calibri" w:hAnsi="TH SarabunPSK" w:cs="TH SarabunPSK" w:hint="cs"/>
-                <w:color w:val="000000"/>
-                <w:sz w:val="24"/>
-                <w:szCs w:val="24"/>
-                <w:cs/>
-              </w:rPr>
-              <w:t>รายการที่</w:t>
-            </w:r>
-            <w:r>
-              <w:rPr>
-                <w:rFonts w:ascii="TH SarabunPSK" w:eastAsia="Calibri" w:hAnsi="TH SarabunPSK" w:cs="TH SarabunPSK" w:hint="cs"/>
-                <w:color w:val="000000"/>
-                <w:sz w:val="24"/>
-                <w:szCs w:val="24"/>
-                <w:cs/>
-              </w:rPr>
-              <w:t>......</w:t>
-            </w:r>
-            <w:r>
-              <w:rPr>
-                <w:rFonts w:ascii="TH SarabunPSK" w:eastAsia="Calibri" w:hAnsi="TH SarabunPSK" w:cs="TH SarabunPSK" w:hint="cs"/>
-                <w:color w:val="000000"/>
-                <w:sz w:val="24"/>
-                <w:szCs w:val="24"/>
-                <w:cs/>
-              </w:rPr>
-              <w:t>..........................</w:t>
-            </w:r>
-          </w:p>
-          <w:p>
-            <w:pPr>
-              <w:spacing w:after="0" w:line="240" w:lineRule="auto"/>
-              <w:rPr>
-                <w:rFonts w:ascii="TH SarabunPSK" w:eastAsia="Calibri" w:hAnsi="TH SarabunPSK" w:cs="TH SarabunPSK"/>
-                <w:color w:val="000000"/>
-                <w:sz w:val="24"/>
-                <w:szCs w:val="24"/>
-              </w:rPr>
-            </w:pPr>
-            <w:r>
-              <w:rPr>
-                <w:rFonts w:ascii="TH SarabunPSK" w:eastAsia="Calibri" w:hAnsi="TH SarabunPSK" w:cs="TH SarabunPSK"/>
-                <w:color w:val="000000"/>
-                <w:sz w:val="24"/>
-                <w:szCs w:val="24"/>
-              </w:rPr>
-              <w:sym w:font="Wingdings 2" w:char="F0A3"/>
-            </w:r>
-            <w:r>
-              <w:rPr>
-                <w:rFonts w:ascii="TH SarabunPSK" w:eastAsia="Calibri" w:hAnsi="TH SarabunPSK" w:cs="TH SarabunPSK"/>
-                <w:color w:val="000000"/>
-                <w:sz w:val="24"/>
-                <w:szCs w:val="24"/>
-              </w:rPr>
-              <w:t xml:space="preserve"> </w:t>
-            </w:r>
+              </w:rPr>
+              <w:t>{</w:t>
+            </w:r>
+            <w:proofErr w:type="spellStart"/>
             <w:r>
               <w:rPr>
                 <w:rFonts w:ascii="TH SarabunPSK" w:hAnsi="TH SarabunPSK" w:cs="TH SarabunPSK"/>
@@ -13751,20 +13485,19 @@
                 <w:kern w:val="32"/>
                 <w:sz w:val="24"/>
                 <w:szCs w:val="24"/>
-                <w:cs/>
-              </w:rPr>
-              <w:t>สืบราคา</w:t>
-            </w:r>
-            <w:r>
-              <w:rPr>
-                <w:rFonts w:ascii="TH SarabunPSK" w:hAnsi="TH SarabunPSK" w:cs="TH SarabunPSK" w:hint="cs"/>
+              </w:rPr>
+              <w:t>marketCount</w:t>
+            </w:r>
+            <w:proofErr w:type="spellEnd"/>
+            <w:r>
+              <w:rPr>
+                <w:rFonts w:ascii="TH SarabunPSK" w:hAnsi="TH SarabunPSK" w:cs="TH SarabunPSK"/>
                 <w:color w:val="000000"/>
                 <w:kern w:val="32"/>
                 <w:sz w:val="24"/>
                 <w:szCs w:val="24"/>
-                <w:cs/>
-              </w:rPr>
-              <w:t>ฯ</w:t>
+              </w:rPr>
+              <w:t>}</w:t>
             </w:r>
             <w:r>
               <w:rPr>
@@ -13775,7 +13508,7 @@
                 <w:szCs w:val="24"/>
                 <w:cs/>
               </w:rPr>
-              <w:t xml:space="preserve"> จำนวน</w:t>
+              <w:t xml:space="preserve"> </w:t>
             </w:r>
             <w:r>
               <w:rPr>
@@ -13785,58 +13518,57 @@
                 <w:szCs w:val="24"/>
                 <w:cs/>
               </w:rPr>
-              <w:t>.....</w:t>
-            </w:r>
-            <w:r>
-              <w:rPr>
-                <w:rFonts w:ascii="TH SarabunPSK" w:eastAsia="Calibri" w:hAnsi="TH SarabunPSK" w:cs="TH SarabunPSK" w:hint="cs"/>
+              <w:t>ราย</w:t>
+            </w:r>
+          </w:p>
+          <w:p>
+            <w:pPr>
+              <w:spacing w:after="0" w:line="240" w:lineRule="auto"/>
+              <w:rPr>
+                <w:rFonts w:ascii="TH SarabunPSK" w:eastAsia="Calibri" w:hAnsi="TH SarabunPSK" w:cs="TH SarabunPSK"/>
                 <w:color w:val="000000"/>
                 <w:sz w:val="24"/>
                 <w:szCs w:val="24"/>
-                <w:cs/>
-              </w:rPr>
-              <w:t>ราย</w:t>
-            </w:r>
-          </w:p>
-          <w:p>
-            <w:pPr>
-              <w:spacing w:after="0" w:line="240" w:lineRule="auto"/>
-              <w:rPr>
-                <w:rFonts w:ascii="TH SarabunPSK" w:eastAsia="Calibri" w:hAnsi="TH SarabunPSK" w:cs="TH SarabunPSK"/>
+              </w:rPr>
+            </w:pPr>
+            <w:r>
+              <w:rPr>
+                <w:rFonts w:ascii="TH SarabunPSK" w:eastAsia="Calibri" w:hAnsi="TH SarabunPSK" w:cs="TH SarabunPSK" w:hint="cs"/>
                 <w:color w:val="000000"/>
                 <w:sz w:val="24"/>
                 <w:szCs w:val="24"/>
-              </w:rPr>
-            </w:pPr>
-            <w:r>
-              <w:rPr>
-                <w:rFonts w:ascii="TH SarabunPSK" w:eastAsia="Calibri" w:hAnsi="TH SarabunPSK" w:cs="TH SarabunPSK" w:hint="cs"/>
+                <w:cs/>
+              </w:rPr>
+              <w:t>ใช้ของบริษัท</w:t>
+            </w:r>
+            <w:r>
+              <w:rPr>
+                <w:rFonts w:ascii="TH SarabunPSK" w:eastAsia="Calibri" w:hAnsi="TH SarabunPSK" w:cs="TH SarabunPSK"/>
                 <w:color w:val="000000"/>
                 <w:sz w:val="24"/>
                 <w:szCs w:val="24"/>
-                <w:cs/>
-              </w:rPr>
-              <w:t>ใช้ของบริษัท</w:t>
-            </w:r>
-            <w:r>
-              <w:rPr>
-                <w:rFonts w:ascii="TH SarabunPSK" w:eastAsia="Calibri" w:hAnsi="TH SarabunPSK" w:cs="TH SarabunPSK" w:hint="cs"/>
+              </w:rPr>
+              <w:t xml:space="preserve"> {</w:t>
+            </w:r>
+            <w:proofErr w:type="spellStart"/>
+            <w:r>
+              <w:rPr>
+                <w:rFonts w:ascii="TH SarabunPSK" w:eastAsia="Calibri" w:hAnsi="TH SarabunPSK" w:cs="TH SarabunPSK"/>
                 <w:color w:val="000000"/>
                 <w:sz w:val="24"/>
                 <w:szCs w:val="24"/>
-                <w:cs/>
-              </w:rPr>
-              <w:t>.</w:t>
-            </w:r>
-            <w:r>
-              <w:rPr>
-                <w:rFonts w:ascii="TH SarabunPSK" w:eastAsia="Calibri" w:hAnsi="TH SarabunPSK" w:cs="TH SarabunPSK" w:hint="cs"/>
+              </w:rPr>
+              <w:t>marketCompany</w:t>
+            </w:r>
+            <w:proofErr w:type="spellEnd"/>
+            <w:r>
+              <w:rPr>
+                <w:rFonts w:ascii="TH SarabunPSK" w:eastAsia="Calibri" w:hAnsi="TH SarabunPSK" w:cs="TH SarabunPSK"/>
                 <w:color w:val="000000"/>
                 <w:sz w:val="24"/>
                 <w:szCs w:val="24"/>
-                <w:cs/>
-              </w:rPr>
-              <w:t>..........................</w:t>
+              </w:rPr>
+              <w:t xml:space="preserve">} </w:t>
             </w:r>
           </w:p>
           <w:p>
@@ -13851,53 +13583,54 @@
             </w:pPr>
             <w:r>
               <w:rPr>
-                <w:rFonts w:ascii="TH SarabunPSK" w:eastAsia="Calibri" w:hAnsi="TH SarabunPSK" w:cs="TH SarabunPSK" w:hint="cs"/>
+                <w:rFonts w:ascii="TH SarabunPSK" w:eastAsia="Calibri" w:hAnsi="TH SarabunPSK" w:cs="TH SarabunPSK"/>
                 <w:color w:val="000000"/>
                 <w:sz w:val="24"/>
                 <w:szCs w:val="24"/>
-                <w:cs/>
-              </w:rPr>
-              <w:t>..</w:t>
-            </w:r>
-            <w:r>
-              <w:rPr>
-                <w:rFonts w:ascii="TH SarabunPSK" w:eastAsia="Calibri" w:hAnsi="TH SarabunPSK" w:cs="TH SarabunPSK" w:hint="cs"/>
+              </w:rPr>
+              <w:t>{</w:t>
+            </w:r>
+            <w:proofErr w:type="spellStart"/>
+            <w:r>
+              <w:rPr>
+                <w:rFonts w:ascii="TH SarabunPSK" w:eastAsia="Calibri" w:hAnsi="TH SarabunPSK" w:cs="TH SarabunPSK"/>
                 <w:color w:val="000000"/>
                 <w:sz w:val="24"/>
                 <w:szCs w:val="24"/>
-                <w:cs/>
-              </w:rPr>
-              <w:t>.............................................</w:t>
-            </w:r>
-          </w:p>
-          <w:p>
-            <w:pPr>
-              <w:spacing w:after="0" w:line="240" w:lineRule="auto"/>
+              </w:rPr>
+              <w:t>chkPrev</w:t>
+            </w:r>
+            <w:proofErr w:type="spellEnd"/>
+            <w:r>
               <w:rPr>
                 <w:rFonts w:ascii="TH SarabunPSK" w:eastAsia="Calibri" w:hAnsi="TH SarabunPSK" w:cs="TH SarabunPSK"/>
                 <w:color w:val="000000"/>
                 <w:sz w:val="24"/>
                 <w:szCs w:val="24"/>
               </w:rPr>
-            </w:pPr>
-            <w:r>
-              <w:rPr>
-                <w:rFonts w:ascii="TH SarabunPSK" w:eastAsia="Calibri" w:hAnsi="TH SarabunPSK" w:cs="TH SarabunPSK"/>
+              <w:t xml:space="preserve">} </w:t>
+            </w:r>
+            <w:r>
+              <w:rPr>
+                <w:rFonts w:ascii="TH SarabunPSK" w:eastAsia="Calibri" w:hAnsi="TH SarabunPSK" w:cs="TH SarabunPSK" w:hint="cs"/>
                 <w:color w:val="000000"/>
                 <w:sz w:val="24"/>
                 <w:szCs w:val="24"/>
-              </w:rPr>
-              <w:sym w:font="Wingdings 2" w:char="F0A3"/>
-            </w:r>
-            <w:r>
+                <w:cs/>
+              </w:rPr>
+              <w:t>ราคาที่เคยจัดหาฯ</w:t>
+            </w:r>
+          </w:p>
+          <w:p>
+            <w:pPr>
+              <w:spacing w:after="0" w:line="240" w:lineRule="auto"/>
               <w:rPr>
                 <w:rFonts w:ascii="TH SarabunPSK" w:eastAsia="Calibri" w:hAnsi="TH SarabunPSK" w:cs="TH SarabunPSK"/>
                 <w:color w:val="000000"/>
                 <w:sz w:val="24"/>
                 <w:szCs w:val="24"/>
               </w:rPr>
-              <w:t xml:space="preserve"> </w:t>
-            </w:r>
+            </w:pPr>
             <w:r>
               <w:rPr>
                 <w:rFonts w:ascii="TH SarabunPSK" w:eastAsia="Calibri" w:hAnsi="TH SarabunPSK" w:cs="TH SarabunPSK" w:hint="cs"/>
@@ -13906,128 +13639,125 @@
                 <w:szCs w:val="24"/>
                 <w:cs/>
               </w:rPr>
-              <w:t>ราคาที่เคยจัดหาฯ</w:t>
-            </w:r>
-          </w:p>
-          <w:p>
-            <w:pPr>
-              <w:spacing w:after="0" w:line="240" w:lineRule="auto"/>
+              <w:t xml:space="preserve">โครงการ </w:t>
+            </w:r>
+            <w:r>
               <w:rPr>
                 <w:rFonts w:ascii="TH SarabunPSK" w:eastAsia="Calibri" w:hAnsi="TH SarabunPSK" w:cs="TH SarabunPSK"/>
                 <w:color w:val="000000"/>
                 <w:sz w:val="24"/>
                 <w:szCs w:val="24"/>
               </w:rPr>
-            </w:pPr>
-            <w:r>
-              <w:rPr>
-                <w:rFonts w:ascii="TH SarabunPSK" w:eastAsia="Calibri" w:hAnsi="TH SarabunPSK" w:cs="TH SarabunPSK" w:hint="cs"/>
+              <w:t>{</w:t>
+            </w:r>
+            <w:proofErr w:type="spellStart"/>
+            <w:r>
+              <w:rPr>
+                <w:rFonts w:ascii="TH SarabunPSK" w:eastAsia="Calibri" w:hAnsi="TH SarabunPSK" w:cs="TH SarabunPSK"/>
                 <w:color w:val="000000"/>
                 <w:sz w:val="24"/>
                 <w:szCs w:val="24"/>
-                <w:cs/>
-              </w:rPr>
-              <w:t>โครงการ</w:t>
-            </w:r>
-            <w:r>
-              <w:rPr>
-                <w:rFonts w:ascii="TH SarabunPSK" w:eastAsia="Calibri" w:hAnsi="TH SarabunPSK" w:cs="TH SarabunPSK" w:hint="cs"/>
+              </w:rPr>
+              <w:t>prevProject</w:t>
+            </w:r>
+            <w:proofErr w:type="spellEnd"/>
+            <w:r>
+              <w:rPr>
+                <w:rFonts w:ascii="TH SarabunPSK" w:eastAsia="Calibri" w:hAnsi="TH SarabunPSK" w:cs="TH SarabunPSK"/>
                 <w:color w:val="000000"/>
                 <w:sz w:val="24"/>
                 <w:szCs w:val="24"/>
-                <w:cs/>
-              </w:rPr>
-              <w:t>..</w:t>
-            </w:r>
-            <w:r>
-              <w:rPr>
-                <w:rFonts w:ascii="TH SarabunPSK" w:eastAsia="Calibri" w:hAnsi="TH SarabunPSK" w:cs="TH SarabunPSK" w:hint="cs"/>
+              </w:rPr>
+              <w:t>}</w:t>
+            </w:r>
+          </w:p>
+          <w:p>
+            <w:pPr>
+              <w:spacing w:after="0" w:line="240" w:lineRule="auto"/>
+              <w:rPr>
+                <w:rFonts w:ascii="TH SarabunPSK" w:eastAsia="Calibri" w:hAnsi="TH SarabunPSK" w:cs="TH SarabunPSK"/>
                 <w:color w:val="000000"/>
                 <w:sz w:val="24"/>
                 <w:szCs w:val="24"/>
-                <w:cs/>
-              </w:rPr>
-              <w:t>.................</w:t>
-            </w:r>
-            <w:r>
-              <w:rPr>
-                <w:rFonts w:ascii="TH SarabunPSK" w:eastAsia="Calibri" w:hAnsi="TH SarabunPSK" w:cs="TH SarabunPSK"/>
+              </w:rPr>
+            </w:pPr>
+            <w:r>
+              <w:rPr>
+                <w:rFonts w:ascii="TH SarabunPSK" w:eastAsia="Calibri" w:hAnsi="TH SarabunPSK" w:cs="TH SarabunPSK" w:hint="cs"/>
                 <w:color w:val="000000"/>
                 <w:sz w:val="24"/>
                 <w:szCs w:val="24"/>
-              </w:rPr>
-              <w:t>.</w:t>
-            </w:r>
-            <w:r>
-              <w:rPr>
-                <w:rFonts w:ascii="TH SarabunPSK" w:eastAsia="Calibri" w:hAnsi="TH SarabunPSK" w:cs="TH SarabunPSK" w:hint="cs"/>
+                <w:cs/>
+              </w:rPr>
+              <w:t xml:space="preserve">พ.ศ. </w:t>
+            </w:r>
+            <w:r>
+              <w:rPr>
+                <w:rFonts w:ascii="TH SarabunPSK" w:eastAsia="Calibri" w:hAnsi="TH SarabunPSK" w:cs="TH SarabunPSK"/>
                 <w:color w:val="000000"/>
                 <w:sz w:val="24"/>
                 <w:szCs w:val="24"/>
-                <w:cs/>
-              </w:rPr>
-              <w:t>..............</w:t>
-            </w:r>
-          </w:p>
-          <w:p>
-            <w:pPr>
-              <w:spacing w:after="0" w:line="240" w:lineRule="auto"/>
+              </w:rPr>
+              <w:t>{</w:t>
+            </w:r>
+            <w:proofErr w:type="spellStart"/>
+            <w:r>
               <w:rPr>
                 <w:rFonts w:ascii="TH SarabunPSK" w:eastAsia="Calibri" w:hAnsi="TH SarabunPSK" w:cs="TH SarabunPSK"/>
                 <w:color w:val="000000"/>
                 <w:sz w:val="24"/>
                 <w:szCs w:val="24"/>
               </w:rPr>
-            </w:pPr>
-            <w:r>
-              <w:rPr>
-                <w:rFonts w:ascii="TH SarabunPSK" w:eastAsia="Calibri" w:hAnsi="TH SarabunPSK" w:cs="TH SarabunPSK" w:hint="cs"/>
+              <w:t>prevYear</w:t>
+            </w:r>
+            <w:proofErr w:type="spellEnd"/>
+            <w:r>
+              <w:rPr>
+                <w:rFonts w:ascii="TH SarabunPSK" w:eastAsia="Calibri" w:hAnsi="TH SarabunPSK" w:cs="TH SarabunPSK"/>
                 <w:color w:val="000000"/>
                 <w:sz w:val="24"/>
                 <w:szCs w:val="24"/>
-                <w:cs/>
-              </w:rPr>
-              <w:t>.</w:t>
-            </w:r>
-            <w:r>
-              <w:rPr>
-                <w:rFonts w:ascii="TH SarabunPSK" w:eastAsia="Calibri" w:hAnsi="TH SarabunPSK" w:cs="TH SarabunPSK" w:hint="cs"/>
+              </w:rPr>
+              <w:t>}</w:t>
+            </w:r>
+          </w:p>
+          <w:p>
+            <w:pPr>
+              <w:spacing w:after="0" w:line="240" w:lineRule="auto"/>
+              <w:rPr>
+                <w:rFonts w:ascii="TH SarabunIT๙" w:eastAsia="Calibri" w:hAnsi="TH SarabunIT๙" w:cs="TH SarabunIT๙"/>
+                <w:color w:val="000000"/>
+                <w:sz w:val="28"/>
+              </w:rPr>
+            </w:pPr>
+            <w:r>
+              <w:rPr>
+                <w:rFonts w:ascii="TH SarabunPSK" w:eastAsia="Calibri" w:hAnsi="TH SarabunPSK" w:cs="TH SarabunPSK"/>
                 <w:color w:val="000000"/>
                 <w:sz w:val="24"/>
                 <w:szCs w:val="24"/>
-                <w:cs/>
-              </w:rPr>
-              <w:t>..............................พ.ศ...........</w:t>
-            </w:r>
-          </w:p>
-          <w:p>
-            <w:pPr>
-              <w:spacing w:after="0" w:line="240" w:lineRule="auto"/>
-              <w:jc w:val="center"/>
-              <w:rPr>
-                <w:rFonts w:ascii="TH SarabunIT๙" w:eastAsia="Calibri" w:hAnsi="TH SarabunIT๙" w:cs="TH SarabunIT๙"/>
-                <w:color w:val="000000"/>
-                <w:sz w:val="28"/>
-              </w:rPr>
-            </w:pPr>
-            <w:r>
-              <w:rPr>
-                <w:rFonts w:ascii="TH SarabunPSK" w:eastAsia="Calibri" w:hAnsi="TH SarabunPSK" w:cs="TH SarabunPSK" w:hint="cs"/>
+              </w:rPr>
+              <w:t>{</w:t>
+            </w:r>
+            <w:proofErr w:type="spellStart"/>
+            <w:r>
+              <w:rPr>
+                <w:rFonts w:ascii="TH SarabunPSK" w:eastAsia="Calibri" w:hAnsi="TH SarabunPSK" w:cs="TH SarabunPSK"/>
                 <w:color w:val="000000"/>
                 <w:sz w:val="24"/>
                 <w:szCs w:val="24"/>
               </w:rPr>
-              <w:sym w:font="Wingdings 2" w:char="F0A3"/>
-            </w:r>
-            <w:r>
-              <w:rPr>
-                <w:rFonts w:ascii="TH SarabunPSK" w:eastAsia="Calibri" w:hAnsi="TH SarabunPSK" w:cs="TH SarabunPSK" w:hint="cs"/>
+              <w:t>chkOther</w:t>
+            </w:r>
+            <w:proofErr w:type="spellEnd"/>
+            <w:r>
+              <w:rPr>
+                <w:rFonts w:ascii="TH SarabunPSK" w:eastAsia="Calibri" w:hAnsi="TH SarabunPSK" w:cs="TH SarabunPSK"/>
                 <w:color w:val="000000"/>
                 <w:sz w:val="24"/>
                 <w:szCs w:val="24"/>
-                <w:cs/>
-              </w:rPr>
-              <w:t xml:space="preserve"> อื่นๆ......................</w:t>
+              </w:rPr>
+              <w:t>}</w:t>
             </w:r>
             <w:r>
               <w:rPr>
@@ -14037,15 +13767,81 @@
                 <w:szCs w:val="24"/>
                 <w:cs/>
               </w:rPr>
-              <w:t>...........</w:t>
+              <w:t xml:space="preserve"> อื่นๆ </w:t>
+            </w:r>
+            <w:r>
+              <w:rPr>
+                <w:rFonts w:ascii="TH SarabunPSK" w:eastAsia="Calibri" w:hAnsi="TH SarabunPSK" w:cs="TH SarabunPSK"/>
+                <w:color w:val="000000"/>
+                <w:sz w:val="24"/>
+                <w:szCs w:val="24"/>
+              </w:rPr>
+              <w:t>{</w:t>
+            </w:r>
+            <w:proofErr w:type="spellStart"/>
+            <w:r>
+              <w:rPr>
+                <w:rFonts w:ascii="TH SarabunPSK" w:eastAsia="Calibri" w:hAnsi="TH SarabunPSK" w:cs="TH SarabunPSK"/>
+                <w:color w:val="000000"/>
+                <w:sz w:val="24"/>
+                <w:szCs w:val="24"/>
+              </w:rPr>
+              <w:t>otherDetail</w:t>
+            </w:r>
+            <w:proofErr w:type="spellEnd"/>
+            <w:r>
+              <w:rPr>
+                <w:rFonts w:ascii="TH SarabunPSK" w:eastAsia="Calibri" w:hAnsi="TH SarabunPSK" w:cs="TH SarabunPSK"/>
+                <w:color w:val="000000"/>
+                <w:sz w:val="24"/>
+                <w:szCs w:val="24"/>
+              </w:rPr>
+              <w:t>}</w:t>
+            </w:r>
+            <w:r>
+              <w:rPr>
+                <w:rFonts w:ascii="TH SarabunIT๙" w:eastAsia="Calibri" w:hAnsi="TH SarabunIT๙" w:cs="TH SarabunIT๙"/>
+                <w:color w:val="000000"/>
+                <w:sz w:val="28"/>
+              </w:rPr>
+              <w:t xml:space="preserve"> {/</w:t>
+            </w:r>
+            <w:proofErr w:type="spellStart"/>
+            <w:r>
+              <w:rPr>
+                <w:rFonts w:ascii="TH SarabunIT๙" w:eastAsia="Calibri" w:hAnsi="TH SarabunIT๙" w:cs="TH SarabunIT๙"/>
+                <w:color w:val="000000"/>
+                <w:sz w:val="28"/>
+              </w:rPr>
+              <w:t>software</w:t>
+            </w:r>
+            <w:r>
+              <w:rPr>
+                <w:rFonts w:ascii="TH SarabunIT๙" w:eastAsia="Calibri" w:hAnsi="TH SarabunIT๙" w:cs="TH SarabunIT๙"/>
+                <w:color w:val="000000"/>
+                <w:sz w:val="28"/>
+              </w:rPr>
+              <w:t>Costs</w:t>
+            </w:r>
+            <w:proofErr w:type="spellEnd"/>
+            <w:r>
+              <w:rPr>
+                <w:rFonts w:ascii="TH SarabunIT๙" w:eastAsia="Calibri" w:hAnsi="TH SarabunIT๙" w:cs="TH SarabunIT๙"/>
+                <w:color w:val="000000"/>
+                <w:sz w:val="28"/>
+              </w:rPr>
+              <w:t>}</w:t>
             </w:r>
           </w:p>
         </w:tc>
       </w:tr>
       <w:tr>
-        <w:tc>
-          <w:tcPr>
-            <w:tcW w:w="6295" w:type="dxa"/>
+        <w:trPr>
+          <w:trHeight w:val="174"/>
+        </w:trPr>
+        <w:tc>
+          <w:tcPr>
+            <w:tcW w:w="6609" w:type="dxa"/>
             <w:gridSpan w:val="4"/>
           </w:tcPr>
           <w:p>
@@ -14075,28 +13871,28 @@
         </w:tc>
         <w:tc>
           <w:tcPr>
-            <w:tcW w:w="1440" w:type="dxa"/>
-          </w:tcPr>
-          <w:p>
-            <w:pPr>
-              <w:spacing w:after="0" w:line="240" w:lineRule="auto"/>
-              <w:jc w:val="center"/>
-              <w:rPr>
-                <w:rFonts w:ascii="TH SarabunIT๙" w:eastAsia="Calibri" w:hAnsi="TH SarabunIT๙" w:cs="TH SarabunIT๙"/>
-                <w:color w:val="000000"/>
-                <w:sz w:val="28"/>
-              </w:rPr>
-            </w:pPr>
-          </w:p>
-        </w:tc>
-        <w:tc>
-          <w:tcPr>
-            <w:tcW w:w="2120" w:type="dxa"/>
-          </w:tcPr>
-          <w:p>
-            <w:pPr>
-              <w:spacing w:after="0" w:line="240" w:lineRule="auto"/>
-              <w:jc w:val="center"/>
+            <w:tcW w:w="1200" w:type="dxa"/>
+          </w:tcPr>
+          <w:p>
+            <w:pPr>
+              <w:spacing w:after="0" w:line="240" w:lineRule="auto"/>
+              <w:jc w:val="right"/>
+              <w:rPr>
+                <w:rFonts w:ascii="TH SarabunIT๙" w:eastAsia="Calibri" w:hAnsi="TH SarabunIT๙" w:cs="TH SarabunIT๙"/>
+                <w:color w:val="000000"/>
+                <w:sz w:val="28"/>
+              </w:rPr>
+            </w:pPr>
+          </w:p>
+        </w:tc>
+        <w:tc>
+          <w:tcPr>
+            <w:tcW w:w="2080" w:type="dxa"/>
+          </w:tcPr>
+          <w:p>
+            <w:pPr>
+              <w:spacing w:after="0" w:line="240" w:lineRule="auto"/>
+              <w:jc w:val="right"/>
               <w:rPr>
                 <w:rFonts w:ascii="TH SarabunIT๙" w:eastAsia="Calibri" w:hAnsi="TH SarabunIT๙" w:cs="TH SarabunIT๙"/>
                 <w:color w:val="000000"/>
@@ -14107,6 +13903,244 @@
         </w:tc>
       </w:tr>
     </w:tbl>
+    <w:p>
+      <w:pPr>
+        <w:pStyle w:val="ListParagraph"/>
+        <w:widowControl w:val="0"/>
+        <w:tabs>
+          <w:tab w:val="left" w:pos="164"/>
+        </w:tabs>
+        <w:suppressAutoHyphens/>
+        <w:spacing w:before="240" w:after="120" w:line="240" w:lineRule="auto"/>
+        <w:ind w:hanging="720"/>
+        <w:contextualSpacing w:val="0"/>
+        <w:jc w:val="center"/>
+        <w:rPr>
+          <w:rFonts w:ascii="TH SarabunIT๙" w:hAnsi="TH SarabunIT๙" w:cs="TH SarabunIT๙"/>
+          <w:b/>
+          <w:bCs/>
+          <w:color w:val="000000"/>
+          <w:sz w:val="32"/>
+          <w:szCs w:val="32"/>
+        </w:rPr>
+      </w:pPr>
+      <w:r>
+        <w:rPr>
+          <w:rFonts w:ascii="TH SarabunIT๙" w:hAnsi="TH SarabunIT๙" w:cs="TH SarabunIT๙"/>
+          <w:b/>
+          <w:bCs/>
+          <w:color w:val="000000"/>
+          <w:sz w:val="32"/>
+          <w:szCs w:val="32"/>
+        </w:rPr>
+        <w:t>{/</w:t>
+      </w:r>
+      <w:proofErr w:type="spellStart"/>
+      <w:r>
+        <w:rPr>
+          <w:rFonts w:ascii="TH SarabunIT๙" w:hAnsi="TH SarabunIT๙" w:cs="TH SarabunIT๙"/>
+          <w:b/>
+          <w:bCs/>
+          <w:color w:val="000000"/>
+          <w:sz w:val="32"/>
+          <w:szCs w:val="32"/>
+        </w:rPr>
+        <w:t>has</w:t>
+      </w:r>
+      <w:r>
+        <w:rPr>
+          <w:rFonts w:ascii="TH SarabunIT๙" w:hAnsi="TH SarabunIT๙" w:cs="TH SarabunIT๙"/>
+          <w:b/>
+          <w:bCs/>
+          <w:color w:val="000000"/>
+          <w:sz w:val="32"/>
+          <w:szCs w:val="32"/>
+        </w:rPr>
+        <w:t>Soft</w:t>
+      </w:r>
+      <w:r>
+        <w:rPr>
+          <w:rFonts w:ascii="TH SarabunIT๙" w:hAnsi="TH SarabunIT๙" w:cs="TH SarabunIT๙"/>
+          <w:b/>
+          <w:bCs/>
+          <w:color w:val="000000"/>
+          <w:sz w:val="32"/>
+          <w:szCs w:val="32"/>
+        </w:rPr>
+        <w:t>wareCosts</w:t>
+      </w:r>
+      <w:proofErr w:type="spellEnd"/>
+      <w:r>
+        <w:rPr>
+          <w:rFonts w:ascii="TH SarabunIT๙" w:hAnsi="TH SarabunIT๙" w:cs="TH SarabunIT๙"/>
+          <w:b/>
+          <w:bCs/>
+          <w:color w:val="000000"/>
+          <w:sz w:val="32"/>
+          <w:szCs w:val="32"/>
+        </w:rPr>
+        <w:t>}</w:t>
+      </w:r>
+    </w:p>
+    <w:p>
+      <w:pPr>
+        <w:pStyle w:val="ListParagraph"/>
+        <w:widowControl w:val="0"/>
+        <w:tabs>
+          <w:tab w:val="left" w:pos="164"/>
+        </w:tabs>
+        <w:suppressAutoHyphens/>
+        <w:spacing w:before="240" w:after="120" w:line="240" w:lineRule="auto"/>
+        <w:ind w:hanging="720"/>
+        <w:contextualSpacing w:val="0"/>
+        <w:jc w:val="center"/>
+        <w:rPr>
+          <w:rFonts w:ascii="TH SarabunIT๙" w:hAnsi="TH SarabunIT๙" w:cs="TH SarabunIT๙"/>
+          <w:b/>
+          <w:bCs/>
+          <w:color w:val="000000"/>
+          <w:sz w:val="32"/>
+          <w:szCs w:val="32"/>
+        </w:rPr>
+      </w:pPr>
+      <w:r>
+        <w:rPr>
+          <w:rFonts w:ascii="TH SarabunIT๙" w:hAnsi="TH SarabunIT๙" w:cs="TH SarabunIT๙"/>
+          <w:b/>
+          <w:bCs/>
+          <w:color w:val="000000"/>
+          <w:sz w:val="32"/>
+          <w:szCs w:val="32"/>
+        </w:rPr>
+        <w:t>{^</w:t>
+      </w:r>
+      <w:proofErr w:type="spellStart"/>
+      <w:r>
+        <w:rPr>
+          <w:rFonts w:ascii="TH SarabunIT๙" w:hAnsi="TH SarabunIT๙" w:cs="TH SarabunIT๙"/>
+          <w:b/>
+          <w:bCs/>
+          <w:color w:val="000000"/>
+          <w:sz w:val="32"/>
+          <w:szCs w:val="32"/>
+        </w:rPr>
+        <w:t>has</w:t>
+      </w:r>
+      <w:r>
+        <w:rPr>
+          <w:rFonts w:ascii="TH SarabunIT๙" w:hAnsi="TH SarabunIT๙" w:cs="TH SarabunIT๙"/>
+          <w:b/>
+          <w:bCs/>
+          <w:color w:val="000000"/>
+          <w:sz w:val="32"/>
+          <w:szCs w:val="32"/>
+        </w:rPr>
+        <w:t>Soft</w:t>
+      </w:r>
+      <w:r>
+        <w:rPr>
+          <w:rFonts w:ascii="TH SarabunIT๙" w:hAnsi="TH SarabunIT๙" w:cs="TH SarabunIT๙"/>
+          <w:b/>
+          <w:bCs/>
+          <w:color w:val="000000"/>
+          <w:sz w:val="32"/>
+          <w:szCs w:val="32"/>
+        </w:rPr>
+        <w:t>wareCosts</w:t>
+      </w:r>
+      <w:proofErr w:type="spellEnd"/>
+      <w:r>
+        <w:rPr>
+          <w:rFonts w:ascii="TH SarabunIT๙" w:hAnsi="TH SarabunIT๙" w:cs="TH SarabunIT๙"/>
+          <w:b/>
+          <w:bCs/>
+          <w:color w:val="000000"/>
+          <w:sz w:val="32"/>
+          <w:szCs w:val="32"/>
+        </w:rPr>
+        <w:t>}</w:t>
+      </w:r>
+      <w:r>
+        <w:rPr>
+          <w:rFonts w:ascii="TH SarabunIT๙" w:hAnsi="TH SarabunIT๙" w:cs="TH SarabunIT๙"/>
+          <w:b/>
+          <w:bCs/>
+          <w:color w:val="000000"/>
+          <w:sz w:val="32"/>
+          <w:szCs w:val="32"/>
+        </w:rPr>
+        <w:t xml:space="preserve"> -</w:t>
+      </w:r>
+      <w:r>
+        <w:rPr>
+          <w:rFonts w:ascii="TH SarabunIT๙" w:hAnsi="TH SarabunIT๙" w:cs="TH SarabunIT๙"/>
+          <w:b/>
+          <w:bCs/>
+          <w:color w:val="000000"/>
+          <w:sz w:val="32"/>
+          <w:szCs w:val="32"/>
+          <w:cs/>
+        </w:rPr>
+        <w:t>ไม่มี-</w:t>
+      </w:r>
+      <w:r>
+        <w:rPr>
+          <w:rFonts w:ascii="TH SarabunIT๙" w:hAnsi="TH SarabunIT๙" w:cs="TH SarabunIT๙"/>
+          <w:b/>
+          <w:bCs/>
+          <w:color w:val="000000"/>
+          <w:sz w:val="32"/>
+          <w:szCs w:val="32"/>
+        </w:rPr>
+        <w:t xml:space="preserve"> {/</w:t>
+      </w:r>
+      <w:proofErr w:type="spellStart"/>
+      <w:r>
+        <w:rPr>
+          <w:rFonts w:ascii="TH SarabunIT๙" w:hAnsi="TH SarabunIT๙" w:cs="TH SarabunIT๙"/>
+          <w:b/>
+          <w:bCs/>
+          <w:color w:val="000000"/>
+          <w:sz w:val="32"/>
+          <w:szCs w:val="32"/>
+        </w:rPr>
+        <w:t>has</w:t>
+      </w:r>
+      <w:r>
+        <w:rPr>
+          <w:rFonts w:ascii="TH SarabunIT๙" w:hAnsi="TH SarabunIT๙" w:cs="TH SarabunIT๙"/>
+          <w:b/>
+          <w:bCs/>
+          <w:color w:val="000000"/>
+          <w:sz w:val="32"/>
+          <w:szCs w:val="32"/>
+        </w:rPr>
+        <w:t>Soft</w:t>
+      </w:r>
+      <w:r>
+        <w:rPr>
+          <w:rFonts w:ascii="TH SarabunIT๙" w:hAnsi="TH SarabunIT๙" w:cs="TH SarabunIT๙"/>
+          <w:b/>
+          <w:bCs/>
+          <w:color w:val="000000"/>
+          <w:sz w:val="32"/>
+          <w:szCs w:val="32"/>
+        </w:rPr>
+        <w:t>wareCosts</w:t>
+      </w:r>
+      <w:proofErr w:type="spellEnd"/>
+      <w:r>
+        <w:rPr>
+          <w:rFonts w:ascii="TH SarabunIT๙" w:hAnsi="TH SarabunIT๙" w:cs="TH SarabunIT๙"/>
+          <w:b/>
+          <w:bCs/>
+          <w:color w:val="000000"/>
+          <w:sz w:val="32"/>
+          <w:szCs w:val="32"/>
+        </w:rPr>
+        <w:t>}</w:t>
+      </w:r>
+    </w:p>
     <w:p>
       <w:pPr>
         <w:spacing w:after="0" w:line="240" w:lineRule="auto"/>
@@ -14429,6 +14463,7 @@
           <w:sz w:val="24"/>
           <w:szCs w:val="24"/>
         </w:rPr>
+        <w:lastRenderedPageBreak/>
         <w:t>(</w:t>
       </w:r>
       <w:r>
@@ -14883,7 +14918,6 @@
         </w:tabs>
         <w:suppressAutoHyphens/>
         <w:spacing w:after="0" w:line="240" w:lineRule="auto"/>
-        <w:ind w:left="1170"/>
         <w:rPr>
           <w:rFonts w:ascii="TH SarabunPSK" w:hAnsi="TH SarabunPSK" w:cs="TH SarabunPSK"/>
           <w:i/>
@@ -14903,7 +14937,6 @@
         </w:tabs>
         <w:suppressAutoHyphens/>
         <w:spacing w:after="0" w:line="240" w:lineRule="auto"/>
-        <w:ind w:left="1170"/>
         <w:rPr>
           <w:rFonts w:ascii="TH SarabunPSK" w:hAnsi="TH SarabunPSK" w:cs="TH SarabunPSK"/>
           <w:i/>
@@ -14923,7 +14956,6 @@
         </w:tabs>
         <w:suppressAutoHyphens/>
         <w:spacing w:after="0" w:line="240" w:lineRule="auto"/>
-        <w:ind w:left="1170"/>
         <w:rPr>
           <w:rFonts w:ascii="TH SarabunPSK" w:hAnsi="TH SarabunPSK" w:cs="TH SarabunPSK" w:hint="cs"/>
           <w:i/>
@@ -18930,6 +18962,7 @@
                 <w:szCs w:val="22"/>
                 <w:cs/>
               </w:rPr>
+              <w:lastRenderedPageBreak/>
               <w:t>รวมทั้งสิ้น</w:t>
             </w:r>
           </w:p>
@@ -21395,7 +21428,6 @@
                 <w:sz w:val="28"/>
                 <w:cs/>
               </w:rPr>
-              <w:lastRenderedPageBreak/>
               <w:t>รวมทั้งสิ้น</w:t>
             </w:r>
           </w:p>
@@ -21492,6 +21524,7 @@
           <w:szCs w:val="32"/>
           <w:cs/>
         </w:rPr>
+        <w:lastRenderedPageBreak/>
         <w:t>๘.</w:t>
       </w:r>
       <w:r>
@@ -22577,7 +22610,7 @@
               <w:spacing w:before="120" w:after="120" w:line="240" w:lineRule="auto"/>
               <w:jc w:val="center"/>
               <w:rPr>
-                <w:rFonts w:ascii="TH SarabunIT๙" w:hAnsi="TH SarabunIT๙" w:cs="TH SarabunIT๙" w:hint="cs"/>
+                <w:rFonts w:ascii="TH SarabunIT๙" w:hAnsi="TH SarabunIT๙" w:cs="TH SarabunIT๙"/>
                 <w:b/>
                 <w:bCs/>
                 <w:color w:val="000000"/>
@@ -23119,6 +23152,53 @@
       <w:pPr>
         <w:spacing w:before="240" w:after="0" w:line="240" w:lineRule="auto"/>
         <w:rPr>
+          <w:rFonts w:ascii="TH SarabunIT๙" w:hAnsi="TH SarabunIT๙" w:cs="TH SarabunIT๙"/>
+          <w:b/>
+          <w:bCs/>
+          <w:color w:val="000000"/>
+          <w:sz w:val="32"/>
+          <w:szCs w:val="32"/>
+          <w:cs/>
+        </w:rPr>
+      </w:pPr>
+      <w:r>
+        <w:rPr>
+          <w:rFonts w:ascii="TH SarabunIT๙" w:hAnsi="TH SarabunIT๙" w:cs="TH SarabunIT๙"/>
+          <w:b/>
+          <w:bCs/>
+          <w:color w:val="000000"/>
+          <w:sz w:val="32"/>
+          <w:szCs w:val="32"/>
+          <w:cs/>
+        </w:rPr>
+        <w:t>๑</w:t>
+      </w:r>
+      <w:r>
+        <w:rPr>
+          <w:rFonts w:ascii="TH SarabunIT๙" w:hAnsi="TH SarabunIT๙" w:cs="TH SarabunIT๙"/>
+          <w:b/>
+          <w:bCs/>
+          <w:color w:val="000000"/>
+          <w:sz w:val="32"/>
+          <w:szCs w:val="32"/>
+          <w:cs/>
+        </w:rPr>
+        <w:t>2</w:t>
+      </w:r>
+      <w:r>
+        <w:rPr>
+          <w:rFonts w:ascii="TH SarabunIT๙" w:hAnsi="TH SarabunIT๙" w:cs="TH SarabunIT๙"/>
+          <w:b/>
+          <w:bCs/>
+          <w:color w:val="000000"/>
+          <w:sz w:val="32"/>
+          <w:szCs w:val="32"/>
+          <w:cs/>
+        </w:rPr>
+        <w:t xml:space="preserve">. </w:t>
+      </w:r>
+      <w:r>
+        <w:rPr>
           <w:rFonts w:ascii="TH SarabunIT๙" w:hAnsi="TH SarabunIT๙" w:cs="TH SarabunIT๙" w:hint="cs"/>
           <w:b/>
           <w:bCs/>
@@ -23127,7 +23207,8 @@
           <w:szCs w:val="32"/>
           <w:cs/>
         </w:rPr>
-      </w:pPr>
+        <w:t>โครงการนี้อยู่ใน</w:t>
+      </w:r>
       <w:r>
         <w:rPr>
           <w:rFonts w:ascii="TH SarabunIT๙" w:hAnsi="TH SarabunIT๙" w:cs="TH SarabunIT๙"/>
@@ -23136,33 +23217,8 @@
           <w:color w:val="000000"/>
           <w:sz w:val="32"/>
           <w:szCs w:val="32"/>
-          <w:cs/>
-        </w:rPr>
-        <w:t>๑</w:t>
-      </w:r>
-      <w:r>
-        <w:rPr>
-          <w:rFonts w:ascii="TH SarabunIT๙" w:hAnsi="TH SarabunIT๙" w:cs="TH SarabunIT๙"/>
-          <w:b/>
-          <w:bCs/>
-          <w:color w:val="000000"/>
-          <w:sz w:val="32"/>
-          <w:szCs w:val="32"/>
-          <w:cs/>
-        </w:rPr>
-        <w:t>2</w:t>
-      </w:r>
-      <w:r>
-        <w:rPr>
-          <w:rFonts w:ascii="TH SarabunIT๙" w:hAnsi="TH SarabunIT๙" w:cs="TH SarabunIT๙"/>
-          <w:b/>
-          <w:bCs/>
-          <w:color w:val="000000"/>
-          <w:sz w:val="32"/>
-          <w:szCs w:val="32"/>
-          <w:cs/>
-        </w:rPr>
-        <w:t xml:space="preserve">. </w:t>
+        </w:rPr>
+        <w:t xml:space="preserve"> Roadmap </w:t>
       </w:r>
       <w:r>
         <w:rPr>
@@ -23174,29 +23230,6 @@
           <w:szCs w:val="32"/>
           <w:cs/>
         </w:rPr>
-        <w:t>โครงการนี้อยู่ใน</w:t>
-      </w:r>
-      <w:r>
-        <w:rPr>
-          <w:rFonts w:ascii="TH SarabunIT๙" w:hAnsi="TH SarabunIT๙" w:cs="TH SarabunIT๙"/>
-          <w:b/>
-          <w:bCs/>
-          <w:color w:val="000000"/>
-          <w:sz w:val="32"/>
-          <w:szCs w:val="32"/>
-        </w:rPr>
-        <w:t xml:space="preserve"> Roadmap </w:t>
-      </w:r>
-      <w:r>
-        <w:rPr>
-          <w:rFonts w:ascii="TH SarabunIT๙" w:hAnsi="TH SarabunIT๙" w:cs="TH SarabunIT๙" w:hint="cs"/>
-          <w:b/>
-          <w:bCs/>
-          <w:color w:val="000000"/>
-          <w:sz w:val="32"/>
-          <w:szCs w:val="32"/>
-          <w:cs/>
-        </w:rPr>
         <w:t>ของหน่วยงานหรือไม่</w:t>
       </w:r>
     </w:p>
@@ -23205,7 +23238,7 @@
         <w:spacing w:after="0" w:line="240" w:lineRule="auto"/>
         <w:ind w:firstLine="567"/>
         <w:rPr>
-          <w:rFonts w:ascii="TH SarabunIT๙" w:hAnsi="TH SarabunIT๙" w:cs="TH SarabunIT๙" w:hint="cs"/>
+          <w:rFonts w:ascii="TH SarabunIT๙" w:hAnsi="TH SarabunIT๙" w:cs="TH SarabunIT๙"/>
           <w:color w:val="000000"/>
           <w:sz w:val="32"/>
           <w:szCs w:val="32"/>
@@ -23247,7 +23280,7 @@
         <w:spacing w:after="0" w:line="240" w:lineRule="auto"/>
         <w:ind w:firstLine="567"/>
         <w:rPr>
-          <w:rFonts w:ascii="TH SarabunIT๙" w:hAnsi="TH SarabunIT๙" w:cs="TH SarabunIT๙" w:hint="cs"/>
+          <w:rFonts w:ascii="TH SarabunIT๙" w:hAnsi="TH SarabunIT๙" w:cs="TH SarabunIT๙"/>
           <w:color w:val="000000"/>
           <w:sz w:val="32"/>
           <w:szCs w:val="32"/>
@@ -23359,6 +23392,7 @@
           <w:szCs w:val="32"/>
           <w:cs/>
         </w:rPr>
+        <w:lastRenderedPageBreak/>
         <w:t>(...............................................................................)</w:t>
       </w:r>
     </w:p>
@@ -26763,7 +26797,7 @@
   <w:style w:type="paragraph" w:default="1" w:styleId="Normal">
     <w:name w:val="Normal"/>
     <w:qFormat/>
-    <w:rsid w:val="00F04576"/>
+    <w:rsid w:val="00FF7D11"/>
     <w:pPr>
       <w:spacing w:after="200" w:line="276" w:lineRule="auto"/>
     </w:pPr>

</xml_diff>

<commit_message>
feat: add project management components and user management features
- Implemented ProjectTable and ProjectTabs components for displaying project data.
- Created mock data for projects and users to facilitate development.
- Developed useProjects and useUsers hooks for managing project and user states.
- Added UserPagination, UserSummaryCards, UserTable, and UserToolbar components for user management.
- Introduced document generation utility for proposals using Docxtemplater.
- Enhanced user filtering and searching capabilities in the user management section.
</commit_message>
<xml_diff>
--- a/public/templates/project-proposal.docx
+++ b/public/templates/project-proposal.docx
@@ -166,28 +166,15 @@
     </w:p>
     <w:p>
       <w:pPr>
-        <w:tabs>
-          <w:tab w:val="left" w:pos="284"/>
-        </w:tabs>
-        <w:spacing w:before="120" w:after="0" w:line="240" w:lineRule="auto"/>
-        <w:rPr>
-          <w:rFonts w:ascii="TH SarabunIT๙" w:hAnsi="TH SarabunIT๙" w:cs="TH SarabunIT๙"/>
-          <w:color w:val="000000"/>
-          <w:sz w:val="32"/>
-          <w:szCs w:val="32"/>
-          <w:u w:val="dotted"/>
-        </w:rPr>
-      </w:pPr>
-      <w:r>
-        <w:rPr>
-          <w:rFonts w:ascii="TH SarabunIT๙" w:hAnsi="TH SarabunIT๙" w:cs="TH SarabunIT๙"/>
-          <w:color w:val="000000"/>
-          <w:sz w:val="32"/>
-          <w:szCs w:val="32"/>
-          <w:u w:val="dotted"/>
-        </w:rPr>
-        <w:tab/>
-      </w:r>
+        <w:spacing w:after="0" w:line="240" w:lineRule="auto"/>
+        <w:ind w:firstLine="720"/>
+        <w:rPr>
+          <w:rFonts w:ascii="TH SarabunIT๙" w:hAnsi="TH SarabunIT๙" w:cs="TH SarabunIT๙"/>
+          <w:color w:val="000000"/>
+          <w:sz w:val="32"/>
+          <w:szCs w:val="32"/>
+        </w:rPr>
+      </w:pPr>
       <w:r>
         <w:rPr>
           <w:rFonts w:ascii="TH SarabunIT๙" w:hAnsi="TH SarabunIT๙" w:cs="TH SarabunIT๙"/>
@@ -225,7 +212,7 @@
       <w:pPr>
         <w:spacing w:before="240" w:after="0" w:line="240" w:lineRule="auto"/>
         <w:rPr>
-          <w:rFonts w:ascii="TH SarabunIT๙" w:hAnsi="TH SarabunIT๙" w:cs="TH SarabunIT๙"/>
+          <w:rFonts w:ascii="TH SarabunIT๙" w:hAnsi="TH SarabunIT๙" w:cs="TH SarabunIT๙" w:hint="cs"/>
           <w:color w:val="000000"/>
           <w:sz w:val="32"/>
           <w:szCs w:val="32"/>
@@ -358,11 +345,12 @@
         <w:spacing w:after="120" w:line="240" w:lineRule="auto"/>
         <w:ind w:firstLine="360"/>
         <w:rPr>
-          <w:rFonts w:ascii="TH SarabunIT๙" w:hAnsi="TH SarabunIT๙" w:cs="TH SarabunIT๙"/>
+          <w:rFonts w:ascii="TH SarabunIT๙" w:hAnsi="TH SarabunIT๙" w:cs="TH SarabunIT๙" w:hint="cs"/>
           <w:color w:val="000000"/>
           <w:sz w:val="32"/>
           <w:szCs w:val="32"/>
           <w:u w:val="dotted"/>
+          <w:cs/>
         </w:rPr>
       </w:pPr>
       <w:r>
@@ -3792,11 +3780,12 @@
       <w:pPr>
         <w:spacing w:before="120" w:after="240" w:line="240" w:lineRule="auto"/>
         <w:rPr>
-          <w:rFonts w:ascii="TH SarabunIT๙" w:hAnsi="TH SarabunIT๙" w:cs="TH SarabunIT๙"/>
+          <w:rFonts w:ascii="TH SarabunIT๙" w:hAnsi="TH SarabunIT๙" w:cs="TH SarabunIT๙" w:hint="cs"/>
           <w:color w:val="000000"/>
           <w:sz w:val="32"/>
           <w:szCs w:val="32"/>
           <w:u w:val="dotted"/>
+          <w:cs/>
         </w:rPr>
       </w:pPr>
       <w:r>
@@ -8905,9 +8894,10 @@
         </w:tabs>
         <w:spacing w:after="0" w:line="240" w:lineRule="auto"/>
         <w:rPr>
-          <w:rFonts w:ascii="TH SarabunIT๙" w:hAnsi="TH SarabunIT๙" w:cs="TH SarabunIT๙"/>
-          <w:sz w:val="32"/>
-          <w:szCs w:val="32"/>
+          <w:rFonts w:ascii="TH SarabunIT๙" w:hAnsi="TH SarabunIT๙" w:cs="TH SarabunIT๙" w:hint="cs"/>
+          <w:sz w:val="32"/>
+          <w:szCs w:val="32"/>
+          <w:cs/>
         </w:rPr>
       </w:pPr>
       <w:r>
@@ -10963,7 +10953,7 @@
         <w:ind w:hanging="720"/>
         <w:contextualSpacing w:val="0"/>
         <w:rPr>
-          <w:rFonts w:ascii="TH SarabunIT๙" w:hAnsi="TH SarabunIT๙" w:cs="TH SarabunIT๙" w:hint="cs"/>
+          <w:rFonts w:ascii="TH SarabunIT๙" w:hAnsi="TH SarabunIT๙" w:cs="TH SarabunIT๙"/>
           <w:b/>
           <w:bCs/>
           <w:color w:val="000000"/>
@@ -12265,15 +12255,7 @@
                 <w:color w:val="000000"/>
                 <w:sz w:val="28"/>
               </w:rPr>
-              <w:t xml:space="preserve"> </w:t>
-            </w:r>
-            <w:r>
-              <w:rPr>
-                <w:rFonts w:ascii="TH SarabunIT๙" w:eastAsia="Calibri" w:hAnsi="TH SarabunIT๙" w:cs="TH SarabunIT๙"/>
-                <w:color w:val="000000"/>
-                <w:sz w:val="28"/>
-              </w:rPr>
-              <w:t>{/</w:t>
+              <w:t xml:space="preserve"> {/</w:t>
             </w:r>
             <w:proofErr w:type="spellStart"/>
             <w:r>
@@ -12570,7 +12552,7 @@
         <w:ind w:hanging="720"/>
         <w:contextualSpacing w:val="0"/>
         <w:rPr>
-          <w:rFonts w:ascii="TH SarabunIT๙" w:hAnsi="TH SarabunIT๙" w:cs="TH SarabunIT๙" w:hint="cs"/>
+          <w:rFonts w:ascii="TH SarabunIT๙" w:hAnsi="TH SarabunIT๙" w:cs="TH SarabunIT๙"/>
           <w:b/>
           <w:bCs/>
           <w:color w:val="000000"/>
@@ -12646,29 +12628,7 @@
           <w:sz w:val="32"/>
           <w:szCs w:val="32"/>
         </w:rPr>
-        <w:t>{#has</w:t>
-      </w:r>
-      <w:r>
-        <w:rPr>
-          <w:rFonts w:ascii="TH SarabunIT๙" w:hAnsi="TH SarabunIT๙" w:cs="TH SarabunIT๙"/>
-          <w:b/>
-          <w:bCs/>
-          <w:color w:val="000000"/>
-          <w:sz w:val="32"/>
-          <w:szCs w:val="32"/>
-        </w:rPr>
-        <w:t>Soft</w:t>
-      </w:r>
-      <w:r>
-        <w:rPr>
-          <w:rFonts w:ascii="TH SarabunIT๙" w:hAnsi="TH SarabunIT๙" w:cs="TH SarabunIT๙"/>
-          <w:b/>
-          <w:bCs/>
-          <w:color w:val="000000"/>
-          <w:sz w:val="32"/>
-          <w:szCs w:val="32"/>
-        </w:rPr>
-        <w:t>wareCosts}</w:t>
+        <w:t>{#hasSoftwareCosts}</w:t>
       </w:r>
     </w:p>
     <w:tbl>
@@ -14957,7 +14917,7 @@
         <w:suppressAutoHyphens/>
         <w:spacing w:after="0" w:line="240" w:lineRule="auto"/>
         <w:rPr>
-          <w:rFonts w:ascii="TH SarabunPSK" w:hAnsi="TH SarabunPSK" w:cs="TH SarabunPSK" w:hint="cs"/>
+          <w:rFonts w:ascii="TH SarabunPSK" w:hAnsi="TH SarabunPSK" w:cs="TH SarabunPSK"/>
           <w:i/>
           <w:iCs/>
           <w:color w:val="000000"/>
@@ -26805,6 +26765,7 @@
   <w:style w:type="character" w:default="1" w:styleId="DefaultParagraphFont">
     <w:name w:val="Default Paragraph Font"/>
     <w:uiPriority w:val="1"/>
+    <w:semiHidden/>
     <w:unhideWhenUsed/>
   </w:style>
   <w:style w:type="table" w:default="1" w:styleId="TableNormal">

</xml_diff>

<commit_message>
feat: enhance proposal document generation with additional diagrams and image compression
</commit_message>
<xml_diff>
--- a/public/templates/project-proposal.docx
+++ b/public/templates/project-proposal.docx
@@ -212,7 +212,7 @@
       <w:pPr>
         <w:spacing w:before="240" w:after="0" w:line="240" w:lineRule="auto"/>
         <w:rPr>
-          <w:rFonts w:ascii="TH SarabunIT๙" w:hAnsi="TH SarabunIT๙" w:cs="TH SarabunIT๙" w:hint="cs"/>
+          <w:rFonts w:ascii="TH SarabunIT๙" w:hAnsi="TH SarabunIT๙" w:cs="TH SarabunIT๙"/>
           <w:color w:val="000000"/>
           <w:sz w:val="32"/>
           <w:szCs w:val="32"/>
@@ -345,7 +345,7 @@
         <w:spacing w:after="120" w:line="240" w:lineRule="auto"/>
         <w:ind w:firstLine="360"/>
         <w:rPr>
-          <w:rFonts w:ascii="TH SarabunIT๙" w:hAnsi="TH SarabunIT๙" w:cs="TH SarabunIT๙" w:hint="cs"/>
+          <w:rFonts w:ascii="TH SarabunIT๙" w:hAnsi="TH SarabunIT๙" w:cs="TH SarabunIT๙"/>
           <w:color w:val="000000"/>
           <w:sz w:val="32"/>
           <w:szCs w:val="32"/>
@@ -3780,7 +3780,7 @@
       <w:pPr>
         <w:spacing w:before="120" w:after="240" w:line="240" w:lineRule="auto"/>
         <w:rPr>
-          <w:rFonts w:ascii="TH SarabunIT๙" w:hAnsi="TH SarabunIT๙" w:cs="TH SarabunIT๙" w:hint="cs"/>
+          <w:rFonts w:ascii="TH SarabunIT๙" w:hAnsi="TH SarabunIT๙" w:cs="TH SarabunIT๙"/>
           <w:color w:val="000000"/>
           <w:sz w:val="32"/>
           <w:szCs w:val="32"/>
@@ -6527,20 +6527,14 @@
         </w:rPr>
         <w:t>ตารางแสดงรายการครุภัณฑ์คอมพิวเตอร์ที่มีอยู่ในปัจจุบัน</w:t>
       </w:r>
-    </w:p>
-    <w:p>
-      <w:pPr>
-        <w:tabs>
-          <w:tab w:val="left" w:pos="270"/>
-        </w:tabs>
-        <w:spacing w:after="120" w:line="240" w:lineRule="auto"/>
-        <w:ind w:left="720" w:hanging="14"/>
-        <w:rPr>
-          <w:rFonts w:ascii="TH SarabunIT๙" w:hAnsi="TH SarabunIT๙" w:cs="TH SarabunIT๙"/>
-          <w:sz w:val="32"/>
-          <w:szCs w:val="32"/>
-        </w:rPr>
-      </w:pPr>
+      <w:r>
+        <w:rPr>
+          <w:rFonts w:ascii="TH SarabunIT๙" w:hAnsi="TH SarabunIT๙" w:cs="TH SarabunIT๙"/>
+          <w:sz w:val="32"/>
+          <w:szCs w:val="32"/>
+        </w:rPr>
+        <w:t xml:space="preserve"> </w:t>
+      </w:r>
       <w:r>
         <w:rPr>
           <w:rFonts w:ascii="TH SarabunIT๙" w:hAnsi="TH SarabunIT๙" w:cs="TH SarabunIT๙"/>
@@ -8854,7 +8848,7 @@
         <w:spacing w:after="0" w:line="240" w:lineRule="auto"/>
         <w:jc w:val="center"/>
         <w:rPr>
-          <w:rFonts w:ascii="TH SarabunIT๙" w:hAnsi="TH SarabunIT๙" w:cs="TH SarabunIT๙"/>
+          <w:rFonts w:ascii="TH SarabunIT๙" w:hAnsi="TH SarabunIT๙" w:cs="TH SarabunIT๙" w:hint="cs"/>
           <w:sz w:val="32"/>
           <w:szCs w:val="32"/>
           <w:cs/>
@@ -8924,7 +8918,7 @@
           <w:sz w:val="32"/>
           <w:szCs w:val="32"/>
         </w:rPr>
-        <w:t>systemDesc</w:t>
+        <w:t>systemImageDesc</w:t>
       </w:r>
       <w:proofErr w:type="spellEnd"/>
       <w:r>
@@ -9095,12 +9089,73 @@
           <w:tab w:val="left" w:pos="284"/>
         </w:tabs>
         <w:spacing w:after="0" w:line="240" w:lineRule="auto"/>
-        <w:rPr>
-          <w:rFonts w:ascii="TH SarabunIT๙" w:hAnsi="TH SarabunIT๙" w:cs="TH SarabunIT๙"/>
-          <w:sz w:val="32"/>
-          <w:szCs w:val="32"/>
-        </w:rPr>
-      </w:pPr>
+        <w:ind w:firstLine="720"/>
+        <w:rPr>
+          <w:rFonts w:ascii="TH SarabunIT๙" w:hAnsi="TH SarabunIT๙" w:cs="TH SarabunIT๙" w:hint="cs"/>
+          <w:sz w:val="32"/>
+          <w:szCs w:val="32"/>
+        </w:rPr>
+      </w:pPr>
+      <w:r>
+        <w:rPr>
+          <w:rFonts w:ascii="TH SarabunIT๙" w:hAnsi="TH SarabunIT๙" w:cs="TH SarabunIT๙"/>
+          <w:sz w:val="32"/>
+          <w:szCs w:val="32"/>
+        </w:rPr>
+        <w:t xml:space="preserve">-   </w:t>
+      </w:r>
+      <w:r>
+        <w:rPr>
+          <w:rFonts w:ascii="TH SarabunIT๙" w:hAnsi="TH SarabunIT๙" w:cs="TH SarabunIT๙"/>
+          <w:sz w:val="32"/>
+          <w:szCs w:val="32"/>
+          <w:cs/>
+        </w:rPr>
+        <w:t>แผนภาพแสดงปฏิสัมพันธ์ระหว่างระบบงาน (</w:t>
+      </w:r>
+      <w:r>
+        <w:rPr>
+          <w:rFonts w:ascii="TH SarabunIT๙" w:hAnsi="TH SarabunIT๙" w:cs="TH SarabunIT๙"/>
+          <w:sz w:val="32"/>
+          <w:szCs w:val="32"/>
+        </w:rPr>
+        <w:t>Use</w:t>
+      </w:r>
+      <w:r>
+        <w:rPr>
+          <w:rFonts w:ascii="TH SarabunIT๙" w:hAnsi="TH SarabunIT๙" w:cs="TH SarabunIT๙"/>
+          <w:sz w:val="32"/>
+          <w:szCs w:val="32"/>
+          <w:cs/>
+        </w:rPr>
+        <w:t xml:space="preserve"> </w:t>
+      </w:r>
+      <w:r>
+        <w:rPr>
+          <w:rFonts w:ascii="TH SarabunIT๙" w:hAnsi="TH SarabunIT๙" w:cs="TH SarabunIT๙"/>
+          <w:sz w:val="32"/>
+          <w:szCs w:val="32"/>
+        </w:rPr>
+        <w:t>Case Diagram</w:t>
+      </w:r>
+      <w:r>
+        <w:rPr>
+          <w:rFonts w:ascii="TH SarabunIT๙" w:hAnsi="TH SarabunIT๙" w:cs="TH SarabunIT๙"/>
+          <w:sz w:val="32"/>
+          <w:szCs w:val="32"/>
+          <w:cs/>
+        </w:rPr>
+        <w:t>)</w:t>
+      </w:r>
+      <w:r>
+        <w:rPr>
+          <w:rFonts w:ascii="TH SarabunIT๙" w:hAnsi="TH SarabunIT๙" w:cs="TH SarabunIT๙"/>
+          <w:sz w:val="32"/>
+          <w:szCs w:val="32"/>
+          <w:cs/>
+        </w:rPr>
+        <w:t xml:space="preserve"> </w:t>
+      </w:r>
     </w:p>
     <w:p>
       <w:pPr>
@@ -9108,72 +9163,86 @@
           <w:tab w:val="left" w:pos="284"/>
         </w:tabs>
         <w:spacing w:after="0" w:line="240" w:lineRule="auto"/>
-        <w:ind w:firstLine="720"/>
-        <w:rPr>
-          <w:rFonts w:ascii="TH SarabunIT๙" w:hAnsi="TH SarabunIT๙" w:cs="TH SarabunIT๙"/>
-          <w:sz w:val="32"/>
-          <w:szCs w:val="32"/>
-        </w:rPr>
-      </w:pPr>
-      <w:r>
-        <w:rPr>
-          <w:rFonts w:ascii="TH SarabunIT๙" w:hAnsi="TH SarabunIT๙" w:cs="TH SarabunIT๙"/>
-          <w:sz w:val="32"/>
-          <w:szCs w:val="32"/>
-        </w:rPr>
-        <w:t xml:space="preserve">-   </w:t>
-      </w:r>
-      <w:r>
-        <w:rPr>
-          <w:rFonts w:ascii="TH SarabunIT๙" w:hAnsi="TH SarabunIT๙" w:cs="TH SarabunIT๙"/>
-          <w:sz w:val="32"/>
-          <w:szCs w:val="32"/>
-          <w:cs/>
-        </w:rPr>
-        <w:t>แผนภาพแสดงปฏิสัมพันธ์ระหว่างระบบงาน (</w:t>
-      </w:r>
-      <w:r>
-        <w:rPr>
-          <w:rFonts w:ascii="TH SarabunIT๙" w:hAnsi="TH SarabunIT๙" w:cs="TH SarabunIT๙"/>
-          <w:sz w:val="32"/>
-          <w:szCs w:val="32"/>
-        </w:rPr>
-        <w:t>Use</w:t>
-      </w:r>
-      <w:r>
-        <w:rPr>
-          <w:rFonts w:ascii="TH SarabunIT๙" w:hAnsi="TH SarabunIT๙" w:cs="TH SarabunIT๙"/>
-          <w:sz w:val="32"/>
-          <w:szCs w:val="32"/>
-          <w:cs/>
-        </w:rPr>
-        <w:t xml:space="preserve"> </w:t>
-      </w:r>
-      <w:r>
-        <w:rPr>
-          <w:rFonts w:ascii="TH SarabunIT๙" w:hAnsi="TH SarabunIT๙" w:cs="TH SarabunIT๙"/>
-          <w:sz w:val="32"/>
-          <w:szCs w:val="32"/>
-        </w:rPr>
-        <w:t>Case Diagram</w:t>
-      </w:r>
-      <w:r>
-        <w:rPr>
-          <w:rFonts w:ascii="TH SarabunIT๙" w:hAnsi="TH SarabunIT๙" w:cs="TH SarabunIT๙"/>
-          <w:sz w:val="32"/>
-          <w:szCs w:val="32"/>
-          <w:cs/>
-        </w:rPr>
-        <w:t>)</w:t>
-      </w:r>
-      <w:r>
-        <w:rPr>
-          <w:rFonts w:ascii="TH SarabunIT๙" w:hAnsi="TH SarabunIT๙" w:cs="TH SarabunIT๙"/>
-          <w:sz w:val="32"/>
-          <w:szCs w:val="32"/>
-          <w:cs/>
-        </w:rPr>
-        <w:t xml:space="preserve"> </w:t>
+        <w:jc w:val="center"/>
+        <w:rPr>
+          <w:rFonts w:ascii="TH SarabunIT๙" w:hAnsi="TH SarabunIT๙" w:cs="TH SarabunIT๙"/>
+          <w:sz w:val="32"/>
+          <w:szCs w:val="32"/>
+        </w:rPr>
+      </w:pPr>
+      <w:r>
+        <w:rPr>
+          <w:rFonts w:ascii="TH SarabunIT๙" w:hAnsi="TH SarabunIT๙" w:cs="TH SarabunIT๙"/>
+          <w:sz w:val="32"/>
+          <w:szCs w:val="32"/>
+        </w:rPr>
+        <w:t>{%</w:t>
+      </w:r>
+      <w:proofErr w:type="spellStart"/>
+      <w:r>
+        <w:rPr>
+          <w:rFonts w:ascii="TH SarabunIT๙" w:hAnsi="TH SarabunIT๙" w:cs="TH SarabunIT๙"/>
+          <w:sz w:val="32"/>
+          <w:szCs w:val="32"/>
+        </w:rPr>
+        <w:t>useCaseImage</w:t>
+      </w:r>
+      <w:proofErr w:type="spellEnd"/>
+      <w:r>
+        <w:rPr>
+          <w:rFonts w:ascii="TH SarabunIT๙" w:hAnsi="TH SarabunIT๙" w:cs="TH SarabunIT๙"/>
+          <w:sz w:val="32"/>
+          <w:szCs w:val="32"/>
+        </w:rPr>
+        <w:t>}</w:t>
+      </w:r>
+    </w:p>
+    <w:p>
+      <w:pPr>
+        <w:tabs>
+          <w:tab w:val="left" w:pos="284"/>
+        </w:tabs>
+        <w:spacing w:after="0" w:line="240" w:lineRule="auto"/>
+        <w:rPr>
+          <w:rFonts w:ascii="TH SarabunIT๙" w:hAnsi="TH SarabunIT๙" w:cs="TH SarabunIT๙"/>
+          <w:sz w:val="32"/>
+          <w:szCs w:val="32"/>
+        </w:rPr>
+      </w:pPr>
+      <w:r>
+        <w:rPr>
+          <w:rFonts w:ascii="TH SarabunIT๙" w:hAnsi="TH SarabunIT๙" w:cs="TH SarabunIT๙"/>
+          <w:sz w:val="32"/>
+          <w:szCs w:val="32"/>
+          <w:cs/>
+        </w:rPr>
+        <w:t>คำอธิบาย:</w:t>
+      </w:r>
+      <w:r>
+        <w:rPr>
+          <w:rFonts w:ascii="TH SarabunIT๙" w:hAnsi="TH SarabunIT๙" w:cs="TH SarabunIT๙"/>
+          <w:sz w:val="32"/>
+          <w:szCs w:val="32"/>
+        </w:rPr>
+        <w:t xml:space="preserve"> {</w:t>
+      </w:r>
+      <w:proofErr w:type="spellStart"/>
+      <w:r>
+        <w:rPr>
+          <w:rFonts w:ascii="TH SarabunIT๙" w:hAnsi="TH SarabunIT๙" w:cs="TH SarabunIT๙"/>
+          <w:sz w:val="32"/>
+          <w:szCs w:val="32"/>
+        </w:rPr>
+        <w:t>useCaseImageDesc</w:t>
+      </w:r>
+      <w:proofErr w:type="spellEnd"/>
+      <w:r>
+        <w:rPr>
+          <w:rFonts w:ascii="TH SarabunIT๙" w:hAnsi="TH SarabunIT๙" w:cs="TH SarabunIT๙"/>
+          <w:sz w:val="32"/>
+          <w:szCs w:val="32"/>
+        </w:rPr>
+        <w:t>}</w:t>
       </w:r>
     </w:p>
     <w:p>
@@ -9191,7 +9260,6 @@
           <w:rFonts w:ascii="TH SarabunIT๙" w:hAnsi="TH SarabunIT๙" w:cs="TH SarabunIT๙"/>
           <w:sz w:val="32"/>
           <w:szCs w:val="32"/>
-          <w:cs/>
         </w:rPr>
       </w:pPr>
       <w:r>
@@ -9210,6 +9278,95 @@
           <w:szCs w:val="32"/>
         </w:rPr>
         <w:t>Network, System, and Information Security)</w:t>
+      </w:r>
+    </w:p>
+    <w:p>
+      <w:pPr>
+        <w:tabs>
+          <w:tab w:val="left" w:pos="284"/>
+        </w:tabs>
+        <w:spacing w:after="0" w:line="240" w:lineRule="auto"/>
+        <w:jc w:val="center"/>
+        <w:rPr>
+          <w:rFonts w:ascii="TH SarabunIT๙" w:hAnsi="TH SarabunIT๙" w:cs="TH SarabunIT๙"/>
+          <w:sz w:val="32"/>
+          <w:szCs w:val="32"/>
+        </w:rPr>
+      </w:pPr>
+      <w:r>
+        <w:rPr>
+          <w:rFonts w:ascii="TH SarabunIT๙" w:hAnsi="TH SarabunIT๙" w:cs="TH SarabunIT๙"/>
+          <w:sz w:val="32"/>
+          <w:szCs w:val="32"/>
+        </w:rPr>
+        <w:t>{%</w:t>
+      </w:r>
+      <w:proofErr w:type="spellStart"/>
+      <w:r>
+        <w:rPr>
+          <w:rFonts w:ascii="TH SarabunIT๙" w:hAnsi="TH SarabunIT๙" w:cs="TH SarabunIT๙"/>
+          <w:sz w:val="32"/>
+          <w:szCs w:val="32"/>
+        </w:rPr>
+        <w:t>securityImage</w:t>
+      </w:r>
+      <w:proofErr w:type="spellEnd"/>
+      <w:r>
+        <w:rPr>
+          <w:rFonts w:ascii="TH SarabunIT๙" w:hAnsi="TH SarabunIT๙" w:cs="TH SarabunIT๙"/>
+          <w:sz w:val="32"/>
+          <w:szCs w:val="32"/>
+        </w:rPr>
+        <w:t>}</w:t>
+      </w:r>
+    </w:p>
+    <w:p>
+      <w:pPr>
+        <w:tabs>
+          <w:tab w:val="left" w:pos="284"/>
+        </w:tabs>
+        <w:spacing w:after="0" w:line="240" w:lineRule="auto"/>
+        <w:rPr>
+          <w:rFonts w:ascii="TH SarabunIT๙" w:hAnsi="TH SarabunIT๙" w:cs="TH SarabunIT๙"/>
+          <w:sz w:val="32"/>
+          <w:szCs w:val="32"/>
+        </w:rPr>
+      </w:pPr>
+      <w:r>
+        <w:rPr>
+          <w:rFonts w:ascii="TH SarabunIT๙" w:hAnsi="TH SarabunIT๙" w:cs="TH SarabunIT๙"/>
+          <w:sz w:val="32"/>
+          <w:szCs w:val="32"/>
+          <w:cs/>
+        </w:rPr>
+        <w:lastRenderedPageBreak/>
+        <w:t>คำอธิบาย:</w:t>
+      </w:r>
+      <w:r>
+        <w:rPr>
+          <w:rFonts w:ascii="TH SarabunIT๙" w:hAnsi="TH SarabunIT๙" w:cs="TH SarabunIT๙"/>
+          <w:sz w:val="32"/>
+          <w:szCs w:val="32"/>
+        </w:rPr>
+        <w:t xml:space="preserve"> {</w:t>
+      </w:r>
+      <w:proofErr w:type="spellStart"/>
+      <w:r>
+        <w:rPr>
+          <w:rFonts w:ascii="TH SarabunIT๙" w:hAnsi="TH SarabunIT๙" w:cs="TH SarabunIT๙"/>
+          <w:sz w:val="32"/>
+          <w:szCs w:val="32"/>
+        </w:rPr>
+        <w:t>securityImageDesc</w:t>
+      </w:r>
+      <w:proofErr w:type="spellEnd"/>
+      <w:r>
+        <w:rPr>
+          <w:rFonts w:ascii="TH SarabunIT๙" w:hAnsi="TH SarabunIT๙" w:cs="TH SarabunIT๙"/>
+          <w:sz w:val="32"/>
+          <w:szCs w:val="32"/>
+        </w:rPr>
+        <w:t>}</w:t>
       </w:r>
     </w:p>
     <w:p>
@@ -9218,11 +9375,12 @@
         <w:ind w:right="-45" w:firstLine="284"/>
         <w:jc w:val="thaiDistribute"/>
         <w:rPr>
-          <w:rFonts w:ascii="TH SarabunIT๙" w:hAnsi="TH SarabunIT๙" w:cs="TH SarabunIT๙"/>
+          <w:rFonts w:ascii="TH SarabunIT๙" w:hAnsi="TH SarabunIT๙" w:cs="TH SarabunIT๙" w:hint="cs"/>
           <w:b/>
           <w:bCs/>
           <w:sz w:val="32"/>
           <w:szCs w:val="32"/>
+          <w:cs/>
         </w:rPr>
       </w:pPr>
       <w:r>
@@ -9331,7 +9489,6 @@
                 <w:szCs w:val="32"/>
                 <w:cs/>
               </w:rPr>
-              <w:lastRenderedPageBreak/>
               <w:t>ลำดับ</w:t>
             </w:r>
           </w:p>
@@ -11635,6 +11792,7 @@
                 <w:szCs w:val="24"/>
                 <w:cs/>
               </w:rPr>
+              <w:lastRenderedPageBreak/>
               <w:t>ฉบับเดือน</w:t>
             </w:r>
             <w:r>
@@ -11814,7 +11972,6 @@
                 <w:sz w:val="24"/>
                 <w:szCs w:val="24"/>
               </w:rPr>
-              <w:lastRenderedPageBreak/>
               <w:t>{</w:t>
             </w:r>
             <w:proofErr w:type="spellStart"/>
@@ -14138,6 +14295,7 @@
           <w:u w:val="single"/>
           <w:cs/>
         </w:rPr>
+        <w:lastRenderedPageBreak/>
         <w:t>หมายเหตุ</w:t>
       </w:r>
       <w:r>
@@ -14423,7 +14581,6 @@
           <w:sz w:val="24"/>
           <w:szCs w:val="24"/>
         </w:rPr>
-        <w:lastRenderedPageBreak/>
         <w:t>(</w:t>
       </w:r>
       <w:r>
@@ -18922,7 +19079,6 @@
                 <w:szCs w:val="22"/>
                 <w:cs/>
               </w:rPr>
-              <w:lastRenderedPageBreak/>
               <w:t>รวมทั้งสิ้น</w:t>
             </w:r>
           </w:p>
@@ -21432,6 +21588,7 @@
           <w:u w:val="single"/>
           <w:cs/>
         </w:rPr>
+        <w:lastRenderedPageBreak/>
         <w:t>หมายเหตุ</w:t>
       </w:r>
       <w:r>
@@ -21484,7 +21641,6 @@
           <w:szCs w:val="32"/>
           <w:cs/>
         </w:rPr>
-        <w:lastRenderedPageBreak/>
         <w:t>๘.</w:t>
       </w:r>
       <w:r>
@@ -23330,6 +23486,7 @@
           <w:szCs w:val="32"/>
           <w:cs/>
         </w:rPr>
+        <w:lastRenderedPageBreak/>
         <w:t>ลงชื่อ.................................................................................</w:t>
       </w:r>
     </w:p>
@@ -23352,7 +23509,6 @@
           <w:szCs w:val="32"/>
           <w:cs/>
         </w:rPr>
-        <w:lastRenderedPageBreak/>
         <w:t>(...............................................................................)</w:t>
       </w:r>
     </w:p>
@@ -26757,7 +26913,7 @@
   <w:style w:type="paragraph" w:default="1" w:styleId="Normal">
     <w:name w:val="Normal"/>
     <w:qFormat/>
-    <w:rsid w:val="00FF7D11"/>
+    <w:rsid w:val="00CF6149"/>
     <w:pPr>
       <w:spacing w:after="200" w:line="276" w:lineRule="auto"/>
     </w:pPr>
@@ -26765,7 +26921,6 @@
   <w:style w:type="character" w:default="1" w:styleId="DefaultParagraphFont">
     <w:name w:val="Default Paragraph Font"/>
     <w:uiPriority w:val="1"/>
-    <w:semiHidden/>
     <w:unhideWhenUsed/>
   </w:style>
   <w:style w:type="table" w:default="1" w:styleId="TableNormal">

</xml_diff>

<commit_message>
feat: update profile label and enhance training cost section with additional details
</commit_message>
<xml_diff>
--- a/public/templates/project-proposal.docx
+++ b/public/templates/project-proposal.docx
@@ -6404,7 +6404,7 @@
           <w:sz w:val="32"/>
           <w:szCs w:val="32"/>
         </w:rPr>
-        <w:t xml:space="preserve">“- </w:t>
+        <w:t xml:space="preserve">- </w:t>
       </w:r>
       <w:r>
         <w:rPr>
@@ -6421,7 +6421,7 @@
           <w:sz w:val="32"/>
           <w:szCs w:val="32"/>
         </w:rPr>
-        <w:t>-”</w:t>
+        <w:t>-</w:t>
       </w:r>
     </w:p>
     <w:p>
@@ -7191,7 +7191,7 @@
           <w:sz w:val="32"/>
           <w:szCs w:val="32"/>
         </w:rPr>
-        <w:t xml:space="preserve">“- </w:t>
+        <w:t xml:space="preserve">- </w:t>
       </w:r>
       <w:r>
         <w:rPr>
@@ -7208,7 +7208,7 @@
           <w:sz w:val="32"/>
           <w:szCs w:val="32"/>
         </w:rPr>
-        <w:t>-”</w:t>
+        <w:t>-</w:t>
       </w:r>
     </w:p>
     <w:p>
@@ -12645,13 +12645,20 @@
           <w:sz w:val="32"/>
           <w:szCs w:val="32"/>
         </w:rPr>
-        <w:t xml:space="preserve"> -</w:t>
-      </w:r>
-      <w:r>
-        <w:rPr>
-          <w:rFonts w:ascii="TH SarabunIT๙" w:hAnsi="TH SarabunIT๙" w:cs="TH SarabunIT๙"/>
-          <w:b/>
-          <w:bCs/>
+        <w:t xml:space="preserve"> </w:t>
+      </w:r>
+      <w:r>
+        <w:rPr>
+          <w:rFonts w:ascii="TH SarabunIT๙" w:hAnsi="TH SarabunIT๙" w:cs="TH SarabunIT๙"/>
+          <w:color w:val="000000"/>
+          <w:sz w:val="32"/>
+          <w:szCs w:val="32"/>
+        </w:rPr>
+        <w:t>-</w:t>
+      </w:r>
+      <w:r>
+        <w:rPr>
+          <w:rFonts w:ascii="TH SarabunIT๙" w:hAnsi="TH SarabunIT๙" w:cs="TH SarabunIT๙"/>
           <w:color w:val="000000"/>
           <w:sz w:val="32"/>
           <w:szCs w:val="32"/>
@@ -14197,30 +14204,15 @@
       <w:r>
         <w:rPr>
           <w:rFonts w:ascii="TH SarabunIT๙" w:hAnsi="TH SarabunIT๙" w:cs="TH SarabunIT๙"/>
-          <w:b/>
-          <w:bCs/>
-          <w:color w:val="000000"/>
-          <w:sz w:val="32"/>
-          <w:szCs w:val="32"/>
-        </w:rPr>
-        <w:t>}</w:t>
-      </w:r>
-      <w:r>
-        <w:rPr>
-          <w:rFonts w:ascii="TH SarabunIT๙" w:hAnsi="TH SarabunIT๙" w:cs="TH SarabunIT๙"/>
-          <w:b/>
-          <w:bCs/>
-          <w:color w:val="000000"/>
-          <w:sz w:val="32"/>
-          <w:szCs w:val="32"/>
-        </w:rPr>
-        <w:t xml:space="preserve"> -</w:t>
-      </w:r>
-      <w:r>
-        <w:rPr>
-          <w:rFonts w:ascii="TH SarabunIT๙" w:hAnsi="TH SarabunIT๙" w:cs="TH SarabunIT๙"/>
-          <w:b/>
-          <w:bCs/>
+          <w:color w:val="000000"/>
+          <w:sz w:val="32"/>
+          <w:szCs w:val="32"/>
+        </w:rPr>
+        <w:t>} -</w:t>
+      </w:r>
+      <w:r>
+        <w:rPr>
+          <w:rFonts w:ascii="TH SarabunIT๙" w:hAnsi="TH SarabunIT๙" w:cs="TH SarabunIT๙"/>
           <w:color w:val="000000"/>
           <w:sz w:val="32"/>
           <w:szCs w:val="32"/>
@@ -14231,8 +14223,6 @@
       <w:r>
         <w:rPr>
           <w:rFonts w:ascii="TH SarabunIT๙" w:hAnsi="TH SarabunIT๙" w:cs="TH SarabunIT๙"/>
-          <w:b/>
-          <w:bCs/>
           <w:color w:val="000000"/>
           <w:sz w:val="32"/>
           <w:szCs w:val="32"/>
@@ -19932,13 +19922,102 @@
       <w:r>
         <w:rPr>
           <w:rFonts w:ascii="TH SarabunIT๙" w:hAnsi="TH SarabunIT๙" w:cs="TH SarabunIT๙"/>
+          <w:color w:val="000000"/>
+          <w:sz w:val="32"/>
+          <w:szCs w:val="32"/>
+        </w:rPr>
+        <w:t>-</w:t>
+      </w:r>
+      <w:r>
+        <w:rPr>
+          <w:rFonts w:ascii="TH SarabunIT๙" w:hAnsi="TH SarabunIT๙" w:cs="TH SarabunIT๙" w:hint="cs"/>
+          <w:color w:val="000000"/>
+          <w:sz w:val="32"/>
+          <w:szCs w:val="32"/>
+          <w:cs/>
+        </w:rPr>
+        <w:t>ไม่มี-</w:t>
+      </w:r>
+      <w:r>
+        <w:rPr>
+          <w:rFonts w:ascii="TH SarabunPSK" w:hAnsi="TH SarabunPSK" w:cs="TH SarabunPSK"/>
+          <w:color w:val="000000"/>
+          <w:sz w:val="32"/>
+          <w:szCs w:val="32"/>
+        </w:rPr>
+        <w:t>{/</w:t>
+      </w:r>
+      <w:proofErr w:type="spellStart"/>
+      <w:r>
+        <w:rPr>
+          <w:rFonts w:ascii="TH SarabunPSK" w:hAnsi="TH SarabunPSK" w:cs="TH SarabunPSK"/>
+          <w:color w:val="000000"/>
+          <w:sz w:val="32"/>
+          <w:szCs w:val="32"/>
+        </w:rPr>
+        <w:t>hasPersonnelResponsibilities</w:t>
+      </w:r>
+      <w:proofErr w:type="spellEnd"/>
+      <w:r>
+        <w:rPr>
+          <w:rFonts w:ascii="TH SarabunPSK" w:hAnsi="TH SarabunPSK" w:cs="TH SarabunPSK"/>
+          <w:color w:val="000000"/>
+          <w:sz w:val="32"/>
+          <w:szCs w:val="32"/>
+        </w:rPr>
+        <w:t>}</w:t>
+      </w:r>
+    </w:p>
+    <w:p>
+      <w:pPr>
+        <w:spacing w:after="120" w:line="240" w:lineRule="auto"/>
+        <w:jc w:val="thaiDistribute"/>
+        <w:rPr>
+          <w:rFonts w:ascii="TH SarabunIT๙" w:hAnsi="TH SarabunIT๙" w:cs="TH SarabunIT๙"/>
           <w:b/>
           <w:bCs/>
           <w:color w:val="000000"/>
           <w:sz w:val="32"/>
           <w:szCs w:val="32"/>
         </w:rPr>
-        <w:t>-</w:t>
+      </w:pPr>
+    </w:p>
+    <w:p>
+      <w:pPr>
+        <w:spacing w:after="120" w:line="240" w:lineRule="auto"/>
+        <w:jc w:val="thaiDistribute"/>
+        <w:rPr>
+          <w:rFonts w:ascii="TH SarabunIT๙" w:hAnsi="TH SarabunIT๙" w:cs="TH SarabunIT๙"/>
+          <w:b/>
+          <w:bCs/>
+          <w:color w:val="000000"/>
+          <w:sz w:val="32"/>
+          <w:szCs w:val="32"/>
+        </w:rPr>
+      </w:pPr>
+    </w:p>
+    <w:p>
+      <w:pPr>
+        <w:spacing w:after="120" w:line="240" w:lineRule="auto"/>
+        <w:jc w:val="thaiDistribute"/>
+        <w:rPr>
+          <w:rFonts w:ascii="TH SarabunIT๙" w:hAnsi="TH SarabunIT๙" w:cs="TH SarabunIT๙"/>
+          <w:color w:val="000000"/>
+          <w:sz w:val="32"/>
+          <w:szCs w:val="32"/>
+        </w:rPr>
+      </w:pPr>
+      <w:r>
+        <w:rPr>
+          <w:rFonts w:ascii="TH SarabunIT๙" w:hAnsi="TH SarabunIT๙" w:cs="TH SarabunIT๙"/>
+          <w:b/>
+          <w:bCs/>
+          <w:color w:val="000000"/>
+          <w:sz w:val="32"/>
+          <w:szCs w:val="32"/>
+          <w:cs/>
+        </w:rPr>
+        <w:t>๘.</w:t>
       </w:r>
       <w:r>
         <w:rPr>
@@ -19950,42 +20029,9 @@
           <w:szCs w:val="32"/>
           <w:cs/>
         </w:rPr>
-        <w:t>ไม่มี-</w:t>
-      </w:r>
-      <w:r>
-        <w:rPr>
-          <w:rFonts w:ascii="TH SarabunPSK" w:hAnsi="TH SarabunPSK" w:cs="TH SarabunPSK"/>
-          <w:color w:val="000000"/>
-          <w:sz w:val="32"/>
-          <w:szCs w:val="32"/>
-        </w:rPr>
-        <w:t>{/</w:t>
-      </w:r>
-      <w:proofErr w:type="spellStart"/>
-      <w:r>
-        <w:rPr>
-          <w:rFonts w:ascii="TH SarabunPSK" w:hAnsi="TH SarabunPSK" w:cs="TH SarabunPSK"/>
-          <w:color w:val="000000"/>
-          <w:sz w:val="32"/>
-          <w:szCs w:val="32"/>
-        </w:rPr>
-        <w:t>hasPersonnelResponsibilities</w:t>
-      </w:r>
-      <w:proofErr w:type="spellEnd"/>
-      <w:r>
-        <w:rPr>
-          <w:rFonts w:ascii="TH SarabunPSK" w:hAnsi="TH SarabunPSK" w:cs="TH SarabunPSK"/>
-          <w:color w:val="000000"/>
-          <w:sz w:val="32"/>
-          <w:szCs w:val="32"/>
-        </w:rPr>
-        <w:t>}</w:t>
-      </w:r>
-    </w:p>
-    <w:p>
-      <w:pPr>
-        <w:spacing w:after="120" w:line="240" w:lineRule="auto"/>
-        <w:jc w:val="thaiDistribute"/>
+        <w:t>4</w:t>
+      </w:r>
+      <w:r>
         <w:rPr>
           <w:rFonts w:ascii="TH SarabunIT๙" w:hAnsi="TH SarabunIT๙" w:cs="TH SarabunIT๙"/>
           <w:b/>
@@ -19994,44 +20040,7 @@
           <w:sz w:val="32"/>
           <w:szCs w:val="32"/>
         </w:rPr>
-      </w:pPr>
-    </w:p>
-    <w:p>
-      <w:pPr>
-        <w:spacing w:after="120" w:line="240" w:lineRule="auto"/>
-        <w:jc w:val="thaiDistribute"/>
-        <w:rPr>
-          <w:rFonts w:ascii="TH SarabunIT๙" w:hAnsi="TH SarabunIT๙" w:cs="TH SarabunIT๙"/>
-          <w:b/>
-          <w:bCs/>
-          <w:color w:val="000000"/>
-          <w:sz w:val="32"/>
-          <w:szCs w:val="32"/>
-        </w:rPr>
-      </w:pPr>
-    </w:p>
-    <w:p>
-      <w:pPr>
-        <w:spacing w:after="120" w:line="240" w:lineRule="auto"/>
-        <w:jc w:val="thaiDistribute"/>
-        <w:rPr>
-          <w:rFonts w:ascii="TH SarabunIT๙" w:hAnsi="TH SarabunIT๙" w:cs="TH SarabunIT๙"/>
-          <w:color w:val="000000"/>
-          <w:sz w:val="32"/>
-          <w:szCs w:val="32"/>
-        </w:rPr>
-      </w:pPr>
-      <w:r>
-        <w:rPr>
-          <w:rFonts w:ascii="TH SarabunIT๙" w:hAnsi="TH SarabunIT๙" w:cs="TH SarabunIT๙"/>
-          <w:b/>
-          <w:bCs/>
-          <w:color w:val="000000"/>
-          <w:sz w:val="32"/>
-          <w:szCs w:val="32"/>
-          <w:cs/>
-        </w:rPr>
-        <w:t>๘.</w:t>
+        <w:t xml:space="preserve"> </w:t>
       </w:r>
       <w:r>
         <w:rPr>
@@ -20043,7 +20052,7 @@
           <w:szCs w:val="32"/>
           <w:cs/>
         </w:rPr>
-        <w:t>4</w:t>
+        <w:t>ค่าใช้จ่าย</w:t>
       </w:r>
       <w:r>
         <w:rPr>
@@ -20053,10 +20062,290 @@
           <w:color w:val="000000"/>
           <w:sz w:val="32"/>
           <w:szCs w:val="32"/>
+          <w:cs/>
+        </w:rPr>
+        <w:t>การฝึกอบรม</w:t>
+      </w:r>
+      <w:r>
+        <w:rPr>
+          <w:rFonts w:ascii="TH SarabunIT๙" w:hAnsi="TH SarabunIT๙" w:cs="TH SarabunIT๙"/>
+          <w:color w:val="000000"/>
+          <w:sz w:val="32"/>
+          <w:szCs w:val="32"/>
+          <w:cs/>
+        </w:rPr>
+        <w:t xml:space="preserve"> (หลักสูตร วิธีการฝึกอบรม ระยะเวลา ค่าใช้จ่าย จำนวนผู้ฝึกอบรมและวิทยากร )</w:t>
+      </w:r>
+    </w:p>
+    <w:p>
+      <w:pPr>
+        <w:spacing w:after="120" w:line="240" w:lineRule="auto"/>
+        <w:jc w:val="thaiDistribute"/>
+        <w:rPr>
+          <w:rFonts w:ascii="TH SarabunIT๙" w:hAnsi="TH SarabunIT๙" w:cs="TH SarabunIT๙"/>
+          <w:color w:val="000000"/>
+          <w:sz w:val="32"/>
+          <w:szCs w:val="32"/>
+        </w:rPr>
+      </w:pPr>
+      <w:r>
+        <w:rPr>
+          <w:rFonts w:ascii="TH SarabunIT๙" w:hAnsi="TH SarabunIT๙" w:cs="TH SarabunIT๙"/>
+          <w:color w:val="000000"/>
+          <w:sz w:val="32"/>
+          <w:szCs w:val="32"/>
+        </w:rPr>
+        <w:t>{#</w:t>
+      </w:r>
+      <w:r>
+        <w:rPr>
+          <w:rFonts w:ascii="TH SarabunIT๙" w:hAnsi="TH SarabunIT๙" w:cs="TH SarabunIT๙"/>
+          <w:color w:val="000000"/>
+          <w:sz w:val="32"/>
+          <w:szCs w:val="32"/>
+        </w:rPr>
+        <w:t>hasTrainingCourses</w:t>
+      </w:r>
+      <w:r>
+        <w:rPr>
+          <w:rFonts w:ascii="TH SarabunIT๙" w:hAnsi="TH SarabunIT๙" w:cs="TH SarabunIT๙"/>
+          <w:color w:val="000000"/>
+          <w:sz w:val="32"/>
+          <w:szCs w:val="32"/>
+        </w:rPr>
+        <w:t xml:space="preserve">} </w:t>
+      </w:r>
+      <w:r>
+        <w:rPr>
+          <w:rFonts w:ascii="TH SarabunIT๙" w:hAnsi="TH SarabunIT๙" w:cs="TH SarabunIT๙"/>
+          <w:color w:val="000000"/>
+          <w:sz w:val="32"/>
+          <w:szCs w:val="32"/>
+        </w:rPr>
+        <w:t>{#</w:t>
+      </w:r>
+      <w:proofErr w:type="gramStart"/>
+      <w:r>
+        <w:rPr>
+          <w:rFonts w:ascii="TH SarabunIT๙" w:hAnsi="TH SarabunIT๙" w:cs="TH SarabunIT๙"/>
+          <w:color w:val="000000"/>
+          <w:sz w:val="32"/>
+          <w:szCs w:val="32"/>
+        </w:rPr>
+        <w:t>trainingCourses}</w:t>
+      </w:r>
+      <w:r>
+        <w:rPr>
+          <w:rFonts w:ascii="TH SarabunIT๙" w:hAnsi="TH SarabunIT๙" w:cs="TH SarabunIT๙"/>
+          <w:color w:val="000000"/>
+          <w:sz w:val="32"/>
+          <w:szCs w:val="32"/>
+          <w:cs/>
+        </w:rPr>
+        <w:t>หลักสูตรที่</w:t>
+      </w:r>
+      <w:proofErr w:type="gramEnd"/>
+      <w:r>
+        <w:rPr>
+          <w:rFonts w:ascii="TH SarabunIT๙" w:hAnsi="TH SarabunIT๙" w:cs="TH SarabunIT๙"/>
+          <w:color w:val="000000"/>
+          <w:sz w:val="32"/>
+          <w:szCs w:val="32"/>
+          <w:cs/>
         </w:rPr>
         <w:t xml:space="preserve"> </w:t>
       </w:r>
       <w:r>
+        <w:rPr>
+          <w:rFonts w:ascii="TH SarabunIT๙" w:hAnsi="TH SarabunIT๙" w:cs="TH SarabunIT๙"/>
+          <w:color w:val="000000"/>
+          <w:sz w:val="32"/>
+          <w:szCs w:val="32"/>
+        </w:rPr>
+        <w:t xml:space="preserve">{index}: </w:t>
+      </w:r>
+    </w:p>
+    <w:p>
+      <w:pPr>
+        <w:spacing w:after="120" w:line="240" w:lineRule="auto"/>
+        <w:jc w:val="thaiDistribute"/>
+        <w:rPr>
+          <w:rFonts w:ascii="TH SarabunIT๙" w:hAnsi="TH SarabunIT๙" w:cs="TH SarabunIT๙"/>
+          <w:color w:val="000000"/>
+          <w:sz w:val="32"/>
+          <w:szCs w:val="32"/>
+        </w:rPr>
+      </w:pPr>
+      <w:r>
+        <w:rPr>
+          <w:rFonts w:ascii="TH SarabunIT๙" w:hAnsi="TH SarabunIT๙" w:cs="TH SarabunIT๙"/>
+          <w:color w:val="000000"/>
+          <w:sz w:val="32"/>
+          <w:szCs w:val="32"/>
+          <w:cs/>
+        </w:rPr>
+        <w:t xml:space="preserve">หลักสูตร </w:t>
+      </w:r>
+      <w:r>
+        <w:rPr>
+          <w:rFonts w:ascii="TH SarabunIT๙" w:hAnsi="TH SarabunIT๙" w:cs="TH SarabunIT๙"/>
+          <w:color w:val="000000"/>
+          <w:sz w:val="32"/>
+          <w:szCs w:val="32"/>
+          <w:u w:val="dotted"/>
+        </w:rPr>
+        <w:t>{</w:t>
+      </w:r>
+      <w:proofErr w:type="spellStart"/>
+      <w:r>
+        <w:rPr>
+          <w:rFonts w:ascii="TH SarabunIT๙" w:hAnsi="TH SarabunIT๙" w:cs="TH SarabunIT๙"/>
+          <w:color w:val="000000"/>
+          <w:sz w:val="32"/>
+          <w:szCs w:val="32"/>
+          <w:u w:val="dotted"/>
+        </w:rPr>
+        <w:t>courseName</w:t>
+      </w:r>
+      <w:proofErr w:type="spellEnd"/>
+      <w:r>
+        <w:rPr>
+          <w:rFonts w:ascii="TH SarabunIT๙" w:hAnsi="TH SarabunIT๙" w:cs="TH SarabunIT๙"/>
+          <w:color w:val="000000"/>
+          <w:sz w:val="32"/>
+          <w:szCs w:val="32"/>
+          <w:u w:val="dotted"/>
+        </w:rPr>
+        <w:t>}</w:t>
+      </w:r>
+    </w:p>
+    <w:p>
+      <w:pPr>
+        <w:spacing w:after="120" w:line="240" w:lineRule="auto"/>
+        <w:jc w:val="thaiDistribute"/>
+        <w:rPr>
+          <w:rFonts w:ascii="TH SarabunIT๙" w:hAnsi="TH SarabunIT๙" w:cs="TH SarabunIT๙"/>
+          <w:color w:val="000000"/>
+          <w:sz w:val="32"/>
+          <w:szCs w:val="32"/>
+        </w:rPr>
+      </w:pPr>
+      <w:r>
+        <w:rPr>
+          <w:rFonts w:ascii="TH SarabunIT๙" w:hAnsi="TH SarabunIT๙" w:cs="TH SarabunIT๙"/>
+          <w:color w:val="000000"/>
+          <w:sz w:val="32"/>
+          <w:szCs w:val="32"/>
+          <w:cs/>
+        </w:rPr>
+        <w:t xml:space="preserve">วิธีการฝึกอบรม </w:t>
+      </w:r>
+      <w:r>
+        <w:rPr>
+          <w:rFonts w:ascii="TH SarabunIT๙" w:hAnsi="TH SarabunIT๙" w:cs="TH SarabunIT๙"/>
+          <w:color w:val="000000"/>
+          <w:sz w:val="32"/>
+          <w:szCs w:val="32"/>
+          <w:u w:val="dotted"/>
+        </w:rPr>
+        <w:t>{</w:t>
+      </w:r>
+      <w:proofErr w:type="spellStart"/>
+      <w:r>
+        <w:rPr>
+          <w:rFonts w:ascii="TH SarabunIT๙" w:hAnsi="TH SarabunIT๙" w:cs="TH SarabunIT๙"/>
+          <w:color w:val="000000"/>
+          <w:sz w:val="32"/>
+          <w:szCs w:val="32"/>
+          <w:u w:val="dotted"/>
+        </w:rPr>
+        <w:t>trainingMethod</w:t>
+      </w:r>
+      <w:proofErr w:type="spellEnd"/>
+      <w:r>
+        <w:rPr>
+          <w:rFonts w:ascii="TH SarabunIT๙" w:hAnsi="TH SarabunIT๙" w:cs="TH SarabunIT๙"/>
+          <w:color w:val="000000"/>
+          <w:sz w:val="32"/>
+          <w:szCs w:val="32"/>
+          <w:u w:val="dotted"/>
+        </w:rPr>
+        <w:t>}</w:t>
+      </w:r>
+    </w:p>
+    <w:p>
+      <w:pPr>
+        <w:spacing w:after="0" w:line="240" w:lineRule="auto"/>
+        <w:rPr>
+          <w:rFonts w:ascii="TH SarabunIT๙" w:hAnsi="TH SarabunIT๙" w:cs="TH SarabunIT๙"/>
+          <w:color w:val="000000"/>
+          <w:sz w:val="32"/>
+          <w:szCs w:val="32"/>
+        </w:rPr>
+      </w:pPr>
+      <w:r>
+        <w:rPr>
+          <w:rFonts w:ascii="TH SarabunIT๙" w:hAnsi="TH SarabunIT๙" w:cs="TH SarabunIT๙"/>
+          <w:color w:val="000000"/>
+          <w:sz w:val="32"/>
+          <w:szCs w:val="32"/>
+          <w:cs/>
+        </w:rPr>
+        <w:t xml:space="preserve">สถานที่ฝึกอบรม </w:t>
+      </w:r>
+      <w:r>
+        <w:rPr>
+          <w:rFonts w:ascii="TH SarabunIT๙" w:hAnsi="TH SarabunIT๙" w:cs="TH SarabunIT๙"/>
+          <w:color w:val="000000"/>
+          <w:sz w:val="32"/>
+          <w:szCs w:val="32"/>
+          <w:cs/>
+        </w:rPr>
+        <w:tab/>
+      </w:r>
+      <w:r>
+        <w:rPr>
+          <w:rFonts w:ascii="TH SarabunIT๙" w:hAnsi="TH SarabunIT๙" w:cs="TH SarabunIT๙"/>
+          <w:color w:val="000000"/>
+          <w:sz w:val="32"/>
+          <w:szCs w:val="32"/>
+          <w:cs/>
+        </w:rPr>
+        <w:tab/>
+      </w:r>
+      <w:r>
+        <w:rPr>
+          <w:rFonts w:ascii="TH SarabunIT๙" w:hAnsi="TH SarabunIT๙" w:cs="TH SarabunIT๙"/>
+          <w:color w:val="000000"/>
+          <w:sz w:val="32"/>
+          <w:szCs w:val="32"/>
+        </w:rPr>
+        <w:t>{</w:t>
+      </w:r>
+      <w:proofErr w:type="spellStart"/>
+      <w:r>
+        <w:rPr>
+          <w:rFonts w:ascii="TH SarabunIT๙" w:hAnsi="TH SarabunIT๙" w:cs="TH SarabunIT๙"/>
+          <w:color w:val="000000"/>
+          <w:sz w:val="32"/>
+          <w:szCs w:val="32"/>
+        </w:rPr>
+        <w:t>locationStr</w:t>
+      </w:r>
+      <w:proofErr w:type="spellEnd"/>
+      <w:r>
+        <w:rPr>
+          <w:rFonts w:ascii="TH SarabunIT๙" w:hAnsi="TH SarabunIT๙" w:cs="TH SarabunIT๙"/>
+          <w:color w:val="000000"/>
+          <w:sz w:val="32"/>
+          <w:szCs w:val="32"/>
+        </w:rPr>
+        <w:t>}</w:t>
+      </w:r>
+    </w:p>
+    <w:p>
+      <w:pPr>
+        <w:spacing w:before="120" w:after="0" w:line="240" w:lineRule="auto"/>
         <w:rPr>
           <w:rFonts w:ascii="TH SarabunIT๙" w:hAnsi="TH SarabunIT๙" w:cs="TH SarabunIT๙" w:hint="cs"/>
           <w:b/>
@@ -20066,121 +20355,16 @@
           <w:szCs w:val="32"/>
           <w:cs/>
         </w:rPr>
-        <w:t>ค่าใช้จ่าย</w:t>
-      </w:r>
-      <w:r>
-        <w:rPr>
-          <w:rFonts w:ascii="TH SarabunIT๙" w:hAnsi="TH SarabunIT๙" w:cs="TH SarabunIT๙"/>
-          <w:b/>
-          <w:bCs/>
-          <w:color w:val="000000"/>
-          <w:sz w:val="32"/>
-          <w:szCs w:val="32"/>
-          <w:cs/>
-        </w:rPr>
-        <w:t>การฝึกอบรม</w:t>
-      </w:r>
-      <w:r>
-        <w:rPr>
-          <w:rFonts w:ascii="TH SarabunIT๙" w:hAnsi="TH SarabunIT๙" w:cs="TH SarabunIT๙"/>
-          <w:color w:val="000000"/>
-          <w:sz w:val="32"/>
-          <w:szCs w:val="32"/>
-          <w:cs/>
-        </w:rPr>
-        <w:t xml:space="preserve"> (หลักสูตร วิธีการฝึกอบรม ระยะเวลา ค่าใช้จ่าย จำนวนผู้ฝึกอบรมและวิทยากร )</w:t>
-      </w:r>
-    </w:p>
-    <w:p>
-      <w:pPr>
-        <w:spacing w:after="0" w:line="240" w:lineRule="auto"/>
-        <w:rPr>
-          <w:rFonts w:ascii="TH SarabunIT๙" w:hAnsi="TH SarabunIT๙" w:cs="TH SarabunIT๙"/>
-          <w:color w:val="000000"/>
-          <w:sz w:val="32"/>
-          <w:szCs w:val="32"/>
-        </w:rPr>
-      </w:pPr>
-      <w:r>
-        <w:rPr>
-          <w:rFonts w:ascii="TH SarabunIT๙" w:hAnsi="TH SarabunIT๙" w:cs="TH SarabunIT๙"/>
-          <w:color w:val="000000"/>
-          <w:sz w:val="32"/>
-          <w:szCs w:val="32"/>
-          <w:cs/>
-        </w:rPr>
-        <w:t>หลักสูตร ....................................................................................................................................................</w:t>
-      </w:r>
-    </w:p>
-    <w:p>
-      <w:pPr>
-        <w:spacing w:after="0" w:line="240" w:lineRule="auto"/>
-        <w:rPr>
-          <w:rFonts w:ascii="TH SarabunIT๙" w:hAnsi="TH SarabunIT๙" w:cs="TH SarabunIT๙"/>
-          <w:color w:val="000000"/>
-          <w:sz w:val="32"/>
-          <w:szCs w:val="32"/>
-        </w:rPr>
-      </w:pPr>
-      <w:r>
-        <w:rPr>
-          <w:rFonts w:ascii="TH SarabunIT๙" w:hAnsi="TH SarabunIT๙" w:cs="TH SarabunIT๙"/>
-          <w:color w:val="000000"/>
-          <w:sz w:val="32"/>
-          <w:szCs w:val="32"/>
-          <w:cs/>
-        </w:rPr>
-        <w:t>วิธีการฝึกอบรม ..........................................................................................................................................</w:t>
-      </w:r>
-    </w:p>
-    <w:p>
-      <w:pPr>
-        <w:spacing w:after="0" w:line="240" w:lineRule="auto"/>
-        <w:rPr>
-          <w:rFonts w:ascii="TH SarabunIT๙" w:hAnsi="TH SarabunIT๙" w:cs="TH SarabunIT๙"/>
-          <w:color w:val="000000"/>
-          <w:sz w:val="32"/>
-          <w:szCs w:val="32"/>
-        </w:rPr>
-      </w:pPr>
-      <w:r>
-        <w:rPr>
-          <w:rFonts w:ascii="TH SarabunIT๙" w:hAnsi="TH SarabunIT๙" w:cs="TH SarabunIT๙"/>
-          <w:color w:val="000000"/>
-          <w:sz w:val="32"/>
-          <w:szCs w:val="32"/>
-          <w:cs/>
-        </w:rPr>
-        <w:t xml:space="preserve">สถานที่ฝึกอบรม </w:t>
-      </w:r>
-      <w:r>
-        <w:rPr>
-          <w:rFonts w:ascii="TH SarabunIT๙" w:hAnsi="TH SarabunIT๙" w:cs="TH SarabunIT๙"/>
-          <w:color w:val="000000"/>
-          <w:sz w:val="32"/>
-          <w:szCs w:val="32"/>
-          <w:cs/>
-        </w:rPr>
-        <w:tab/>
-      </w:r>
-      <w:r>
-        <w:rPr>
-          <w:rFonts w:ascii="TH SarabunIT๙" w:hAnsi="TH SarabunIT๙" w:cs="TH SarabunIT๙"/>
-          <w:color w:val="000000"/>
-          <w:sz w:val="32"/>
-          <w:szCs w:val="32"/>
-          <w:cs/>
-        </w:rPr>
-        <w:tab/>
-      </w:r>
-      <w:r>
-        <w:rPr>
-          <w:rFonts w:ascii="TH SarabunIT๙" w:hAnsi="TH SarabunIT๙" w:cs="TH SarabunIT๙"/>
-          <w:color w:val="000000"/>
-          <w:sz w:val="32"/>
-          <w:szCs w:val="32"/>
-        </w:rPr>
-        <w:sym w:font="Wingdings" w:char="F06F"/>
+      </w:pPr>
+      <w:r>
+        <w:rPr>
+          <w:rFonts w:ascii="TH SarabunIT๙" w:hAnsi="TH SarabunIT๙" w:cs="TH SarabunIT๙"/>
+          <w:color w:val="000000"/>
+          <w:sz w:val="32"/>
+          <w:szCs w:val="32"/>
+          <w:cs/>
+        </w:rPr>
+        <w:t>ความจำเป็นของวิทยากร</w:t>
       </w:r>
       <w:r>
         <w:rPr>
@@ -20190,66 +20374,39 @@
           <w:szCs w:val="32"/>
           <w:cs/>
         </w:rPr>
-        <w:t xml:space="preserve">  </w:t>
-      </w:r>
-      <w:r>
-        <w:rPr>
-          <w:rFonts w:ascii="TH SarabunIT๙" w:hAnsi="TH SarabunIT๙" w:cs="TH SarabunIT๙"/>
-          <w:color w:val="000000"/>
-          <w:sz w:val="32"/>
-          <w:szCs w:val="32"/>
-          <w:cs/>
-        </w:rPr>
-        <w:t>สถานที่ราชการ</w:t>
-      </w:r>
-      <w:r>
-        <w:rPr>
-          <w:rFonts w:ascii="TH SarabunIT๙" w:hAnsi="TH SarabunIT๙" w:cs="TH SarabunIT๙" w:hint="cs"/>
-          <w:color w:val="000000"/>
-          <w:sz w:val="32"/>
-          <w:szCs w:val="32"/>
-          <w:cs/>
-        </w:rPr>
-        <w:t xml:space="preserve"> </w:t>
-      </w:r>
-      <w:r>
-        <w:rPr>
-          <w:rFonts w:ascii="TH SarabunIT๙" w:hAnsi="TH SarabunIT๙" w:cs="TH SarabunIT๙"/>
-          <w:color w:val="000000"/>
-          <w:sz w:val="32"/>
-          <w:szCs w:val="32"/>
-          <w:cs/>
-        </w:rPr>
-        <w:tab/>
-      </w:r>
-      <w:r>
-        <w:rPr>
-          <w:rFonts w:ascii="TH SarabunIT๙" w:hAnsi="TH SarabunIT๙" w:cs="TH SarabunIT๙"/>
-          <w:color w:val="000000"/>
-          <w:sz w:val="32"/>
-          <w:szCs w:val="32"/>
-        </w:rPr>
-        <w:sym w:font="Wingdings" w:char="F06F"/>
-      </w:r>
-      <w:r>
-        <w:rPr>
-          <w:rFonts w:ascii="TH SarabunPSK" w:eastAsia="Calibri" w:hAnsi="TH SarabunPSK" w:cs="TH SarabunPSK" w:hint="cs"/>
-          <w:color w:val="000000"/>
-          <w:sz w:val="24"/>
-          <w:szCs w:val="24"/>
-          <w:cs/>
-        </w:rPr>
-        <w:t xml:space="preserve">  </w:t>
-      </w:r>
-      <w:r>
-        <w:rPr>
-          <w:rFonts w:ascii="TH SarabunIT๙" w:hAnsi="TH SarabunIT๙" w:cs="TH SarabunIT๙"/>
-          <w:color w:val="000000"/>
-          <w:sz w:val="32"/>
-          <w:szCs w:val="32"/>
-          <w:cs/>
-        </w:rPr>
-        <w:t>สถานที่เอกชน</w:t>
+        <w:t xml:space="preserve">ภายนอก </w:t>
+      </w:r>
+      <w:r>
+        <w:rPr>
+          <w:rFonts w:ascii="TH SarabunIT๙" w:hAnsi="TH SarabunIT๙" w:cs="TH SarabunIT๙"/>
+          <w:color w:val="000000"/>
+          <w:sz w:val="32"/>
+          <w:szCs w:val="32"/>
+          <w:u w:val="dotted"/>
+        </w:rPr>
+        <w:t>{</w:t>
+      </w:r>
+      <w:proofErr w:type="spellStart"/>
+      <w:r>
+        <w:rPr>
+          <w:rFonts w:ascii="TH SarabunIT๙" w:hAnsi="TH SarabunIT๙" w:cs="TH SarabunIT๙"/>
+          <w:color w:val="000000"/>
+          <w:sz w:val="32"/>
+          <w:szCs w:val="32"/>
+          <w:u w:val="dotted"/>
+        </w:rPr>
+        <w:t>chkHasSpeaker</w:t>
+      </w:r>
+      <w:proofErr w:type="spellEnd"/>
+      <w:r>
+        <w:rPr>
+          <w:rFonts w:ascii="TH SarabunIT๙" w:hAnsi="TH SarabunIT๙" w:cs="TH SarabunIT๙"/>
+          <w:color w:val="000000"/>
+          <w:sz w:val="32"/>
+          <w:szCs w:val="32"/>
+          <w:u w:val="dotted"/>
+        </w:rPr>
+        <w:t>}</w:t>
       </w:r>
     </w:p>
     <w:p>
@@ -20291,12 +20448,12 @@
         <w:tblLook w:val="04A0" w:firstRow="1" w:lastRow="0" w:firstColumn="1" w:lastColumn="0" w:noHBand="0" w:noVBand="1"/>
       </w:tblPr>
       <w:tblGrid>
-        <w:gridCol w:w="819"/>
-        <w:gridCol w:w="2981"/>
-        <w:gridCol w:w="1729"/>
-        <w:gridCol w:w="2240"/>
-        <w:gridCol w:w="1075"/>
-        <w:gridCol w:w="1442"/>
+        <w:gridCol w:w="1572"/>
+        <w:gridCol w:w="2693"/>
+        <w:gridCol w:w="1409"/>
+        <w:gridCol w:w="1873"/>
+        <w:gridCol w:w="983"/>
+        <w:gridCol w:w="1756"/>
       </w:tblGrid>
       <w:tr>
         <w:trPr>
@@ -20304,7 +20461,7 @@
         </w:trPr>
         <w:tc>
           <w:tcPr>
-            <w:tcW w:w="819" w:type="dxa"/>
+            <w:tcW w:w="1154" w:type="dxa"/>
             <w:vMerge w:val="restart"/>
           </w:tcPr>
           <w:p>
@@ -20334,7 +20491,7 @@
         </w:tc>
         <w:tc>
           <w:tcPr>
-            <w:tcW w:w="2981" w:type="dxa"/>
+            <w:tcW w:w="3118" w:type="dxa"/>
             <w:vMerge w:val="restart"/>
           </w:tcPr>
           <w:p>
@@ -20365,7 +20522,7 @@
         </w:tc>
         <w:tc>
           <w:tcPr>
-            <w:tcW w:w="3969" w:type="dxa"/>
+            <w:tcW w:w="3635" w:type="dxa"/>
             <w:gridSpan w:val="2"/>
           </w:tcPr>
           <w:p>
@@ -20396,7 +20553,7 @@
         </w:tc>
         <w:tc>
           <w:tcPr>
-            <w:tcW w:w="1075" w:type="dxa"/>
+            <w:tcW w:w="1037" w:type="dxa"/>
             <w:vMerge w:val="restart"/>
           </w:tcPr>
           <w:p>
@@ -20439,7 +20596,7 @@
         </w:tc>
         <w:tc>
           <w:tcPr>
-            <w:tcW w:w="1442" w:type="dxa"/>
+            <w:tcW w:w="1342" w:type="dxa"/>
             <w:vMerge w:val="restart"/>
           </w:tcPr>
           <w:p>
@@ -20487,7 +20644,7 @@
         </w:trPr>
         <w:tc>
           <w:tcPr>
-            <w:tcW w:w="819" w:type="dxa"/>
+            <w:tcW w:w="1154" w:type="dxa"/>
             <w:vMerge/>
             <w:shd w:val="clear" w:color="auto" w:fill="C6D9F1"/>
           </w:tcPr>
@@ -20508,7 +20665,7 @@
         </w:tc>
         <w:tc>
           <w:tcPr>
-            <w:tcW w:w="2981" w:type="dxa"/>
+            <w:tcW w:w="3118" w:type="dxa"/>
             <w:vMerge/>
             <w:shd w:val="clear" w:color="auto" w:fill="C6D9F1"/>
           </w:tcPr>
@@ -20529,7 +20686,7 @@
         </w:tc>
         <w:tc>
           <w:tcPr>
-            <w:tcW w:w="1729" w:type="dxa"/>
+            <w:tcW w:w="1595" w:type="dxa"/>
           </w:tcPr>
           <w:p>
             <w:pPr>
@@ -20559,7 +20716,7 @@
         </w:tc>
         <w:tc>
           <w:tcPr>
-            <w:tcW w:w="2240" w:type="dxa"/>
+            <w:tcW w:w="2040" w:type="dxa"/>
           </w:tcPr>
           <w:p>
             <w:pPr>
@@ -20601,7 +20758,7 @@
         </w:tc>
         <w:tc>
           <w:tcPr>
-            <w:tcW w:w="1075" w:type="dxa"/>
+            <w:tcW w:w="1037" w:type="dxa"/>
             <w:vMerge/>
             <w:shd w:val="clear" w:color="auto" w:fill="C6D9F1"/>
           </w:tcPr>
@@ -20622,7 +20779,7 @@
         </w:tc>
         <w:tc>
           <w:tcPr>
-            <w:tcW w:w="1442" w:type="dxa"/>
+            <w:tcW w:w="1342" w:type="dxa"/>
             <w:vMerge/>
             <w:shd w:val="clear" w:color="auto" w:fill="C6D9F1"/>
           </w:tcPr>
@@ -20645,7 +20802,7 @@
       <w:tr>
         <w:tc>
           <w:tcPr>
-            <w:tcW w:w="819" w:type="dxa"/>
+            <w:tcW w:w="1154" w:type="dxa"/>
           </w:tcPr>
           <w:p>
             <w:pPr>
@@ -20657,14 +20814,43 @@
               <w:rPr>
                 <w:rFonts w:ascii="TH SarabunIT๙" w:eastAsia="Calibri" w:hAnsi="TH SarabunIT๙" w:cs="TH SarabunIT๙"/>
                 <w:color w:val="000000"/>
-                <w:sz w:val="28"/>
-              </w:rPr>
-            </w:pPr>
-          </w:p>
-        </w:tc>
-        <w:tc>
-          <w:tcPr>
-            <w:tcW w:w="2981" w:type="dxa"/>
+              </w:rPr>
+            </w:pPr>
+            <w:r>
+              <w:rPr>
+                <w:rFonts w:ascii="TH SarabunIT๙" w:eastAsia="Calibri" w:hAnsi="TH SarabunIT๙" w:cs="TH SarabunIT๙"/>
+                <w:color w:val="000000"/>
+              </w:rPr>
+              <w:t>{#</w:t>
+            </w:r>
+            <w:proofErr w:type="gramStart"/>
+            <w:r>
+              <w:rPr>
+                <w:rFonts w:ascii="TH SarabunIT๙" w:eastAsia="Calibri" w:hAnsi="TH SarabunIT๙" w:cs="TH SarabunIT๙"/>
+                <w:color w:val="000000"/>
+              </w:rPr>
+              <w:t>speakerCosts}</w:t>
+            </w:r>
+            <w:r>
+              <w:rPr>
+                <w:rFonts w:ascii="TH SarabunIT๙" w:eastAsia="Calibri" w:hAnsi="TH SarabunIT๙" w:cs="TH SarabunIT๙"/>
+                <w:color w:val="000000"/>
+              </w:rPr>
+              <w:t>{</w:t>
+            </w:r>
+            <w:proofErr w:type="gramEnd"/>
+            <w:r>
+              <w:rPr>
+                <w:rFonts w:ascii="TH SarabunIT๙" w:eastAsia="Calibri" w:hAnsi="TH SarabunIT๙" w:cs="TH SarabunIT๙"/>
+                <w:color w:val="000000"/>
+              </w:rPr>
+              <w:t>index}</w:t>
+            </w:r>
+          </w:p>
+        </w:tc>
+        <w:tc>
+          <w:tcPr>
+            <w:tcW w:w="3118" w:type="dxa"/>
           </w:tcPr>
           <w:p>
             <w:pPr>
@@ -20673,14 +20859,36 @@
               <w:rPr>
                 <w:rFonts w:ascii="TH SarabunIT๙" w:eastAsia="Calibri" w:hAnsi="TH SarabunIT๙" w:cs="TH SarabunIT๙"/>
                 <w:color w:val="000000"/>
-                <w:sz w:val="28"/>
-              </w:rPr>
-            </w:pPr>
-          </w:p>
-        </w:tc>
-        <w:tc>
-          <w:tcPr>
-            <w:tcW w:w="1729" w:type="dxa"/>
+              </w:rPr>
+            </w:pPr>
+            <w:r>
+              <w:rPr>
+                <w:rFonts w:ascii="TH SarabunIT๙" w:eastAsia="Calibri" w:hAnsi="TH SarabunIT๙" w:cs="TH SarabunIT๙"/>
+                <w:color w:val="000000"/>
+              </w:rPr>
+              <w:t>{</w:t>
+            </w:r>
+            <w:proofErr w:type="spellStart"/>
+            <w:r>
+              <w:rPr>
+                <w:rFonts w:ascii="TH SarabunIT๙" w:eastAsia="Calibri" w:hAnsi="TH SarabunIT๙" w:cs="TH SarabunIT๙"/>
+                <w:color w:val="000000"/>
+              </w:rPr>
+              <w:t>itemName</w:t>
+            </w:r>
+            <w:proofErr w:type="spellEnd"/>
+            <w:r>
+              <w:rPr>
+                <w:rFonts w:ascii="TH SarabunIT๙" w:eastAsia="Calibri" w:hAnsi="TH SarabunIT๙" w:cs="TH SarabunIT๙"/>
+                <w:color w:val="000000"/>
+              </w:rPr>
+              <w:t>}</w:t>
+            </w:r>
+          </w:p>
+        </w:tc>
+        <w:tc>
+          <w:tcPr>
+            <w:tcW w:w="1595" w:type="dxa"/>
           </w:tcPr>
           <w:p>
             <w:pPr>
@@ -20689,14 +20897,20 @@
               <w:rPr>
                 <w:rFonts w:ascii="TH SarabunIT๙" w:eastAsia="Calibri" w:hAnsi="TH SarabunIT๙" w:cs="TH SarabunIT๙"/>
                 <w:color w:val="000000"/>
-                <w:sz w:val="28"/>
-              </w:rPr>
-            </w:pPr>
-          </w:p>
-        </w:tc>
-        <w:tc>
-          <w:tcPr>
-            <w:tcW w:w="2240" w:type="dxa"/>
+              </w:rPr>
+            </w:pPr>
+            <w:r>
+              <w:rPr>
+                <w:rFonts w:ascii="TH SarabunIT๙" w:eastAsia="Calibri" w:hAnsi="TH SarabunIT๙" w:cs="TH SarabunIT๙"/>
+                <w:color w:val="000000"/>
+              </w:rPr>
+              <w:t>{hours}</w:t>
+            </w:r>
+          </w:p>
+        </w:tc>
+        <w:tc>
+          <w:tcPr>
+            <w:tcW w:w="2040" w:type="dxa"/>
           </w:tcPr>
           <w:p>
             <w:pPr>
@@ -20705,14 +20919,36 @@
               <w:rPr>
                 <w:rFonts w:ascii="TH SarabunIT๙" w:eastAsia="Calibri" w:hAnsi="TH SarabunIT๙" w:cs="TH SarabunIT๙"/>
                 <w:color w:val="000000"/>
-                <w:sz w:val="28"/>
-              </w:rPr>
-            </w:pPr>
-          </w:p>
-        </w:tc>
-        <w:tc>
-          <w:tcPr>
-            <w:tcW w:w="1075" w:type="dxa"/>
+              </w:rPr>
+            </w:pPr>
+            <w:r>
+              <w:rPr>
+                <w:rFonts w:ascii="TH SarabunIT๙" w:eastAsia="Calibri" w:hAnsi="TH SarabunIT๙" w:cs="TH SarabunIT๙"/>
+                <w:color w:val="000000"/>
+              </w:rPr>
+              <w:t>{</w:t>
+            </w:r>
+            <w:proofErr w:type="spellStart"/>
+            <w:r>
+              <w:rPr>
+                <w:rFonts w:ascii="TH SarabunIT๙" w:eastAsia="Calibri" w:hAnsi="TH SarabunIT๙" w:cs="TH SarabunIT๙"/>
+                <w:color w:val="000000"/>
+              </w:rPr>
+              <w:t>ratePerHourStr</w:t>
+            </w:r>
+            <w:proofErr w:type="spellEnd"/>
+            <w:r>
+              <w:rPr>
+                <w:rFonts w:ascii="TH SarabunIT๙" w:eastAsia="Calibri" w:hAnsi="TH SarabunIT๙" w:cs="TH SarabunIT๙"/>
+                <w:color w:val="000000"/>
+              </w:rPr>
+              <w:t>}</w:t>
+            </w:r>
+          </w:p>
+        </w:tc>
+        <w:tc>
+          <w:tcPr>
+            <w:tcW w:w="1037" w:type="dxa"/>
           </w:tcPr>
           <w:p>
             <w:pPr>
@@ -20721,14 +20957,20 @@
               <w:rPr>
                 <w:rFonts w:ascii="TH SarabunIT๙" w:eastAsia="Calibri" w:hAnsi="TH SarabunIT๙" w:cs="TH SarabunIT๙"/>
                 <w:color w:val="000000"/>
-                <w:sz w:val="28"/>
-              </w:rPr>
-            </w:pPr>
-          </w:p>
-        </w:tc>
-        <w:tc>
-          <w:tcPr>
-            <w:tcW w:w="1442" w:type="dxa"/>
+              </w:rPr>
+            </w:pPr>
+            <w:r>
+              <w:rPr>
+                <w:rFonts w:ascii="TH SarabunIT๙" w:eastAsia="Calibri" w:hAnsi="TH SarabunIT๙" w:cs="TH SarabunIT๙"/>
+                <w:color w:val="000000"/>
+              </w:rPr>
+              <w:t>{days}</w:t>
+            </w:r>
+          </w:p>
+        </w:tc>
+        <w:tc>
+          <w:tcPr>
+            <w:tcW w:w="1342" w:type="dxa"/>
           </w:tcPr>
           <w:p>
             <w:pPr>
@@ -20737,239 +20979,75 @@
               <w:rPr>
                 <w:rFonts w:ascii="TH SarabunIT๙" w:eastAsia="Calibri" w:hAnsi="TH SarabunIT๙" w:cs="TH SarabunIT๙"/>
                 <w:color w:val="000000"/>
-                <w:sz w:val="28"/>
-              </w:rPr>
-            </w:pPr>
+              </w:rPr>
+            </w:pPr>
+            <w:r>
+              <w:rPr>
+                <w:rFonts w:ascii="TH SarabunIT๙" w:eastAsia="Calibri" w:hAnsi="TH SarabunIT๙" w:cs="TH SarabunIT๙"/>
+                <w:color w:val="000000"/>
+              </w:rPr>
+              <w:t>{</w:t>
+            </w:r>
+            <w:proofErr w:type="spellStart"/>
+            <w:r>
+              <w:rPr>
+                <w:rFonts w:ascii="TH SarabunIT๙" w:eastAsia="Calibri" w:hAnsi="TH SarabunIT๙" w:cs="TH SarabunIT๙"/>
+                <w:color w:val="000000"/>
+              </w:rPr>
+              <w:t>rowTotal</w:t>
+            </w:r>
+            <w:proofErr w:type="spellEnd"/>
+            <w:r>
+              <w:rPr>
+                <w:rFonts w:ascii="TH SarabunIT๙" w:eastAsia="Calibri" w:hAnsi="TH SarabunIT๙" w:cs="TH SarabunIT๙"/>
+                <w:color w:val="000000"/>
+              </w:rPr>
+              <w:t>}{/</w:t>
+            </w:r>
+            <w:proofErr w:type="spellStart"/>
+            <w:r>
+              <w:rPr>
+                <w:rFonts w:ascii="TH SarabunIT๙" w:eastAsia="Calibri" w:hAnsi="TH SarabunIT๙" w:cs="TH SarabunIT๙"/>
+                <w:color w:val="000000"/>
+              </w:rPr>
+              <w:t>speakerCosts</w:t>
+            </w:r>
+            <w:proofErr w:type="spellEnd"/>
+            <w:r>
+              <w:rPr>
+                <w:rFonts w:ascii="TH SarabunIT๙" w:eastAsia="Calibri" w:hAnsi="TH SarabunIT๙" w:cs="TH SarabunIT๙"/>
+                <w:color w:val="000000"/>
+              </w:rPr>
+              <w:t>}</w:t>
+            </w:r>
           </w:p>
         </w:tc>
       </w:tr>
       <w:tr>
         <w:tc>
           <w:tcPr>
-            <w:tcW w:w="819" w:type="dxa"/>
-          </w:tcPr>
-          <w:p>
-            <w:pPr>
-              <w:tabs>
-                <w:tab w:val="left" w:pos="90"/>
-              </w:tabs>
-              <w:spacing w:after="0" w:line="240" w:lineRule="auto"/>
-              <w:ind w:left="180" w:hanging="180"/>
-              <w:rPr>
-                <w:rFonts w:ascii="TH SarabunIT๙" w:eastAsia="Calibri" w:hAnsi="TH SarabunIT๙" w:cs="TH SarabunIT๙"/>
+            <w:tcW w:w="8944" w:type="dxa"/>
+            <w:gridSpan w:val="5"/>
+          </w:tcPr>
+          <w:p>
+            <w:pPr>
+              <w:spacing w:after="0" w:line="240" w:lineRule="auto"/>
+              <w:jc w:val="right"/>
+              <w:rPr>
+                <w:rFonts w:ascii="TH SarabunIT๙" w:eastAsia="Calibri" w:hAnsi="TH SarabunIT๙" w:cs="TH SarabunIT๙"/>
+                <w:b/>
+                <w:bCs/>
                 <w:color w:val="000000"/>
                 <w:sz w:val="28"/>
               </w:rPr>
             </w:pPr>
-          </w:p>
-        </w:tc>
-        <w:tc>
-          <w:tcPr>
-            <w:tcW w:w="2981" w:type="dxa"/>
-          </w:tcPr>
-          <w:p>
-            <w:pPr>
-              <w:spacing w:after="0" w:line="240" w:lineRule="auto"/>
-              <w:jc w:val="center"/>
-              <w:rPr>
-                <w:rFonts w:ascii="TH SarabunIT๙" w:eastAsia="Calibri" w:hAnsi="TH SarabunIT๙" w:cs="TH SarabunIT๙"/>
+            <w:r>
+              <w:rPr>
+                <w:rFonts w:ascii="TH SarabunIT๙" w:eastAsia="Calibri" w:hAnsi="TH SarabunIT๙" w:cs="TH SarabunIT๙"/>
+                <w:b/>
+                <w:bCs/>
                 <w:color w:val="000000"/>
                 <w:sz w:val="28"/>
-              </w:rPr>
-            </w:pPr>
-          </w:p>
-        </w:tc>
-        <w:tc>
-          <w:tcPr>
-            <w:tcW w:w="1729" w:type="dxa"/>
-          </w:tcPr>
-          <w:p>
-            <w:pPr>
-              <w:spacing w:after="0" w:line="240" w:lineRule="auto"/>
-              <w:jc w:val="center"/>
-              <w:rPr>
-                <w:rFonts w:ascii="TH SarabunIT๙" w:eastAsia="Calibri" w:hAnsi="TH SarabunIT๙" w:cs="TH SarabunIT๙"/>
-                <w:color w:val="000000"/>
-                <w:sz w:val="28"/>
-              </w:rPr>
-            </w:pPr>
-          </w:p>
-        </w:tc>
-        <w:tc>
-          <w:tcPr>
-            <w:tcW w:w="2240" w:type="dxa"/>
-          </w:tcPr>
-          <w:p>
-            <w:pPr>
-              <w:spacing w:after="0" w:line="240" w:lineRule="auto"/>
-              <w:jc w:val="center"/>
-              <w:rPr>
-                <w:rFonts w:ascii="TH SarabunIT๙" w:eastAsia="Calibri" w:hAnsi="TH SarabunIT๙" w:cs="TH SarabunIT๙"/>
-                <w:color w:val="000000"/>
-                <w:sz w:val="28"/>
-              </w:rPr>
-            </w:pPr>
-          </w:p>
-        </w:tc>
-        <w:tc>
-          <w:tcPr>
-            <w:tcW w:w="1075" w:type="dxa"/>
-          </w:tcPr>
-          <w:p>
-            <w:pPr>
-              <w:spacing w:after="0" w:line="240" w:lineRule="auto"/>
-              <w:jc w:val="center"/>
-              <w:rPr>
-                <w:rFonts w:ascii="TH SarabunIT๙" w:eastAsia="Calibri" w:hAnsi="TH SarabunIT๙" w:cs="TH SarabunIT๙"/>
-                <w:color w:val="000000"/>
-                <w:sz w:val="28"/>
-              </w:rPr>
-            </w:pPr>
-          </w:p>
-        </w:tc>
-        <w:tc>
-          <w:tcPr>
-            <w:tcW w:w="1442" w:type="dxa"/>
-          </w:tcPr>
-          <w:p>
-            <w:pPr>
-              <w:spacing w:after="0" w:line="240" w:lineRule="auto"/>
-              <w:jc w:val="center"/>
-              <w:rPr>
-                <w:rFonts w:ascii="TH SarabunIT๙" w:eastAsia="Calibri" w:hAnsi="TH SarabunIT๙" w:cs="TH SarabunIT๙"/>
-                <w:color w:val="000000"/>
-                <w:sz w:val="28"/>
-              </w:rPr>
-            </w:pPr>
-          </w:p>
-        </w:tc>
-      </w:tr>
-      <w:tr>
-        <w:tc>
-          <w:tcPr>
-            <w:tcW w:w="819" w:type="dxa"/>
-          </w:tcPr>
-          <w:p>
-            <w:pPr>
-              <w:tabs>
-                <w:tab w:val="left" w:pos="90"/>
-              </w:tabs>
-              <w:spacing w:after="0" w:line="240" w:lineRule="auto"/>
-              <w:ind w:left="180" w:hanging="180"/>
-              <w:rPr>
-                <w:rFonts w:ascii="TH SarabunIT๙" w:eastAsia="Calibri" w:hAnsi="TH SarabunIT๙" w:cs="TH SarabunIT๙"/>
-                <w:color w:val="000000"/>
-                <w:sz w:val="28"/>
-              </w:rPr>
-            </w:pPr>
-          </w:p>
-        </w:tc>
-        <w:tc>
-          <w:tcPr>
-            <w:tcW w:w="2981" w:type="dxa"/>
-          </w:tcPr>
-          <w:p>
-            <w:pPr>
-              <w:spacing w:after="0" w:line="240" w:lineRule="auto"/>
-              <w:jc w:val="center"/>
-              <w:rPr>
-                <w:rFonts w:ascii="TH SarabunIT๙" w:eastAsia="Calibri" w:hAnsi="TH SarabunIT๙" w:cs="TH SarabunIT๙"/>
-                <w:color w:val="000000"/>
-                <w:sz w:val="28"/>
-              </w:rPr>
-            </w:pPr>
-          </w:p>
-        </w:tc>
-        <w:tc>
-          <w:tcPr>
-            <w:tcW w:w="1729" w:type="dxa"/>
-          </w:tcPr>
-          <w:p>
-            <w:pPr>
-              <w:spacing w:after="0" w:line="240" w:lineRule="auto"/>
-              <w:jc w:val="center"/>
-              <w:rPr>
-                <w:rFonts w:ascii="TH SarabunIT๙" w:eastAsia="Calibri" w:hAnsi="TH SarabunIT๙" w:cs="TH SarabunIT๙"/>
-                <w:color w:val="000000"/>
-                <w:sz w:val="28"/>
-              </w:rPr>
-            </w:pPr>
-          </w:p>
-        </w:tc>
-        <w:tc>
-          <w:tcPr>
-            <w:tcW w:w="2240" w:type="dxa"/>
-          </w:tcPr>
-          <w:p>
-            <w:pPr>
-              <w:spacing w:after="0" w:line="240" w:lineRule="auto"/>
-              <w:jc w:val="center"/>
-              <w:rPr>
-                <w:rFonts w:ascii="TH SarabunIT๙" w:eastAsia="Calibri" w:hAnsi="TH SarabunIT๙" w:cs="TH SarabunIT๙"/>
-                <w:color w:val="000000"/>
-                <w:sz w:val="28"/>
-              </w:rPr>
-            </w:pPr>
-          </w:p>
-        </w:tc>
-        <w:tc>
-          <w:tcPr>
-            <w:tcW w:w="1075" w:type="dxa"/>
-          </w:tcPr>
-          <w:p>
-            <w:pPr>
-              <w:spacing w:after="0" w:line="240" w:lineRule="auto"/>
-              <w:jc w:val="center"/>
-              <w:rPr>
-                <w:rFonts w:ascii="TH SarabunIT๙" w:eastAsia="Calibri" w:hAnsi="TH SarabunIT๙" w:cs="TH SarabunIT๙"/>
-                <w:color w:val="000000"/>
-                <w:sz w:val="28"/>
-              </w:rPr>
-            </w:pPr>
-          </w:p>
-        </w:tc>
-        <w:tc>
-          <w:tcPr>
-            <w:tcW w:w="1442" w:type="dxa"/>
-          </w:tcPr>
-          <w:p>
-            <w:pPr>
-              <w:spacing w:after="0" w:line="240" w:lineRule="auto"/>
-              <w:jc w:val="center"/>
-              <w:rPr>
-                <w:rFonts w:ascii="TH SarabunIT๙" w:eastAsia="Calibri" w:hAnsi="TH SarabunIT๙" w:cs="TH SarabunIT๙"/>
-                <w:color w:val="000000"/>
-                <w:sz w:val="28"/>
-              </w:rPr>
-            </w:pPr>
-          </w:p>
-        </w:tc>
-      </w:tr>
-      <w:tr>
-        <w:tc>
-          <w:tcPr>
-            <w:tcW w:w="8844" w:type="dxa"/>
-            <w:gridSpan w:val="5"/>
-          </w:tcPr>
-          <w:p>
-            <w:pPr>
-              <w:spacing w:after="0" w:line="240" w:lineRule="auto"/>
-              <w:jc w:val="right"/>
-              <w:rPr>
-                <w:rFonts w:ascii="TH SarabunIT๙" w:eastAsia="Calibri" w:hAnsi="TH SarabunIT๙" w:cs="TH SarabunIT๙"/>
-                <w:b/>
-                <w:bCs/>
-                <w:color w:val="000000"/>
-                <w:sz w:val="28"/>
-              </w:rPr>
-            </w:pPr>
-            <w:r>
-              <w:rPr>
-                <w:rFonts w:ascii="TH SarabunIT๙" w:eastAsia="Calibri" w:hAnsi="TH SarabunIT๙" w:cs="TH SarabunIT๙"/>
-                <w:b/>
-                <w:bCs/>
-                <w:color w:val="000000"/>
-                <w:sz w:val="28"/>
                 <w:cs/>
               </w:rPr>
               <w:t>รวมทั้งสิ้น</w:t>
@@ -20978,7 +21056,7 @@
         </w:tc>
         <w:tc>
           <w:tcPr>
-            <w:tcW w:w="1442" w:type="dxa"/>
+            <w:tcW w:w="1342" w:type="dxa"/>
           </w:tcPr>
           <w:p>
             <w:pPr>
@@ -21012,87 +21090,47 @@
           <w:szCs w:val="32"/>
           <w:cs/>
         </w:rPr>
-        <w:t>เหตุผลความจำเป็นที่ต้องใช้วิทยากรเชี่ยวชาญเฉพาะด้าน ...........................................................................................</w:t>
-      </w:r>
-      <w:r>
-        <w:rPr>
-          <w:rFonts w:ascii="TH SarabunIT๙" w:hAnsi="TH SarabunIT๙" w:cs="TH SarabunIT๙" w:hint="cs"/>
-          <w:color w:val="000000"/>
-          <w:sz w:val="32"/>
-          <w:szCs w:val="32"/>
-          <w:cs/>
-        </w:rPr>
-        <w:t>...</w:t>
+        <w:t xml:space="preserve">เหตุผลความจำเป็นที่ต้องใช้วิทยากรเชี่ยวชาญเฉพาะด้าน </w:t>
+      </w:r>
+      <w:r>
+        <w:rPr>
+          <w:rFonts w:ascii="TH SarabunIT๙" w:hAnsi="TH SarabunIT๙" w:cs="TH SarabunIT๙"/>
+          <w:color w:val="000000"/>
+          <w:sz w:val="32"/>
+          <w:szCs w:val="32"/>
+          <w:u w:val="dotted"/>
+        </w:rPr>
+        <w:t>{</w:t>
+      </w:r>
+      <w:proofErr w:type="spellStart"/>
+      <w:r>
+        <w:rPr>
+          <w:rFonts w:ascii="TH SarabunIT๙" w:hAnsi="TH SarabunIT๙" w:cs="TH SarabunIT๙"/>
+          <w:color w:val="000000"/>
+          <w:sz w:val="32"/>
+          <w:szCs w:val="32"/>
+          <w:u w:val="dotted"/>
+        </w:rPr>
+        <w:t>speakerReason</w:t>
+      </w:r>
+      <w:proofErr w:type="spellEnd"/>
+      <w:r>
+        <w:rPr>
+          <w:rFonts w:ascii="TH SarabunIT๙" w:hAnsi="TH SarabunIT๙" w:cs="TH SarabunIT๙"/>
+          <w:color w:val="000000"/>
+          <w:sz w:val="32"/>
+          <w:szCs w:val="32"/>
+          <w:u w:val="dotted"/>
+        </w:rPr>
+        <w:t>}</w:t>
       </w:r>
     </w:p>
     <w:p>
       <w:pPr>
-        <w:spacing w:after="0" w:line="240" w:lineRule="auto"/>
-        <w:rPr>
-          <w:rFonts w:ascii="TH SarabunIT๙" w:hAnsi="TH SarabunIT๙" w:cs="TH SarabunIT๙"/>
-          <w:color w:val="000000"/>
-          <w:sz w:val="32"/>
-          <w:szCs w:val="32"/>
-        </w:rPr>
-      </w:pPr>
-      <w:r>
-        <w:rPr>
-          <w:rFonts w:ascii="TH SarabunIT๙" w:hAnsi="TH SarabunIT๙" w:cs="TH SarabunIT๙"/>
-          <w:color w:val="000000"/>
-          <w:sz w:val="32"/>
-          <w:szCs w:val="32"/>
-          <w:cs/>
-        </w:rPr>
-        <w:t>.................................................................................................................................................................................</w:t>
-      </w:r>
-      <w:r>
-        <w:rPr>
-          <w:rFonts w:ascii="TH SarabunIT๙" w:hAnsi="TH SarabunIT๙" w:cs="TH SarabunIT๙" w:hint="cs"/>
-          <w:color w:val="000000"/>
-          <w:sz w:val="32"/>
-          <w:szCs w:val="32"/>
-          <w:cs/>
-        </w:rPr>
-        <w:t>........</w:t>
-      </w:r>
-    </w:p>
-    <w:p>
-      <w:pPr>
-        <w:spacing w:after="0" w:line="240" w:lineRule="auto"/>
-        <w:rPr>
-          <w:rFonts w:ascii="TH SarabunIT๙" w:hAnsi="TH SarabunIT๙" w:cs="TH SarabunIT๙"/>
-          <w:color w:val="000000"/>
-          <w:sz w:val="32"/>
-          <w:szCs w:val="32"/>
-        </w:rPr>
-      </w:pPr>
-      <w:r>
-        <w:rPr>
-          <w:rFonts w:ascii="TH SarabunIT๙" w:hAnsi="TH SarabunIT๙" w:cs="TH SarabunIT๙"/>
-          <w:color w:val="000000"/>
-          <w:sz w:val="32"/>
-          <w:szCs w:val="32"/>
-          <w:cs/>
-        </w:rPr>
-        <w:t>.................................................................................................................................................................................</w:t>
-      </w:r>
-      <w:r>
-        <w:rPr>
-          <w:rFonts w:ascii="TH SarabunIT๙" w:hAnsi="TH SarabunIT๙" w:cs="TH SarabunIT๙" w:hint="cs"/>
-          <w:color w:val="000000"/>
-          <w:sz w:val="32"/>
-          <w:szCs w:val="32"/>
-          <w:cs/>
-        </w:rPr>
-        <w:t>........</w:t>
-      </w:r>
-    </w:p>
-    <w:p>
-      <w:pPr>
         <w:spacing w:before="240" w:after="120" w:line="240" w:lineRule="auto"/>
         <w:jc w:val="center"/>
         <w:rPr>
-          <w:rFonts w:ascii="TH SarabunIT๙" w:hAnsi="TH SarabunIT๙" w:cs="TH SarabunIT๙"/>
+          <w:rFonts w:ascii="TH SarabunIT๙" w:hAnsi="TH SarabunIT๙" w:cs="TH SarabunIT๙" w:hint="cs"/>
           <w:b/>
           <w:bCs/>
           <w:color w:val="000000"/>
@@ -21129,13 +21167,13 @@
         <w:tblLook w:val="04A0" w:firstRow="1" w:lastRow="0" w:firstColumn="1" w:lastColumn="0" w:noHBand="0" w:noVBand="1"/>
       </w:tblPr>
       <w:tblGrid>
-        <w:gridCol w:w="819"/>
-        <w:gridCol w:w="2981"/>
-        <w:gridCol w:w="992"/>
-        <w:gridCol w:w="1417"/>
-        <w:gridCol w:w="1560"/>
-        <w:gridCol w:w="1075"/>
-        <w:gridCol w:w="1442"/>
+        <w:gridCol w:w="982"/>
+        <w:gridCol w:w="2758"/>
+        <w:gridCol w:w="1024"/>
+        <w:gridCol w:w="1392"/>
+        <w:gridCol w:w="1514"/>
+        <w:gridCol w:w="1041"/>
+        <w:gridCol w:w="1575"/>
       </w:tblGrid>
       <w:tr>
         <w:trPr>
@@ -21551,200 +21589,114 @@
               <w:rPr>
                 <w:rFonts w:ascii="TH SarabunIT๙" w:eastAsia="Calibri" w:hAnsi="TH SarabunIT๙" w:cs="TH SarabunIT๙"/>
                 <w:color w:val="000000"/>
-                <w:sz w:val="28"/>
-              </w:rPr>
-            </w:pPr>
-            <w:r>
-              <w:rPr>
-                <w:rFonts w:ascii="TH SarabunIT๙" w:eastAsia="Calibri" w:hAnsi="TH SarabunIT๙" w:cs="TH SarabunIT๙"/>
-                <w:color w:val="000000"/>
-                <w:sz w:val="28"/>
-                <w:cs/>
-              </w:rPr>
-              <w:t>1</w:t>
-            </w:r>
-            <w:r>
-              <w:rPr>
-                <w:rFonts w:ascii="TH SarabunIT๙" w:eastAsia="Calibri" w:hAnsi="TH SarabunIT๙" w:cs="TH SarabunIT๙" w:hint="cs"/>
-                <w:color w:val="000000"/>
-                <w:sz w:val="28"/>
-                <w:cs/>
-              </w:rPr>
-              <w:t>.</w:t>
-            </w:r>
-          </w:p>
-        </w:tc>
-        <w:tc>
-          <w:tcPr>
-            <w:tcW w:w="2981" w:type="dxa"/>
-          </w:tcPr>
-          <w:p>
-            <w:pPr>
-              <w:spacing w:after="0" w:line="240" w:lineRule="auto"/>
-              <w:rPr>
-                <w:rFonts w:ascii="TH SarabunIT๙" w:eastAsia="Calibri" w:hAnsi="TH SarabunIT๙" w:cs="TH SarabunIT๙"/>
-                <w:color w:val="000000"/>
-                <w:sz w:val="28"/>
-              </w:rPr>
-            </w:pPr>
-            <w:r>
-              <w:rPr>
-                <w:rFonts w:ascii="TH SarabunIT๙" w:eastAsia="Calibri" w:hAnsi="TH SarabunIT๙" w:cs="TH SarabunIT๙"/>
-                <w:color w:val="000000"/>
-                <w:sz w:val="28"/>
-                <w:cs/>
-              </w:rPr>
-              <w:t>ค่าอาหาร (ไม่ครบมื้อ)</w:t>
-            </w:r>
-          </w:p>
-        </w:tc>
-        <w:tc>
-          <w:tcPr>
-            <w:tcW w:w="992" w:type="dxa"/>
-          </w:tcPr>
-          <w:p>
-            <w:pPr>
-              <w:spacing w:after="0" w:line="240" w:lineRule="auto"/>
-              <w:jc w:val="center"/>
-              <w:rPr>
-                <w:rFonts w:ascii="TH SarabunIT๙" w:eastAsia="Calibri" w:hAnsi="TH SarabunIT๙" w:cs="TH SarabunIT๙"/>
-                <w:color w:val="000000"/>
-                <w:sz w:val="28"/>
-              </w:rPr>
-            </w:pPr>
-          </w:p>
-        </w:tc>
-        <w:tc>
-          <w:tcPr>
-            <w:tcW w:w="1417" w:type="dxa"/>
-          </w:tcPr>
-          <w:p>
-            <w:pPr>
-              <w:spacing w:after="0" w:line="240" w:lineRule="auto"/>
-              <w:jc w:val="center"/>
-              <w:rPr>
-                <w:rFonts w:ascii="TH SarabunIT๙" w:eastAsia="Calibri" w:hAnsi="TH SarabunIT๙" w:cs="TH SarabunIT๙"/>
-                <w:color w:val="000000"/>
-                <w:sz w:val="28"/>
-              </w:rPr>
-            </w:pPr>
-          </w:p>
-        </w:tc>
-        <w:tc>
-          <w:tcPr>
-            <w:tcW w:w="1560" w:type="dxa"/>
-          </w:tcPr>
-          <w:p>
-            <w:pPr>
-              <w:spacing w:after="0" w:line="240" w:lineRule="auto"/>
-              <w:jc w:val="center"/>
-              <w:rPr>
-                <w:rFonts w:ascii="TH SarabunIT๙" w:eastAsia="Calibri" w:hAnsi="TH SarabunIT๙" w:cs="TH SarabunIT๙"/>
-                <w:color w:val="000000"/>
-                <w:sz w:val="28"/>
-              </w:rPr>
-            </w:pPr>
-          </w:p>
-        </w:tc>
-        <w:tc>
-          <w:tcPr>
-            <w:tcW w:w="1075" w:type="dxa"/>
-          </w:tcPr>
-          <w:p>
-            <w:pPr>
-              <w:spacing w:after="0" w:line="240" w:lineRule="auto"/>
-              <w:jc w:val="center"/>
-              <w:rPr>
-                <w:rFonts w:ascii="TH SarabunIT๙" w:eastAsia="Calibri" w:hAnsi="TH SarabunIT๙" w:cs="TH SarabunIT๙"/>
-                <w:color w:val="000000"/>
-                <w:sz w:val="28"/>
-              </w:rPr>
-            </w:pPr>
-          </w:p>
-        </w:tc>
-        <w:tc>
-          <w:tcPr>
-            <w:tcW w:w="1442" w:type="dxa"/>
-          </w:tcPr>
-          <w:p>
-            <w:pPr>
-              <w:spacing w:after="0" w:line="240" w:lineRule="auto"/>
-              <w:jc w:val="center"/>
-              <w:rPr>
-                <w:rFonts w:ascii="TH SarabunIT๙" w:eastAsia="Calibri" w:hAnsi="TH SarabunIT๙" w:cs="TH SarabunIT๙"/>
-                <w:color w:val="000000"/>
-                <w:sz w:val="28"/>
-              </w:rPr>
-            </w:pPr>
-          </w:p>
-        </w:tc>
-      </w:tr>
-      <w:tr>
-        <w:tc>
-          <w:tcPr>
-            <w:tcW w:w="819" w:type="dxa"/>
-          </w:tcPr>
+              </w:rPr>
+            </w:pPr>
+            <w:r>
+              <w:rPr>
+                <w:rFonts w:ascii="TH SarabunIT๙" w:eastAsia="Calibri" w:hAnsi="TH SarabunIT๙" w:cs="TH SarabunIT๙"/>
+                <w:color w:val="000000"/>
+              </w:rPr>
+              <w:t>{#foodCosts}</w:t>
+            </w:r>
+          </w:p>
           <w:p>
             <w:pPr>
               <w:tabs>
                 <w:tab w:val="left" w:pos="90"/>
               </w:tabs>
               <w:spacing w:after="0" w:line="240" w:lineRule="auto"/>
-              <w:ind w:left="180" w:hanging="180"/>
+              <w:rPr>
+                <w:rFonts w:ascii="TH SarabunIT๙" w:eastAsia="Calibri" w:hAnsi="TH SarabunIT๙" w:cs="TH SarabunIT๙"/>
+                <w:color w:val="000000"/>
+              </w:rPr>
+            </w:pPr>
+            <w:r>
+              <w:rPr>
+                <w:rFonts w:ascii="TH SarabunIT๙" w:eastAsia="Calibri" w:hAnsi="TH SarabunIT๙" w:cs="TH SarabunIT๙"/>
+                <w:color w:val="000000"/>
+              </w:rPr>
+              <w:t>{index}</w:t>
+            </w:r>
+          </w:p>
+        </w:tc>
+        <w:tc>
+          <w:tcPr>
+            <w:tcW w:w="2981" w:type="dxa"/>
+          </w:tcPr>
+          <w:p>
+            <w:pPr>
+              <w:spacing w:after="0" w:line="240" w:lineRule="auto"/>
+              <w:rPr>
+                <w:rFonts w:ascii="TH SarabunIT๙" w:eastAsia="Calibri" w:hAnsi="TH SarabunIT๙" w:cs="TH SarabunIT๙" w:hint="cs"/>
+                <w:color w:val="000000"/>
+              </w:rPr>
+            </w:pPr>
+            <w:r>
+              <w:rPr>
+                <w:rFonts w:ascii="TH SarabunIT๙" w:eastAsia="Calibri" w:hAnsi="TH SarabunIT๙" w:cs="TH SarabunIT๙"/>
+                <w:color w:val="000000"/>
+              </w:rPr>
+              <w:t>{</w:t>
+            </w:r>
+            <w:proofErr w:type="spellStart"/>
+            <w:r>
+              <w:rPr>
+                <w:rFonts w:ascii="TH SarabunIT๙" w:eastAsia="Calibri" w:hAnsi="TH SarabunIT๙" w:cs="TH SarabunIT๙"/>
+                <w:color w:val="000000"/>
+              </w:rPr>
+              <w:t>itemName</w:t>
+            </w:r>
+            <w:proofErr w:type="spellEnd"/>
+            <w:r>
+              <w:rPr>
+                <w:rFonts w:ascii="TH SarabunIT๙" w:eastAsia="Calibri" w:hAnsi="TH SarabunIT๙" w:cs="TH SarabunIT๙"/>
+                <w:color w:val="000000"/>
+              </w:rPr>
+              <w:t>}</w:t>
+            </w:r>
+          </w:p>
+        </w:tc>
+        <w:tc>
+          <w:tcPr>
+            <w:tcW w:w="992" w:type="dxa"/>
+          </w:tcPr>
+          <w:p>
+            <w:pPr>
+              <w:spacing w:after="0" w:line="240" w:lineRule="auto"/>
               <w:jc w:val="center"/>
               <w:rPr>
                 <w:rFonts w:ascii="TH SarabunIT๙" w:eastAsia="Calibri" w:hAnsi="TH SarabunIT๙" w:cs="TH SarabunIT๙"/>
                 <w:color w:val="000000"/>
-                <w:sz w:val="28"/>
-              </w:rPr>
-            </w:pPr>
-            <w:r>
-              <w:rPr>
-                <w:rFonts w:ascii="TH SarabunIT๙" w:eastAsia="Calibri" w:hAnsi="TH SarabunIT๙" w:cs="TH SarabunIT๙"/>
-                <w:color w:val="000000"/>
-                <w:sz w:val="28"/>
-                <w:cs/>
-              </w:rPr>
-              <w:t>2</w:t>
-            </w:r>
-            <w:r>
-              <w:rPr>
-                <w:rFonts w:ascii="TH SarabunIT๙" w:eastAsia="Calibri" w:hAnsi="TH SarabunIT๙" w:cs="TH SarabunIT๙" w:hint="cs"/>
-                <w:color w:val="000000"/>
-                <w:sz w:val="28"/>
-                <w:cs/>
-              </w:rPr>
-              <w:t>.</w:t>
-            </w:r>
-          </w:p>
-        </w:tc>
-        <w:tc>
-          <w:tcPr>
-            <w:tcW w:w="2981" w:type="dxa"/>
-          </w:tcPr>
-          <w:p>
-            <w:pPr>
-              <w:spacing w:after="0" w:line="240" w:lineRule="auto"/>
-              <w:rPr>
-                <w:rFonts w:ascii="TH SarabunIT๙" w:eastAsia="Calibri" w:hAnsi="TH SarabunIT๙" w:cs="TH SarabunIT๙"/>
-                <w:color w:val="000000"/>
-                <w:sz w:val="28"/>
-              </w:rPr>
-            </w:pPr>
-            <w:r>
-              <w:rPr>
-                <w:rFonts w:ascii="TH SarabunIT๙" w:eastAsia="Calibri" w:hAnsi="TH SarabunIT๙" w:cs="TH SarabunIT๙"/>
-                <w:color w:val="000000"/>
-                <w:sz w:val="28"/>
-                <w:cs/>
-              </w:rPr>
-              <w:t>ค่าอาหารและเครื่องดื่ม</w:t>
-            </w:r>
-          </w:p>
-        </w:tc>
-        <w:tc>
-          <w:tcPr>
-            <w:tcW w:w="992" w:type="dxa"/>
+              </w:rPr>
+            </w:pPr>
+            <w:r>
+              <w:rPr>
+                <w:rFonts w:ascii="TH SarabunIT๙" w:eastAsia="Calibri" w:hAnsi="TH SarabunIT๙" w:cs="TH SarabunIT๙"/>
+                <w:color w:val="000000"/>
+              </w:rPr>
+              <w:t>{</w:t>
+            </w:r>
+            <w:proofErr w:type="spellStart"/>
+            <w:r>
+              <w:rPr>
+                <w:rFonts w:ascii="TH SarabunIT๙" w:eastAsia="Calibri" w:hAnsi="TH SarabunIT๙" w:cs="TH SarabunIT๙"/>
+                <w:color w:val="000000"/>
+              </w:rPr>
+              <w:t>mealsCount</w:t>
+            </w:r>
+            <w:proofErr w:type="spellEnd"/>
+            <w:r>
+              <w:rPr>
+                <w:rFonts w:ascii="TH SarabunIT๙" w:eastAsia="Calibri" w:hAnsi="TH SarabunIT๙" w:cs="TH SarabunIT๙"/>
+                <w:color w:val="000000"/>
+              </w:rPr>
+              <w:t>}</w:t>
+            </w:r>
+          </w:p>
+        </w:tc>
+        <w:tc>
+          <w:tcPr>
+            <w:tcW w:w="1417" w:type="dxa"/>
           </w:tcPr>
           <w:p>
             <w:pPr>
@@ -21753,14 +21705,36 @@
               <w:rPr>
                 <w:rFonts w:ascii="TH SarabunIT๙" w:eastAsia="Calibri" w:hAnsi="TH SarabunIT๙" w:cs="TH SarabunIT๙"/>
                 <w:color w:val="000000"/>
-                <w:sz w:val="28"/>
-              </w:rPr>
-            </w:pPr>
-          </w:p>
-        </w:tc>
-        <w:tc>
-          <w:tcPr>
-            <w:tcW w:w="1417" w:type="dxa"/>
+              </w:rPr>
+            </w:pPr>
+            <w:r>
+              <w:rPr>
+                <w:rFonts w:ascii="TH SarabunIT๙" w:eastAsia="Calibri" w:hAnsi="TH SarabunIT๙" w:cs="TH SarabunIT๙"/>
+                <w:color w:val="000000"/>
+              </w:rPr>
+              <w:t>{</w:t>
+            </w:r>
+            <w:proofErr w:type="spellStart"/>
+            <w:r>
+              <w:rPr>
+                <w:rFonts w:ascii="TH SarabunIT๙" w:eastAsia="Calibri" w:hAnsi="TH SarabunIT๙" w:cs="TH SarabunIT๙"/>
+                <w:color w:val="000000"/>
+              </w:rPr>
+              <w:t>ratePerMealStr</w:t>
+            </w:r>
+            <w:proofErr w:type="spellEnd"/>
+            <w:r>
+              <w:rPr>
+                <w:rFonts w:ascii="TH SarabunIT๙" w:eastAsia="Calibri" w:hAnsi="TH SarabunIT๙" w:cs="TH SarabunIT๙"/>
+                <w:color w:val="000000"/>
+              </w:rPr>
+              <w:t>}</w:t>
+            </w:r>
+          </w:p>
+        </w:tc>
+        <w:tc>
+          <w:tcPr>
+            <w:tcW w:w="1560" w:type="dxa"/>
           </w:tcPr>
           <w:p>
             <w:pPr>
@@ -21769,14 +21743,36 @@
               <w:rPr>
                 <w:rFonts w:ascii="TH SarabunIT๙" w:eastAsia="Calibri" w:hAnsi="TH SarabunIT๙" w:cs="TH SarabunIT๙"/>
                 <w:color w:val="000000"/>
-                <w:sz w:val="28"/>
-              </w:rPr>
-            </w:pPr>
-          </w:p>
-        </w:tc>
-        <w:tc>
-          <w:tcPr>
-            <w:tcW w:w="1560" w:type="dxa"/>
+              </w:rPr>
+            </w:pPr>
+            <w:r>
+              <w:rPr>
+                <w:rFonts w:ascii="TH SarabunIT๙" w:eastAsia="Calibri" w:hAnsi="TH SarabunIT๙" w:cs="TH SarabunIT๙"/>
+                <w:color w:val="000000"/>
+              </w:rPr>
+              <w:t>{</w:t>
+            </w:r>
+            <w:proofErr w:type="spellStart"/>
+            <w:r>
+              <w:rPr>
+                <w:rFonts w:ascii="TH SarabunIT๙" w:eastAsia="Calibri" w:hAnsi="TH SarabunIT๙" w:cs="TH SarabunIT๙"/>
+                <w:color w:val="000000"/>
+              </w:rPr>
+              <w:t>traineesCount</w:t>
+            </w:r>
+            <w:proofErr w:type="spellEnd"/>
+            <w:r>
+              <w:rPr>
+                <w:rFonts w:ascii="TH SarabunIT๙" w:eastAsia="Calibri" w:hAnsi="TH SarabunIT๙" w:cs="TH SarabunIT๙"/>
+                <w:color w:val="000000"/>
+              </w:rPr>
+              <w:t>}</w:t>
+            </w:r>
+          </w:p>
+        </w:tc>
+        <w:tc>
+          <w:tcPr>
+            <w:tcW w:w="1075" w:type="dxa"/>
           </w:tcPr>
           <w:p>
             <w:pPr>
@@ -21785,14 +21781,20 @@
               <w:rPr>
                 <w:rFonts w:ascii="TH SarabunIT๙" w:eastAsia="Calibri" w:hAnsi="TH SarabunIT๙" w:cs="TH SarabunIT๙"/>
                 <w:color w:val="000000"/>
-                <w:sz w:val="28"/>
-              </w:rPr>
-            </w:pPr>
-          </w:p>
-        </w:tc>
-        <w:tc>
-          <w:tcPr>
-            <w:tcW w:w="1075" w:type="dxa"/>
+              </w:rPr>
+            </w:pPr>
+            <w:r>
+              <w:rPr>
+                <w:rFonts w:ascii="TH SarabunIT๙" w:eastAsia="Calibri" w:hAnsi="TH SarabunIT๙" w:cs="TH SarabunIT๙"/>
+                <w:color w:val="000000"/>
+              </w:rPr>
+              <w:t>{days}</w:t>
+            </w:r>
+          </w:p>
+        </w:tc>
+        <w:tc>
+          <w:tcPr>
+            <w:tcW w:w="1442" w:type="dxa"/>
           </w:tcPr>
           <w:p>
             <w:pPr>
@@ -21801,141 +21803,47 @@
               <w:rPr>
                 <w:rFonts w:ascii="TH SarabunIT๙" w:eastAsia="Calibri" w:hAnsi="TH SarabunIT๙" w:cs="TH SarabunIT๙"/>
                 <w:color w:val="000000"/>
-                <w:sz w:val="28"/>
-              </w:rPr>
-            </w:pPr>
-          </w:p>
-        </w:tc>
-        <w:tc>
-          <w:tcPr>
-            <w:tcW w:w="1442" w:type="dxa"/>
-          </w:tcPr>
-          <w:p>
-            <w:pPr>
-              <w:spacing w:after="0" w:line="240" w:lineRule="auto"/>
-              <w:jc w:val="center"/>
-              <w:rPr>
-                <w:rFonts w:ascii="TH SarabunIT๙" w:eastAsia="Calibri" w:hAnsi="TH SarabunIT๙" w:cs="TH SarabunIT๙"/>
-                <w:color w:val="000000"/>
-                <w:sz w:val="28"/>
-              </w:rPr>
-            </w:pPr>
-          </w:p>
-        </w:tc>
-      </w:tr>
-      <w:tr>
-        <w:tc>
-          <w:tcPr>
-            <w:tcW w:w="819" w:type="dxa"/>
-          </w:tcPr>
-          <w:p>
-            <w:pPr>
-              <w:tabs>
-                <w:tab w:val="left" w:pos="90"/>
-              </w:tabs>
-              <w:spacing w:after="0" w:line="240" w:lineRule="auto"/>
-              <w:ind w:left="180" w:hanging="180"/>
-              <w:rPr>
-                <w:rFonts w:ascii="TH SarabunIT๙" w:eastAsia="Calibri" w:hAnsi="TH SarabunIT๙" w:cs="TH SarabunIT๙"/>
-                <w:color w:val="000000"/>
-                <w:sz w:val="28"/>
-              </w:rPr>
-            </w:pPr>
-          </w:p>
-        </w:tc>
-        <w:tc>
-          <w:tcPr>
-            <w:tcW w:w="2981" w:type="dxa"/>
-          </w:tcPr>
-          <w:p>
-            <w:pPr>
-              <w:spacing w:after="0" w:line="240" w:lineRule="auto"/>
-              <w:rPr>
-                <w:rFonts w:ascii="TH SarabunIT๙" w:eastAsia="Calibri" w:hAnsi="TH SarabunIT๙" w:cs="TH SarabunIT๙"/>
-                <w:color w:val="000000"/>
-                <w:sz w:val="28"/>
-              </w:rPr>
-            </w:pPr>
-          </w:p>
-        </w:tc>
-        <w:tc>
-          <w:tcPr>
-            <w:tcW w:w="992" w:type="dxa"/>
-          </w:tcPr>
-          <w:p>
-            <w:pPr>
-              <w:spacing w:after="0" w:line="240" w:lineRule="auto"/>
-              <w:jc w:val="center"/>
-              <w:rPr>
-                <w:rFonts w:ascii="TH SarabunIT๙" w:eastAsia="Calibri" w:hAnsi="TH SarabunIT๙" w:cs="TH SarabunIT๙"/>
-                <w:color w:val="000000"/>
-                <w:sz w:val="28"/>
-              </w:rPr>
-            </w:pPr>
-          </w:p>
-        </w:tc>
-        <w:tc>
-          <w:tcPr>
-            <w:tcW w:w="1417" w:type="dxa"/>
-          </w:tcPr>
-          <w:p>
-            <w:pPr>
-              <w:spacing w:after="0" w:line="240" w:lineRule="auto"/>
-              <w:jc w:val="center"/>
-              <w:rPr>
-                <w:rFonts w:ascii="TH SarabunIT๙" w:eastAsia="Calibri" w:hAnsi="TH SarabunIT๙" w:cs="TH SarabunIT๙"/>
-                <w:color w:val="000000"/>
-                <w:sz w:val="28"/>
-              </w:rPr>
-            </w:pPr>
-          </w:p>
-        </w:tc>
-        <w:tc>
-          <w:tcPr>
-            <w:tcW w:w="1560" w:type="dxa"/>
-          </w:tcPr>
-          <w:p>
-            <w:pPr>
-              <w:spacing w:after="0" w:line="240" w:lineRule="auto"/>
-              <w:jc w:val="center"/>
-              <w:rPr>
-                <w:rFonts w:ascii="TH SarabunIT๙" w:eastAsia="Calibri" w:hAnsi="TH SarabunIT๙" w:cs="TH SarabunIT๙"/>
-                <w:color w:val="000000"/>
-                <w:sz w:val="28"/>
-              </w:rPr>
-            </w:pPr>
-          </w:p>
-        </w:tc>
-        <w:tc>
-          <w:tcPr>
-            <w:tcW w:w="1075" w:type="dxa"/>
-          </w:tcPr>
-          <w:p>
-            <w:pPr>
-              <w:spacing w:after="0" w:line="240" w:lineRule="auto"/>
-              <w:jc w:val="center"/>
-              <w:rPr>
-                <w:rFonts w:ascii="TH SarabunIT๙" w:eastAsia="Calibri" w:hAnsi="TH SarabunIT๙" w:cs="TH SarabunIT๙"/>
-                <w:color w:val="000000"/>
-                <w:sz w:val="28"/>
-              </w:rPr>
-            </w:pPr>
-          </w:p>
-        </w:tc>
-        <w:tc>
-          <w:tcPr>
-            <w:tcW w:w="1442" w:type="dxa"/>
-          </w:tcPr>
-          <w:p>
-            <w:pPr>
-              <w:spacing w:after="0" w:line="240" w:lineRule="auto"/>
-              <w:jc w:val="center"/>
-              <w:rPr>
-                <w:rFonts w:ascii="TH SarabunIT๙" w:eastAsia="Calibri" w:hAnsi="TH SarabunIT๙" w:cs="TH SarabunIT๙"/>
-                <w:color w:val="000000"/>
-                <w:sz w:val="28"/>
-              </w:rPr>
-            </w:pPr>
+              </w:rPr>
+            </w:pPr>
+            <w:r>
+              <w:rPr>
+                <w:rFonts w:ascii="TH SarabunIT๙" w:eastAsia="Calibri" w:hAnsi="TH SarabunIT๙" w:cs="TH SarabunIT๙"/>
+                <w:color w:val="000000"/>
+              </w:rPr>
+              <w:t>{</w:t>
+            </w:r>
+            <w:proofErr w:type="spellStart"/>
+            <w:r>
+              <w:rPr>
+                <w:rFonts w:ascii="TH SarabunIT๙" w:eastAsia="Calibri" w:hAnsi="TH SarabunIT๙" w:cs="TH SarabunIT๙"/>
+                <w:color w:val="000000"/>
+              </w:rPr>
+              <w:t>rowTotal</w:t>
+            </w:r>
+            <w:proofErr w:type="spellEnd"/>
+            <w:r>
+              <w:rPr>
+                <w:rFonts w:ascii="TH SarabunIT๙" w:eastAsia="Calibri" w:hAnsi="TH SarabunIT๙" w:cs="TH SarabunIT๙"/>
+                <w:color w:val="000000"/>
+              </w:rPr>
+              <w:t>}{/</w:t>
+            </w:r>
+            <w:proofErr w:type="spellStart"/>
+            <w:r>
+              <w:rPr>
+                <w:rFonts w:ascii="TH SarabunIT๙" w:eastAsia="Calibri" w:hAnsi="TH SarabunIT๙" w:cs="TH SarabunIT๙"/>
+                <w:color w:val="000000"/>
+              </w:rPr>
+              <w:t>foodCosts</w:t>
+            </w:r>
+            <w:proofErr w:type="spellEnd"/>
+            <w:r>
+              <w:rPr>
+                <w:rFonts w:ascii="TH SarabunIT๙" w:eastAsia="Calibri" w:hAnsi="TH SarabunIT๙" w:cs="TH SarabunIT๙"/>
+                <w:color w:val="000000"/>
+              </w:rPr>
+              <w:t>}</w:t>
+            </w:r>
           </w:p>
         </w:tc>
       </w:tr>
@@ -22037,6 +21945,236 @@
           <w:cs/>
         </w:rPr>
         <w:t>ระเบียบกรุงเทพมหานครว่าด้วยค่าใช้จ่ายในการฝึกอบรม พ.ศ.2541</w:t>
+      </w:r>
+      <w:r>
+        <w:rPr>
+          <w:rFonts w:ascii="TH SarabunIT๙" w:hAnsi="TH SarabunIT๙" w:cs="TH SarabunIT๙"/>
+          <w:color w:val="000000"/>
+          <w:sz w:val="28"/>
+        </w:rPr>
+        <w:t xml:space="preserve"> </w:t>
+      </w:r>
+      <w:r>
+        <w:rPr>
+          <w:rFonts w:ascii="TH SarabunIT๙" w:hAnsi="TH SarabunIT๙" w:cs="TH SarabunIT๙"/>
+          <w:color w:val="000000"/>
+          <w:sz w:val="32"/>
+          <w:szCs w:val="32"/>
+        </w:rPr>
+        <w:t>{</w:t>
+      </w:r>
+      <w:r>
+        <w:rPr>
+          <w:rFonts w:ascii="TH SarabunIT๙" w:hAnsi="TH SarabunIT๙" w:cs="TH SarabunIT๙"/>
+          <w:color w:val="000000"/>
+          <w:sz w:val="32"/>
+          <w:szCs w:val="32"/>
+        </w:rPr>
+        <w:t>/</w:t>
+      </w:r>
+      <w:proofErr w:type="spellStart"/>
+      <w:r>
+        <w:rPr>
+          <w:rFonts w:ascii="TH SarabunIT๙" w:hAnsi="TH SarabunIT๙" w:cs="TH SarabunIT๙"/>
+          <w:color w:val="000000"/>
+          <w:sz w:val="32"/>
+          <w:szCs w:val="32"/>
+        </w:rPr>
+        <w:t>trainingCourses</w:t>
+      </w:r>
+      <w:proofErr w:type="spellEnd"/>
+      <w:r>
+        <w:rPr>
+          <w:rFonts w:ascii="TH SarabunIT๙" w:hAnsi="TH SarabunIT๙" w:cs="TH SarabunIT๙"/>
+          <w:color w:val="000000"/>
+          <w:sz w:val="32"/>
+          <w:szCs w:val="32"/>
+        </w:rPr>
+        <w:t>}</w:t>
+      </w:r>
+      <w:r>
+        <w:rPr>
+          <w:rFonts w:ascii="TH SarabunIT๙" w:hAnsi="TH SarabunIT๙" w:cs="TH SarabunIT๙"/>
+          <w:color w:val="000000"/>
+          <w:sz w:val="32"/>
+          <w:szCs w:val="32"/>
+        </w:rPr>
+        <w:t xml:space="preserve"> </w:t>
+      </w:r>
+      <w:r>
+        <w:rPr>
+          <w:rFonts w:ascii="TH SarabunIT๙" w:hAnsi="TH SarabunIT๙" w:cs="TH SarabunIT๙"/>
+          <w:color w:val="000000"/>
+          <w:sz w:val="32"/>
+          <w:szCs w:val="32"/>
+        </w:rPr>
+        <w:t>{</w:t>
+      </w:r>
+      <w:r>
+        <w:rPr>
+          <w:rFonts w:ascii="TH SarabunIT๙" w:hAnsi="TH SarabunIT๙" w:cs="TH SarabunIT๙"/>
+          <w:color w:val="000000"/>
+          <w:sz w:val="32"/>
+          <w:szCs w:val="32"/>
+        </w:rPr>
+        <w:t>/</w:t>
+      </w:r>
+      <w:proofErr w:type="spellStart"/>
+      <w:r>
+        <w:rPr>
+          <w:rFonts w:ascii="TH SarabunIT๙" w:hAnsi="TH SarabunIT๙" w:cs="TH SarabunIT๙"/>
+          <w:color w:val="000000"/>
+          <w:sz w:val="32"/>
+          <w:szCs w:val="32"/>
+        </w:rPr>
+        <w:t>hasTrainingCourses</w:t>
+      </w:r>
+      <w:proofErr w:type="spellEnd"/>
+      <w:r>
+        <w:rPr>
+          <w:rFonts w:ascii="TH SarabunIT๙" w:hAnsi="TH SarabunIT๙" w:cs="TH SarabunIT๙"/>
+          <w:color w:val="000000"/>
+          <w:sz w:val="32"/>
+          <w:szCs w:val="32"/>
+        </w:rPr>
+        <w:t>}</w:t>
+      </w:r>
+    </w:p>
+    <w:p>
+      <w:pPr>
+        <w:spacing w:after="0" w:line="240" w:lineRule="auto"/>
+        <w:jc w:val="center"/>
+        <w:rPr>
+          <w:rFonts w:ascii="TH SarabunIT๙" w:hAnsi="TH SarabunIT๙" w:cs="TH SarabunIT๙"/>
+          <w:color w:val="000000"/>
+          <w:sz w:val="32"/>
+          <w:szCs w:val="32"/>
+        </w:rPr>
+      </w:pPr>
+      <w:r>
+        <w:rPr>
+          <w:rFonts w:ascii="TH SarabunIT๙" w:hAnsi="TH SarabunIT๙" w:cs="TH SarabunIT๙"/>
+          <w:color w:val="000000"/>
+          <w:sz w:val="32"/>
+          <w:szCs w:val="32"/>
+        </w:rPr>
+        <w:t>{</w:t>
+      </w:r>
+      <w:r>
+        <w:rPr>
+          <w:rFonts w:ascii="TH SarabunIT๙" w:hAnsi="TH SarabunIT๙" w:cs="TH SarabunIT๙"/>
+          <w:color w:val="000000"/>
+          <w:sz w:val="32"/>
+          <w:szCs w:val="32"/>
+        </w:rPr>
+        <w:t>^</w:t>
+      </w:r>
+      <w:proofErr w:type="spellStart"/>
+      <w:r>
+        <w:rPr>
+          <w:rFonts w:ascii="TH SarabunIT๙" w:hAnsi="TH SarabunIT๙" w:cs="TH SarabunIT๙"/>
+          <w:color w:val="000000"/>
+          <w:sz w:val="32"/>
+          <w:szCs w:val="32"/>
+        </w:rPr>
+        <w:t>hasTrainingCourses</w:t>
+      </w:r>
+      <w:proofErr w:type="spellEnd"/>
+      <w:r>
+        <w:rPr>
+          <w:rFonts w:ascii="TH SarabunIT๙" w:hAnsi="TH SarabunIT๙" w:cs="TH SarabunIT๙"/>
+          <w:color w:val="000000"/>
+          <w:sz w:val="32"/>
+          <w:szCs w:val="32"/>
+        </w:rPr>
+        <w:t>}</w:t>
+      </w:r>
+      <w:r>
+        <w:rPr>
+          <w:rFonts w:ascii="TH SarabunIT๙" w:hAnsi="TH SarabunIT๙" w:cs="TH SarabunIT๙"/>
+          <w:color w:val="000000"/>
+          <w:sz w:val="32"/>
+          <w:szCs w:val="32"/>
+        </w:rPr>
+        <w:t>-</w:t>
+      </w:r>
+      <w:r>
+        <w:rPr>
+          <w:rFonts w:ascii="TH SarabunIT๙" w:hAnsi="TH SarabunIT๙" w:cs="TH SarabunIT๙" w:hint="cs"/>
+          <w:color w:val="000000"/>
+          <w:sz w:val="32"/>
+          <w:szCs w:val="32"/>
+          <w:cs/>
+        </w:rPr>
+        <w:t>ไม่มี</w:t>
+      </w:r>
+      <w:r>
+        <w:rPr>
+          <w:rFonts w:ascii="TH SarabunIT๙" w:hAnsi="TH SarabunIT๙" w:cs="TH SarabunIT๙" w:hint="cs"/>
+          <w:color w:val="000000"/>
+          <w:sz w:val="32"/>
+          <w:szCs w:val="32"/>
+          <w:cs/>
+        </w:rPr>
+        <w:t>ค่าใช้จ่าย</w:t>
+      </w:r>
+      <w:r>
+        <w:rPr>
+          <w:rFonts w:ascii="TH SarabunIT๙" w:hAnsi="TH SarabunIT๙" w:cs="TH SarabunIT๙"/>
+          <w:color w:val="000000"/>
+          <w:sz w:val="32"/>
+          <w:szCs w:val="32"/>
+          <w:cs/>
+        </w:rPr>
+        <w:t>การฝึกอบรม</w:t>
+      </w:r>
+      <w:r>
+        <w:rPr>
+          <w:rFonts w:ascii="TH SarabunIT๙" w:hAnsi="TH SarabunIT๙" w:cs="TH SarabunIT๙" w:hint="cs"/>
+          <w:color w:val="000000"/>
+          <w:sz w:val="32"/>
+          <w:szCs w:val="32"/>
+          <w:cs/>
+        </w:rPr>
+        <w:t>-</w:t>
+      </w:r>
+      <w:r>
+        <w:rPr>
+          <w:rFonts w:ascii="TH SarabunIT๙" w:hAnsi="TH SarabunIT๙" w:cs="TH SarabunIT๙"/>
+          <w:color w:val="000000"/>
+          <w:sz w:val="32"/>
+          <w:szCs w:val="32"/>
+        </w:rPr>
+        <w:t>{</w:t>
+      </w:r>
+      <w:r>
+        <w:rPr>
+          <w:rFonts w:ascii="TH SarabunIT๙" w:hAnsi="TH SarabunIT๙" w:cs="TH SarabunIT๙"/>
+          <w:color w:val="000000"/>
+          <w:sz w:val="32"/>
+          <w:szCs w:val="32"/>
+        </w:rPr>
+        <w:t>/</w:t>
+      </w:r>
+      <w:proofErr w:type="spellStart"/>
+      <w:r>
+        <w:rPr>
+          <w:rFonts w:ascii="TH SarabunIT๙" w:hAnsi="TH SarabunIT๙" w:cs="TH SarabunIT๙"/>
+          <w:color w:val="000000"/>
+          <w:sz w:val="32"/>
+          <w:szCs w:val="32"/>
+        </w:rPr>
+        <w:t>hasTrainingCourses</w:t>
+      </w:r>
+      <w:proofErr w:type="spellEnd"/>
+      <w:r>
+        <w:rPr>
+          <w:rFonts w:ascii="TH SarabunIT๙" w:hAnsi="TH SarabunIT๙" w:cs="TH SarabunIT๙"/>
+          <w:color w:val="000000"/>
+          <w:sz w:val="32"/>
+          <w:szCs w:val="32"/>
+        </w:rPr>
+        <w:t>}</w:t>
       </w:r>
     </w:p>
     <w:p>
@@ -23452,7 +23590,6 @@
           <w:szCs w:val="32"/>
           <w:cs/>
         </w:rPr>
-        <w:lastRenderedPageBreak/>
         <w:tab/>
       </w:r>
       <w:r>
@@ -23508,6 +23645,7 @@
           <w:sz w:val="32"/>
           <w:szCs w:val="32"/>
         </w:rPr>
+        <w:lastRenderedPageBreak/>
         <w:t>……………………………………………………………………………………………………………………………………………………………………………………………………………………………………………………………………………………………………………………</w:t>
       </w:r>
     </w:p>

</xml_diff>

<commit_message>
feat: Refactor user management components and hooks
- Updated UserToolbar to include department and role filters with new UI components.
- Replaced mock user data structure with a more detailed User interface.
- Removed old useUsers hook and created useUserManagement for better state management.
- Added UserHeader and UserManagementView components for improved layout and functionality.
- Implemented RoleModal and PasswordModal for user role and password management.
- Introduced a new Switch component for toggling active user status.
- Enhanced filtering and sorting logic in user management.
</commit_message>
<xml_diff>
--- a/public/templates/project-proposal.docx
+++ b/public/templates/project-proposal.docx
@@ -1797,25 +1797,19 @@
                 <w:sz w:val="30"/>
                 <w:szCs w:val="30"/>
               </w:rPr>
-              <w:t>%)</w:t>
-            </w:r>
-          </w:p>
-        </w:tc>
-        <w:tc>
-          <w:tcPr>
-            <w:tcW w:w="1701" w:type="dxa"/>
-          </w:tcPr>
-          <w:p>
-            <w:pPr>
-              <w:spacing w:after="0" w:line="240" w:lineRule="auto"/>
-              <w:jc w:val="center"/>
+              <w:t>{</w:t>
+            </w:r>
+            <w:proofErr w:type="spellStart"/>
+            <w:r>
               <w:rPr>
                 <w:rFonts w:ascii="TH SarabunIT๙" w:eastAsia="Calibri" w:hAnsi="TH SarabunIT๙" w:cs="TH SarabunIT๙"/>
                 <w:color w:val="000000"/>
                 <w:sz w:val="30"/>
                 <w:szCs w:val="30"/>
               </w:rPr>
-            </w:pPr>
+              <w:t>hwPercentStr</w:t>
+            </w:r>
+            <w:proofErr w:type="spellEnd"/>
             <w:r>
               <w:rPr>
                 <w:rFonts w:ascii="TH SarabunIT๙" w:eastAsia="Calibri" w:hAnsi="TH SarabunIT๙" w:cs="TH SarabunIT๙"/>
@@ -1823,9 +1817,8 @@
                 <w:sz w:val="30"/>
                 <w:szCs w:val="30"/>
               </w:rPr>
-              <w:t>{</w:t>
-            </w:r>
-            <w:proofErr w:type="spellStart"/>
+              <w:t>}</w:t>
+            </w:r>
             <w:r>
               <w:rPr>
                 <w:rFonts w:ascii="TH SarabunIT๙" w:eastAsia="Calibri" w:hAnsi="TH SarabunIT๙" w:cs="TH SarabunIT๙"/>
@@ -1833,40 +1826,45 @@
                 <w:sz w:val="30"/>
                 <w:szCs w:val="30"/>
               </w:rPr>
-              <w:t>totalSwCostStr</w:t>
-            </w:r>
-            <w:proofErr w:type="spellEnd"/>
-            <w:r>
+              <w:t>%)</w:t>
+            </w:r>
+          </w:p>
+        </w:tc>
+        <w:tc>
+          <w:tcPr>
+            <w:tcW w:w="1701" w:type="dxa"/>
+          </w:tcPr>
+          <w:p>
+            <w:pPr>
+              <w:spacing w:after="0" w:line="240" w:lineRule="auto"/>
+              <w:jc w:val="center"/>
               <w:rPr>
                 <w:rFonts w:ascii="TH SarabunIT๙" w:eastAsia="Calibri" w:hAnsi="TH SarabunIT๙" w:cs="TH SarabunIT๙"/>
                 <w:color w:val="000000"/>
                 <w:sz w:val="30"/>
                 <w:szCs w:val="30"/>
               </w:rPr>
-              <w:t>}</w:t>
-            </w:r>
-          </w:p>
-          <w:p>
-            <w:pPr>
-              <w:spacing w:after="0" w:line="240" w:lineRule="auto"/>
-              <w:jc w:val="center"/>
+            </w:pPr>
+            <w:r>
               <w:rPr>
                 <w:rFonts w:ascii="TH SarabunIT๙" w:eastAsia="Calibri" w:hAnsi="TH SarabunIT๙" w:cs="TH SarabunIT๙"/>
                 <w:color w:val="000000"/>
                 <w:sz w:val="30"/>
                 <w:szCs w:val="30"/>
               </w:rPr>
-            </w:pPr>
+              <w:t>{</w:t>
+            </w:r>
+            <w:proofErr w:type="spellStart"/>
             <w:r>
               <w:rPr>
                 <w:rFonts w:ascii="TH SarabunIT๙" w:eastAsia="Calibri" w:hAnsi="TH SarabunIT๙" w:cs="TH SarabunIT๙"/>
                 <w:color w:val="000000"/>
                 <w:sz w:val="30"/>
                 <w:szCs w:val="30"/>
-                <w:cs/>
-              </w:rPr>
-              <w:t>(</w:t>
-            </w:r>
+              </w:rPr>
+              <w:t>totalSwCostStr</w:t>
+            </w:r>
+            <w:proofErr w:type="spellEnd"/>
             <w:r>
               <w:rPr>
                 <w:rFonts w:ascii="TH SarabunIT๙" w:eastAsia="Calibri" w:hAnsi="TH SarabunIT๙" w:cs="TH SarabunIT๙"/>
@@ -1874,14 +1872,9 @@
                 <w:sz w:val="30"/>
                 <w:szCs w:val="30"/>
               </w:rPr>
-              <w:t>%)</w:t>
-            </w:r>
-          </w:p>
-        </w:tc>
-        <w:tc>
-          <w:tcPr>
-            <w:tcW w:w="1843" w:type="dxa"/>
-          </w:tcPr>
+              <w:t>}</w:t>
+            </w:r>
+          </w:p>
           <w:p>
             <w:pPr>
               <w:spacing w:after="0" w:line="240" w:lineRule="auto"/>
@@ -1899,10 +1892,10 @@
                 <w:color w:val="000000"/>
                 <w:sz w:val="30"/>
                 <w:szCs w:val="30"/>
-              </w:rPr>
-              <w:t>{</w:t>
-            </w:r>
-            <w:proofErr w:type="spellStart"/>
+                <w:cs/>
+              </w:rPr>
+              <w:t>(</w:t>
+            </w:r>
             <w:r>
               <w:rPr>
                 <w:rFonts w:ascii="TH SarabunIT๙" w:eastAsia="Calibri" w:hAnsi="TH SarabunIT๙" w:cs="TH SarabunIT๙"/>
@@ -1910,9 +1903,9 @@
                 <w:sz w:val="30"/>
                 <w:szCs w:val="30"/>
               </w:rPr>
-              <w:t>totalPersonnelCostStr</w:t>
-            </w:r>
-            <w:proofErr w:type="spellEnd"/>
+              <w:t>{</w:t>
+            </w:r>
+            <w:proofErr w:type="spellStart"/>
             <w:r>
               <w:rPr>
                 <w:rFonts w:ascii="TH SarabunIT๙" w:eastAsia="Calibri" w:hAnsi="TH SarabunIT๙" w:cs="TH SarabunIT๙"/>
@@ -1920,58 +1913,54 @@
                 <w:sz w:val="30"/>
                 <w:szCs w:val="30"/>
               </w:rPr>
-              <w:t>}</w:t>
-            </w:r>
-          </w:p>
-          <w:p>
-            <w:pPr>
-              <w:spacing w:after="0" w:line="240" w:lineRule="auto"/>
-              <w:jc w:val="center"/>
+              <w:t>swPercentStr</w:t>
+            </w:r>
+            <w:proofErr w:type="spellEnd"/>
+            <w:r>
               <w:rPr>
                 <w:rFonts w:ascii="TH SarabunIT๙" w:eastAsia="Calibri" w:hAnsi="TH SarabunIT๙" w:cs="TH SarabunIT๙"/>
                 <w:color w:val="000000"/>
                 <w:sz w:val="30"/>
                 <w:szCs w:val="30"/>
-                <w:cs/>
-              </w:rPr>
-            </w:pPr>
+              </w:rPr>
+              <w:t>}</w:t>
+            </w:r>
             <w:r>
               <w:rPr>
                 <w:rFonts w:ascii="TH SarabunIT๙" w:eastAsia="Calibri" w:hAnsi="TH SarabunIT๙" w:cs="TH SarabunIT๙"/>
                 <w:color w:val="000000"/>
                 <w:sz w:val="30"/>
                 <w:szCs w:val="30"/>
-                <w:cs/>
-              </w:rPr>
-              <w:t>(</w:t>
-            </w:r>
-            <w:r>
+              </w:rPr>
+              <w:t>%)</w:t>
+            </w:r>
+          </w:p>
+        </w:tc>
+        <w:tc>
+          <w:tcPr>
+            <w:tcW w:w="1843" w:type="dxa"/>
+          </w:tcPr>
+          <w:p>
+            <w:pPr>
+              <w:spacing w:after="0" w:line="240" w:lineRule="auto"/>
+              <w:jc w:val="center"/>
               <w:rPr>
                 <w:rFonts w:ascii="TH SarabunIT๙" w:eastAsia="Calibri" w:hAnsi="TH SarabunIT๙" w:cs="TH SarabunIT๙"/>
                 <w:color w:val="000000"/>
                 <w:sz w:val="30"/>
                 <w:szCs w:val="30"/>
               </w:rPr>
-              <w:t>%)</w:t>
-            </w:r>
-          </w:p>
-        </w:tc>
-        <w:tc>
-          <w:tcPr>
-            <w:tcW w:w="1559" w:type="dxa"/>
-          </w:tcPr>
-          <w:p>
-            <w:pPr>
-              <w:spacing w:after="0" w:line="240" w:lineRule="auto"/>
-              <w:jc w:val="center"/>
+            </w:pPr>
+            <w:r>
               <w:rPr>
                 <w:rFonts w:ascii="TH SarabunIT๙" w:eastAsia="Calibri" w:hAnsi="TH SarabunIT๙" w:cs="TH SarabunIT๙"/>
                 <w:color w:val="000000"/>
                 <w:sz w:val="30"/>
                 <w:szCs w:val="30"/>
-                <w:cs/>
-              </w:rPr>
-            </w:pPr>
+              </w:rPr>
+              <w:t>{</w:t>
+            </w:r>
+            <w:proofErr w:type="spellStart"/>
             <w:r>
               <w:rPr>
                 <w:rFonts w:ascii="TH SarabunIT๙" w:eastAsia="Calibri" w:hAnsi="TH SarabunIT๙" w:cs="TH SarabunIT๙"/>
@@ -1979,9 +1968,9 @@
                 <w:sz w:val="30"/>
                 <w:szCs w:val="30"/>
               </w:rPr>
-              <w:t>{</w:t>
-            </w:r>
-            <w:proofErr w:type="spellStart"/>
+              <w:t>totalPersonnelCostStr</w:t>
+            </w:r>
+            <w:proofErr w:type="spellEnd"/>
             <w:r>
               <w:rPr>
                 <w:rFonts w:ascii="TH SarabunIT๙" w:eastAsia="Calibri" w:hAnsi="TH SarabunIT๙" w:cs="TH SarabunIT๙"/>
@@ -1989,40 +1978,41 @@
                 <w:sz w:val="30"/>
                 <w:szCs w:val="30"/>
               </w:rPr>
-              <w:t>totalTrainingCostStr</w:t>
-            </w:r>
-            <w:proofErr w:type="spellEnd"/>
-            <w:r>
+              <w:t>}</w:t>
+            </w:r>
+          </w:p>
+          <w:p>
+            <w:pPr>
+              <w:spacing w:after="0" w:line="240" w:lineRule="auto"/>
+              <w:jc w:val="center"/>
               <w:rPr>
                 <w:rFonts w:ascii="TH SarabunIT๙" w:eastAsia="Calibri" w:hAnsi="TH SarabunIT๙" w:cs="TH SarabunIT๙"/>
                 <w:color w:val="000000"/>
                 <w:sz w:val="30"/>
                 <w:szCs w:val="30"/>
-              </w:rPr>
-              <w:t>}</w:t>
-            </w:r>
-          </w:p>
-          <w:p>
-            <w:pPr>
-              <w:spacing w:after="0" w:line="240" w:lineRule="auto"/>
-              <w:jc w:val="center"/>
+                <w:cs/>
+              </w:rPr>
+            </w:pPr>
+            <w:r>
               <w:rPr>
                 <w:rFonts w:ascii="TH SarabunIT๙" w:eastAsia="Calibri" w:hAnsi="TH SarabunIT๙" w:cs="TH SarabunIT๙"/>
                 <w:color w:val="000000"/>
                 <w:sz w:val="30"/>
                 <w:szCs w:val="30"/>
-              </w:rPr>
-            </w:pPr>
+                <w:cs/>
+              </w:rPr>
+              <w:t>(</w:t>
+            </w:r>
             <w:r>
               <w:rPr>
                 <w:rFonts w:ascii="TH SarabunIT๙" w:eastAsia="Calibri" w:hAnsi="TH SarabunIT๙" w:cs="TH SarabunIT๙"/>
                 <w:color w:val="000000"/>
                 <w:sz w:val="30"/>
                 <w:szCs w:val="30"/>
-                <w:cs/>
-              </w:rPr>
-              <w:t>(</w:t>
-            </w:r>
+              </w:rPr>
+              <w:t>{</w:t>
+            </w:r>
+            <w:proofErr w:type="spellStart"/>
             <w:r>
               <w:rPr>
                 <w:rFonts w:ascii="TH SarabunIT๙" w:eastAsia="Calibri" w:hAnsi="TH SarabunIT๙" w:cs="TH SarabunIT๙"/>
@@ -2030,26 +2020,18 @@
                 <w:sz w:val="30"/>
                 <w:szCs w:val="30"/>
               </w:rPr>
-              <w:t>%)</w:t>
-            </w:r>
-          </w:p>
-        </w:tc>
-        <w:tc>
-          <w:tcPr>
-            <w:tcW w:w="1559" w:type="dxa"/>
-          </w:tcPr>
-          <w:p>
-            <w:pPr>
-              <w:spacing w:after="0" w:line="240" w:lineRule="auto"/>
-              <w:jc w:val="center"/>
+              <w:t>personnelPercentStr</w:t>
+            </w:r>
+            <w:proofErr w:type="spellEnd"/>
+            <w:r>
               <w:rPr>
                 <w:rFonts w:ascii="TH SarabunIT๙" w:eastAsia="Calibri" w:hAnsi="TH SarabunIT๙" w:cs="TH SarabunIT๙"/>
                 <w:color w:val="000000"/>
                 <w:sz w:val="30"/>
                 <w:szCs w:val="30"/>
-                <w:cs/>
-              </w:rPr>
-            </w:pPr>
+              </w:rPr>
+              <w:t>}</w:t>
+            </w:r>
             <w:r>
               <w:rPr>
                 <w:rFonts w:ascii="TH SarabunIT๙" w:eastAsia="Calibri" w:hAnsi="TH SarabunIT๙" w:cs="TH SarabunIT๙"/>
@@ -2057,19 +2039,26 @@
                 <w:sz w:val="30"/>
                 <w:szCs w:val="30"/>
               </w:rPr>
-              <w:t>{</w:t>
-            </w:r>
-            <w:proofErr w:type="spellStart"/>
-            <w:r>
+              <w:t>%)</w:t>
+            </w:r>
+          </w:p>
+        </w:tc>
+        <w:tc>
+          <w:tcPr>
+            <w:tcW w:w="1559" w:type="dxa"/>
+          </w:tcPr>
+          <w:p>
+            <w:pPr>
+              <w:spacing w:after="0" w:line="240" w:lineRule="auto"/>
+              <w:jc w:val="center"/>
               <w:rPr>
                 <w:rFonts w:ascii="TH SarabunIT๙" w:eastAsia="Calibri" w:hAnsi="TH SarabunIT๙" w:cs="TH SarabunIT๙"/>
                 <w:color w:val="000000"/>
                 <w:sz w:val="30"/>
                 <w:szCs w:val="30"/>
-              </w:rPr>
-              <w:t>totalOtherITStr</w:t>
-            </w:r>
-            <w:proofErr w:type="spellEnd"/>
+                <w:cs/>
+              </w:rPr>
+            </w:pPr>
             <w:r>
               <w:rPr>
                 <w:rFonts w:ascii="TH SarabunIT๙" w:eastAsia="Calibri" w:hAnsi="TH SarabunIT๙" w:cs="TH SarabunIT๙"/>
@@ -2077,29 +2066,185 @@
                 <w:sz w:val="30"/>
                 <w:szCs w:val="30"/>
               </w:rPr>
-              <w:t>}</w:t>
-            </w:r>
-          </w:p>
-          <w:p>
-            <w:pPr>
-              <w:spacing w:after="0" w:line="240" w:lineRule="auto"/>
-              <w:jc w:val="center"/>
+              <w:t>{</w:t>
+            </w:r>
+            <w:proofErr w:type="spellStart"/>
+            <w:r>
               <w:rPr>
                 <w:rFonts w:ascii="TH SarabunIT๙" w:eastAsia="Calibri" w:hAnsi="TH SarabunIT๙" w:cs="TH SarabunIT๙"/>
                 <w:color w:val="000000"/>
                 <w:sz w:val="30"/>
                 <w:szCs w:val="30"/>
               </w:rPr>
-            </w:pPr>
+              <w:t>totalTrainingCostStr</w:t>
+            </w:r>
+            <w:proofErr w:type="spellEnd"/>
             <w:r>
               <w:rPr>
                 <w:rFonts w:ascii="TH SarabunIT๙" w:eastAsia="Calibri" w:hAnsi="TH SarabunIT๙" w:cs="TH SarabunIT๙"/>
                 <w:color w:val="000000"/>
                 <w:sz w:val="30"/>
                 <w:szCs w:val="30"/>
+              </w:rPr>
+              <w:t>}</w:t>
+            </w:r>
+          </w:p>
+          <w:p>
+            <w:pPr>
+              <w:spacing w:after="0" w:line="240" w:lineRule="auto"/>
+              <w:jc w:val="center"/>
+              <w:rPr>
+                <w:rFonts w:ascii="TH SarabunIT๙" w:eastAsia="Calibri" w:hAnsi="TH SarabunIT๙" w:cs="TH SarabunIT๙"/>
+                <w:color w:val="000000"/>
+                <w:sz w:val="30"/>
+                <w:szCs w:val="30"/>
+              </w:rPr>
+            </w:pPr>
+            <w:r>
+              <w:rPr>
+                <w:rFonts w:ascii="TH SarabunIT๙" w:eastAsia="Calibri" w:hAnsi="TH SarabunIT๙" w:cs="TH SarabunIT๙"/>
+                <w:color w:val="000000"/>
+                <w:sz w:val="30"/>
+                <w:szCs w:val="30"/>
                 <w:cs/>
               </w:rPr>
               <w:t>(</w:t>
+            </w:r>
+            <w:r>
+              <w:rPr>
+                <w:rFonts w:ascii="TH SarabunIT๙" w:eastAsia="Calibri" w:hAnsi="TH SarabunIT๙" w:cs="TH SarabunIT๙"/>
+                <w:color w:val="000000"/>
+                <w:sz w:val="30"/>
+                <w:szCs w:val="30"/>
+              </w:rPr>
+              <w:t>{</w:t>
+            </w:r>
+            <w:proofErr w:type="spellStart"/>
+            <w:r>
+              <w:rPr>
+                <w:rFonts w:ascii="TH SarabunIT๙" w:eastAsia="Calibri" w:hAnsi="TH SarabunIT๙" w:cs="TH SarabunIT๙"/>
+                <w:color w:val="000000"/>
+                <w:sz w:val="30"/>
+                <w:szCs w:val="30"/>
+              </w:rPr>
+              <w:t>trainingPercentStr</w:t>
+            </w:r>
+            <w:proofErr w:type="spellEnd"/>
+            <w:r>
+              <w:rPr>
+                <w:rFonts w:ascii="TH SarabunIT๙" w:eastAsia="Calibri" w:hAnsi="TH SarabunIT๙" w:cs="TH SarabunIT๙"/>
+                <w:color w:val="000000"/>
+                <w:sz w:val="30"/>
+                <w:szCs w:val="30"/>
+              </w:rPr>
+              <w:t>}</w:t>
+            </w:r>
+            <w:r>
+              <w:rPr>
+                <w:rFonts w:ascii="TH SarabunIT๙" w:eastAsia="Calibri" w:hAnsi="TH SarabunIT๙" w:cs="TH SarabunIT๙"/>
+                <w:color w:val="000000"/>
+                <w:sz w:val="30"/>
+                <w:szCs w:val="30"/>
+              </w:rPr>
+              <w:t>%)</w:t>
+            </w:r>
+          </w:p>
+        </w:tc>
+        <w:tc>
+          <w:tcPr>
+            <w:tcW w:w="1559" w:type="dxa"/>
+          </w:tcPr>
+          <w:p>
+            <w:pPr>
+              <w:spacing w:after="0" w:line="240" w:lineRule="auto"/>
+              <w:jc w:val="center"/>
+              <w:rPr>
+                <w:rFonts w:ascii="TH SarabunIT๙" w:eastAsia="Calibri" w:hAnsi="TH SarabunIT๙" w:cs="TH SarabunIT๙"/>
+                <w:color w:val="000000"/>
+                <w:sz w:val="30"/>
+                <w:szCs w:val="30"/>
+                <w:cs/>
+              </w:rPr>
+            </w:pPr>
+            <w:r>
+              <w:rPr>
+                <w:rFonts w:ascii="TH SarabunIT๙" w:eastAsia="Calibri" w:hAnsi="TH SarabunIT๙" w:cs="TH SarabunIT๙"/>
+                <w:color w:val="000000"/>
+                <w:sz w:val="30"/>
+                <w:szCs w:val="30"/>
+              </w:rPr>
+              <w:t>{</w:t>
+            </w:r>
+            <w:proofErr w:type="spellStart"/>
+            <w:r>
+              <w:rPr>
+                <w:rFonts w:ascii="TH SarabunIT๙" w:eastAsia="Calibri" w:hAnsi="TH SarabunIT๙" w:cs="TH SarabunIT๙"/>
+                <w:color w:val="000000"/>
+                <w:sz w:val="30"/>
+                <w:szCs w:val="30"/>
+              </w:rPr>
+              <w:t>totalOtherITStr</w:t>
+            </w:r>
+            <w:proofErr w:type="spellEnd"/>
+            <w:r>
+              <w:rPr>
+                <w:rFonts w:ascii="TH SarabunIT๙" w:eastAsia="Calibri" w:hAnsi="TH SarabunIT๙" w:cs="TH SarabunIT๙"/>
+                <w:color w:val="000000"/>
+                <w:sz w:val="30"/>
+                <w:szCs w:val="30"/>
+              </w:rPr>
+              <w:t>}</w:t>
+            </w:r>
+          </w:p>
+          <w:p>
+            <w:pPr>
+              <w:spacing w:after="0" w:line="240" w:lineRule="auto"/>
+              <w:jc w:val="center"/>
+              <w:rPr>
+                <w:rFonts w:ascii="TH SarabunIT๙" w:eastAsia="Calibri" w:hAnsi="TH SarabunIT๙" w:cs="TH SarabunIT๙"/>
+                <w:color w:val="000000"/>
+                <w:sz w:val="30"/>
+                <w:szCs w:val="30"/>
+              </w:rPr>
+            </w:pPr>
+            <w:r>
+              <w:rPr>
+                <w:rFonts w:ascii="TH SarabunIT๙" w:eastAsia="Calibri" w:hAnsi="TH SarabunIT๙" w:cs="TH SarabunIT๙"/>
+                <w:color w:val="000000"/>
+                <w:sz w:val="30"/>
+                <w:szCs w:val="30"/>
+                <w:cs/>
+              </w:rPr>
+              <w:t>(</w:t>
+            </w:r>
+            <w:r>
+              <w:rPr>
+                <w:rFonts w:ascii="TH SarabunIT๙" w:eastAsia="Calibri" w:hAnsi="TH SarabunIT๙" w:cs="TH SarabunIT๙"/>
+                <w:color w:val="000000"/>
+                <w:sz w:val="30"/>
+                <w:szCs w:val="30"/>
+              </w:rPr>
+              <w:t>{</w:t>
+            </w:r>
+            <w:proofErr w:type="spellStart"/>
+            <w:r>
+              <w:rPr>
+                <w:rFonts w:ascii="TH SarabunIT๙" w:eastAsia="Calibri" w:hAnsi="TH SarabunIT๙" w:cs="TH SarabunIT๙"/>
+                <w:color w:val="000000"/>
+                <w:sz w:val="30"/>
+                <w:szCs w:val="30"/>
+              </w:rPr>
+              <w:t>otherITPercentStr</w:t>
+            </w:r>
+            <w:proofErr w:type="spellEnd"/>
+            <w:r>
+              <w:rPr>
+                <w:rFonts w:ascii="TH SarabunIT๙" w:eastAsia="Calibri" w:hAnsi="TH SarabunIT๙" w:cs="TH SarabunIT๙"/>
+                <w:color w:val="000000"/>
+                <w:sz w:val="30"/>
+                <w:szCs w:val="30"/>
+              </w:rPr>
+              <w:t>}</w:t>
             </w:r>
             <w:r>
               <w:rPr>
@@ -2569,7 +2714,6 @@
           <w:szCs w:val="32"/>
           <w:cs/>
         </w:rPr>
-        <w:lastRenderedPageBreak/>
         <w:t>๕. การพิจารณาของคณะกรรมการ</w:t>
       </w:r>
       <w:r>
@@ -4376,6 +4520,7 @@
           <w:szCs w:val="32"/>
           <w:cs/>
         </w:rPr>
+        <w:lastRenderedPageBreak/>
         <w:t>๖</w:t>
       </w:r>
       <w:r>
@@ -4412,7 +4557,6 @@
           <w:sz w:val="32"/>
           <w:szCs w:val="32"/>
         </w:rPr>
-        <w:lastRenderedPageBreak/>
         <w:tab/>
       </w:r>
       <w:r>
@@ -6793,6 +6937,7 @@
           <w:szCs w:val="32"/>
           <w:cs/>
         </w:rPr>
+        <w:lastRenderedPageBreak/>
         <w:t>แผนงานการพัฒนากรุงเทพมหานคร</w:t>
       </w:r>
       <w:r>
@@ -6897,7 +7042,6 @@
           <w:szCs w:val="32"/>
           <w:cs/>
         </w:rPr>
-        <w:lastRenderedPageBreak/>
         <w:t>ประเด็นการพัฒนา</w:t>
       </w:r>
       <w:r>
@@ -11373,6 +11517,7 @@
                 <w:szCs w:val="24"/>
                 <w:cs/>
               </w:rPr>
+              <w:lastRenderedPageBreak/>
               <w:t>ใช้ของบริษัท</w:t>
             </w:r>
             <w:r>
@@ -11482,7 +11627,6 @@
                 <w:szCs w:val="24"/>
                 <w:cs/>
               </w:rPr>
-              <w:lastRenderedPageBreak/>
               <w:t>โครงการ</w:t>
             </w:r>
             <w:r>
@@ -14027,6 +14171,7 @@
           <w:sz w:val="24"/>
           <w:szCs w:val="24"/>
         </w:rPr>
+        <w:lastRenderedPageBreak/>
         <w:t>(</w:t>
       </w:r>
       <w:r>
@@ -14189,7 +14334,6 @@
           <w:szCs w:val="24"/>
           <w:cs/>
         </w:rPr>
-        <w:lastRenderedPageBreak/>
         <w:tab/>
       </w:r>
       <w:r>
@@ -17346,6 +17490,7 @@
           <w:sz w:val="24"/>
           <w:szCs w:val="24"/>
         </w:rPr>
+        <w:lastRenderedPageBreak/>
         <w:t>{/</w:t>
       </w:r>
       <w:proofErr w:type="spellStart"/>
@@ -17638,7 +17783,6 @@
                 <w:szCs w:val="22"/>
                 <w:cs/>
               </w:rPr>
-              <w:lastRenderedPageBreak/>
               <w:t>บุคลากรสนับสนุน</w:t>
             </w:r>
           </w:p>
@@ -19477,10 +19621,11 @@
         <w:spacing w:after="120" w:line="240" w:lineRule="auto"/>
         <w:jc w:val="thaiDistribute"/>
         <w:rPr>
-          <w:rFonts w:ascii="TH SarabunIT๙" w:hAnsi="TH SarabunIT๙" w:cs="TH SarabunIT๙"/>
-          <w:color w:val="000000"/>
-          <w:sz w:val="32"/>
-          <w:szCs w:val="32"/>
+          <w:rFonts w:ascii="TH SarabunIT๙" w:hAnsi="TH SarabunIT๙" w:cs="TH SarabunIT๙" w:hint="cs"/>
+          <w:color w:val="000000"/>
+          <w:sz w:val="32"/>
+          <w:szCs w:val="32"/>
+          <w:cs/>
         </w:rPr>
       </w:pPr>
       <w:r>
@@ -20372,9 +20517,35 @@
               <w:rPr>
                 <w:rFonts w:ascii="TH SarabunIT๙" w:eastAsia="Calibri" w:hAnsi="TH SarabunIT๙" w:cs="TH SarabunIT๙"/>
                 <w:color w:val="000000"/>
-                <w:sz w:val="28"/>
-              </w:rPr>
-            </w:pPr>
+                <w:szCs w:val="14"/>
+              </w:rPr>
+            </w:pPr>
+            <w:r>
+              <w:rPr>
+                <w:rFonts w:ascii="TH SarabunIT๙" w:eastAsia="Calibri" w:hAnsi="TH SarabunIT๙" w:cs="TH SarabunIT๙"/>
+                <w:color w:val="000000"/>
+                <w:szCs w:val="14"/>
+              </w:rPr>
+              <w:t>{</w:t>
+            </w:r>
+            <w:proofErr w:type="spellStart"/>
+            <w:r>
+              <w:rPr>
+                <w:rFonts w:ascii="TH SarabunIT๙" w:eastAsia="Calibri" w:hAnsi="TH SarabunIT๙" w:cs="TH SarabunIT๙"/>
+                <w:color w:val="000000"/>
+                <w:szCs w:val="14"/>
+              </w:rPr>
+              <w:t>speakerTotalStr</w:t>
+            </w:r>
+            <w:proofErr w:type="spellEnd"/>
+            <w:r>
+              <w:rPr>
+                <w:rFonts w:ascii="TH SarabunIT๙" w:eastAsia="Calibri" w:hAnsi="TH SarabunIT๙" w:cs="TH SarabunIT๙"/>
+                <w:color w:val="000000"/>
+                <w:szCs w:val="14"/>
+              </w:rPr>
+              <w:t>}</w:t>
+            </w:r>
           </w:p>
         </w:tc>
       </w:tr>
@@ -20456,6 +20627,7 @@
           <w:szCs w:val="32"/>
           <w:cs/>
         </w:rPr>
+        <w:lastRenderedPageBreak/>
         <w:t>ตารางค่าอาหาร อาหารว่างและเครื่องดื่ม</w:t>
       </w:r>
     </w:p>
@@ -21198,9 +21370,41 @@
                 <w:b/>
                 <w:bCs/>
                 <w:color w:val="000000"/>
-                <w:sz w:val="28"/>
-              </w:rPr>
-            </w:pPr>
+                <w:szCs w:val="14"/>
+              </w:rPr>
+            </w:pPr>
+            <w:r>
+              <w:rPr>
+                <w:rFonts w:ascii="TH SarabunIT๙" w:eastAsia="Calibri" w:hAnsi="TH SarabunIT๙" w:cs="TH SarabunIT๙"/>
+                <w:b/>
+                <w:bCs/>
+                <w:color w:val="000000"/>
+                <w:szCs w:val="14"/>
+              </w:rPr>
+              <w:t>{</w:t>
+            </w:r>
+            <w:proofErr w:type="spellStart"/>
+            <w:r>
+              <w:rPr>
+                <w:rFonts w:ascii="TH SarabunIT๙" w:eastAsia="Calibri" w:hAnsi="TH SarabunIT๙" w:cs="TH SarabunIT๙"/>
+                <w:b/>
+                <w:bCs/>
+                <w:color w:val="000000"/>
+                <w:szCs w:val="14"/>
+              </w:rPr>
+              <w:t>foodTotalStr</w:t>
+            </w:r>
+            <w:proofErr w:type="spellEnd"/>
+            <w:r>
+              <w:rPr>
+                <w:rFonts w:ascii="TH SarabunIT๙" w:eastAsia="Calibri" w:hAnsi="TH SarabunIT๙" w:cs="TH SarabunIT๙"/>
+                <w:b/>
+                <w:bCs/>
+                <w:color w:val="000000"/>
+                <w:szCs w:val="14"/>
+              </w:rPr>
+              <w:t>}</w:t>
+            </w:r>
           </w:p>
         </w:tc>
       </w:tr>
@@ -23612,6 +23816,7 @@
           <w:szCs w:val="32"/>
           <w:cs/>
         </w:rPr>
+        <w:lastRenderedPageBreak/>
         <w:t>๑</w:t>
       </w:r>
       <w:r>
@@ -23676,7 +23881,6 @@
           <w:szCs w:val="32"/>
           <w:cs/>
         </w:rPr>
-        <w:lastRenderedPageBreak/>
         <w:t>ข้อมูลผู้ขอใช้บริการ</w:t>
       </w:r>
     </w:p>

</xml_diff>

<commit_message>
feat(profile): update user profile structure and enhance UI components
</commit_message>
<xml_diff>
--- a/public/templates/project-proposal.docx
+++ b/public/templates/project-proposal.docx
@@ -212,7 +212,7 @@
       <w:pPr>
         <w:spacing w:before="240" w:after="0" w:line="240" w:lineRule="auto"/>
         <w:rPr>
-          <w:rFonts w:ascii="TH SarabunIT๙" w:hAnsi="TH SarabunIT๙" w:cs="TH SarabunIT๙" w:hint="cs"/>
+          <w:rFonts w:ascii="TH SarabunIT๙" w:hAnsi="TH SarabunIT๙" w:cs="TH SarabunIT๙"/>
           <w:color w:val="000000"/>
           <w:sz w:val="32"/>
           <w:szCs w:val="32"/>
@@ -14810,7 +14810,7 @@
               <w:spacing w:after="0" w:line="240" w:lineRule="auto"/>
               <w:jc w:val="center"/>
               <w:rPr>
-                <w:rFonts w:ascii="TH SarabunIT๙" w:eastAsia="Calibri" w:hAnsi="TH SarabunIT๙" w:cs="TH SarabunIT๙" w:hint="cs"/>
+                <w:rFonts w:ascii="TH SarabunIT๙" w:eastAsia="Calibri" w:hAnsi="TH SarabunIT๙" w:cs="TH SarabunIT๙"/>
                 <w:b/>
                 <w:bCs/>
                 <w:color w:val="000000"/>
@@ -19621,7 +19621,7 @@
         <w:spacing w:after="120" w:line="240" w:lineRule="auto"/>
         <w:jc w:val="thaiDistribute"/>
         <w:rPr>
-          <w:rFonts w:ascii="TH SarabunIT๙" w:hAnsi="TH SarabunIT๙" w:cs="TH SarabunIT๙" w:hint="cs"/>
+          <w:rFonts w:ascii="TH SarabunIT๙" w:hAnsi="TH SarabunIT๙" w:cs="TH SarabunIT๙"/>
           <w:color w:val="000000"/>
           <w:sz w:val="32"/>
           <w:szCs w:val="32"/>
@@ -19799,7 +19799,7 @@
       <w:pPr>
         <w:spacing w:before="120" w:after="0" w:line="240" w:lineRule="auto"/>
         <w:rPr>
-          <w:rFonts w:ascii="TH SarabunIT๙" w:hAnsi="TH SarabunIT๙" w:cs="TH SarabunIT๙" w:hint="cs"/>
+          <w:rFonts w:ascii="TH SarabunIT๙" w:hAnsi="TH SarabunIT๙" w:cs="TH SarabunIT๙"/>
           <w:b/>
           <w:bCs/>
           <w:color w:val="000000"/>
@@ -20608,7 +20608,7 @@
         <w:spacing w:before="240" w:after="120" w:line="240" w:lineRule="auto"/>
         <w:jc w:val="center"/>
         <w:rPr>
-          <w:rFonts w:ascii="TH SarabunIT๙" w:hAnsi="TH SarabunIT๙" w:cs="TH SarabunIT๙" w:hint="cs"/>
+          <w:rFonts w:ascii="TH SarabunIT๙" w:hAnsi="TH SarabunIT๙" w:cs="TH SarabunIT๙"/>
           <w:b/>
           <w:bCs/>
           <w:color w:val="000000"/>
@@ -20698,7 +20698,7 @@
               <w:spacing w:after="0" w:line="240" w:lineRule="auto"/>
               <w:jc w:val="center"/>
               <w:rPr>
-                <w:rFonts w:ascii="TH SarabunIT๙" w:eastAsia="Calibri" w:hAnsi="TH SarabunIT๙" w:cs="TH SarabunIT๙" w:hint="cs"/>
+                <w:rFonts w:ascii="TH SarabunIT๙" w:eastAsia="Calibri" w:hAnsi="TH SarabunIT๙" w:cs="TH SarabunIT๙"/>
                 <w:b/>
                 <w:bCs/>
                 <w:color w:val="000000"/>
@@ -21818,7 +21818,7 @@
               <w:spacing w:after="0" w:line="240" w:lineRule="auto"/>
               <w:jc w:val="center"/>
               <w:rPr>
-                <w:rFonts w:ascii="TH SarabunIT๙" w:eastAsia="Calibri" w:hAnsi="TH SarabunIT๙" w:cs="TH SarabunIT๙" w:hint="cs"/>
+                <w:rFonts w:ascii="TH SarabunIT๙" w:eastAsia="Calibri" w:hAnsi="TH SarabunIT๙" w:cs="TH SarabunIT๙"/>
                 <w:b/>
                 <w:bCs/>
                 <w:color w:val="000000"/>
@@ -22500,7 +22500,7 @@
               <w:spacing w:after="0" w:line="240" w:lineRule="auto"/>
               <w:jc w:val="right"/>
               <w:rPr>
-                <w:rFonts w:ascii="TH SarabunIT๙" w:eastAsia="Calibri" w:hAnsi="TH SarabunIT๙" w:cs="TH SarabunIT๙" w:hint="cs"/>
+                <w:rFonts w:ascii="TH SarabunIT๙" w:eastAsia="Calibri" w:hAnsi="TH SarabunIT๙" w:cs="TH SarabunIT๙"/>
                 <w:b/>
                 <w:bCs/>
                 <w:color w:val="000000"/>
@@ -22596,7 +22596,7 @@
               <w:spacing w:after="0" w:line="240" w:lineRule="auto"/>
               <w:jc w:val="right"/>
               <w:rPr>
-                <w:rFonts w:ascii="TH SarabunIT๙" w:eastAsia="Calibri" w:hAnsi="TH SarabunIT๙" w:cs="TH SarabunIT๙" w:hint="cs"/>
+                <w:rFonts w:ascii="TH SarabunIT๙" w:eastAsia="Calibri" w:hAnsi="TH SarabunIT๙" w:cs="TH SarabunIT๙"/>
                 <w:b/>
                 <w:bCs/>
                 <w:color w:val="000000"/>
@@ -22822,7 +22822,7 @@
         <w:spacing w:before="240" w:after="0" w:line="240" w:lineRule="auto"/>
         <w:ind w:firstLine="720"/>
         <w:rPr>
-          <w:rFonts w:ascii="TH SarabunIT๙" w:hAnsi="TH SarabunIT๙" w:cs="TH SarabunIT๙" w:hint="cs"/>
+          <w:rFonts w:ascii="TH SarabunIT๙" w:hAnsi="TH SarabunIT๙" w:cs="TH SarabunIT๙"/>
           <w:color w:val="000000"/>
           <w:sz w:val="32"/>
           <w:szCs w:val="32"/>
@@ -23011,7 +23011,7 @@
               <w:spacing w:before="120" w:after="120" w:line="240" w:lineRule="auto"/>
               <w:jc w:val="center"/>
               <w:rPr>
-                <w:rFonts w:ascii="TH SarabunIT๙" w:hAnsi="TH SarabunIT๙" w:cs="TH SarabunIT๙" w:hint="cs"/>
+                <w:rFonts w:ascii="TH SarabunIT๙" w:hAnsi="TH SarabunIT๙" w:cs="TH SarabunIT๙"/>
                 <w:b/>
                 <w:bCs/>
                 <w:color w:val="000000"/>
@@ -23336,7 +23336,7 @@
         </w:tabs>
         <w:spacing w:after="0" w:line="240" w:lineRule="auto"/>
         <w:rPr>
-          <w:rFonts w:ascii="TH SarabunIT๙" w:hAnsi="TH SarabunIT๙" w:cs="TH SarabunIT๙" w:hint="cs"/>
+          <w:rFonts w:ascii="TH SarabunIT๙" w:hAnsi="TH SarabunIT๙" w:cs="TH SarabunIT๙"/>
           <w:color w:val="000000"/>
           <w:sz w:val="32"/>
           <w:szCs w:val="32"/>
@@ -23561,7 +23561,7 @@
       <w:pPr>
         <w:spacing w:before="240" w:after="0" w:line="240" w:lineRule="auto"/>
         <w:rPr>
-          <w:rFonts w:ascii="TH SarabunIT๙" w:hAnsi="TH SarabunIT๙" w:cs="TH SarabunIT๙" w:hint="cs"/>
+          <w:rFonts w:ascii="TH SarabunIT๙" w:hAnsi="TH SarabunIT๙" w:cs="TH SarabunIT๙"/>
           <w:b/>
           <w:bCs/>
           <w:color w:val="000000"/>
@@ -23881,7 +23881,18 @@
           <w:szCs w:val="32"/>
           <w:cs/>
         </w:rPr>
-        <w:t>ข้อมูลผู้ขอใช้บริการ</w:t>
+        <w:t xml:space="preserve">รายละเอียดการขอใช้บริการ </w:t>
+      </w:r>
+      <w:r>
+        <w:rPr>
+          <w:rFonts w:ascii="TH SarabunIT๙" w:hAnsi="TH SarabunIT๙" w:cs="TH SarabunIT๙"/>
+          <w:b/>
+          <w:bCs/>
+          <w:color w:val="000000"/>
+          <w:sz w:val="32"/>
+          <w:szCs w:val="32"/>
+        </w:rPr>
+        <w:t>Infrastructure</w:t>
       </w:r>
     </w:p>
     <w:p>
@@ -23915,16 +23926,35 @@
           <w:szCs w:val="32"/>
           <w:cs/>
         </w:rPr>
-        <w:t>ชื่อหน่วยงาน</w:t>
-      </w:r>
-      <w:r>
-        <w:rPr>
-          <w:rFonts w:ascii="TH SarabunIT๙" w:hAnsi="TH SarabunIT๙" w:cs="TH SarabunIT๙"/>
-          <w:color w:val="000000"/>
-          <w:sz w:val="32"/>
-          <w:szCs w:val="32"/>
-        </w:rPr>
-        <w:t xml:space="preserve"> :</w:t>
+        <w:t>ชื่อโครงการ/ระบบงาน</w:t>
+      </w:r>
+      <w:r>
+        <w:rPr>
+          <w:rFonts w:ascii="TH SarabunIT๙" w:hAnsi="TH SarabunIT๙" w:cs="TH SarabunIT๙" w:hint="cs"/>
+          <w:color w:val="000000"/>
+          <w:sz w:val="32"/>
+          <w:szCs w:val="32"/>
+          <w:cs/>
+        </w:rPr>
+        <w:t xml:space="preserve"> </w:t>
+      </w:r>
+      <w:r>
+        <w:rPr>
+          <w:rFonts w:ascii="TH SarabunIT๙" w:hAnsi="TH SarabunIT๙" w:cs="TH SarabunIT๙"/>
+          <w:color w:val="000000"/>
+          <w:sz w:val="32"/>
+          <w:szCs w:val="32"/>
+        </w:rPr>
+        <w:t>:</w:t>
+      </w:r>
+      <w:r>
+        <w:rPr>
+          <w:rFonts w:ascii="TH SarabunIT๙" w:hAnsi="TH SarabunIT๙" w:cs="TH SarabunIT๙"/>
+          <w:color w:val="000000"/>
+          <w:sz w:val="32"/>
+          <w:szCs w:val="32"/>
+        </w:rPr>
+        <w:t xml:space="preserve"> </w:t>
       </w:r>
     </w:p>
     <w:p>
@@ -23946,7 +23976,6 @@
           <w:color w:val="000000"/>
           <w:sz w:val="32"/>
           <w:szCs w:val="32"/>
-          <w:cs/>
         </w:rPr>
         <w:tab/>
       </w:r>
@@ -23958,7 +23987,7 @@
           <w:szCs w:val="32"/>
           <w:cs/>
         </w:rPr>
-        <w:t>หัวหน้าหน่วยงาน</w:t>
+        <w:t>วันที่ต้องการขอใช้บริการ</w:t>
       </w:r>
       <w:r>
         <w:rPr>
@@ -23968,6 +23997,15 @@
           <w:szCs w:val="32"/>
         </w:rPr>
         <w:t xml:space="preserve"> :</w:t>
+      </w:r>
+      <w:r>
+        <w:rPr>
+          <w:rFonts w:ascii="TH SarabunIT๙" w:hAnsi="TH SarabunIT๙" w:cs="TH SarabunIT๙"/>
+          <w:color w:val="000000"/>
+          <w:sz w:val="32"/>
+          <w:szCs w:val="32"/>
+        </w:rPr>
+        <w:t xml:space="preserve"> </w:t>
       </w:r>
     </w:p>
     <w:p>
@@ -23977,19 +24015,19 @@
         </w:tabs>
         <w:spacing w:after="0" w:line="240" w:lineRule="auto"/>
         <w:rPr>
-          <w:rFonts w:ascii="TH SarabunIT๙" w:hAnsi="TH SarabunIT๙" w:cs="TH SarabunIT๙"/>
-          <w:color w:val="000000"/>
-          <w:sz w:val="32"/>
-          <w:szCs w:val="32"/>
-        </w:rPr>
-      </w:pPr>
-      <w:r>
-        <w:rPr>
-          <w:rFonts w:ascii="TH SarabunIT๙" w:hAnsi="TH SarabunIT๙" w:cs="TH SarabunIT๙"/>
-          <w:color w:val="000000"/>
-          <w:sz w:val="32"/>
-          <w:szCs w:val="32"/>
-          <w:cs/>
+          <w:rFonts w:ascii="TH SarabunIT๙" w:hAnsi="TH SarabunIT๙" w:cs="TH SarabunIT๙" w:hint="cs"/>
+          <w:color w:val="000000"/>
+          <w:sz w:val="32"/>
+          <w:szCs w:val="32"/>
+          <w:cs/>
+        </w:rPr>
+      </w:pPr>
+      <w:r>
+        <w:rPr>
+          <w:rFonts w:ascii="TH SarabunIT๙" w:hAnsi="TH SarabunIT๙" w:cs="TH SarabunIT๙"/>
+          <w:color w:val="000000"/>
+          <w:sz w:val="32"/>
+          <w:szCs w:val="32"/>
         </w:rPr>
         <w:tab/>
       </w:r>
@@ -24001,7 +24039,7 @@
           <w:szCs w:val="32"/>
           <w:cs/>
         </w:rPr>
-        <w:t xml:space="preserve">ที่อยู่หน่วยงาน </w:t>
+        <w:t xml:space="preserve">วันที่บันทึกคำขอใช้บริการ </w:t>
       </w:r>
       <w:r>
         <w:rPr>
@@ -24035,401 +24073,6 @@
         <w:spacing w:after="0" w:line="240" w:lineRule="auto"/>
         <w:rPr>
           <w:rFonts w:ascii="TH SarabunIT๙" w:hAnsi="TH SarabunIT๙" w:cs="TH SarabunIT๙"/>
-          <w:b/>
-          <w:bCs/>
-          <w:color w:val="000000"/>
-          <w:sz w:val="32"/>
-          <w:szCs w:val="32"/>
-        </w:rPr>
-      </w:pPr>
-      <w:r>
-        <w:rPr>
-          <w:rFonts w:ascii="TH SarabunIT๙" w:hAnsi="TH SarabunIT๙" w:cs="TH SarabunIT๙" w:hint="cs"/>
-          <w:b/>
-          <w:bCs/>
-          <w:color w:val="000000"/>
-          <w:sz w:val="32"/>
-          <w:szCs w:val="32"/>
-          <w:cs/>
-        </w:rPr>
-        <w:t>ผู้ประสานงาน</w:t>
-      </w:r>
-    </w:p>
-    <w:p>
-      <w:pPr>
-        <w:tabs>
-          <w:tab w:val="left" w:pos="284"/>
-        </w:tabs>
-        <w:spacing w:after="0" w:line="240" w:lineRule="auto"/>
-        <w:rPr>
-          <w:rFonts w:ascii="TH SarabunIT๙" w:hAnsi="TH SarabunIT๙" w:cs="TH SarabunIT๙"/>
-          <w:color w:val="000000"/>
-          <w:sz w:val="14"/>
-          <w:szCs w:val="14"/>
-        </w:rPr>
-      </w:pPr>
-      <w:r>
-        <w:rPr>
-          <w:rFonts w:ascii="TH SarabunIT๙" w:hAnsi="TH SarabunIT๙" w:cs="TH SarabunIT๙"/>
-          <w:color w:val="000000"/>
-          <w:sz w:val="32"/>
-          <w:szCs w:val="32"/>
-          <w:cs/>
-        </w:rPr>
-        <w:tab/>
-      </w:r>
-      <w:r>
-        <w:rPr>
-          <w:rFonts w:ascii="TH SarabunIT๙" w:hAnsi="TH SarabunIT๙" w:cs="TH SarabunIT๙" w:hint="cs"/>
-          <w:color w:val="000000"/>
-          <w:sz w:val="32"/>
-          <w:szCs w:val="32"/>
-          <w:cs/>
-        </w:rPr>
-        <w:t xml:space="preserve">ชื่อ-นามสกุล </w:t>
-      </w:r>
-      <w:r>
-        <w:rPr>
-          <w:rFonts w:ascii="TH SarabunIT๙" w:hAnsi="TH SarabunIT๙" w:cs="TH SarabunIT๙"/>
-          <w:color w:val="000000"/>
-          <w:sz w:val="32"/>
-          <w:szCs w:val="32"/>
-        </w:rPr>
-        <w:t>:</w:t>
-      </w:r>
-    </w:p>
-    <w:p>
-      <w:pPr>
-        <w:tabs>
-          <w:tab w:val="left" w:pos="284"/>
-        </w:tabs>
-        <w:spacing w:after="0" w:line="240" w:lineRule="auto"/>
-        <w:rPr>
-          <w:rFonts w:ascii="TH SarabunIT๙" w:hAnsi="TH SarabunIT๙" w:cs="TH SarabunIT๙"/>
-          <w:color w:val="000000"/>
-          <w:sz w:val="14"/>
-          <w:szCs w:val="14"/>
-        </w:rPr>
-      </w:pPr>
-      <w:r>
-        <w:rPr>
-          <w:rFonts w:ascii="TH SarabunIT๙" w:hAnsi="TH SarabunIT๙" w:cs="TH SarabunIT๙"/>
-          <w:color w:val="000000"/>
-          <w:sz w:val="14"/>
-          <w:szCs w:val="14"/>
-          <w:cs/>
-        </w:rPr>
-        <w:tab/>
-      </w:r>
-      <w:r>
-        <w:rPr>
-          <w:rFonts w:ascii="TH SarabunIT๙" w:hAnsi="TH SarabunIT๙" w:cs="TH SarabunIT๙" w:hint="cs"/>
-          <w:color w:val="000000"/>
-          <w:sz w:val="32"/>
-          <w:szCs w:val="32"/>
-          <w:cs/>
-        </w:rPr>
-        <w:t>ตำแหน่ง</w:t>
-      </w:r>
-      <w:r>
-        <w:rPr>
-          <w:rFonts w:ascii="TH SarabunIT๙" w:hAnsi="TH SarabunIT๙" w:cs="TH SarabunIT๙"/>
-          <w:color w:val="000000"/>
-          <w:sz w:val="32"/>
-          <w:szCs w:val="32"/>
-        </w:rPr>
-        <w:t xml:space="preserve"> : </w:t>
-      </w:r>
-    </w:p>
-    <w:p>
-      <w:pPr>
-        <w:tabs>
-          <w:tab w:val="left" w:pos="284"/>
-        </w:tabs>
-        <w:spacing w:after="0" w:line="240" w:lineRule="auto"/>
-        <w:rPr>
-          <w:rFonts w:ascii="TH SarabunIT๙" w:hAnsi="TH SarabunIT๙" w:cs="TH SarabunIT๙"/>
-          <w:color w:val="000000"/>
-          <w:sz w:val="14"/>
-          <w:szCs w:val="14"/>
-        </w:rPr>
-      </w:pPr>
-      <w:r>
-        <w:rPr>
-          <w:rFonts w:ascii="TH SarabunIT๙" w:hAnsi="TH SarabunIT๙" w:cs="TH SarabunIT๙"/>
-          <w:color w:val="000000"/>
-          <w:sz w:val="14"/>
-          <w:szCs w:val="14"/>
-          <w:cs/>
-        </w:rPr>
-        <w:tab/>
-      </w:r>
-      <w:r>
-        <w:rPr>
-          <w:rFonts w:ascii="TH SarabunIT๙" w:hAnsi="TH SarabunIT๙" w:cs="TH SarabunIT๙" w:hint="cs"/>
-          <w:color w:val="000000"/>
-          <w:sz w:val="32"/>
-          <w:szCs w:val="32"/>
-          <w:cs/>
-        </w:rPr>
-        <w:t xml:space="preserve">โทรศัพท์ </w:t>
-      </w:r>
-      <w:r>
-        <w:rPr>
-          <w:rFonts w:ascii="TH SarabunIT๙" w:hAnsi="TH SarabunIT๙" w:cs="TH SarabunIT๙"/>
-          <w:color w:val="000000"/>
-          <w:sz w:val="32"/>
-          <w:szCs w:val="32"/>
-        </w:rPr>
-        <w:t>:</w:t>
-      </w:r>
-    </w:p>
-    <w:p>
-      <w:pPr>
-        <w:tabs>
-          <w:tab w:val="left" w:pos="284"/>
-        </w:tabs>
-        <w:spacing w:after="0" w:line="240" w:lineRule="auto"/>
-        <w:rPr>
-          <w:rFonts w:ascii="TH SarabunIT๙" w:hAnsi="TH SarabunIT๙" w:cs="TH SarabunIT๙"/>
-          <w:color w:val="000000"/>
-          <w:sz w:val="32"/>
-          <w:szCs w:val="32"/>
-        </w:rPr>
-      </w:pPr>
-      <w:r>
-        <w:rPr>
-          <w:rFonts w:ascii="TH SarabunIT๙" w:hAnsi="TH SarabunIT๙" w:cs="TH SarabunIT๙"/>
-          <w:color w:val="000000"/>
-          <w:sz w:val="14"/>
-          <w:szCs w:val="14"/>
-        </w:rPr>
-        <w:tab/>
-      </w:r>
-      <w:proofErr w:type="gramStart"/>
-      <w:r>
-        <w:rPr>
-          <w:rFonts w:ascii="TH SarabunIT๙" w:hAnsi="TH SarabunIT๙" w:cs="TH SarabunIT๙"/>
-          <w:color w:val="000000"/>
-          <w:sz w:val="32"/>
-          <w:szCs w:val="32"/>
-        </w:rPr>
-        <w:t>Email :</w:t>
-      </w:r>
-      <w:proofErr w:type="gramEnd"/>
-    </w:p>
-    <w:p>
-      <w:pPr>
-        <w:tabs>
-          <w:tab w:val="left" w:pos="284"/>
-        </w:tabs>
-        <w:spacing w:after="0" w:line="240" w:lineRule="auto"/>
-        <w:rPr>
-          <w:rFonts w:ascii="TH SarabunIT๙" w:hAnsi="TH SarabunIT๙" w:cs="TH SarabunIT๙"/>
-          <w:color w:val="000000"/>
-          <w:sz w:val="32"/>
-          <w:szCs w:val="32"/>
-        </w:rPr>
-      </w:pPr>
-    </w:p>
-    <w:p>
-      <w:pPr>
-        <w:tabs>
-          <w:tab w:val="left" w:pos="284"/>
-        </w:tabs>
-        <w:spacing w:after="0" w:line="240" w:lineRule="auto"/>
-        <w:rPr>
-          <w:rFonts w:ascii="TH SarabunIT๙" w:hAnsi="TH SarabunIT๙" w:cs="TH SarabunIT๙"/>
-          <w:b/>
-          <w:bCs/>
-          <w:color w:val="000000"/>
-          <w:sz w:val="32"/>
-          <w:szCs w:val="32"/>
-        </w:rPr>
-      </w:pPr>
-      <w:r>
-        <w:rPr>
-          <w:rFonts w:ascii="TH SarabunIT๙" w:hAnsi="TH SarabunIT๙" w:cs="TH SarabunIT๙" w:hint="cs"/>
-          <w:b/>
-          <w:bCs/>
-          <w:color w:val="000000"/>
-          <w:sz w:val="32"/>
-          <w:szCs w:val="32"/>
-          <w:cs/>
-        </w:rPr>
-        <w:t xml:space="preserve">รายละเอียดการขอใช้บริการ </w:t>
-      </w:r>
-      <w:r>
-        <w:rPr>
-          <w:rFonts w:ascii="TH SarabunIT๙" w:hAnsi="TH SarabunIT๙" w:cs="TH SarabunIT๙"/>
-          <w:b/>
-          <w:bCs/>
-          <w:color w:val="000000"/>
-          <w:sz w:val="32"/>
-          <w:szCs w:val="32"/>
-        </w:rPr>
-        <w:t>Infrastructure</w:t>
-      </w:r>
-    </w:p>
-    <w:p>
-      <w:pPr>
-        <w:tabs>
-          <w:tab w:val="left" w:pos="284"/>
-        </w:tabs>
-        <w:spacing w:after="0" w:line="240" w:lineRule="auto"/>
-        <w:rPr>
-          <w:rFonts w:ascii="TH SarabunIT๙" w:hAnsi="TH SarabunIT๙" w:cs="TH SarabunIT๙"/>
-          <w:color w:val="000000"/>
-          <w:sz w:val="32"/>
-          <w:szCs w:val="32"/>
-        </w:rPr>
-      </w:pPr>
-      <w:r>
-        <w:rPr>
-          <w:rFonts w:ascii="TH SarabunIT๙" w:hAnsi="TH SarabunIT๙" w:cs="TH SarabunIT๙"/>
-          <w:color w:val="000000"/>
-          <w:sz w:val="32"/>
-          <w:szCs w:val="32"/>
-          <w:cs/>
-        </w:rPr>
-        <w:tab/>
-      </w:r>
-      <w:r>
-        <w:rPr>
-          <w:rFonts w:ascii="TH SarabunIT๙" w:hAnsi="TH SarabunIT๙" w:cs="TH SarabunIT๙" w:hint="cs"/>
-          <w:color w:val="000000"/>
-          <w:sz w:val="32"/>
-          <w:szCs w:val="32"/>
-          <w:cs/>
-        </w:rPr>
-        <w:t>ชื่อโครงการ/ระบบงาน</w:t>
-      </w:r>
-      <w:r>
-        <w:rPr>
-          <w:rFonts w:ascii="TH SarabunIT๙" w:hAnsi="TH SarabunIT๙" w:cs="TH SarabunIT๙" w:hint="cs"/>
-          <w:color w:val="000000"/>
-          <w:sz w:val="32"/>
-          <w:szCs w:val="32"/>
-          <w:cs/>
-        </w:rPr>
-        <w:t xml:space="preserve"> </w:t>
-      </w:r>
-      <w:r>
-        <w:rPr>
-          <w:rFonts w:ascii="TH SarabunIT๙" w:hAnsi="TH SarabunIT๙" w:cs="TH SarabunIT๙"/>
-          <w:color w:val="000000"/>
-          <w:sz w:val="32"/>
-          <w:szCs w:val="32"/>
-        </w:rPr>
-        <w:t>:</w:t>
-      </w:r>
-    </w:p>
-    <w:p>
-      <w:pPr>
-        <w:tabs>
-          <w:tab w:val="left" w:pos="284"/>
-        </w:tabs>
-        <w:spacing w:after="0" w:line="240" w:lineRule="auto"/>
-        <w:rPr>
-          <w:rFonts w:ascii="TH SarabunIT๙" w:hAnsi="TH SarabunIT๙" w:cs="TH SarabunIT๙"/>
-          <w:color w:val="000000"/>
-          <w:sz w:val="32"/>
-          <w:szCs w:val="32"/>
-        </w:rPr>
-      </w:pPr>
-      <w:r>
-        <w:rPr>
-          <w:rFonts w:ascii="TH SarabunIT๙" w:hAnsi="TH SarabunIT๙" w:cs="TH SarabunIT๙"/>
-          <w:color w:val="000000"/>
-          <w:sz w:val="32"/>
-          <w:szCs w:val="32"/>
-        </w:rPr>
-        <w:tab/>
-      </w:r>
-      <w:r>
-        <w:rPr>
-          <w:rFonts w:ascii="TH SarabunIT๙" w:hAnsi="TH SarabunIT๙" w:cs="TH SarabunIT๙" w:hint="cs"/>
-          <w:color w:val="000000"/>
-          <w:sz w:val="32"/>
-          <w:szCs w:val="32"/>
-          <w:cs/>
-        </w:rPr>
-        <w:t>วันที่ต้องการขอใช้บริการ</w:t>
-      </w:r>
-      <w:r>
-        <w:rPr>
-          <w:rFonts w:ascii="TH SarabunIT๙" w:hAnsi="TH SarabunIT๙" w:cs="TH SarabunIT๙"/>
-          <w:color w:val="000000"/>
-          <w:sz w:val="32"/>
-          <w:szCs w:val="32"/>
-        </w:rPr>
-        <w:t xml:space="preserve"> :</w:t>
-      </w:r>
-    </w:p>
-    <w:p>
-      <w:pPr>
-        <w:tabs>
-          <w:tab w:val="left" w:pos="284"/>
-        </w:tabs>
-        <w:spacing w:after="0" w:line="240" w:lineRule="auto"/>
-        <w:rPr>
-          <w:rFonts w:ascii="TH SarabunIT๙" w:hAnsi="TH SarabunIT๙" w:cs="TH SarabunIT๙"/>
-          <w:color w:val="000000"/>
-          <w:sz w:val="32"/>
-          <w:szCs w:val="32"/>
-        </w:rPr>
-      </w:pPr>
-      <w:r>
-        <w:rPr>
-          <w:rFonts w:ascii="TH SarabunIT๙" w:hAnsi="TH SarabunIT๙" w:cs="TH SarabunIT๙"/>
-          <w:color w:val="000000"/>
-          <w:sz w:val="32"/>
-          <w:szCs w:val="32"/>
-        </w:rPr>
-        <w:tab/>
-      </w:r>
-      <w:r>
-        <w:rPr>
-          <w:rFonts w:ascii="TH SarabunIT๙" w:hAnsi="TH SarabunIT๙" w:cs="TH SarabunIT๙" w:hint="cs"/>
-          <w:color w:val="000000"/>
-          <w:sz w:val="32"/>
-          <w:szCs w:val="32"/>
-          <w:cs/>
-        </w:rPr>
-        <w:t xml:space="preserve">วันที่บันทึกคำขอใช้บริการ </w:t>
-      </w:r>
-      <w:r>
-        <w:rPr>
-          <w:rFonts w:ascii="TH SarabunIT๙" w:hAnsi="TH SarabunIT๙" w:cs="TH SarabunIT๙"/>
-          <w:color w:val="000000"/>
-          <w:sz w:val="32"/>
-          <w:szCs w:val="32"/>
-        </w:rPr>
-        <w:t>:</w:t>
-      </w:r>
-    </w:p>
-    <w:p>
-      <w:pPr>
-        <w:tabs>
-          <w:tab w:val="left" w:pos="284"/>
-        </w:tabs>
-        <w:spacing w:after="0" w:line="240" w:lineRule="auto"/>
-        <w:rPr>
-          <w:rFonts w:ascii="TH SarabunIT๙" w:hAnsi="TH SarabunIT๙" w:cs="TH SarabunIT๙"/>
-          <w:color w:val="000000"/>
-          <w:sz w:val="32"/>
-          <w:szCs w:val="32"/>
-        </w:rPr>
-      </w:pPr>
-    </w:p>
-    <w:p>
-      <w:pPr>
-        <w:tabs>
-          <w:tab w:val="left" w:pos="284"/>
-        </w:tabs>
-        <w:spacing w:after="0" w:line="240" w:lineRule="auto"/>
-        <w:rPr>
-          <w:rFonts w:ascii="TH SarabunIT๙" w:hAnsi="TH SarabunIT๙" w:cs="TH SarabunIT๙" w:hint="cs"/>
           <w:color w:val="000000"/>
           <w:sz w:val="14"/>
           <w:szCs w:val="14"/>
@@ -24535,7 +24178,7 @@
               <w:spacing w:after="0" w:line="240" w:lineRule="auto"/>
               <w:jc w:val="center"/>
               <w:rPr>
-                <w:rFonts w:ascii="TH SarabunIT๙" w:hAnsi="TH SarabunIT๙" w:cs="TH SarabunIT๙" w:hint="cs"/>
+                <w:rFonts w:ascii="TH SarabunIT๙" w:hAnsi="TH SarabunIT๙" w:cs="TH SarabunIT๙"/>
                 <w:color w:val="000000"/>
                 <w:sz w:val="24"/>
                 <w:szCs w:val="24"/>
@@ -24631,7 +24274,7 @@
               <w:spacing w:after="0" w:line="240" w:lineRule="auto"/>
               <w:jc w:val="center"/>
               <w:rPr>
-                <w:rFonts w:ascii="TH SarabunIT๙" w:hAnsi="TH SarabunIT๙" w:cs="TH SarabunIT๙" w:hint="cs"/>
+                <w:rFonts w:ascii="TH SarabunIT๙" w:hAnsi="TH SarabunIT๙" w:cs="TH SarabunIT๙"/>
                 <w:color w:val="000000"/>
                 <w:sz w:val="24"/>
                 <w:szCs w:val="24"/>
@@ -24678,7 +24321,7 @@
               <w:spacing w:after="0" w:line="240" w:lineRule="auto"/>
               <w:jc w:val="center"/>
               <w:rPr>
-                <w:rFonts w:ascii="TH SarabunIT๙" w:hAnsi="TH SarabunIT๙" w:cs="TH SarabunIT๙" w:hint="cs"/>
+                <w:rFonts w:ascii="TH SarabunIT๙" w:hAnsi="TH SarabunIT๙" w:cs="TH SarabunIT๙"/>
                 <w:color w:val="000000"/>
                 <w:sz w:val="24"/>
                 <w:szCs w:val="24"/>
@@ -24725,7 +24368,7 @@
               <w:spacing w:after="0" w:line="240" w:lineRule="auto"/>
               <w:jc w:val="center"/>
               <w:rPr>
-                <w:rFonts w:ascii="TH SarabunIT๙" w:hAnsi="TH SarabunIT๙" w:cs="TH SarabunIT๙" w:hint="cs"/>
+                <w:rFonts w:ascii="TH SarabunIT๙" w:hAnsi="TH SarabunIT๙" w:cs="TH SarabunIT๙"/>
                 <w:color w:val="000000"/>
                 <w:sz w:val="24"/>
                 <w:szCs w:val="24"/>
@@ -24820,7 +24463,7 @@
               <w:spacing w:after="0" w:line="240" w:lineRule="auto"/>
               <w:jc w:val="center"/>
               <w:rPr>
-                <w:rFonts w:ascii="TH SarabunIT๙" w:hAnsi="TH SarabunIT๙" w:cs="TH SarabunIT๙" w:hint="cs"/>
+                <w:rFonts w:ascii="TH SarabunIT๙" w:hAnsi="TH SarabunIT๙" w:cs="TH SarabunIT๙"/>
                 <w:color w:val="000000"/>
                 <w:sz w:val="24"/>
                 <w:szCs w:val="24"/>
@@ -24838,7 +24481,7 @@
               <w:spacing w:after="0" w:line="240" w:lineRule="auto"/>
               <w:jc w:val="center"/>
               <w:rPr>
-                <w:rFonts w:ascii="TH SarabunIT๙" w:hAnsi="TH SarabunIT๙" w:cs="TH SarabunIT๙" w:hint="cs"/>
+                <w:rFonts w:ascii="TH SarabunIT๙" w:hAnsi="TH SarabunIT๙" w:cs="TH SarabunIT๙"/>
                 <w:color w:val="000000"/>
                 <w:sz w:val="24"/>
                 <w:szCs w:val="24"/>
@@ -24856,7 +24499,7 @@
               <w:spacing w:after="0" w:line="240" w:lineRule="auto"/>
               <w:jc w:val="center"/>
               <w:rPr>
-                <w:rFonts w:ascii="TH SarabunIT๙" w:hAnsi="TH SarabunIT๙" w:cs="TH SarabunIT๙" w:hint="cs"/>
+                <w:rFonts w:ascii="TH SarabunIT๙" w:hAnsi="TH SarabunIT๙" w:cs="TH SarabunIT๙"/>
                 <w:color w:val="000000"/>
                 <w:sz w:val="24"/>
                 <w:szCs w:val="24"/>
@@ -24942,7 +24585,7 @@
               <w:spacing w:after="0" w:line="240" w:lineRule="auto"/>
               <w:jc w:val="center"/>
               <w:rPr>
-                <w:rFonts w:ascii="TH SarabunIT๙" w:hAnsi="TH SarabunIT๙" w:cs="TH SarabunIT๙" w:hint="cs"/>
+                <w:rFonts w:ascii="TH SarabunIT๙" w:hAnsi="TH SarabunIT๙" w:cs="TH SarabunIT๙"/>
                 <w:color w:val="000000"/>
                 <w:sz w:val="24"/>
                 <w:szCs w:val="24"/>
@@ -24963,7 +24606,7 @@
               <w:spacing w:after="0" w:line="240" w:lineRule="auto"/>
               <w:jc w:val="right"/>
               <w:rPr>
-                <w:rFonts w:ascii="TH SarabunIT๙" w:hAnsi="TH SarabunIT๙" w:cs="TH SarabunIT๙" w:hint="cs"/>
+                <w:rFonts w:ascii="TH SarabunIT๙" w:hAnsi="TH SarabunIT๙" w:cs="TH SarabunIT๙"/>
                 <w:color w:val="000000"/>
                 <w:sz w:val="24"/>
                 <w:szCs w:val="24"/>
@@ -25081,7 +24724,7 @@
               <w:spacing w:after="0" w:line="240" w:lineRule="auto"/>
               <w:jc w:val="center"/>
               <w:rPr>
-                <w:rFonts w:ascii="TH SarabunIT๙" w:hAnsi="TH SarabunIT๙" w:cs="TH SarabunIT๙" w:hint="cs"/>
+                <w:rFonts w:ascii="TH SarabunIT๙" w:hAnsi="TH SarabunIT๙" w:cs="TH SarabunIT๙"/>
                 <w:color w:val="000000"/>
                 <w:sz w:val="24"/>
                 <w:szCs w:val="24"/>
@@ -25096,7 +24739,7 @@
       <w:pPr>
         <w:spacing w:after="0" w:line="240" w:lineRule="auto"/>
         <w:rPr>
-          <w:rFonts w:ascii="TH SarabunIT๙" w:hAnsi="TH SarabunIT๙" w:cs="TH SarabunIT๙" w:hint="cs"/>
+          <w:rFonts w:ascii="TH SarabunIT๙" w:hAnsi="TH SarabunIT๙" w:cs="TH SarabunIT๙"/>
           <w:color w:val="000000"/>
           <w:sz w:val="32"/>
           <w:szCs w:val="32"/>
@@ -25108,7 +24751,7 @@
       <w:pPr>
         <w:spacing w:after="0" w:line="240" w:lineRule="auto"/>
         <w:rPr>
-          <w:rFonts w:ascii="TH SarabunIT๙" w:hAnsi="TH SarabunIT๙" w:cs="TH SarabunIT๙" w:hint="cs"/>
+          <w:rFonts w:ascii="TH SarabunIT๙" w:hAnsi="TH SarabunIT๙" w:cs="TH SarabunIT๙"/>
           <w:color w:val="000000"/>
           <w:sz w:val="32"/>
           <w:szCs w:val="32"/>
@@ -28593,6 +28236,7 @@
   <w:style w:type="character" w:default="1" w:styleId="DefaultParagraphFont">
     <w:name w:val="Default Paragraph Font"/>
     <w:uiPriority w:val="1"/>
+    <w:semiHidden/>
     <w:unhideWhenUsed/>
   </w:style>
   <w:style w:type="table" w:default="1" w:styleId="TableNormal">

</xml_diff>

<commit_message>
feat: add cloud request for step5
</commit_message>
<xml_diff>
--- a/public/templates/project-proposal.docx
+++ b/public/templates/project-proposal.docx
@@ -23903,58 +23903,47 @@
         <w:spacing w:after="0" w:line="240" w:lineRule="auto"/>
         <w:rPr>
           <w:rFonts w:ascii="TH SarabunIT๙" w:hAnsi="TH SarabunIT๙" w:cs="TH SarabunIT๙"/>
-          <w:color w:val="000000"/>
-          <w:sz w:val="32"/>
-          <w:szCs w:val="32"/>
-        </w:rPr>
-      </w:pPr>
-      <w:r>
-        <w:rPr>
-          <w:rFonts w:ascii="TH SarabunIT๙" w:hAnsi="TH SarabunIT๙" w:cs="TH SarabunIT๙"/>
-          <w:color w:val="000000"/>
-          <w:sz w:val="32"/>
-          <w:szCs w:val="32"/>
-          <w:cs/>
-        </w:rPr>
-        <w:tab/>
-      </w:r>
-      <w:r>
-        <w:rPr>
-          <w:rFonts w:ascii="TH SarabunIT๙" w:hAnsi="TH SarabunIT๙" w:cs="TH SarabunIT๙" w:hint="cs"/>
-          <w:color w:val="000000"/>
-          <w:sz w:val="32"/>
-          <w:szCs w:val="32"/>
-          <w:cs/>
-        </w:rPr>
-        <w:t>ชื่อโครงการ/ระบบงาน</w:t>
-      </w:r>
-      <w:r>
-        <w:rPr>
-          <w:rFonts w:ascii="TH SarabunIT๙" w:hAnsi="TH SarabunIT๙" w:cs="TH SarabunIT๙" w:hint="cs"/>
-          <w:color w:val="000000"/>
-          <w:sz w:val="32"/>
-          <w:szCs w:val="32"/>
-          <w:cs/>
-        </w:rPr>
-        <w:t xml:space="preserve"> </w:t>
-      </w:r>
-      <w:r>
-        <w:rPr>
-          <w:rFonts w:ascii="TH SarabunIT๙" w:hAnsi="TH SarabunIT๙" w:cs="TH SarabunIT๙"/>
-          <w:color w:val="000000"/>
-          <w:sz w:val="32"/>
-          <w:szCs w:val="32"/>
-        </w:rPr>
-        <w:t>:</w:t>
-      </w:r>
-      <w:r>
-        <w:rPr>
-          <w:rFonts w:ascii="TH SarabunIT๙" w:hAnsi="TH SarabunIT๙" w:cs="TH SarabunIT๙"/>
-          <w:color w:val="000000"/>
-          <w:sz w:val="32"/>
-          <w:szCs w:val="32"/>
-        </w:rPr>
-        <w:t xml:space="preserve"> </w:t>
+          <w:b/>
+          <w:bCs/>
+          <w:color w:val="000000"/>
+          <w:sz w:val="32"/>
+          <w:szCs w:val="32"/>
+        </w:rPr>
+      </w:pPr>
+      <w:r>
+        <w:rPr>
+          <w:rFonts w:ascii="TH SarabunIT๙" w:hAnsi="TH SarabunIT๙" w:cs="TH SarabunIT๙"/>
+          <w:b/>
+          <w:bCs/>
+          <w:color w:val="000000"/>
+          <w:sz w:val="32"/>
+          <w:szCs w:val="32"/>
+        </w:rPr>
+        <w:t>{#</w:t>
+      </w:r>
+      <w:proofErr w:type="gramStart"/>
+      <w:r>
+        <w:rPr>
+          <w:rFonts w:ascii="TH SarabunIT๙" w:hAnsi="TH SarabunIT๙" w:cs="TH SarabunIT๙"/>
+          <w:b/>
+          <w:bCs/>
+          <w:color w:val="000000"/>
+          <w:sz w:val="32"/>
+          <w:szCs w:val="32"/>
+        </w:rPr>
+        <w:t>hasCloudRequests}{</w:t>
+      </w:r>
+      <w:proofErr w:type="gramEnd"/>
+      <w:r>
+        <w:rPr>
+          <w:rFonts w:ascii="TH SarabunIT๙" w:hAnsi="TH SarabunIT๙" w:cs="TH SarabunIT๙"/>
+          <w:b/>
+          <w:bCs/>
+          <w:color w:val="000000"/>
+          <w:sz w:val="32"/>
+          <w:szCs w:val="32"/>
+        </w:rPr>
+        <w:t>#cloudRequests}</w:t>
       </w:r>
     </w:p>
     <w:p>
@@ -23976,6 +23965,7 @@
           <w:color w:val="000000"/>
           <w:sz w:val="32"/>
           <w:szCs w:val="32"/>
+          <w:cs/>
         </w:rPr>
         <w:tab/>
       </w:r>
@@ -23987,25 +23977,64 @@
           <w:szCs w:val="32"/>
           <w:cs/>
         </w:rPr>
-        <w:t>วันที่ต้องการขอใช้บริการ</w:t>
-      </w:r>
-      <w:r>
-        <w:rPr>
-          <w:rFonts w:ascii="TH SarabunIT๙" w:hAnsi="TH SarabunIT๙" w:cs="TH SarabunIT๙"/>
-          <w:color w:val="000000"/>
-          <w:sz w:val="32"/>
-          <w:szCs w:val="32"/>
-        </w:rPr>
-        <w:t xml:space="preserve"> :</w:t>
-      </w:r>
-      <w:r>
-        <w:rPr>
-          <w:rFonts w:ascii="TH SarabunIT๙" w:hAnsi="TH SarabunIT๙" w:cs="TH SarabunIT๙"/>
-          <w:color w:val="000000"/>
-          <w:sz w:val="32"/>
-          <w:szCs w:val="32"/>
+        <w:t>ชื่อโครงการ/ระบบงาน</w:t>
+      </w:r>
+      <w:r>
+        <w:rPr>
+          <w:rFonts w:ascii="TH SarabunIT๙" w:hAnsi="TH SarabunIT๙" w:cs="TH SarabunIT๙" w:hint="cs"/>
+          <w:color w:val="000000"/>
+          <w:sz w:val="32"/>
+          <w:szCs w:val="32"/>
+          <w:cs/>
         </w:rPr>
         <w:t xml:space="preserve"> </w:t>
+      </w:r>
+      <w:r>
+        <w:rPr>
+          <w:rFonts w:ascii="TH SarabunIT๙" w:hAnsi="TH SarabunIT๙" w:cs="TH SarabunIT๙"/>
+          <w:color w:val="000000"/>
+          <w:sz w:val="32"/>
+          <w:szCs w:val="32"/>
+        </w:rPr>
+        <w:t>:</w:t>
+      </w:r>
+      <w:r>
+        <w:rPr>
+          <w:rFonts w:ascii="TH SarabunIT๙" w:hAnsi="TH SarabunIT๙" w:cs="TH SarabunIT๙"/>
+          <w:color w:val="000000"/>
+          <w:sz w:val="32"/>
+          <w:szCs w:val="32"/>
+        </w:rPr>
+        <w:t xml:space="preserve"> </w:t>
+      </w:r>
+      <w:r>
+        <w:rPr>
+          <w:rFonts w:ascii="TH SarabunIT๙" w:hAnsi="TH SarabunIT๙" w:cs="TH SarabunIT๙"/>
+          <w:color w:val="000000"/>
+          <w:sz w:val="32"/>
+          <w:szCs w:val="32"/>
+        </w:rPr>
+        <w:t>{</w:t>
+      </w:r>
+      <w:proofErr w:type="spellStart"/>
+      <w:r>
+        <w:rPr>
+          <w:rFonts w:ascii="TH SarabunIT๙" w:hAnsi="TH SarabunIT๙" w:cs="TH SarabunIT๙"/>
+          <w:color w:val="000000"/>
+          <w:sz w:val="32"/>
+          <w:szCs w:val="32"/>
+        </w:rPr>
+        <w:t>systemName</w:t>
+      </w:r>
+      <w:proofErr w:type="spellEnd"/>
+      <w:r>
+        <w:rPr>
+          <w:rFonts w:ascii="TH SarabunIT๙" w:hAnsi="TH SarabunIT๙" w:cs="TH SarabunIT๙"/>
+          <w:color w:val="000000"/>
+          <w:sz w:val="32"/>
+          <w:szCs w:val="32"/>
+        </w:rPr>
+        <w:t>}</w:t>
       </w:r>
     </w:p>
     <w:p>
@@ -24015,40 +24044,77 @@
         </w:tabs>
         <w:spacing w:after="0" w:line="240" w:lineRule="auto"/>
         <w:rPr>
+          <w:rFonts w:ascii="TH SarabunIT๙" w:hAnsi="TH SarabunIT๙" w:cs="TH SarabunIT๙"/>
+          <w:color w:val="000000"/>
+          <w:sz w:val="32"/>
+          <w:szCs w:val="32"/>
+        </w:rPr>
+      </w:pPr>
+      <w:r>
+        <w:rPr>
+          <w:rFonts w:ascii="TH SarabunIT๙" w:hAnsi="TH SarabunIT๙" w:cs="TH SarabunIT๙"/>
+          <w:color w:val="000000"/>
+          <w:sz w:val="32"/>
+          <w:szCs w:val="32"/>
+        </w:rPr>
+        <w:tab/>
+      </w:r>
+      <w:r>
+        <w:rPr>
           <w:rFonts w:ascii="TH SarabunIT๙" w:hAnsi="TH SarabunIT๙" w:cs="TH SarabunIT๙" w:hint="cs"/>
           <w:color w:val="000000"/>
           <w:sz w:val="32"/>
           <w:szCs w:val="32"/>
           <w:cs/>
         </w:rPr>
-      </w:pPr>
-      <w:r>
-        <w:rPr>
-          <w:rFonts w:ascii="TH SarabunIT๙" w:hAnsi="TH SarabunIT๙" w:cs="TH SarabunIT๙"/>
-          <w:color w:val="000000"/>
-          <w:sz w:val="32"/>
-          <w:szCs w:val="32"/>
-        </w:rPr>
-        <w:tab/>
-      </w:r>
-      <w:r>
-        <w:rPr>
-          <w:rFonts w:ascii="TH SarabunIT๙" w:hAnsi="TH SarabunIT๙" w:cs="TH SarabunIT๙" w:hint="cs"/>
-          <w:color w:val="000000"/>
-          <w:sz w:val="32"/>
-          <w:szCs w:val="32"/>
-          <w:cs/>
-        </w:rPr>
-        <w:t xml:space="preserve">วันที่บันทึกคำขอใช้บริการ </w:t>
-      </w:r>
-      <w:r>
-        <w:rPr>
-          <w:rFonts w:ascii="TH SarabunIT๙" w:hAnsi="TH SarabunIT๙" w:cs="TH SarabunIT๙"/>
-          <w:color w:val="000000"/>
-          <w:sz w:val="32"/>
-          <w:szCs w:val="32"/>
-        </w:rPr>
-        <w:t>:</w:t>
+        <w:t>วันที่ต้องการขอใช้บริการ</w:t>
+      </w:r>
+      <w:r>
+        <w:rPr>
+          <w:rFonts w:ascii="TH SarabunIT๙" w:hAnsi="TH SarabunIT๙" w:cs="TH SarabunIT๙"/>
+          <w:color w:val="000000"/>
+          <w:sz w:val="32"/>
+          <w:szCs w:val="32"/>
+        </w:rPr>
+        <w:t xml:space="preserve"> :</w:t>
+      </w:r>
+      <w:r>
+        <w:rPr>
+          <w:rFonts w:ascii="TH SarabunIT๙" w:hAnsi="TH SarabunIT๙" w:cs="TH SarabunIT๙"/>
+          <w:color w:val="000000"/>
+          <w:sz w:val="32"/>
+          <w:szCs w:val="32"/>
+        </w:rPr>
+        <w:t xml:space="preserve"> </w:t>
+      </w:r>
+      <w:r>
+        <w:rPr>
+          <w:rFonts w:ascii="TH SarabunIT๙" w:hAnsi="TH SarabunIT๙" w:cs="TH SarabunIT๙"/>
+          <w:color w:val="000000"/>
+          <w:sz w:val="32"/>
+          <w:szCs w:val="32"/>
+        </w:rPr>
+        <w:t>{</w:t>
+      </w:r>
+      <w:proofErr w:type="spellStart"/>
+      <w:r>
+        <w:rPr>
+          <w:rFonts w:ascii="TH SarabunIT๙" w:hAnsi="TH SarabunIT๙" w:cs="TH SarabunIT๙"/>
+          <w:color w:val="000000"/>
+          <w:sz w:val="32"/>
+          <w:szCs w:val="32"/>
+        </w:rPr>
+        <w:t>requestedServiceDate</w:t>
+      </w:r>
+      <w:proofErr w:type="spellEnd"/>
+      <w:r>
+        <w:rPr>
+          <w:rFonts w:ascii="TH SarabunIT๙" w:hAnsi="TH SarabunIT๙" w:cs="TH SarabunIT๙"/>
+          <w:color w:val="000000"/>
+          <w:sz w:val="32"/>
+          <w:szCs w:val="32"/>
+        </w:rPr>
+        <w:t>}</w:t>
       </w:r>
     </w:p>
     <w:p>
@@ -24058,12 +24124,80 @@
         </w:tabs>
         <w:spacing w:after="0" w:line="240" w:lineRule="auto"/>
         <w:rPr>
-          <w:rFonts w:ascii="TH SarabunIT๙" w:hAnsi="TH SarabunIT๙" w:cs="TH SarabunIT๙"/>
-          <w:color w:val="000000"/>
-          <w:sz w:val="32"/>
-          <w:szCs w:val="32"/>
-        </w:rPr>
-      </w:pPr>
+          <w:rFonts w:ascii="TH SarabunIT๙" w:hAnsi="TH SarabunIT๙" w:cs="TH SarabunIT๙" w:hint="cs"/>
+          <w:color w:val="000000"/>
+          <w:sz w:val="32"/>
+          <w:szCs w:val="32"/>
+          <w:cs/>
+        </w:rPr>
+      </w:pPr>
+      <w:r>
+        <w:rPr>
+          <w:rFonts w:ascii="TH SarabunIT๙" w:hAnsi="TH SarabunIT๙" w:cs="TH SarabunIT๙"/>
+          <w:color w:val="000000"/>
+          <w:sz w:val="32"/>
+          <w:szCs w:val="32"/>
+        </w:rPr>
+        <w:tab/>
+      </w:r>
+      <w:r>
+        <w:rPr>
+          <w:rFonts w:ascii="TH SarabunIT๙" w:hAnsi="TH SarabunIT๙" w:cs="TH SarabunIT๙" w:hint="cs"/>
+          <w:color w:val="000000"/>
+          <w:sz w:val="32"/>
+          <w:szCs w:val="32"/>
+          <w:cs/>
+        </w:rPr>
+        <w:t xml:space="preserve">วันที่บันทึกคำขอใช้บริการ </w:t>
+      </w:r>
+      <w:r>
+        <w:rPr>
+          <w:rFonts w:ascii="TH SarabunIT๙" w:hAnsi="TH SarabunIT๙" w:cs="TH SarabunIT๙"/>
+          <w:color w:val="000000"/>
+          <w:sz w:val="32"/>
+          <w:szCs w:val="32"/>
+        </w:rPr>
+        <w:t>:</w:t>
+      </w:r>
+      <w:r>
+        <w:rPr>
+          <w:rFonts w:ascii="TH SarabunIT๙" w:hAnsi="TH SarabunIT๙" w:cs="TH SarabunIT๙" w:hint="cs"/>
+          <w:color w:val="000000"/>
+          <w:sz w:val="32"/>
+          <w:szCs w:val="32"/>
+          <w:cs/>
+        </w:rPr>
+        <w:t xml:space="preserve"> </w:t>
+      </w:r>
+      <w:r>
+        <w:rPr>
+          <w:rFonts w:ascii="TH SarabunIT๙" w:hAnsi="TH SarabunIT๙" w:cs="TH SarabunIT๙"/>
+          <w:color w:val="000000"/>
+          <w:sz w:val="32"/>
+          <w:szCs w:val="32"/>
+        </w:rPr>
+        <w:t>{</w:t>
+      </w:r>
+      <w:proofErr w:type="spellStart"/>
+      <w:r>
+        <w:rPr>
+          <w:rFonts w:ascii="TH SarabunIT๙" w:hAnsi="TH SarabunIT๙" w:cs="TH SarabunIT๙"/>
+          <w:color w:val="000000"/>
+          <w:sz w:val="32"/>
+          <w:szCs w:val="32"/>
+        </w:rPr>
+        <w:t>recordedRequestDate</w:t>
+      </w:r>
+      <w:proofErr w:type="spellEnd"/>
+      <w:r>
+        <w:rPr>
+          <w:rFonts w:ascii="TH SarabunIT๙" w:hAnsi="TH SarabunIT๙" w:cs="TH SarabunIT๙"/>
+          <w:color w:val="000000"/>
+          <w:sz w:val="32"/>
+          <w:szCs w:val="32"/>
+        </w:rPr>
+        <w:t>}</w:t>
+      </w:r>
     </w:p>
     <w:p>
       <w:pPr>
@@ -24074,6 +24208,20 @@
         <w:rPr>
           <w:rFonts w:ascii="TH SarabunIT๙" w:hAnsi="TH SarabunIT๙" w:cs="TH SarabunIT๙"/>
           <w:color w:val="000000"/>
+          <w:sz w:val="32"/>
+          <w:szCs w:val="32"/>
+        </w:rPr>
+      </w:pPr>
+    </w:p>
+    <w:p>
+      <w:pPr>
+        <w:tabs>
+          <w:tab w:val="left" w:pos="284"/>
+        </w:tabs>
+        <w:spacing w:after="0" w:line="240" w:lineRule="auto"/>
+        <w:rPr>
+          <w:rFonts w:ascii="TH SarabunIT๙" w:hAnsi="TH SarabunIT๙" w:cs="TH SarabunIT๙"/>
+          <w:color w:val="000000"/>
           <w:sz w:val="14"/>
           <w:szCs w:val="14"/>
         </w:rPr>
@@ -24091,24 +24239,25 @@
     <w:tbl>
       <w:tblPr>
         <w:tblStyle w:val="TableGrid"/>
-        <w:tblW w:w="10349" w:type="dxa"/>
+        <w:tblW w:w="10321" w:type="dxa"/>
         <w:tblInd w:w="-431" w:type="dxa"/>
+        <w:tblLayout w:type="fixed"/>
         <w:tblLook w:val="04A0" w:firstRow="1" w:lastRow="0" w:firstColumn="1" w:lastColumn="0" w:noHBand="0" w:noVBand="1"/>
       </w:tblPr>
       <w:tblGrid>
-        <w:gridCol w:w="581"/>
-        <w:gridCol w:w="1688"/>
-        <w:gridCol w:w="2268"/>
-        <w:gridCol w:w="851"/>
-        <w:gridCol w:w="850"/>
-        <w:gridCol w:w="851"/>
-        <w:gridCol w:w="1275"/>
-        <w:gridCol w:w="1985"/>
+        <w:gridCol w:w="876"/>
+        <w:gridCol w:w="1749"/>
+        <w:gridCol w:w="1575"/>
+        <w:gridCol w:w="1224"/>
+        <w:gridCol w:w="1225"/>
+        <w:gridCol w:w="1224"/>
+        <w:gridCol w:w="1224"/>
+        <w:gridCol w:w="1224"/>
       </w:tblGrid>
       <w:tr>
         <w:tc>
           <w:tcPr>
-            <w:tcW w:w="581" w:type="dxa"/>
+            <w:tcW w:w="876" w:type="dxa"/>
           </w:tcPr>
           <w:p>
             <w:pPr>
@@ -24135,7 +24284,7 @@
         </w:tc>
         <w:tc>
           <w:tcPr>
-            <w:tcW w:w="1688" w:type="dxa"/>
+            <w:tcW w:w="1749" w:type="dxa"/>
           </w:tcPr>
           <w:p>
             <w:pPr>
@@ -24171,7 +24320,7 @@
         </w:tc>
         <w:tc>
           <w:tcPr>
-            <w:tcW w:w="2268" w:type="dxa"/>
+            <w:tcW w:w="1575" w:type="dxa"/>
           </w:tcPr>
           <w:p>
             <w:pPr>
@@ -24199,7 +24348,7 @@
         </w:tc>
         <w:tc>
           <w:tcPr>
-            <w:tcW w:w="851" w:type="dxa"/>
+            <w:tcW w:w="1224" w:type="dxa"/>
           </w:tcPr>
           <w:p>
             <w:pPr>
@@ -24246,7 +24395,7 @@
         </w:tc>
         <w:tc>
           <w:tcPr>
-            <w:tcW w:w="850" w:type="dxa"/>
+            <w:tcW w:w="1225" w:type="dxa"/>
           </w:tcPr>
           <w:p>
             <w:pPr>
@@ -24293,7 +24442,7 @@
         </w:tc>
         <w:tc>
           <w:tcPr>
-            <w:tcW w:w="851" w:type="dxa"/>
+            <w:tcW w:w="1224" w:type="dxa"/>
           </w:tcPr>
           <w:p>
             <w:pPr>
@@ -24340,7 +24489,7 @@
         </w:tc>
         <w:tc>
           <w:tcPr>
-            <w:tcW w:w="1275" w:type="dxa"/>
+            <w:tcW w:w="1224" w:type="dxa"/>
           </w:tcPr>
           <w:p>
             <w:pPr>
@@ -24387,7 +24536,7 @@
         </w:tc>
         <w:tc>
           <w:tcPr>
-            <w:tcW w:w="1985" w:type="dxa"/>
+            <w:tcW w:w="1224" w:type="dxa"/>
           </w:tcPr>
           <w:p>
             <w:pPr>
@@ -24456,78 +24605,54 @@
       <w:tr>
         <w:tc>
           <w:tcPr>
-            <w:tcW w:w="581" w:type="dxa"/>
+            <w:tcW w:w="876" w:type="dxa"/>
           </w:tcPr>
           <w:p>
             <w:pPr>
               <w:spacing w:after="0" w:line="240" w:lineRule="auto"/>
               <w:jc w:val="center"/>
               <w:rPr>
-                <w:rFonts w:ascii="TH SarabunIT๙" w:hAnsi="TH SarabunIT๙" w:cs="TH SarabunIT๙"/>
+                <w:rFonts w:ascii="TH SarabunIT๙" w:hAnsi="TH SarabunIT๙" w:cs="TH SarabunIT๙" w:hint="cs"/>
                 <w:color w:val="000000"/>
                 <w:sz w:val="24"/>
                 <w:szCs w:val="24"/>
                 <w:cs/>
               </w:rPr>
             </w:pPr>
-          </w:p>
-        </w:tc>
-        <w:tc>
-          <w:tcPr>
-            <w:tcW w:w="1688" w:type="dxa"/>
-          </w:tcPr>
-          <w:p>
-            <w:pPr>
-              <w:spacing w:after="0" w:line="240" w:lineRule="auto"/>
-              <w:jc w:val="center"/>
+            <w:r>
               <w:rPr>
                 <w:rFonts w:ascii="TH SarabunIT๙" w:hAnsi="TH SarabunIT๙" w:cs="TH SarabunIT๙"/>
                 <w:color w:val="000000"/>
                 <w:sz w:val="24"/>
                 <w:szCs w:val="24"/>
-                <w:cs/>
-              </w:rPr>
-            </w:pPr>
-          </w:p>
-        </w:tc>
-        <w:tc>
-          <w:tcPr>
-            <w:tcW w:w="2268" w:type="dxa"/>
-          </w:tcPr>
-          <w:p>
-            <w:pPr>
-              <w:spacing w:after="0" w:line="240" w:lineRule="auto"/>
-              <w:jc w:val="center"/>
+              </w:rPr>
+              <w:t>{#</w:t>
+            </w:r>
+            <w:proofErr w:type="gramStart"/>
+            <w:r>
               <w:rPr>
                 <w:rFonts w:ascii="TH SarabunIT๙" w:hAnsi="TH SarabunIT๙" w:cs="TH SarabunIT๙"/>
                 <w:color w:val="000000"/>
                 <w:sz w:val="24"/>
                 <w:szCs w:val="24"/>
-                <w:cs/>
-              </w:rPr>
-            </w:pPr>
-          </w:p>
-        </w:tc>
-        <w:tc>
-          <w:tcPr>
-            <w:tcW w:w="851" w:type="dxa"/>
-          </w:tcPr>
-          <w:p>
-            <w:pPr>
-              <w:spacing w:after="0" w:line="240" w:lineRule="auto"/>
-              <w:jc w:val="center"/>
+              </w:rPr>
+              <w:t>vms}{</w:t>
+            </w:r>
+            <w:proofErr w:type="gramEnd"/>
+            <w:r>
               <w:rPr>
                 <w:rFonts w:ascii="TH SarabunIT๙" w:hAnsi="TH SarabunIT๙" w:cs="TH SarabunIT๙"/>
                 <w:color w:val="000000"/>
                 <w:sz w:val="24"/>
                 <w:szCs w:val="24"/>
               </w:rPr>
-            </w:pPr>
-          </w:p>
-        </w:tc>
-        <w:tc>
-          <w:tcPr>
-            <w:tcW w:w="850" w:type="dxa"/>
+              <w:t>index}</w:t>
+            </w:r>
+          </w:p>
+        </w:tc>
+        <w:tc>
+          <w:tcPr>
+            <w:tcW w:w="1749" w:type="dxa"/>
           </w:tcPr>
           <w:p>
             <w:pPr>
@@ -24538,67 +24663,362 @@
                 <w:color w:val="000000"/>
                 <w:sz w:val="24"/>
                 <w:szCs w:val="24"/>
-              </w:rPr>
-            </w:pPr>
-          </w:p>
-        </w:tc>
-        <w:tc>
-          <w:tcPr>
-            <w:tcW w:w="851" w:type="dxa"/>
-          </w:tcPr>
-          <w:p>
-            <w:pPr>
-              <w:spacing w:after="0" w:line="240" w:lineRule="auto"/>
-              <w:jc w:val="center"/>
+                <w:cs/>
+              </w:rPr>
+            </w:pPr>
+            <w:r>
               <w:rPr>
                 <w:rFonts w:ascii="TH SarabunIT๙" w:hAnsi="TH SarabunIT๙" w:cs="TH SarabunIT๙"/>
                 <w:color w:val="000000"/>
                 <w:sz w:val="24"/>
                 <w:szCs w:val="24"/>
               </w:rPr>
-            </w:pPr>
-          </w:p>
-        </w:tc>
-        <w:tc>
-          <w:tcPr>
-            <w:tcW w:w="1275" w:type="dxa"/>
-          </w:tcPr>
-          <w:p>
-            <w:pPr>
-              <w:spacing w:after="0" w:line="240" w:lineRule="auto"/>
-              <w:jc w:val="center"/>
+              <w:t>{</w:t>
+            </w:r>
+            <w:proofErr w:type="spellStart"/>
+            <w:r>
               <w:rPr>
                 <w:rFonts w:ascii="TH SarabunIT๙" w:hAnsi="TH SarabunIT๙" w:cs="TH SarabunIT๙"/>
                 <w:color w:val="000000"/>
                 <w:sz w:val="24"/>
                 <w:szCs w:val="24"/>
               </w:rPr>
-            </w:pPr>
-          </w:p>
-        </w:tc>
-        <w:tc>
-          <w:tcPr>
-            <w:tcW w:w="1985" w:type="dxa"/>
-          </w:tcPr>
-          <w:p>
-            <w:pPr>
-              <w:spacing w:after="0" w:line="240" w:lineRule="auto"/>
-              <w:jc w:val="center"/>
+              <w:t>vmDescription</w:t>
+            </w:r>
+            <w:proofErr w:type="spellEnd"/>
+            <w:r>
               <w:rPr>
                 <w:rFonts w:ascii="TH SarabunIT๙" w:hAnsi="TH SarabunIT๙" w:cs="TH SarabunIT๙"/>
                 <w:color w:val="000000"/>
                 <w:sz w:val="24"/>
                 <w:szCs w:val="24"/>
-                <w:cs/>
-              </w:rPr>
-            </w:pPr>
+              </w:rPr>
+              <w:t>}</w:t>
+            </w:r>
+          </w:p>
+        </w:tc>
+        <w:tc>
+          <w:tcPr>
+            <w:tcW w:w="1575" w:type="dxa"/>
+          </w:tcPr>
+          <w:p>
+            <w:pPr>
+              <w:spacing w:after="0" w:line="240" w:lineRule="auto"/>
+              <w:jc w:val="center"/>
+              <w:rPr>
+                <w:rFonts w:ascii="TH SarabunIT๙" w:hAnsi="TH SarabunIT๙" w:cs="TH SarabunIT๙"/>
+                <w:color w:val="000000"/>
+                <w:sz w:val="24"/>
+                <w:szCs w:val="24"/>
+                <w:cs/>
+              </w:rPr>
+            </w:pPr>
+            <w:r>
+              <w:rPr>
+                <w:rFonts w:ascii="TH SarabunIT๙" w:hAnsi="TH SarabunIT๙" w:cs="TH SarabunIT๙"/>
+                <w:color w:val="000000"/>
+                <w:sz w:val="24"/>
+                <w:szCs w:val="24"/>
+              </w:rPr>
+              <w:t>{</w:t>
+            </w:r>
+            <w:proofErr w:type="spellStart"/>
+            <w:r>
+              <w:rPr>
+                <w:rFonts w:ascii="TH SarabunIT๙" w:hAnsi="TH SarabunIT๙" w:cs="TH SarabunIT๙"/>
+                <w:color w:val="000000"/>
+                <w:sz w:val="24"/>
+                <w:szCs w:val="24"/>
+              </w:rPr>
+              <w:t>osDatabase</w:t>
+            </w:r>
+            <w:proofErr w:type="spellEnd"/>
+            <w:r>
+              <w:rPr>
+                <w:rFonts w:ascii="TH SarabunIT๙" w:hAnsi="TH SarabunIT๙" w:cs="TH SarabunIT๙"/>
+                <w:color w:val="000000"/>
+                <w:sz w:val="24"/>
+                <w:szCs w:val="24"/>
+              </w:rPr>
+              <w:t>}</w:t>
+            </w:r>
+          </w:p>
+        </w:tc>
+        <w:tc>
+          <w:tcPr>
+            <w:tcW w:w="1224" w:type="dxa"/>
+          </w:tcPr>
+          <w:p>
+            <w:pPr>
+              <w:spacing w:after="0" w:line="240" w:lineRule="auto"/>
+              <w:jc w:val="center"/>
+              <w:rPr>
+                <w:rFonts w:ascii="TH SarabunIT๙" w:hAnsi="TH SarabunIT๙" w:cs="TH SarabunIT๙"/>
+                <w:color w:val="000000"/>
+                <w:sz w:val="24"/>
+                <w:szCs w:val="24"/>
+              </w:rPr>
+            </w:pPr>
+            <w:r>
+              <w:rPr>
+                <w:rFonts w:ascii="TH SarabunIT๙" w:hAnsi="TH SarabunIT๙" w:cs="TH SarabunIT๙"/>
+                <w:color w:val="000000"/>
+                <w:sz w:val="24"/>
+                <w:szCs w:val="24"/>
+              </w:rPr>
+              <w:t>{</w:t>
+            </w:r>
+            <w:proofErr w:type="spellStart"/>
+            <w:r>
+              <w:rPr>
+                <w:rFonts w:ascii="TH SarabunIT๙" w:hAnsi="TH SarabunIT๙" w:cs="TH SarabunIT๙"/>
+                <w:color w:val="000000"/>
+                <w:sz w:val="24"/>
+                <w:szCs w:val="24"/>
+              </w:rPr>
+              <w:t>vcpu</w:t>
+            </w:r>
+            <w:proofErr w:type="spellEnd"/>
+            <w:r>
+              <w:rPr>
+                <w:rFonts w:ascii="TH SarabunIT๙" w:hAnsi="TH SarabunIT๙" w:cs="TH SarabunIT๙"/>
+                <w:color w:val="000000"/>
+                <w:sz w:val="24"/>
+                <w:szCs w:val="24"/>
+              </w:rPr>
+              <w:t>}</w:t>
+            </w:r>
+          </w:p>
+        </w:tc>
+        <w:tc>
+          <w:tcPr>
+            <w:tcW w:w="1225" w:type="dxa"/>
+          </w:tcPr>
+          <w:p>
+            <w:pPr>
+              <w:spacing w:after="0" w:line="240" w:lineRule="auto"/>
+              <w:jc w:val="center"/>
+              <w:rPr>
+                <w:rFonts w:ascii="TH SarabunIT๙" w:hAnsi="TH SarabunIT๙" w:cs="TH SarabunIT๙"/>
+                <w:color w:val="000000"/>
+                <w:sz w:val="24"/>
+                <w:szCs w:val="24"/>
+              </w:rPr>
+            </w:pPr>
+            <w:r>
+              <w:rPr>
+                <w:rFonts w:ascii="TH SarabunIT๙" w:hAnsi="TH SarabunIT๙" w:cs="TH SarabunIT๙"/>
+                <w:color w:val="000000"/>
+                <w:sz w:val="24"/>
+                <w:szCs w:val="24"/>
+              </w:rPr>
+              <w:t>{</w:t>
+            </w:r>
+            <w:proofErr w:type="spellStart"/>
+            <w:r>
+              <w:rPr>
+                <w:rFonts w:ascii="TH SarabunIT๙" w:hAnsi="TH SarabunIT๙" w:cs="TH SarabunIT๙"/>
+                <w:color w:val="000000"/>
+                <w:sz w:val="24"/>
+                <w:szCs w:val="24"/>
+              </w:rPr>
+              <w:t>ramGb</w:t>
+            </w:r>
+            <w:proofErr w:type="spellEnd"/>
+            <w:r>
+              <w:rPr>
+                <w:rFonts w:ascii="TH SarabunIT๙" w:hAnsi="TH SarabunIT๙" w:cs="TH SarabunIT๙"/>
+                <w:color w:val="000000"/>
+                <w:sz w:val="24"/>
+                <w:szCs w:val="24"/>
+              </w:rPr>
+              <w:t>}</w:t>
+            </w:r>
+          </w:p>
+        </w:tc>
+        <w:tc>
+          <w:tcPr>
+            <w:tcW w:w="1224" w:type="dxa"/>
+          </w:tcPr>
+          <w:p>
+            <w:pPr>
+              <w:spacing w:after="0" w:line="240" w:lineRule="auto"/>
+              <w:jc w:val="center"/>
+              <w:rPr>
+                <w:rFonts w:ascii="TH SarabunIT๙" w:hAnsi="TH SarabunIT๙" w:cs="TH SarabunIT๙"/>
+                <w:color w:val="000000"/>
+                <w:sz w:val="24"/>
+                <w:szCs w:val="24"/>
+              </w:rPr>
+            </w:pPr>
+            <w:r>
+              <w:rPr>
+                <w:rFonts w:ascii="TH SarabunIT๙" w:hAnsi="TH SarabunIT๙" w:cs="TH SarabunIT๙"/>
+                <w:color w:val="000000"/>
+                <w:sz w:val="24"/>
+                <w:szCs w:val="24"/>
+              </w:rPr>
+              <w:t>{</w:t>
+            </w:r>
+            <w:proofErr w:type="spellStart"/>
+            <w:r>
+              <w:rPr>
+                <w:rFonts w:ascii="TH SarabunIT๙" w:hAnsi="TH SarabunIT๙" w:cs="TH SarabunIT๙"/>
+                <w:color w:val="000000"/>
+                <w:sz w:val="24"/>
+                <w:szCs w:val="24"/>
+              </w:rPr>
+              <w:t>gpuGb</w:t>
+            </w:r>
+            <w:proofErr w:type="spellEnd"/>
+            <w:r>
+              <w:rPr>
+                <w:rFonts w:ascii="TH SarabunIT๙" w:hAnsi="TH SarabunIT๙" w:cs="TH SarabunIT๙"/>
+                <w:color w:val="000000"/>
+                <w:sz w:val="24"/>
+                <w:szCs w:val="24"/>
+              </w:rPr>
+              <w:t>}</w:t>
+            </w:r>
+          </w:p>
+        </w:tc>
+        <w:tc>
+          <w:tcPr>
+            <w:tcW w:w="1224" w:type="dxa"/>
+          </w:tcPr>
+          <w:p>
+            <w:pPr>
+              <w:spacing w:after="0" w:line="240" w:lineRule="auto"/>
+              <w:jc w:val="center"/>
+              <w:rPr>
+                <w:rFonts w:ascii="TH SarabunIT๙" w:hAnsi="TH SarabunIT๙" w:cs="TH SarabunIT๙"/>
+                <w:color w:val="000000"/>
+                <w:sz w:val="24"/>
+                <w:szCs w:val="24"/>
+              </w:rPr>
+            </w:pPr>
+            <w:r>
+              <w:rPr>
+                <w:rFonts w:ascii="TH SarabunIT๙" w:hAnsi="TH SarabunIT๙" w:cs="TH SarabunIT๙"/>
+                <w:color w:val="000000"/>
+                <w:sz w:val="24"/>
+                <w:szCs w:val="24"/>
+              </w:rPr>
+              <w:t>{</w:t>
+            </w:r>
+            <w:proofErr w:type="spellStart"/>
+            <w:r>
+              <w:rPr>
+                <w:rFonts w:ascii="TH SarabunIT๙" w:hAnsi="TH SarabunIT๙" w:cs="TH SarabunIT๙"/>
+                <w:color w:val="000000"/>
+                <w:sz w:val="24"/>
+                <w:szCs w:val="24"/>
+              </w:rPr>
+              <w:t>storageGb</w:t>
+            </w:r>
+            <w:proofErr w:type="spellEnd"/>
+            <w:r>
+              <w:rPr>
+                <w:rFonts w:ascii="TH SarabunIT๙" w:hAnsi="TH SarabunIT๙" w:cs="TH SarabunIT๙"/>
+                <w:color w:val="000000"/>
+                <w:sz w:val="24"/>
+                <w:szCs w:val="24"/>
+              </w:rPr>
+              <w:t>}</w:t>
+            </w:r>
+          </w:p>
+        </w:tc>
+        <w:tc>
+          <w:tcPr>
+            <w:tcW w:w="1224" w:type="dxa"/>
+          </w:tcPr>
+          <w:p>
+            <w:pPr>
+              <w:spacing w:after="0" w:line="240" w:lineRule="auto"/>
+              <w:jc w:val="center"/>
+              <w:rPr>
+                <w:rFonts w:ascii="TH SarabunIT๙" w:hAnsi="TH SarabunIT๙" w:cs="TH SarabunIT๙"/>
+                <w:color w:val="000000"/>
+                <w:sz w:val="24"/>
+                <w:szCs w:val="24"/>
+              </w:rPr>
+            </w:pPr>
+            <w:r>
+              <w:rPr>
+                <w:rFonts w:ascii="TH SarabunIT๙" w:hAnsi="TH SarabunIT๙" w:cs="TH SarabunIT๙"/>
+                <w:color w:val="000000"/>
+                <w:sz w:val="24"/>
+                <w:szCs w:val="24"/>
+              </w:rPr>
+              <w:t>{</w:t>
+            </w:r>
+            <w:proofErr w:type="spellStart"/>
+            <w:r>
+              <w:rPr>
+                <w:rFonts w:ascii="TH SarabunIT๙" w:hAnsi="TH SarabunIT๙" w:cs="TH SarabunIT๙"/>
+                <w:color w:val="000000"/>
+                <w:sz w:val="24"/>
+                <w:szCs w:val="24"/>
+              </w:rPr>
+              <w:t>priceFormatted</w:t>
+            </w:r>
+            <w:proofErr w:type="spellEnd"/>
+            <w:r>
+              <w:rPr>
+                <w:rFonts w:ascii="TH SarabunIT๙" w:hAnsi="TH SarabunIT๙" w:cs="TH SarabunIT๙"/>
+                <w:color w:val="000000"/>
+                <w:sz w:val="24"/>
+                <w:szCs w:val="24"/>
+              </w:rPr>
+              <w:t>}</w:t>
+            </w:r>
+            <w:r>
+              <w:rPr>
+                <w:rFonts w:eastAsia="Times New Roman"/>
+                <w:sz w:val="20"/>
+                <w:szCs w:val="20"/>
+              </w:rPr>
+              <w:t xml:space="preserve"> </w:t>
+            </w:r>
+            <w:r>
+              <w:rPr>
+                <w:rFonts w:ascii="TH SarabunIT๙" w:hAnsi="TH SarabunIT๙" w:cs="TH SarabunIT๙"/>
+                <w:color w:val="000000"/>
+                <w:sz w:val="24"/>
+                <w:szCs w:val="24"/>
+              </w:rPr>
+              <w:t>{/</w:t>
+            </w:r>
+            <w:proofErr w:type="spellStart"/>
+            <w:r>
+              <w:rPr>
+                <w:rFonts w:ascii="TH SarabunIT๙" w:hAnsi="TH SarabunIT๙" w:cs="TH SarabunIT๙"/>
+                <w:color w:val="000000"/>
+                <w:sz w:val="24"/>
+                <w:szCs w:val="24"/>
+              </w:rPr>
+              <w:t>vms</w:t>
+            </w:r>
+            <w:proofErr w:type="spellEnd"/>
+            <w:r>
+              <w:rPr>
+                <w:rFonts w:ascii="TH SarabunIT๙" w:hAnsi="TH SarabunIT๙" w:cs="TH SarabunIT๙"/>
+                <w:color w:val="000000"/>
+                <w:sz w:val="24"/>
+                <w:szCs w:val="24"/>
+              </w:rPr>
+              <w:t>}</w:t>
+            </w:r>
           </w:p>
         </w:tc>
       </w:tr>
       <w:tr>
-        <w:tc>
-          <w:tcPr>
-            <w:tcW w:w="4537" w:type="dxa"/>
+        <w:trPr>
+          <w:trHeight w:val="471"/>
+        </w:trPr>
+        <w:tc>
+          <w:tcPr>
+            <w:tcW w:w="4200" w:type="dxa"/>
             <w:gridSpan w:val="3"/>
           </w:tcPr>
           <w:p>
@@ -24649,7 +25069,7 @@
         </w:tc>
         <w:tc>
           <w:tcPr>
-            <w:tcW w:w="851" w:type="dxa"/>
+            <w:tcW w:w="1224" w:type="dxa"/>
           </w:tcPr>
           <w:p>
             <w:pPr>
@@ -24662,62 +25082,40 @@
                 <w:szCs w:val="24"/>
               </w:rPr>
             </w:pPr>
-          </w:p>
-        </w:tc>
-        <w:tc>
-          <w:tcPr>
-            <w:tcW w:w="850" w:type="dxa"/>
-          </w:tcPr>
-          <w:p>
-            <w:pPr>
-              <w:spacing w:after="0" w:line="240" w:lineRule="auto"/>
-              <w:jc w:val="center"/>
+            <w:r>
               <w:rPr>
                 <w:rFonts w:ascii="TH SarabunIT๙" w:hAnsi="TH SarabunIT๙" w:cs="TH SarabunIT๙"/>
                 <w:color w:val="000000"/>
                 <w:sz w:val="24"/>
                 <w:szCs w:val="24"/>
               </w:rPr>
-            </w:pPr>
-          </w:p>
-        </w:tc>
-        <w:tc>
-          <w:tcPr>
-            <w:tcW w:w="851" w:type="dxa"/>
-          </w:tcPr>
-          <w:p>
-            <w:pPr>
-              <w:spacing w:after="0" w:line="240" w:lineRule="auto"/>
-              <w:jc w:val="center"/>
+              <w:t>{</w:t>
+            </w:r>
+            <w:proofErr w:type="spellStart"/>
+            <w:r>
               <w:rPr>
                 <w:rFonts w:ascii="TH SarabunIT๙" w:hAnsi="TH SarabunIT๙" w:cs="TH SarabunIT๙"/>
                 <w:color w:val="000000"/>
                 <w:sz w:val="24"/>
                 <w:szCs w:val="24"/>
               </w:rPr>
-            </w:pPr>
-          </w:p>
-        </w:tc>
-        <w:tc>
-          <w:tcPr>
-            <w:tcW w:w="1275" w:type="dxa"/>
-          </w:tcPr>
-          <w:p>
-            <w:pPr>
-              <w:spacing w:after="0" w:line="240" w:lineRule="auto"/>
-              <w:jc w:val="center"/>
+              <w:t>groupTotalVcpu</w:t>
+            </w:r>
+            <w:proofErr w:type="spellEnd"/>
+            <w:r>
               <w:rPr>
                 <w:rFonts w:ascii="TH SarabunIT๙" w:hAnsi="TH SarabunIT๙" w:cs="TH SarabunIT๙"/>
                 <w:color w:val="000000"/>
                 <w:sz w:val="24"/>
                 <w:szCs w:val="24"/>
               </w:rPr>
-            </w:pPr>
-          </w:p>
-        </w:tc>
-        <w:tc>
-          <w:tcPr>
-            <w:tcW w:w="1985" w:type="dxa"/>
+              <w:t>}</w:t>
+            </w:r>
+          </w:p>
+        </w:tc>
+        <w:tc>
+          <w:tcPr>
+            <w:tcW w:w="1225" w:type="dxa"/>
           </w:tcPr>
           <w:p>
             <w:pPr>
@@ -24728,9 +25126,176 @@
                 <w:color w:val="000000"/>
                 <w:sz w:val="24"/>
                 <w:szCs w:val="24"/>
-                <w:cs/>
-              </w:rPr>
-            </w:pPr>
+              </w:rPr>
+            </w:pPr>
+            <w:r>
+              <w:rPr>
+                <w:rFonts w:ascii="TH SarabunIT๙" w:hAnsi="TH SarabunIT๙" w:cs="TH SarabunIT๙"/>
+                <w:color w:val="000000"/>
+                <w:sz w:val="24"/>
+                <w:szCs w:val="24"/>
+              </w:rPr>
+              <w:t>{</w:t>
+            </w:r>
+            <w:proofErr w:type="spellStart"/>
+            <w:r>
+              <w:rPr>
+                <w:rFonts w:ascii="TH SarabunIT๙" w:hAnsi="TH SarabunIT๙" w:cs="TH SarabunIT๙"/>
+                <w:color w:val="000000"/>
+                <w:sz w:val="24"/>
+                <w:szCs w:val="24"/>
+              </w:rPr>
+              <w:t>groupTotalRam</w:t>
+            </w:r>
+            <w:proofErr w:type="spellEnd"/>
+            <w:r>
+              <w:rPr>
+                <w:rFonts w:ascii="TH SarabunIT๙" w:hAnsi="TH SarabunIT๙" w:cs="TH SarabunIT๙"/>
+                <w:color w:val="000000"/>
+                <w:sz w:val="24"/>
+                <w:szCs w:val="24"/>
+              </w:rPr>
+              <w:t>}</w:t>
+            </w:r>
+          </w:p>
+        </w:tc>
+        <w:tc>
+          <w:tcPr>
+            <w:tcW w:w="1224" w:type="dxa"/>
+          </w:tcPr>
+          <w:p>
+            <w:pPr>
+              <w:spacing w:after="0" w:line="240" w:lineRule="auto"/>
+              <w:jc w:val="center"/>
+              <w:rPr>
+                <w:rFonts w:ascii="TH SarabunIT๙" w:hAnsi="TH SarabunIT๙" w:cs="TH SarabunIT๙"/>
+                <w:color w:val="000000"/>
+                <w:sz w:val="24"/>
+                <w:szCs w:val="24"/>
+              </w:rPr>
+            </w:pPr>
+            <w:r>
+              <w:rPr>
+                <w:rFonts w:ascii="TH SarabunIT๙" w:hAnsi="TH SarabunIT๙" w:cs="TH SarabunIT๙"/>
+                <w:color w:val="000000"/>
+                <w:sz w:val="24"/>
+                <w:szCs w:val="24"/>
+              </w:rPr>
+              <w:t>{</w:t>
+            </w:r>
+            <w:proofErr w:type="spellStart"/>
+            <w:r>
+              <w:rPr>
+                <w:rFonts w:ascii="TH SarabunIT๙" w:hAnsi="TH SarabunIT๙" w:cs="TH SarabunIT๙"/>
+                <w:color w:val="000000"/>
+                <w:sz w:val="24"/>
+                <w:szCs w:val="24"/>
+              </w:rPr>
+              <w:t>groupTotalGpu</w:t>
+            </w:r>
+            <w:proofErr w:type="spellEnd"/>
+            <w:r>
+              <w:rPr>
+                <w:rFonts w:ascii="TH SarabunIT๙" w:hAnsi="TH SarabunIT๙" w:cs="TH SarabunIT๙"/>
+                <w:color w:val="000000"/>
+                <w:sz w:val="24"/>
+                <w:szCs w:val="24"/>
+              </w:rPr>
+              <w:t>}</w:t>
+            </w:r>
+          </w:p>
+        </w:tc>
+        <w:tc>
+          <w:tcPr>
+            <w:tcW w:w="1224" w:type="dxa"/>
+          </w:tcPr>
+          <w:p>
+            <w:pPr>
+              <w:spacing w:after="0" w:line="240" w:lineRule="auto"/>
+              <w:jc w:val="center"/>
+              <w:rPr>
+                <w:rFonts w:ascii="TH SarabunIT๙" w:hAnsi="TH SarabunIT๙" w:cs="TH SarabunIT๙" w:hint="cs"/>
+                <w:color w:val="000000"/>
+                <w:sz w:val="24"/>
+                <w:szCs w:val="24"/>
+                <w:cs/>
+              </w:rPr>
+            </w:pPr>
+            <w:r>
+              <w:rPr>
+                <w:rFonts w:ascii="TH SarabunIT๙" w:hAnsi="TH SarabunIT๙" w:cs="TH SarabunIT๙"/>
+                <w:color w:val="000000"/>
+                <w:sz w:val="24"/>
+                <w:szCs w:val="24"/>
+              </w:rPr>
+              <w:t>{</w:t>
+            </w:r>
+            <w:proofErr w:type="spellStart"/>
+            <w:r>
+              <w:rPr>
+                <w:rFonts w:ascii="TH SarabunIT๙" w:hAnsi="TH SarabunIT๙" w:cs="TH SarabunIT๙"/>
+                <w:color w:val="000000"/>
+                <w:sz w:val="24"/>
+                <w:szCs w:val="24"/>
+              </w:rPr>
+              <w:t>groupTotalStorage</w:t>
+            </w:r>
+            <w:proofErr w:type="spellEnd"/>
+            <w:r>
+              <w:rPr>
+                <w:rFonts w:ascii="TH SarabunIT๙" w:hAnsi="TH SarabunIT๙" w:cs="TH SarabunIT๙"/>
+                <w:color w:val="000000"/>
+                <w:sz w:val="24"/>
+                <w:szCs w:val="24"/>
+              </w:rPr>
+              <w:t>}</w:t>
+            </w:r>
+          </w:p>
+        </w:tc>
+        <w:tc>
+          <w:tcPr>
+            <w:tcW w:w="1224" w:type="dxa"/>
+          </w:tcPr>
+          <w:p>
+            <w:pPr>
+              <w:spacing w:after="0" w:line="240" w:lineRule="auto"/>
+              <w:jc w:val="center"/>
+              <w:rPr>
+                <w:rFonts w:ascii="TH SarabunIT๙" w:hAnsi="TH SarabunIT๙" w:cs="TH SarabunIT๙"/>
+                <w:color w:val="000000"/>
+                <w:sz w:val="24"/>
+                <w:szCs w:val="24"/>
+              </w:rPr>
+            </w:pPr>
+            <w:r>
+              <w:rPr>
+                <w:rFonts w:ascii="TH SarabunIT๙" w:hAnsi="TH SarabunIT๙" w:cs="TH SarabunIT๙"/>
+                <w:color w:val="000000"/>
+                <w:sz w:val="24"/>
+                <w:szCs w:val="24"/>
+              </w:rPr>
+              <w:t>{</w:t>
+            </w:r>
+            <w:proofErr w:type="spellStart"/>
+            <w:r>
+              <w:rPr>
+                <w:rFonts w:ascii="TH SarabunIT๙" w:hAnsi="TH SarabunIT๙" w:cs="TH SarabunIT๙"/>
+                <w:color w:val="000000"/>
+                <w:sz w:val="24"/>
+                <w:szCs w:val="24"/>
+              </w:rPr>
+              <w:t>groupTotalPriceFormatted</w:t>
+            </w:r>
+            <w:proofErr w:type="spellEnd"/>
+            <w:r>
+              <w:rPr>
+                <w:rFonts w:ascii="TH SarabunIT๙" w:hAnsi="TH SarabunIT๙" w:cs="TH SarabunIT๙"/>
+                <w:color w:val="000000"/>
+                <w:sz w:val="24"/>
+                <w:szCs w:val="24"/>
+              </w:rPr>
+              <w:t>}</w:t>
+            </w:r>
           </w:p>
         </w:tc>
       </w:tr>
@@ -24746,6 +25311,35 @@
           <w:cs/>
         </w:rPr>
       </w:pPr>
+      <w:r>
+        <w:rPr>
+          <w:rFonts w:ascii="TH SarabunIT๙" w:hAnsi="TH SarabunIT๙" w:cs="TH SarabunIT๙"/>
+          <w:color w:val="000000"/>
+          <w:sz w:val="32"/>
+          <w:szCs w:val="32"/>
+        </w:rPr>
+        <w:t>{/</w:t>
+      </w:r>
+      <w:proofErr w:type="spellStart"/>
+      <w:r>
+        <w:rPr>
+          <w:rFonts w:ascii="TH SarabunIT๙" w:hAnsi="TH SarabunIT๙" w:cs="TH SarabunIT๙"/>
+          <w:color w:val="000000"/>
+          <w:sz w:val="32"/>
+          <w:szCs w:val="32"/>
+        </w:rPr>
+        <w:t>cloudRequests</w:t>
+      </w:r>
+      <w:proofErr w:type="spellEnd"/>
+      <w:r>
+        <w:rPr>
+          <w:rFonts w:ascii="TH SarabunIT๙" w:hAnsi="TH SarabunIT๙" w:cs="TH SarabunIT๙"/>
+          <w:color w:val="000000"/>
+          <w:sz w:val="32"/>
+          <w:szCs w:val="32"/>
+        </w:rPr>
+        <w:t>}</w:t>
+      </w:r>
     </w:p>
     <w:p>
       <w:pPr>
@@ -24755,19 +25349,327 @@
           <w:color w:val="000000"/>
           <w:sz w:val="32"/>
           <w:szCs w:val="32"/>
-          <w:cs/>
-        </w:rPr>
-      </w:pPr>
+        </w:rPr>
+      </w:pPr>
+      <w:r>
+        <w:rPr>
+          <w:rFonts w:ascii="TH SarabunIT๙" w:hAnsi="TH SarabunIT๙" w:cs="TH SarabunIT๙"/>
+          <w:color w:val="000000"/>
+          <w:sz w:val="32"/>
+          <w:szCs w:val="32"/>
+          <w:cs/>
+        </w:rPr>
+        <w:t>สรุปรวมทั้งหมด</w:t>
+      </w:r>
+      <w:r>
+        <w:rPr>
+          <w:rFonts w:ascii="TH SarabunIT๙" w:hAnsi="TH SarabunIT๙" w:cs="TH SarabunIT๙"/>
+          <w:color w:val="000000"/>
+          <w:sz w:val="32"/>
+          <w:szCs w:val="32"/>
+        </w:rPr>
+        <w:t xml:space="preserve"> </w:t>
+      </w:r>
     </w:p>
     <w:p>
       <w:pPr>
         <w:spacing w:after="0" w:line="240" w:lineRule="auto"/>
+        <w:rPr>
+          <w:rFonts w:ascii="TH SarabunIT๙" w:hAnsi="TH SarabunIT๙" w:cs="TH SarabunIT๙"/>
+          <w:color w:val="000000"/>
+          <w:sz w:val="32"/>
+          <w:szCs w:val="32"/>
+        </w:rPr>
+      </w:pPr>
+      <w:r>
+        <w:rPr>
+          <w:rFonts w:ascii="TH SarabunIT๙" w:hAnsi="TH SarabunIT๙" w:cs="TH SarabunIT๙"/>
+          <w:color w:val="000000"/>
+          <w:sz w:val="32"/>
+          <w:szCs w:val="32"/>
+          <w:cs/>
+        </w:rPr>
+        <w:t xml:space="preserve">รวม </w:t>
+      </w:r>
+      <w:r>
+        <w:rPr>
+          <w:rFonts w:ascii="TH SarabunIT๙" w:hAnsi="TH SarabunIT๙" w:cs="TH SarabunIT๙"/>
+          <w:color w:val="000000"/>
+          <w:sz w:val="32"/>
+          <w:szCs w:val="32"/>
+        </w:rPr>
+        <w:t>vCPU: {</w:t>
+      </w:r>
+      <w:proofErr w:type="spellStart"/>
+      <w:r>
+        <w:rPr>
+          <w:rFonts w:ascii="TH SarabunIT๙" w:hAnsi="TH SarabunIT๙" w:cs="TH SarabunIT๙"/>
+          <w:color w:val="000000"/>
+          <w:sz w:val="32"/>
+          <w:szCs w:val="32"/>
+        </w:rPr>
+        <w:t>grandTotalVcpu</w:t>
+      </w:r>
+      <w:proofErr w:type="spellEnd"/>
+      <w:r>
+        <w:rPr>
+          <w:rFonts w:ascii="TH SarabunIT๙" w:hAnsi="TH SarabunIT๙" w:cs="TH SarabunIT๙"/>
+          <w:color w:val="000000"/>
+          <w:sz w:val="32"/>
+          <w:szCs w:val="32"/>
+        </w:rPr>
+        <w:t xml:space="preserve">} Core </w:t>
+      </w:r>
+    </w:p>
+    <w:p>
+      <w:pPr>
+        <w:spacing w:after="0" w:line="240" w:lineRule="auto"/>
+        <w:rPr>
+          <w:rFonts w:ascii="TH SarabunIT๙" w:hAnsi="TH SarabunIT๙" w:cs="TH SarabunIT๙"/>
+          <w:color w:val="000000"/>
+          <w:sz w:val="32"/>
+          <w:szCs w:val="32"/>
+        </w:rPr>
+      </w:pPr>
+      <w:r>
+        <w:rPr>
+          <w:rFonts w:ascii="TH SarabunIT๙" w:hAnsi="TH SarabunIT๙" w:cs="TH SarabunIT๙"/>
+          <w:color w:val="000000"/>
+          <w:sz w:val="32"/>
+          <w:szCs w:val="32"/>
+          <w:cs/>
+        </w:rPr>
+        <w:t xml:space="preserve">รวม </w:t>
+      </w:r>
+      <w:r>
+        <w:rPr>
+          <w:rFonts w:ascii="TH SarabunIT๙" w:hAnsi="TH SarabunIT๙" w:cs="TH SarabunIT๙"/>
+          <w:color w:val="000000"/>
+          <w:sz w:val="32"/>
+          <w:szCs w:val="32"/>
+        </w:rPr>
+        <w:t>RAM: {</w:t>
+      </w:r>
+      <w:proofErr w:type="spellStart"/>
+      <w:r>
+        <w:rPr>
+          <w:rFonts w:ascii="TH SarabunIT๙" w:hAnsi="TH SarabunIT๙" w:cs="TH SarabunIT๙"/>
+          <w:color w:val="000000"/>
+          <w:sz w:val="32"/>
+          <w:szCs w:val="32"/>
+        </w:rPr>
+        <w:t>grandTotalRam</w:t>
+      </w:r>
+      <w:proofErr w:type="spellEnd"/>
+      <w:r>
+        <w:rPr>
+          <w:rFonts w:ascii="TH SarabunIT๙" w:hAnsi="TH SarabunIT๙" w:cs="TH SarabunIT๙"/>
+          <w:color w:val="000000"/>
+          <w:sz w:val="32"/>
+          <w:szCs w:val="32"/>
+        </w:rPr>
+        <w:t xml:space="preserve">} GB </w:t>
+      </w:r>
+    </w:p>
+    <w:p>
+      <w:pPr>
+        <w:spacing w:after="0" w:line="240" w:lineRule="auto"/>
+        <w:rPr>
+          <w:rFonts w:ascii="TH SarabunIT๙" w:hAnsi="TH SarabunIT๙" w:cs="TH SarabunIT๙"/>
+          <w:color w:val="000000"/>
+          <w:sz w:val="32"/>
+          <w:szCs w:val="32"/>
+        </w:rPr>
+      </w:pPr>
+      <w:r>
+        <w:rPr>
+          <w:rFonts w:ascii="TH SarabunIT๙" w:hAnsi="TH SarabunIT๙" w:cs="TH SarabunIT๙"/>
+          <w:color w:val="000000"/>
+          <w:sz w:val="32"/>
+          <w:szCs w:val="32"/>
+          <w:cs/>
+        </w:rPr>
+        <w:t xml:space="preserve">รวมราคา: </w:t>
+      </w:r>
+      <w:r>
+        <w:rPr>
+          <w:rFonts w:ascii="TH SarabunIT๙" w:hAnsi="TH SarabunIT๙" w:cs="TH SarabunIT๙"/>
+          <w:color w:val="000000"/>
+          <w:sz w:val="32"/>
+          <w:szCs w:val="32"/>
+        </w:rPr>
+        <w:t>{</w:t>
+      </w:r>
+      <w:proofErr w:type="spellStart"/>
+      <w:r>
+        <w:rPr>
+          <w:rFonts w:ascii="TH SarabunIT๙" w:hAnsi="TH SarabunIT๙" w:cs="TH SarabunIT๙"/>
+          <w:color w:val="000000"/>
+          <w:sz w:val="32"/>
+          <w:szCs w:val="32"/>
+        </w:rPr>
+        <w:t>grandTotalPriceFormatted</w:t>
+      </w:r>
+      <w:proofErr w:type="spellEnd"/>
+      <w:r>
+        <w:rPr>
+          <w:rFonts w:ascii="TH SarabunIT๙" w:hAnsi="TH SarabunIT๙" w:cs="TH SarabunIT๙"/>
+          <w:color w:val="000000"/>
+          <w:sz w:val="32"/>
+          <w:szCs w:val="32"/>
+        </w:rPr>
+        <w:t xml:space="preserve">} </w:t>
+      </w:r>
+      <w:r>
+        <w:rPr>
+          <w:rFonts w:ascii="TH SarabunIT๙" w:hAnsi="TH SarabunIT๙" w:cs="TH SarabunIT๙"/>
+          <w:color w:val="000000"/>
+          <w:sz w:val="32"/>
+          <w:szCs w:val="32"/>
+          <w:cs/>
+        </w:rPr>
+        <w:t>บาท</w:t>
+      </w:r>
+      <w:r>
+        <w:rPr>
+          <w:rFonts w:ascii="TH SarabunIT๙" w:hAnsi="TH SarabunIT๙" w:cs="TH SarabunIT๙"/>
+          <w:color w:val="000000"/>
+          <w:sz w:val="32"/>
+          <w:szCs w:val="32"/>
+        </w:rPr>
+        <w:t xml:space="preserve"> {/</w:t>
+      </w:r>
+      <w:proofErr w:type="spellStart"/>
+      <w:r>
+        <w:rPr>
+          <w:rFonts w:ascii="TH SarabunIT๙" w:hAnsi="TH SarabunIT๙" w:cs="TH SarabunIT๙"/>
+          <w:color w:val="000000"/>
+          <w:sz w:val="32"/>
+          <w:szCs w:val="32"/>
+        </w:rPr>
+        <w:t>hasCloudRequests</w:t>
+      </w:r>
+      <w:proofErr w:type="spellEnd"/>
+      <w:r>
+        <w:rPr>
+          <w:rFonts w:ascii="TH SarabunIT๙" w:hAnsi="TH SarabunIT๙" w:cs="TH SarabunIT๙"/>
+          <w:color w:val="000000"/>
+          <w:sz w:val="32"/>
+          <w:szCs w:val="32"/>
+        </w:rPr>
+        <w:t>}</w:t>
+      </w:r>
+    </w:p>
+    <w:p>
+      <w:pPr>
+        <w:spacing w:after="0" w:line="240" w:lineRule="auto"/>
+        <w:jc w:val="center"/>
+        <w:rPr>
+          <w:rFonts w:ascii="TH SarabunIT๙" w:hAnsi="TH SarabunIT๙" w:cs="TH SarabunIT๙" w:hint="cs"/>
+          <w:color w:val="000000"/>
+          <w:sz w:val="32"/>
+          <w:szCs w:val="32"/>
+          <w:cs/>
+        </w:rPr>
+      </w:pPr>
+      <w:r>
+        <w:rPr>
+          <w:rFonts w:ascii="TH SarabunIT๙" w:hAnsi="TH SarabunIT๙" w:cs="TH SarabunIT๙"/>
+          <w:color w:val="000000"/>
+          <w:sz w:val="32"/>
+          <w:szCs w:val="32"/>
+        </w:rPr>
+        <w:t>{^</w:t>
+      </w:r>
+      <w:proofErr w:type="spellStart"/>
+      <w:r>
+        <w:rPr>
+          <w:rFonts w:ascii="TH SarabunIT๙" w:hAnsi="TH SarabunIT๙" w:cs="TH SarabunIT๙"/>
+          <w:color w:val="000000"/>
+          <w:sz w:val="32"/>
+          <w:szCs w:val="32"/>
+        </w:rPr>
+        <w:t>hasCloudRequests</w:t>
+      </w:r>
+      <w:proofErr w:type="spellEnd"/>
+      <w:r>
+        <w:rPr>
+          <w:rFonts w:ascii="TH SarabunIT๙" w:hAnsi="TH SarabunIT๙" w:cs="TH SarabunIT๙"/>
+          <w:color w:val="000000"/>
+          <w:sz w:val="32"/>
+          <w:szCs w:val="32"/>
+        </w:rPr>
+        <w:t xml:space="preserve">} - </w:t>
+      </w:r>
+      <w:r>
+        <w:rPr>
+          <w:rFonts w:ascii="TH SarabunIT๙" w:hAnsi="TH SarabunIT๙" w:cs="TH SarabunIT๙"/>
+          <w:color w:val="000000"/>
+          <w:sz w:val="32"/>
+          <w:szCs w:val="32"/>
+          <w:cs/>
+        </w:rPr>
+        <w:t xml:space="preserve">ไม่มีคำขอใช้บริการ </w:t>
+      </w:r>
+      <w:r>
+        <w:rPr>
+          <w:rFonts w:ascii="TH SarabunIT๙" w:hAnsi="TH SarabunIT๙" w:cs="TH SarabunIT๙"/>
+          <w:color w:val="000000"/>
+          <w:sz w:val="32"/>
+          <w:szCs w:val="32"/>
+        </w:rPr>
+        <w:t xml:space="preserve">Cloud </w:t>
+      </w:r>
+      <w:r>
+        <w:rPr>
+          <w:rFonts w:ascii="TH SarabunIT๙" w:hAnsi="TH SarabunIT๙" w:cs="TH SarabunIT๙"/>
+          <w:color w:val="000000"/>
+          <w:sz w:val="32"/>
+          <w:szCs w:val="32"/>
+          <w:cs/>
+        </w:rPr>
+        <w:t>-</w:t>
+      </w:r>
+      <w:r>
+        <w:rPr>
+          <w:rFonts w:ascii="TH SarabunIT๙" w:hAnsi="TH SarabunIT๙" w:cs="TH SarabunIT๙"/>
+          <w:color w:val="000000"/>
+          <w:sz w:val="32"/>
+          <w:szCs w:val="32"/>
+        </w:rPr>
+        <w:t xml:space="preserve"> {/</w:t>
+      </w:r>
+      <w:proofErr w:type="spellStart"/>
+      <w:r>
+        <w:rPr>
+          <w:rFonts w:ascii="TH SarabunIT๙" w:hAnsi="TH SarabunIT๙" w:cs="TH SarabunIT๙"/>
+          <w:color w:val="000000"/>
+          <w:sz w:val="32"/>
+          <w:szCs w:val="32"/>
+        </w:rPr>
+        <w:t>hasCloudRequests</w:t>
+      </w:r>
+      <w:proofErr w:type="spellEnd"/>
+      <w:r>
+        <w:rPr>
+          <w:rFonts w:ascii="TH SarabunIT๙" w:hAnsi="TH SarabunIT๙" w:cs="TH SarabunIT๙"/>
+          <w:color w:val="000000"/>
+          <w:sz w:val="32"/>
+          <w:szCs w:val="32"/>
+        </w:rPr>
+        <w:t>}</w:t>
+      </w:r>
+    </w:p>
+    <w:p>
+      <w:pPr>
+        <w:spacing w:after="0" w:line="240" w:lineRule="auto"/>
         <w:jc w:val="right"/>
         <w:rPr>
-          <w:rFonts w:ascii="TH SarabunIT๙" w:hAnsi="TH SarabunIT๙" w:cs="TH SarabunIT๙"/>
-          <w:color w:val="000000"/>
-          <w:sz w:val="32"/>
-          <w:szCs w:val="32"/>
+          <w:rFonts w:ascii="TH SarabunIT๙" w:hAnsi="TH SarabunIT๙" w:cs="TH SarabunIT๙" w:hint="cs"/>
+          <w:color w:val="000000"/>
+          <w:sz w:val="32"/>
+          <w:szCs w:val="32"/>
+          <w:cs/>
         </w:rPr>
       </w:pPr>
     </w:p>
@@ -28236,7 +29138,6 @@
   <w:style w:type="character" w:default="1" w:styleId="DefaultParagraphFont">
     <w:name w:val="Default Paragraph Font"/>
     <w:uiPriority w:val="1"/>
-    <w:semiHidden/>
     <w:unhideWhenUsed/>
   </w:style>
   <w:style w:type="table" w:default="1" w:styleId="TableNormal">

</xml_diff>